<commit_message>
vault backup: 2026-05-06 01:19:05
</commit_message>
<xml_diff>
--- a/Учеба 4 семестр/Теория вероятности/Курсовая работа/Отчет, Код/Курсовая работа.docx
+++ b/Учеба 4 семестр/Теория вероятности/Курсовая работа/Отчет, Код/Курсовая работа.docx
@@ -678,7 +678,13 @@
           <w:szCs w:val="24"/>
         </w:rPr>
         <w:tab/>
-        <w:t>5</w:t>
+      </w:r>
+      <w:r>
+        <w:rPr>
+          <w:sz w:val="24"/>
+          <w:szCs w:val="24"/>
+        </w:rPr>
+        <w:t>4</w:t>
       </w:r>
     </w:p>
     <w:p>
@@ -702,7 +708,13 @@
           <w:szCs w:val="24"/>
         </w:rPr>
         <w:tab/>
-        <w:t>5</w:t>
+      </w:r>
+      <w:r>
+        <w:rPr>
+          <w:sz w:val="24"/>
+          <w:szCs w:val="24"/>
+        </w:rPr>
+        <w:t>4</w:t>
       </w:r>
     </w:p>
     <w:p>
@@ -725,32 +737,21 @@
           <w:sz w:val="24"/>
           <w:szCs w:val="24"/>
         </w:rPr>
+        <w:t>, в задачах информационной безопасности</w:t>
+      </w:r>
+      <w:r>
+        <w:rPr>
+          <w:sz w:val="24"/>
+          <w:szCs w:val="24"/>
+        </w:rPr>
         <w:tab/>
-        <w:t>7</w:t>
-      </w:r>
-    </w:p>
-    <w:p>
-      <w:pPr>
-        <w:tabs>
-          <w:tab w:val="right" w:leader="dot" w:pos="9000"/>
-        </w:tabs>
-        <w:spacing w:before="40" w:after="40" w:line="276" w:lineRule="auto"/>
-        <w:ind w:left="360"/>
-      </w:pPr>
-      <w:r>
-        <w:rPr>
-          <w:sz w:val="24"/>
-          <w:szCs w:val="24"/>
-        </w:rPr>
-        <w:t>1.3. Применение в задачах информационной безопасности</w:t>
-      </w:r>
-      <w:r>
-        <w:rPr>
-          <w:sz w:val="24"/>
-          <w:szCs w:val="24"/>
-        </w:rPr>
-        <w:tab/>
-        <w:t>9</w:t>
+      </w:r>
+      <w:r>
+        <w:rPr>
+          <w:sz w:val="24"/>
+          <w:szCs w:val="24"/>
+        </w:rPr>
+        <w:t>4</w:t>
       </w:r>
     </w:p>
     <w:p>
@@ -2624,6 +2625,144 @@
           <w:szCs w:val="24"/>
         </w:rPr>
       </w:pPr>
+    </w:p>
+    <w:p>
+      <w:pPr>
+        <w:jc w:val="center"/>
+        <w:rPr>
+          <w:b/>
+          <w:bCs/>
+          <w:sz w:val="28"/>
+          <w:szCs w:val="28"/>
+        </w:rPr>
+      </w:pPr>
+      <w:r>
+        <w:rPr>
+          <w:b/>
+          <w:bCs/>
+          <w:sz w:val="28"/>
+          <w:szCs w:val="28"/>
+        </w:rPr>
+        <w:t xml:space="preserve">1.2. </w:t>
+      </w:r>
+      <w:r>
+        <w:rPr>
+          <w:b/>
+          <w:bCs/>
+          <w:sz w:val="28"/>
+          <w:szCs w:val="28"/>
+        </w:rPr>
+        <w:t>Назначение и применение в научных исследованиях, в задачах информационной безопасности</w:t>
+      </w:r>
+    </w:p>
+    <w:p>
+      <w:pPr>
+        <w:rPr>
+          <w:sz w:val="24"/>
+          <w:szCs w:val="24"/>
+        </w:rPr>
+      </w:pPr>
+    </w:p>
+    <w:p>
+      <w:pPr>
+        <w:rPr>
+          <w:sz w:val="24"/>
+          <w:szCs w:val="24"/>
+        </w:rPr>
+      </w:pPr>
+      <w:r>
+        <w:rPr>
+          <w:sz w:val="24"/>
+          <w:szCs w:val="24"/>
+        </w:rPr>
+        <w:t xml:space="preserve">Несмотря на </w:t>
+      </w:r>
+      <w:r>
+        <w:rPr>
+          <w:sz w:val="24"/>
+          <w:szCs w:val="24"/>
+        </w:rPr>
+        <w:t>то,</w:t>
+      </w:r>
+      <w:r>
+        <w:rPr>
+          <w:sz w:val="24"/>
+          <w:szCs w:val="24"/>
+        </w:rPr>
+        <w:t xml:space="preserve"> что двойное гамма-распределение не является специализированным инструментом информационной безопасности, его свойства находят применение в ряде смежных задач. В частности, как показано в работе </w:t>
+      </w:r>
+      <w:proofErr w:type="spellStart"/>
+      <w:r>
+        <w:rPr>
+          <w:sz w:val="24"/>
+          <w:szCs w:val="24"/>
+        </w:rPr>
+        <w:t>Bahashwan</w:t>
+      </w:r>
+      <w:proofErr w:type="spellEnd"/>
+      <w:r>
+        <w:rPr>
+          <w:sz w:val="24"/>
+          <w:szCs w:val="24"/>
+        </w:rPr>
+        <w:t xml:space="preserve">, </w:t>
+      </w:r>
+      <w:proofErr w:type="spellStart"/>
+      <w:r>
+        <w:rPr>
+          <w:sz w:val="24"/>
+          <w:szCs w:val="24"/>
+        </w:rPr>
+        <w:t>Kalantan</w:t>
+      </w:r>
+      <w:proofErr w:type="spellEnd"/>
+      <w:r>
+        <w:rPr>
+          <w:sz w:val="24"/>
+          <w:szCs w:val="24"/>
+        </w:rPr>
+        <w:t xml:space="preserve"> и </w:t>
+      </w:r>
+      <w:proofErr w:type="spellStart"/>
+      <w:r>
+        <w:rPr>
+          <w:sz w:val="24"/>
+          <w:szCs w:val="24"/>
+        </w:rPr>
+        <w:t>Adham</w:t>
+      </w:r>
+      <w:proofErr w:type="spellEnd"/>
+      <w:r>
+        <w:rPr>
+          <w:sz w:val="24"/>
+          <w:szCs w:val="24"/>
+        </w:rPr>
+        <w:t xml:space="preserve"> [1], метод главных компонент (PCA), основанный на двойном гамма-распределении для моделирования шума, демонстрирует повышенную устойчивость к выбросам по сравнению с классическим гауссовским PCA. Данное свойство актуально при анализе сетевого трафика, где наблюдаемые данные, как правило, содержат выбросы и нештатные значения, характерные для атак типа </w:t>
+      </w:r>
+      <w:proofErr w:type="spellStart"/>
+      <w:r>
+        <w:rPr>
+          <w:sz w:val="24"/>
+          <w:szCs w:val="24"/>
+        </w:rPr>
+        <w:t>DoS</w:t>
+      </w:r>
+      <w:proofErr w:type="spellEnd"/>
+      <w:r>
+        <w:rPr>
+          <w:sz w:val="24"/>
+          <w:szCs w:val="24"/>
+        </w:rPr>
+        <w:t xml:space="preserve"> или аномального поведения пользователей. Применение устойчивых к шуму и выбросам методов снижения размерности позволяет выделять информативные признаки из зашумлённых данных, что является одним из ключевых этапов в системах обнаружения вторжений (IDS). Таким образом, двойное </w:t>
+      </w:r>
+      <w:r>
+        <w:rPr>
+          <w:sz w:val="24"/>
+          <w:szCs w:val="24"/>
+        </w:rPr>
+        <w:lastRenderedPageBreak/>
+        <w:t>гамма-распределение представляет интерес как статистическая основа для построения устойчивых к шуму алгоритмов анализа данных в задачах информационной безопасности.</w:t>
+      </w:r>
     </w:p>
     <w:sectPr>
       <w:pgSz w:w="11906" w:h="16838"/>

</xml_diff>

<commit_message>
vault backup: 2026-05-06 02:21:56
</commit_message>
<xml_diff>
--- a/Учеба 4 семестр/Теория вероятности/Курсовая работа/Отчет, Код/Курсовая работа.docx
+++ b/Учеба 4 семестр/Теория вероятности/Курсовая работа/Отчет, Код/Курсовая работа.docx
@@ -1565,8 +1565,52 @@
           <w:sz w:val="28"/>
           <w:szCs w:val="28"/>
         </w:rPr>
-        <w:t>Цель работы</w:t>
-      </w:r>
+        <w:t>Актуальность:</w:t>
+      </w:r>
+      <w:r>
+        <w:rPr>
+          <w:sz w:val="28"/>
+          <w:szCs w:val="28"/>
+        </w:rPr>
+        <w:t xml:space="preserve"> </w:t>
+      </w:r>
+      <w:r>
+        <w:rPr>
+          <w:sz w:val="28"/>
+          <w:szCs w:val="28"/>
+        </w:rPr>
+        <w:t>Д</w:t>
+      </w:r>
+      <w:r>
+        <w:rPr>
+          <w:sz w:val="28"/>
+          <w:szCs w:val="28"/>
+        </w:rPr>
+        <w:t>войное гамма-</w:t>
+      </w:r>
+      <w:r>
+        <w:rPr>
+          <w:sz w:val="28"/>
+          <w:szCs w:val="28"/>
+        </w:rPr>
+        <w:t>распределение находит применение в задачах обработки сигналов, анализе финансовых временных рядов, а также в области информационной безопасности — в частности, при статистическом анализе сетевого трафика и обнаружении аномалий.</w:t>
+      </w:r>
+    </w:p>
+    <w:p>
+      <w:pPr>
+        <w:rPr>
+          <w:sz w:val="28"/>
+          <w:szCs w:val="28"/>
+        </w:rPr>
+      </w:pPr>
+    </w:p>
+    <w:p>
+      <w:pPr>
+        <w:rPr>
+          <w:sz w:val="28"/>
+          <w:szCs w:val="28"/>
+        </w:rPr>
+      </w:pPr>
       <w:r>
         <w:rPr>
           <w:b/>
@@ -1574,43 +1618,7 @@
           <w:sz w:val="28"/>
           <w:szCs w:val="28"/>
         </w:rPr>
-        <w:t xml:space="preserve">: </w:t>
-      </w:r>
-      <w:r>
-        <w:rPr>
-          <w:sz w:val="28"/>
-          <w:szCs w:val="28"/>
-        </w:rPr>
-        <w:t xml:space="preserve">комплексно исследовать двойное гамма распределение, изучить его теоретические свойства, реализовать статистические методы обработки выборки, предоставленной преподавателем, и </w:t>
-      </w:r>
-      <w:r>
-        <w:rPr>
-          <w:sz w:val="28"/>
-          <w:szCs w:val="28"/>
-        </w:rPr>
-        <w:t xml:space="preserve">провести проверку </w:t>
-      </w:r>
-      <w:r>
-        <w:rPr>
-          <w:sz w:val="28"/>
-          <w:szCs w:val="28"/>
-        </w:rPr>
-        <w:t>статистических гипотез.</w:t>
-      </w:r>
-    </w:p>
-    <w:p>
-      <w:pPr>
-        <w:rPr>
-          <w:sz w:val="28"/>
-          <w:szCs w:val="28"/>
-        </w:rPr>
-      </w:pPr>
-      <w:r>
-        <w:rPr>
-          <w:sz w:val="28"/>
-          <w:szCs w:val="28"/>
-        </w:rPr>
-        <w:br/>
+        <w:t>Цель работы</w:t>
       </w:r>
       <w:r>
         <w:rPr>
@@ -1619,21 +1627,28 @@
           <w:sz w:val="28"/>
           <w:szCs w:val="28"/>
         </w:rPr>
-        <w:t>Актуальность:</w:t>
-      </w:r>
-      <w:r>
-        <w:rPr>
-          <w:sz w:val="28"/>
-          <w:szCs w:val="28"/>
-        </w:rPr>
-        <w:t xml:space="preserve"> </w:t>
-      </w:r>
-      <w:r>
-        <w:rPr>
-          <w:sz w:val="28"/>
-          <w:szCs w:val="28"/>
-        </w:rPr>
-        <w:t>Данное распределение находит применение в задачах обработки сигналов, анализе финансовых временных рядов, а также в области информационной безопасности — в частности, при статистическом анализе сетевого трафика и обнаружении аномалий.</w:t>
+        <w:t xml:space="preserve">: </w:t>
+      </w:r>
+      <w:r>
+        <w:rPr>
+          <w:sz w:val="28"/>
+          <w:szCs w:val="28"/>
+        </w:rPr>
+        <w:t xml:space="preserve">комплексно исследовать двойное гамма распределение, изучить его теоретические свойства, реализовать статистические методы обработки выборки, предоставленной преподавателем, и </w:t>
+      </w:r>
+      <w:r>
+        <w:rPr>
+          <w:sz w:val="28"/>
+          <w:szCs w:val="28"/>
+        </w:rPr>
+        <w:t xml:space="preserve">провести проверку </w:t>
+      </w:r>
+      <w:r>
+        <w:rPr>
+          <w:sz w:val="28"/>
+          <w:szCs w:val="28"/>
+        </w:rPr>
+        <w:t>статистических гипотез.</w:t>
       </w:r>
     </w:p>
     <w:p>
@@ -2060,23 +2075,297 @@
           <w:sz w:val="28"/>
           <w:szCs w:val="28"/>
         </w:rPr>
-        <w:t xml:space="preserve">Истоки двойного гамма-распределения связаны с работами датского математика </w:t>
+        <w:t>Истоки двойного гамма-распределения связаны с историей классического гамма-</w:t>
+      </w:r>
+      <w:r>
+        <w:rPr>
+          <w:sz w:val="28"/>
+          <w:szCs w:val="28"/>
+        </w:rPr>
+        <w:t>распределения</w:t>
+      </w:r>
+      <w:r>
+        <w:rPr>
+          <w:sz w:val="28"/>
+          <w:szCs w:val="28"/>
+        </w:rPr>
+        <w:t xml:space="preserve"> (распределение Эрланга)</w:t>
+      </w:r>
+      <w:r>
+        <w:rPr>
+          <w:sz w:val="28"/>
+          <w:szCs w:val="28"/>
+        </w:rPr>
+        <w:t>.</w:t>
+      </w:r>
+      <w:r>
+        <w:rPr>
+          <w:sz w:val="28"/>
+          <w:szCs w:val="28"/>
+        </w:rPr>
+        <w:t xml:space="preserve"> </w:t>
+      </w:r>
+      <w:r>
+        <w:rPr>
+          <w:sz w:val="28"/>
+          <w:szCs w:val="28"/>
+        </w:rPr>
+        <w:t xml:space="preserve">Гамма-распределение было систематизировано английским статистиком Карлом Пирсоном в рамках его системы распределений в 1890-х годах, хотя отдельные его формы встречались в работах более ранних </w:t>
+      </w:r>
+      <w:r>
+        <w:rPr>
+          <w:sz w:val="28"/>
+          <w:szCs w:val="28"/>
+        </w:rPr>
+        <w:t>математиков [</w:t>
+      </w:r>
+      <w:r>
+        <w:rPr>
+          <w:sz w:val="28"/>
+          <w:szCs w:val="28"/>
+        </w:rPr>
+        <w:t>1</w:t>
+      </w:r>
+      <w:r>
+        <w:rPr>
+          <w:sz w:val="28"/>
+          <w:szCs w:val="28"/>
+        </w:rPr>
+        <w:t>]</w:t>
+      </w:r>
+      <w:r>
+        <w:rPr>
+          <w:sz w:val="28"/>
+          <w:szCs w:val="28"/>
+        </w:rPr>
+        <w:t xml:space="preserve">. </w:t>
+      </w:r>
+    </w:p>
+    <w:p>
+      <w:pPr>
+        <w:rPr>
+          <w:sz w:val="28"/>
+          <w:szCs w:val="28"/>
+          <w:lang w:val="en-US"/>
+        </w:rPr>
+      </w:pPr>
+      <w:r>
+        <w:rPr>
+          <w:sz w:val="28"/>
+          <w:szCs w:val="28"/>
+        </w:rPr>
+        <w:t xml:space="preserve">Гамма-распределение определено только для неотрицательных значений случайной величины, что ограничивает его применимость при моделировании симметричных процессов. Для преодоления этого ограничения исследователями было предложено его естественное расширение на всю числовую ось — двойное гамма-распределение (также называемое отражённым гамма-распределением, англ. </w:t>
       </w:r>
       <w:proofErr w:type="spellStart"/>
       <w:r>
         <w:rPr>
-          <w:sz w:val="28"/>
-          <w:szCs w:val="28"/>
-        </w:rPr>
-        <w:t>Торвалда</w:t>
+          <w:i/>
+          <w:iCs/>
+          <w:sz w:val="28"/>
+          <w:szCs w:val="28"/>
+        </w:rPr>
+        <w:t>reflected</w:t>
       </w:r>
       <w:proofErr w:type="spellEnd"/>
       <w:r>
         <w:rPr>
-          <w:sz w:val="28"/>
-          <w:szCs w:val="28"/>
-        </w:rPr>
-        <w:t xml:space="preserve"> Тиле в конце XIX века. Он исследовал семейство распределений, описывающих суммы случайных величин</w:t>
+          <w:i/>
+          <w:iCs/>
+          <w:sz w:val="28"/>
+          <w:szCs w:val="28"/>
+        </w:rPr>
+        <w:t xml:space="preserve"> </w:t>
+      </w:r>
+      <w:proofErr w:type="spellStart"/>
+      <w:r>
+        <w:rPr>
+          <w:i/>
+          <w:iCs/>
+          <w:sz w:val="28"/>
+          <w:szCs w:val="28"/>
+        </w:rPr>
+        <w:t>gamma</w:t>
+      </w:r>
+      <w:proofErr w:type="spellEnd"/>
+      <w:r>
+        <w:rPr>
+          <w:i/>
+          <w:iCs/>
+          <w:sz w:val="28"/>
+          <w:szCs w:val="28"/>
+        </w:rPr>
+        <w:t xml:space="preserve"> </w:t>
+      </w:r>
+      <w:proofErr w:type="spellStart"/>
+      <w:r>
+        <w:rPr>
+          <w:i/>
+          <w:iCs/>
+          <w:sz w:val="28"/>
+          <w:szCs w:val="28"/>
+        </w:rPr>
+        <w:t>distribution</w:t>
+      </w:r>
+      <w:proofErr w:type="spellEnd"/>
+      <w:r>
+        <w:rPr>
+          <w:sz w:val="28"/>
+          <w:szCs w:val="28"/>
+        </w:rPr>
+        <w:t>).</w:t>
+      </w:r>
+    </w:p>
+    <w:p>
+      <w:pPr>
+        <w:rPr>
+          <w:sz w:val="28"/>
+          <w:szCs w:val="28"/>
+        </w:rPr>
+      </w:pPr>
+      <w:r>
+        <w:rPr>
+          <w:sz w:val="28"/>
+          <w:szCs w:val="28"/>
+        </w:rPr>
+        <w:t>Фактически оно строится следующим образом: б</w:t>
+      </w:r>
+      <w:r>
+        <w:rPr>
+          <w:sz w:val="28"/>
+          <w:szCs w:val="28"/>
+        </w:rPr>
+        <w:t>ерется гамма-распределенная величина, знак которой выбирается случайно</w:t>
+      </w:r>
+      <w:r>
+        <w:rPr>
+          <w:sz w:val="28"/>
+          <w:szCs w:val="28"/>
+        </w:rPr>
+        <w:t>.</w:t>
+      </w:r>
+    </w:p>
+    <w:p>
+      <w:pPr>
+        <w:rPr>
+          <w:sz w:val="28"/>
+          <w:szCs w:val="28"/>
+        </w:rPr>
+      </w:pPr>
+      <w:r>
+        <w:rPr>
+          <w:sz w:val="28"/>
+          <w:szCs w:val="28"/>
+        </w:rPr>
+        <w:t xml:space="preserve">Таким образом, распределение становится симметричным относительно начала координат. </w:t>
+      </w:r>
+    </w:p>
+    <w:p>
+      <w:pPr>
+        <w:rPr>
+          <w:sz w:val="28"/>
+          <w:szCs w:val="28"/>
+        </w:rPr>
+      </w:pPr>
+      <w:r>
+        <w:rPr>
+          <w:sz w:val="28"/>
+          <w:szCs w:val="28"/>
+        </w:rPr>
+        <w:t xml:space="preserve">Основная идея распределения: </w:t>
+      </w:r>
+    </w:p>
+    <w:p>
+      <w:pPr>
+        <w:rPr>
+          <w:sz w:val="28"/>
+          <w:szCs w:val="28"/>
+        </w:rPr>
+      </w:pPr>
+      <w:r>
+        <w:rPr>
+          <w:sz w:val="28"/>
+          <w:szCs w:val="28"/>
+        </w:rPr>
+        <w:t>Говорят, что, е</w:t>
+      </w:r>
+      <w:r>
+        <w:rPr>
+          <w:sz w:val="28"/>
+          <w:szCs w:val="28"/>
+        </w:rPr>
+        <w:t xml:space="preserve">сли </w:t>
+      </w:r>
+      <w:r>
+        <w:rPr>
+          <w:sz w:val="28"/>
+          <w:szCs w:val="28"/>
+          <w:lang w:val="en-US"/>
+        </w:rPr>
+        <w:t>Y</w:t>
+      </w:r>
+      <w:r>
+        <w:rPr>
+          <w:sz w:val="28"/>
+          <w:szCs w:val="28"/>
+        </w:rPr>
+        <w:t xml:space="preserve"> – </w:t>
+      </w:r>
+      <w:r>
+        <w:rPr>
+          <w:sz w:val="28"/>
+          <w:szCs w:val="28"/>
+        </w:rPr>
+        <w:t xml:space="preserve">случайная величина с гамма-распределением, а знак выбирается случайно, то получается случайная величина </w:t>
+      </w:r>
+      <w:r>
+        <w:rPr>
+          <w:sz w:val="28"/>
+          <w:szCs w:val="28"/>
+          <w:lang w:val="en-US"/>
+        </w:rPr>
+        <w:t>X</w:t>
+      </w:r>
+      <w:r>
+        <w:rPr>
+          <w:sz w:val="28"/>
+          <w:szCs w:val="28"/>
+        </w:rPr>
+        <w:t>, имеющая двойное гамма-распределение</w:t>
+      </w:r>
+      <w:r>
+        <w:rPr>
+          <w:sz w:val="28"/>
+          <w:szCs w:val="28"/>
+        </w:rPr>
+        <w:t xml:space="preserve"> [</w:t>
+      </w:r>
+      <w:r>
+        <w:rPr>
+          <w:sz w:val="28"/>
+          <w:szCs w:val="28"/>
+        </w:rPr>
+        <w:t>2</w:t>
+      </w:r>
+      <w:r>
+        <w:rPr>
+          <w:sz w:val="28"/>
+          <w:szCs w:val="28"/>
+        </w:rPr>
+        <w:t xml:space="preserve">, </w:t>
+      </w:r>
+      <w:r>
+        <w:rPr>
+          <w:sz w:val="28"/>
+          <w:szCs w:val="28"/>
+        </w:rPr>
+        <w:t>с.</w:t>
+      </w:r>
+      <w:r>
+        <w:rPr>
+          <w:sz w:val="28"/>
+          <w:szCs w:val="28"/>
+        </w:rPr>
+        <w:t xml:space="preserve"> 111]</w:t>
       </w:r>
       <w:r>
         <w:rPr>
@@ -2084,139 +2373,6 @@
           <w:szCs w:val="28"/>
         </w:rPr>
         <w:t xml:space="preserve">. </w:t>
-      </w:r>
-      <w:r>
-        <w:rPr>
-          <w:sz w:val="28"/>
-          <w:szCs w:val="28"/>
-        </w:rPr>
-        <w:t>Позднее английский статистик Карл Пирсон включил гамма-распределение в свою систему распределений в 1890-е годы.</w:t>
-      </w:r>
-    </w:p>
-    <w:p>
-      <w:pPr>
-        <w:rPr>
-          <w:sz w:val="28"/>
-          <w:szCs w:val="28"/>
-        </w:rPr>
-      </w:pPr>
-      <w:r>
-        <w:rPr>
-          <w:sz w:val="28"/>
-          <w:szCs w:val="28"/>
-        </w:rPr>
-        <w:t>Для моделирования симметричных процессов и случайных величин, принимающих значения на всей числовой оси, исследователи предложили модификацию гамма-распределения.</w:t>
-      </w:r>
-      <w:r>
-        <w:rPr>
-          <w:sz w:val="28"/>
-          <w:szCs w:val="28"/>
-        </w:rPr>
-        <w:br/>
-        <w:t>Двойное гамма-распределение было введено как распределение, получаемое из гамма-распределения, но распространяемое на отрицательную и положительную части оси.</w:t>
-      </w:r>
-      <w:r>
-        <w:rPr>
-          <w:sz w:val="28"/>
-          <w:szCs w:val="28"/>
-        </w:rPr>
-        <w:t xml:space="preserve"> Фактически оно строится следующим образом: б</w:t>
-      </w:r>
-      <w:r>
-        <w:rPr>
-          <w:sz w:val="28"/>
-          <w:szCs w:val="28"/>
-        </w:rPr>
-        <w:t>ерется гамма-распределенная величина, знак которой выбирается случайно</w:t>
-      </w:r>
-      <w:r>
-        <w:rPr>
-          <w:sz w:val="28"/>
-          <w:szCs w:val="28"/>
-        </w:rPr>
-        <w:t>.</w:t>
-      </w:r>
-    </w:p>
-    <w:p>
-      <w:pPr>
-        <w:rPr>
-          <w:sz w:val="28"/>
-          <w:szCs w:val="28"/>
-        </w:rPr>
-      </w:pPr>
-      <w:r>
-        <w:rPr>
-          <w:sz w:val="28"/>
-          <w:szCs w:val="28"/>
-        </w:rPr>
-        <w:t xml:space="preserve">Таким образом, распределение становится симметричным относительно начала координат. </w:t>
-      </w:r>
-    </w:p>
-    <w:p>
-      <w:pPr>
-        <w:rPr>
-          <w:sz w:val="28"/>
-          <w:szCs w:val="28"/>
-        </w:rPr>
-      </w:pPr>
-      <w:r>
-        <w:rPr>
-          <w:sz w:val="28"/>
-          <w:szCs w:val="28"/>
-        </w:rPr>
-        <w:t xml:space="preserve">Основная идея распределения: </w:t>
-      </w:r>
-    </w:p>
-    <w:p>
-      <w:pPr>
-        <w:rPr>
-          <w:sz w:val="28"/>
-          <w:szCs w:val="28"/>
-        </w:rPr>
-      </w:pPr>
-      <w:r>
-        <w:rPr>
-          <w:sz w:val="28"/>
-          <w:szCs w:val="28"/>
-        </w:rPr>
-        <w:t xml:space="preserve">Если </w:t>
-      </w:r>
-      <w:r>
-        <w:rPr>
-          <w:sz w:val="28"/>
-          <w:szCs w:val="28"/>
-          <w:lang w:val="en-US"/>
-        </w:rPr>
-        <w:t>Y</w:t>
-      </w:r>
-      <w:r>
-        <w:rPr>
-          <w:sz w:val="28"/>
-          <w:szCs w:val="28"/>
-        </w:rPr>
-        <w:t xml:space="preserve"> – </w:t>
-      </w:r>
-      <w:r>
-        <w:rPr>
-          <w:sz w:val="28"/>
-          <w:szCs w:val="28"/>
-        </w:rPr>
-        <w:t xml:space="preserve">случайная величина с гамма-распределением, а знак выбирается случайно, то получается случайная величина </w:t>
-      </w:r>
-      <w:r>
-        <w:rPr>
-          <w:sz w:val="28"/>
-          <w:szCs w:val="28"/>
-          <w:lang w:val="en-US"/>
-        </w:rPr>
-        <w:t>X</w:t>
-      </w:r>
-      <w:r>
-        <w:rPr>
-          <w:sz w:val="28"/>
-          <w:szCs w:val="28"/>
-        </w:rPr>
-        <w:t xml:space="preserve">, имеющая двойное гамма-распределение. </w:t>
       </w:r>
     </w:p>
     <w:p>
@@ -2520,7 +2676,6 @@
         <w:rPr>
           <w:sz w:val="28"/>
           <w:szCs w:val="28"/>
-          <w:lang w:val="en-US"/>
         </w:rPr>
       </w:pPr>
       <w:r>
@@ -2601,22 +2756,78 @@
         </w:rPr>
         <w:t xml:space="preserve"> — гамма-функция.</w:t>
       </w:r>
-    </w:p>
-    <w:p>
-      <w:pPr>
-        <w:rPr>
-          <w:sz w:val="28"/>
-          <w:szCs w:val="28"/>
-        </w:rPr>
-      </w:pPr>
-    </w:p>
-    <w:p>
-      <w:pPr>
-        <w:rPr>
-          <w:sz w:val="28"/>
-          <w:szCs w:val="28"/>
-        </w:rPr>
-      </w:pPr>
+      <w:r>
+        <w:rPr>
+          <w:sz w:val="28"/>
+          <w:szCs w:val="28"/>
+        </w:rPr>
+        <w:t xml:space="preserve"> [</w:t>
+      </w:r>
+      <w:r>
+        <w:rPr>
+          <w:sz w:val="28"/>
+          <w:szCs w:val="28"/>
+        </w:rPr>
+        <w:t>2</w:t>
+      </w:r>
+      <w:r>
+        <w:rPr>
+          <w:sz w:val="28"/>
+          <w:szCs w:val="28"/>
+        </w:rPr>
+        <w:t xml:space="preserve">, </w:t>
+      </w:r>
+      <w:r>
+        <w:rPr>
+          <w:sz w:val="28"/>
+          <w:szCs w:val="28"/>
+        </w:rPr>
+        <w:t>с 112</w:t>
+      </w:r>
+      <w:r>
+        <w:rPr>
+          <w:sz w:val="28"/>
+          <w:szCs w:val="28"/>
+        </w:rPr>
+        <w:t>]</w:t>
+      </w:r>
+    </w:p>
+    <w:p>
+      <w:pPr>
+        <w:rPr>
+          <w:sz w:val="28"/>
+          <w:szCs w:val="28"/>
+        </w:rPr>
+      </w:pPr>
+    </w:p>
+    <w:p>
+      <w:pPr>
+        <w:rPr>
+          <w:sz w:val="28"/>
+          <w:szCs w:val="28"/>
+        </w:rPr>
+      </w:pPr>
+      <w:r>
+        <w:rPr>
+          <w:sz w:val="28"/>
+          <w:szCs w:val="28"/>
+        </w:rPr>
+        <w:t>Таким образом, двойное гамма-распределение представляет собой гибкий инструмент статистического моделирования, охватывающий широкий класс симметричных распределени</w:t>
+      </w:r>
+      <w:r>
+        <w:rPr>
+          <w:sz w:val="28"/>
+          <w:szCs w:val="28"/>
+        </w:rPr>
+        <w:t>й</w:t>
+      </w:r>
+      <w:r>
+        <w:rPr>
+          <w:sz w:val="28"/>
+          <w:szCs w:val="28"/>
+        </w:rPr>
+        <w:t>.</w:t>
+      </w:r>
     </w:p>
     <w:p>
       <w:pPr>
@@ -2666,103 +2877,391 @@
     <w:p>
       <w:pPr>
         <w:rPr>
-          <w:sz w:val="24"/>
-          <w:szCs w:val="24"/>
-        </w:rPr>
-      </w:pPr>
-      <w:r>
-        <w:rPr>
-          <w:sz w:val="24"/>
-          <w:szCs w:val="24"/>
+          <w:sz w:val="28"/>
+          <w:szCs w:val="28"/>
+        </w:rPr>
+      </w:pPr>
+      <w:r>
+        <w:rPr>
+          <w:sz w:val="28"/>
+          <w:szCs w:val="28"/>
         </w:rPr>
         <w:t xml:space="preserve">Несмотря на </w:t>
       </w:r>
       <w:r>
         <w:rPr>
-          <w:sz w:val="24"/>
-          <w:szCs w:val="24"/>
+          <w:sz w:val="28"/>
+          <w:szCs w:val="28"/>
         </w:rPr>
         <w:t>то,</w:t>
       </w:r>
       <w:r>
         <w:rPr>
-          <w:sz w:val="24"/>
-          <w:szCs w:val="24"/>
+          <w:sz w:val="28"/>
+          <w:szCs w:val="28"/>
         </w:rPr>
         <w:t xml:space="preserve"> что двойное гамма-распределение не является специализированным инструментом информационной безопасности, его свойства находят применение в ряде смежных задач. В частности, как показано в работе </w:t>
       </w:r>
       <w:proofErr w:type="spellStart"/>
       <w:r>
         <w:rPr>
-          <w:sz w:val="24"/>
-          <w:szCs w:val="24"/>
+          <w:sz w:val="28"/>
+          <w:szCs w:val="28"/>
         </w:rPr>
         <w:t>Bahashwan</w:t>
       </w:r>
       <w:proofErr w:type="spellEnd"/>
       <w:r>
         <w:rPr>
-          <w:sz w:val="24"/>
-          <w:szCs w:val="24"/>
+          <w:sz w:val="28"/>
+          <w:szCs w:val="28"/>
         </w:rPr>
         <w:t xml:space="preserve">, </w:t>
       </w:r>
       <w:proofErr w:type="spellStart"/>
       <w:r>
         <w:rPr>
-          <w:sz w:val="24"/>
-          <w:szCs w:val="24"/>
+          <w:sz w:val="28"/>
+          <w:szCs w:val="28"/>
         </w:rPr>
         <w:t>Kalantan</w:t>
       </w:r>
       <w:proofErr w:type="spellEnd"/>
       <w:r>
         <w:rPr>
-          <w:sz w:val="24"/>
-          <w:szCs w:val="24"/>
+          <w:sz w:val="28"/>
+          <w:szCs w:val="28"/>
         </w:rPr>
         <w:t xml:space="preserve"> и </w:t>
       </w:r>
       <w:proofErr w:type="spellStart"/>
       <w:r>
         <w:rPr>
-          <w:sz w:val="24"/>
-          <w:szCs w:val="24"/>
+          <w:sz w:val="28"/>
+          <w:szCs w:val="28"/>
         </w:rPr>
         <w:t>Adham</w:t>
       </w:r>
       <w:proofErr w:type="spellEnd"/>
       <w:r>
         <w:rPr>
-          <w:sz w:val="24"/>
-          <w:szCs w:val="24"/>
-        </w:rPr>
-        <w:t xml:space="preserve"> [1], метод главных компонент (PCA), основанный на двойном гамма-распределении для моделирования шума, демонстрирует повышенную устойчивость к выбросам по сравнению с классическим гауссовским PCA. Данное свойство актуально при анализе сетевого трафика, где наблюдаемые данные, как правило, содержат выбросы и нештатные значения, характерные для атак типа </w:t>
+          <w:sz w:val="28"/>
+          <w:szCs w:val="28"/>
+        </w:rPr>
+        <w:t xml:space="preserve"> [</w:t>
+      </w:r>
+      <w:r>
+        <w:rPr>
+          <w:sz w:val="28"/>
+          <w:szCs w:val="28"/>
+        </w:rPr>
+        <w:t>3</w:t>
+      </w:r>
+      <w:r>
+        <w:rPr>
+          <w:sz w:val="28"/>
+          <w:szCs w:val="28"/>
+        </w:rPr>
+        <w:t xml:space="preserve">], метод главных компонент (PCA), основанный на двойном гамма-распределении для моделирования шума, демонстрирует повышенную устойчивость к выбросам </w:t>
+      </w:r>
+      <w:r>
+        <w:rPr>
+          <w:sz w:val="28"/>
+          <w:szCs w:val="28"/>
+        </w:rPr>
+        <w:lastRenderedPageBreak/>
+        <w:t xml:space="preserve">по сравнению с классическим гауссовским PCA. Данное свойство актуально при анализе сетевого трафика, где наблюдаемые данные, как правило, содержат выбросы и нештатные значения, характерные для атак типа </w:t>
       </w:r>
       <w:proofErr w:type="spellStart"/>
       <w:r>
         <w:rPr>
-          <w:sz w:val="24"/>
-          <w:szCs w:val="24"/>
+          <w:sz w:val="28"/>
+          <w:szCs w:val="28"/>
         </w:rPr>
         <w:t>DoS</w:t>
       </w:r>
       <w:proofErr w:type="spellEnd"/>
       <w:r>
         <w:rPr>
-          <w:sz w:val="24"/>
-          <w:szCs w:val="24"/>
-        </w:rPr>
-        <w:t xml:space="preserve"> или аномального поведения пользователей. Применение устойчивых к шуму и выбросам методов снижения размерности позволяет выделять информативные признаки из зашумлённых данных, что является одним из ключевых этапов в системах обнаружения вторжений (IDS). Таким образом, двойное </w:t>
-      </w:r>
-      <w:r>
-        <w:rPr>
-          <w:sz w:val="24"/>
-          <w:szCs w:val="24"/>
-        </w:rPr>
-        <w:lastRenderedPageBreak/>
-        <w:t>гамма-распределение представляет интерес как статистическая основа для построения устойчивых к шуму алгоритмов анализа данных в задачах информационной безопасности.</w:t>
-      </w:r>
+          <w:sz w:val="28"/>
+          <w:szCs w:val="28"/>
+        </w:rPr>
+        <w:t xml:space="preserve"> или аномального поведения пользователей. Применение устойчивых к шуму и выбросам методов снижения размерности позволяет выделять информативные признаки из зашумлённых данных, что является одним из ключевых этапов в системах обнаружения вторжений (IDS). Таким образом, двойное гамма-распределение представляет интерес как статистическая основа для построения устойчивых к шуму алгоритмов анализа данных в задачах информационной безопасности.</w:t>
+      </w:r>
+    </w:p>
+    <w:p>
+      <w:pPr>
+        <w:rPr>
+          <w:sz w:val="28"/>
+          <w:szCs w:val="28"/>
+        </w:rPr>
+      </w:pPr>
+    </w:p>
+    <w:p>
+      <w:pPr>
+        <w:rPr>
+          <w:sz w:val="28"/>
+          <w:szCs w:val="28"/>
+        </w:rPr>
+      </w:pPr>
+    </w:p>
+    <w:p>
+      <w:pPr>
+        <w:jc w:val="center"/>
+        <w:rPr>
+          <w:b/>
+          <w:bCs/>
+          <w:sz w:val="32"/>
+          <w:szCs w:val="32"/>
+          <w:lang w:val="en-US"/>
+        </w:rPr>
+      </w:pPr>
+      <w:r>
+        <w:rPr>
+          <w:b/>
+          <w:bCs/>
+          <w:sz w:val="32"/>
+          <w:szCs w:val="32"/>
+        </w:rPr>
+        <w:t>Список</w:t>
+      </w:r>
+      <w:r>
+        <w:rPr>
+          <w:b/>
+          <w:bCs/>
+          <w:sz w:val="32"/>
+          <w:szCs w:val="32"/>
+          <w:lang w:val="en-US"/>
+        </w:rPr>
+        <w:t xml:space="preserve"> </w:t>
+      </w:r>
+      <w:r>
+        <w:rPr>
+          <w:b/>
+          <w:bCs/>
+          <w:sz w:val="32"/>
+          <w:szCs w:val="32"/>
+        </w:rPr>
+        <w:t>используемой</w:t>
+      </w:r>
+      <w:r>
+        <w:rPr>
+          <w:b/>
+          <w:bCs/>
+          <w:sz w:val="32"/>
+          <w:szCs w:val="32"/>
+          <w:lang w:val="en-US"/>
+        </w:rPr>
+        <w:t xml:space="preserve"> </w:t>
+      </w:r>
+      <w:r>
+        <w:rPr>
+          <w:b/>
+          <w:bCs/>
+          <w:sz w:val="32"/>
+          <w:szCs w:val="32"/>
+        </w:rPr>
+        <w:t>л</w:t>
+      </w:r>
+      <w:r>
+        <w:rPr>
+          <w:b/>
+          <w:bCs/>
+          <w:sz w:val="32"/>
+          <w:szCs w:val="32"/>
+        </w:rPr>
+        <w:t>итературы</w:t>
+      </w:r>
+    </w:p>
+    <w:p>
+      <w:pPr>
+        <w:jc w:val="center"/>
+        <w:rPr>
+          <w:b/>
+          <w:bCs/>
+          <w:sz w:val="32"/>
+          <w:szCs w:val="32"/>
+          <w:lang w:val="en-US"/>
+        </w:rPr>
+      </w:pPr>
+    </w:p>
+    <w:p>
+      <w:pPr>
+        <w:rPr>
+          <w:b/>
+          <w:bCs/>
+          <w:sz w:val="28"/>
+          <w:szCs w:val="28"/>
+          <w:lang w:val="en-US"/>
+        </w:rPr>
+      </w:pPr>
+      <w:r>
+        <w:rPr>
+          <w:b/>
+          <w:bCs/>
+          <w:sz w:val="32"/>
+          <w:szCs w:val="32"/>
+          <w:lang w:val="en-US"/>
+        </w:rPr>
+        <w:t xml:space="preserve">[1] </w:t>
+      </w:r>
+      <w:r>
+        <w:rPr>
+          <w:b/>
+          <w:bCs/>
+          <w:sz w:val="28"/>
+          <w:szCs w:val="28"/>
+          <w:lang w:val="en-US"/>
+        </w:rPr>
+        <w:t>Pearson K. Tables of the Incomplete Gamma-Function / computed by the staff of the Department of Applied Statistics, University of London</w:t>
+      </w:r>
+      <w:r>
+        <w:rPr>
+          <w:b/>
+          <w:bCs/>
+          <w:sz w:val="28"/>
+          <w:szCs w:val="28"/>
+          <w:lang w:val="en-US"/>
+        </w:rPr>
+        <w:t>.</w:t>
+      </w:r>
+    </w:p>
+    <w:p>
+      <w:pPr>
+        <w:rPr>
+          <w:b/>
+          <w:bCs/>
+          <w:sz w:val="28"/>
+          <w:szCs w:val="28"/>
+          <w:lang w:val="en-US"/>
+        </w:rPr>
+      </w:pPr>
+      <w:r>
+        <w:rPr>
+          <w:b/>
+          <w:bCs/>
+          <w:sz w:val="28"/>
+          <w:szCs w:val="28"/>
+          <w:lang w:val="en-US"/>
+        </w:rPr>
+        <w:t xml:space="preserve">[2] </w:t>
+      </w:r>
+      <w:r>
+        <w:rPr>
+          <w:b/>
+          <w:bCs/>
+          <w:sz w:val="28"/>
+          <w:szCs w:val="28"/>
+          <w:lang w:val="en-US"/>
+        </w:rPr>
+        <w:t>Bain L. J., Engelhardt M. Introduction to Probability and Mathematical Statistics.</w:t>
+      </w:r>
+    </w:p>
+    <w:p>
+      <w:pPr>
+        <w:rPr>
+          <w:b/>
+          <w:bCs/>
+          <w:sz w:val="28"/>
+          <w:szCs w:val="28"/>
+        </w:rPr>
+      </w:pPr>
+      <w:r>
+        <w:rPr>
+          <w:b/>
+          <w:bCs/>
+          <w:sz w:val="28"/>
+          <w:szCs w:val="28"/>
+          <w:lang w:val="en-US"/>
+        </w:rPr>
+        <w:t>[3]</w:t>
+      </w:r>
+      <w:r>
+        <w:rPr>
+          <w:b/>
+          <w:bCs/>
+          <w:sz w:val="28"/>
+          <w:szCs w:val="28"/>
+          <w:lang w:val="en-US"/>
+        </w:rPr>
+        <w:t xml:space="preserve"> </w:t>
+      </w:r>
+      <w:proofErr w:type="spellStart"/>
+      <w:r>
+        <w:rPr>
+          <w:b/>
+          <w:bCs/>
+          <w:sz w:val="28"/>
+          <w:szCs w:val="28"/>
+          <w:lang w:val="en-US"/>
+        </w:rPr>
+        <w:t>Bahashwan</w:t>
+      </w:r>
+      <w:proofErr w:type="spellEnd"/>
+      <w:r>
+        <w:rPr>
+          <w:b/>
+          <w:bCs/>
+          <w:sz w:val="28"/>
+          <w:szCs w:val="28"/>
+          <w:lang w:val="en-US"/>
+        </w:rPr>
+        <w:t xml:space="preserve"> A. O., </w:t>
+      </w:r>
+      <w:proofErr w:type="spellStart"/>
+      <w:r>
+        <w:rPr>
+          <w:b/>
+          <w:bCs/>
+          <w:sz w:val="28"/>
+          <w:szCs w:val="28"/>
+          <w:lang w:val="en-US"/>
+        </w:rPr>
+        <w:t>Kalantan</w:t>
+      </w:r>
+      <w:proofErr w:type="spellEnd"/>
+      <w:r>
+        <w:rPr>
+          <w:b/>
+          <w:bCs/>
+          <w:sz w:val="28"/>
+          <w:szCs w:val="28"/>
+          <w:lang w:val="en-US"/>
+        </w:rPr>
+        <w:t xml:space="preserve"> Z. I., </w:t>
+      </w:r>
+      <w:proofErr w:type="spellStart"/>
+      <w:r>
+        <w:rPr>
+          <w:b/>
+          <w:bCs/>
+          <w:sz w:val="28"/>
+          <w:szCs w:val="28"/>
+          <w:lang w:val="en-US"/>
+        </w:rPr>
+        <w:t>Adham</w:t>
+      </w:r>
+      <w:proofErr w:type="spellEnd"/>
+      <w:r>
+        <w:rPr>
+          <w:b/>
+          <w:bCs/>
+          <w:sz w:val="28"/>
+          <w:szCs w:val="28"/>
+          <w:lang w:val="en-US"/>
+        </w:rPr>
+        <w:t xml:space="preserve"> S. A. Double Gamma Principal Components Analysis // Applied Mathematical Sciences. — 2018.</w:t>
+      </w:r>
+    </w:p>
+    <w:p>
+      <w:pPr>
+        <w:rPr>
+          <w:b/>
+          <w:bCs/>
+          <w:sz w:val="32"/>
+          <w:szCs w:val="32"/>
+        </w:rPr>
+      </w:pPr>
     </w:p>
     <w:sectPr>
       <w:pgSz w:w="11906" w:h="16838"/>
@@ -3587,7 +4086,7 @@
   <w:style w:type="paragraph" w:default="1" w:styleId="a">
     <w:name w:val="Normal"/>
     <w:qFormat/>
-    <w:rsid w:val="005C02E1"/>
+    <w:rsid w:val="008F6500"/>
     <w:pPr>
       <w:spacing w:after="0" w:line="240" w:lineRule="auto"/>
     </w:pPr>

</xml_diff>

<commit_message>
vault backup: 2026-05-06 02:26:28
</commit_message>
<xml_diff>
--- a/Учеба 4 семестр/Теория вероятности/Курсовая работа/Отчет, Код/Курсовая работа.docx
+++ b/Учеба 4 семестр/Теория вероятности/Курсовая работа/Отчет, Код/Курсовая работа.docx
@@ -316,7 +316,6 @@
         </w:rPr>
         <w:tab/>
       </w:r>
-      <w:proofErr w:type="spellStart"/>
       <w:r>
         <w:rPr>
           <w:sz w:val="32"/>
@@ -324,7 +323,6 @@
         </w:rPr>
         <w:t>И.А.Эков</w:t>
       </w:r>
-      <w:proofErr w:type="spellEnd"/>
     </w:p>
     <w:p>
       <w:pPr>
@@ -365,21 +363,12 @@
         </w:rPr>
         <w:t>&lt;</w:t>
       </w:r>
-      <w:proofErr w:type="gramStart"/>
-      <w:r>
-        <w:rPr>
-          <w:sz w:val="32"/>
-          <w:szCs w:val="32"/>
-        </w:rPr>
-        <w:t xml:space="preserve">подпись&gt;   </w:t>
-      </w:r>
-      <w:proofErr w:type="gramEnd"/>
-      <w:r>
-        <w:rPr>
-          <w:sz w:val="32"/>
-          <w:szCs w:val="32"/>
-        </w:rPr>
-        <w:t xml:space="preserve"> </w:t>
+      <w:r>
+        <w:rPr>
+          <w:sz w:val="32"/>
+          <w:szCs w:val="32"/>
+        </w:rPr>
+        <w:t xml:space="preserve">подпись&gt;    </w:t>
       </w:r>
       <w:r>
         <w:rPr>
@@ -388,7 +377,6 @@
         </w:rPr>
         <w:tab/>
       </w:r>
-      <w:proofErr w:type="spellStart"/>
       <w:r>
         <w:rPr>
           <w:sz w:val="32"/>
@@ -396,7 +384,6 @@
         </w:rPr>
         <w:t>Р.А.Ажермачев</w:t>
       </w:r>
-      <w:proofErr w:type="spellEnd"/>
     </w:p>
     <w:p>
       <w:pPr>
@@ -476,7 +463,6 @@
         </w:rPr>
         <w:tab/>
       </w:r>
-      <w:proofErr w:type="spellStart"/>
       <w:r>
         <w:rPr>
           <w:sz w:val="32"/>
@@ -484,7 +470,6 @@
         </w:rPr>
         <w:t>О.А.Пахомова</w:t>
       </w:r>
-      <w:proofErr w:type="spellEnd"/>
     </w:p>
     <w:p>
       <w:pPr>
@@ -885,17 +870,8 @@
           <w:sz w:val="24"/>
           <w:szCs w:val="24"/>
         </w:rPr>
-        <w:t xml:space="preserve">3.2. Реализация на языке Python и анализ </w:t>
-      </w:r>
-      <w:proofErr w:type="spellStart"/>
-      <w:r>
-        <w:rPr>
-          <w:sz w:val="24"/>
-          <w:szCs w:val="24"/>
-        </w:rPr>
-        <w:t>подвыборок</w:t>
-      </w:r>
-      <w:proofErr w:type="spellEnd"/>
+        <w:t>3.2. Реализация на языке Python и анализ подвыборок</w:t>
+      </w:r>
       <w:r>
         <w:rPr>
           <w:sz w:val="24"/>
@@ -989,17 +965,8 @@
           <w:sz w:val="24"/>
           <w:szCs w:val="24"/>
         </w:rPr>
-        <w:t xml:space="preserve">4.2. Реализация на языке Python и анализ </w:t>
-      </w:r>
-      <w:proofErr w:type="spellStart"/>
-      <w:r>
-        <w:rPr>
-          <w:sz w:val="24"/>
-          <w:szCs w:val="24"/>
-        </w:rPr>
-        <w:t>подвыборок</w:t>
-      </w:r>
-      <w:proofErr w:type="spellEnd"/>
+        <w:t>4.2. Реализация на языке Python и анализ подвыборок</w:t>
+      </w:r>
       <w:r>
         <w:rPr>
           <w:sz w:val="24"/>
@@ -1882,23 +1849,7 @@
           <w:sz w:val="28"/>
           <w:szCs w:val="28"/>
         </w:rPr>
-        <w:t xml:space="preserve">Объектом исследования является выборка случайной величины, подчиняющейся </w:t>
-      </w:r>
-      <w:proofErr w:type="gramStart"/>
-      <w:r>
-        <w:rPr>
-          <w:sz w:val="28"/>
-          <w:szCs w:val="28"/>
-        </w:rPr>
-        <w:t>двойному</w:t>
-      </w:r>
-      <w:proofErr w:type="gramEnd"/>
-      <w:r>
-        <w:rPr>
-          <w:sz w:val="28"/>
-          <w:szCs w:val="28"/>
-        </w:rPr>
-        <w:t xml:space="preserve"> гамма распределению. Предметом исследования — статистические свойства данной выборки и методы её анализа.</w:t>
+        <w:t>Объектом исследования является выборка случайной величины, подчиняющейся двойному гамма распределению. Предметом исследования — статистические свойства данной выборки и методы её анализа.</w:t>
       </w:r>
     </w:p>
     <w:p>
@@ -1922,39 +1873,7 @@
           <w:sz w:val="28"/>
           <w:szCs w:val="28"/>
         </w:rPr>
-        <w:t xml:space="preserve">Работа выполнена с использованием языка программирования Python в среде </w:t>
-      </w:r>
-      <w:proofErr w:type="spellStart"/>
-      <w:r>
-        <w:rPr>
-          <w:sz w:val="28"/>
-          <w:szCs w:val="28"/>
-        </w:rPr>
-        <w:t>Jupyter</w:t>
-      </w:r>
-      <w:proofErr w:type="spellEnd"/>
-      <w:r>
-        <w:rPr>
-          <w:sz w:val="28"/>
-          <w:szCs w:val="28"/>
-        </w:rPr>
-        <w:t xml:space="preserve"> </w:t>
-      </w:r>
-      <w:proofErr w:type="spellStart"/>
-      <w:r>
-        <w:rPr>
-          <w:sz w:val="28"/>
-          <w:szCs w:val="28"/>
-        </w:rPr>
-        <w:t>Notebook</w:t>
-      </w:r>
-      <w:proofErr w:type="spellEnd"/>
-      <w:r>
-        <w:rPr>
-          <w:sz w:val="28"/>
-          <w:szCs w:val="28"/>
-        </w:rPr>
-        <w:t>. Все вычисления реализованы самостоятельно, без применения готовых статистических библиотек там, где это оговорено заданием.</w:t>
+        <w:t>Работа выполнена с использованием языка программирования Python в среде Jupyter Notebook. Все вычисления реализованы самостоятельно, без применения готовых статистических библиотек там, где это оговорено заданием.</w:t>
       </w:r>
     </w:p>
     <w:p>
@@ -2156,7 +2075,6 @@
         </w:rPr>
         <w:t xml:space="preserve">Гамма-распределение определено только для неотрицательных значений случайной величины, что ограничивает его применимость при моделировании симметричных процессов. Для преодоления этого ограничения исследователями было предложено его естественное расширение на всю числовую ось — двойное гамма-распределение (также называемое отражённым гамма-распределением, англ. </w:t>
       </w:r>
-      <w:proofErr w:type="spellStart"/>
       <w:r>
         <w:rPr>
           <w:i/>
@@ -2164,230 +2082,153 @@
           <w:sz w:val="28"/>
           <w:szCs w:val="28"/>
         </w:rPr>
-        <w:t>reflected</w:t>
-      </w:r>
-      <w:proofErr w:type="spellEnd"/>
-      <w:r>
-        <w:rPr>
-          <w:i/>
-          <w:iCs/>
+        <w:t>reflected gamma distribution</w:t>
+      </w:r>
+      <w:r>
+        <w:rPr>
+          <w:sz w:val="28"/>
+          <w:szCs w:val="28"/>
+        </w:rPr>
+        <w:t>).</w:t>
+      </w:r>
+    </w:p>
+    <w:p>
+      <w:pPr>
+        <w:rPr>
+          <w:sz w:val="28"/>
+          <w:szCs w:val="28"/>
+          <w:lang w:val="en-US"/>
+        </w:rPr>
+      </w:pPr>
+      <w:r>
+        <w:rPr>
+          <w:sz w:val="28"/>
+          <w:szCs w:val="28"/>
+        </w:rPr>
+        <w:t xml:space="preserve">Основная идея распределения: </w:t>
+      </w:r>
+    </w:p>
+    <w:p>
+      <w:pPr>
+        <w:rPr>
+          <w:sz w:val="28"/>
+          <w:szCs w:val="28"/>
+        </w:rPr>
+      </w:pPr>
+      <w:r>
+        <w:rPr>
+          <w:sz w:val="28"/>
+          <w:szCs w:val="28"/>
+        </w:rPr>
+        <w:t>Е</w:t>
+      </w:r>
+      <w:r>
+        <w:rPr>
+          <w:sz w:val="28"/>
+          <w:szCs w:val="28"/>
+        </w:rPr>
+        <w:t xml:space="preserve">сли </w:t>
+      </w:r>
+      <w:r>
+        <w:rPr>
+          <w:sz w:val="28"/>
+          <w:szCs w:val="28"/>
+          <w:lang w:val="en-US"/>
+        </w:rPr>
+        <w:t>Y</w:t>
+      </w:r>
+      <w:r>
+        <w:rPr>
+          <w:sz w:val="28"/>
+          <w:szCs w:val="28"/>
+        </w:rPr>
+        <w:t xml:space="preserve"> – </w:t>
+      </w:r>
+      <w:r>
+        <w:rPr>
+          <w:sz w:val="28"/>
+          <w:szCs w:val="28"/>
+        </w:rPr>
+        <w:t xml:space="preserve">случайная величина с гамма-распределением, а знак выбирается случайно, то получается случайная величина </w:t>
+      </w:r>
+      <w:r>
+        <w:rPr>
+          <w:sz w:val="28"/>
+          <w:szCs w:val="28"/>
+          <w:lang w:val="en-US"/>
+        </w:rPr>
+        <w:t>X</w:t>
+      </w:r>
+      <w:r>
+        <w:rPr>
+          <w:sz w:val="28"/>
+          <w:szCs w:val="28"/>
+        </w:rPr>
+        <w:t>, имеющая двойное гамма-распределени</w:t>
+      </w:r>
+      <w:r>
+        <w:rPr>
+          <w:sz w:val="28"/>
+          <w:szCs w:val="28"/>
+        </w:rPr>
+        <w:t>е</w:t>
+      </w:r>
+      <w:r>
+        <w:rPr>
+          <w:sz w:val="28"/>
+          <w:szCs w:val="28"/>
+        </w:rPr>
+        <w:t xml:space="preserve">. </w:t>
+      </w:r>
+    </w:p>
+    <w:p>
+      <w:pPr>
+        <w:rPr>
+          <w:sz w:val="28"/>
+          <w:szCs w:val="28"/>
+        </w:rPr>
+      </w:pPr>
+      <w:r>
+        <w:rPr>
+          <w:sz w:val="28"/>
+          <w:szCs w:val="28"/>
+        </w:rPr>
+        <w:t>Плотность такого распределения имеет вид</w:t>
+      </w:r>
+      <w:r>
+        <w:rPr>
           <w:sz w:val="28"/>
           <w:szCs w:val="28"/>
         </w:rPr>
         <w:t xml:space="preserve"> </w:t>
       </w:r>
-      <w:proofErr w:type="spellStart"/>
-      <w:r>
-        <w:rPr>
-          <w:i/>
-          <w:iCs/>
-          <w:sz w:val="28"/>
-          <w:szCs w:val="28"/>
-        </w:rPr>
-        <w:t>gamma</w:t>
-      </w:r>
-      <w:proofErr w:type="spellEnd"/>
-      <w:r>
-        <w:rPr>
-          <w:i/>
-          <w:iCs/>
-          <w:sz w:val="28"/>
-          <w:szCs w:val="28"/>
-        </w:rPr>
-        <w:t xml:space="preserve"> </w:t>
-      </w:r>
-      <w:proofErr w:type="spellStart"/>
-      <w:r>
-        <w:rPr>
-          <w:i/>
-          <w:iCs/>
-          <w:sz w:val="28"/>
-          <w:szCs w:val="28"/>
-        </w:rPr>
-        <w:t>distribution</w:t>
-      </w:r>
-      <w:proofErr w:type="spellEnd"/>
-      <w:r>
-        <w:rPr>
-          <w:sz w:val="28"/>
-          <w:szCs w:val="28"/>
-        </w:rPr>
-        <w:t>).</w:t>
-      </w:r>
-    </w:p>
-    <w:p>
-      <w:pPr>
-        <w:rPr>
-          <w:sz w:val="28"/>
-          <w:szCs w:val="28"/>
-        </w:rPr>
-      </w:pPr>
-      <w:r>
-        <w:rPr>
-          <w:sz w:val="28"/>
-          <w:szCs w:val="28"/>
-        </w:rPr>
-        <w:t>Фактически оно строится следующим образом: б</w:t>
-      </w:r>
-      <w:r>
-        <w:rPr>
-          <w:sz w:val="28"/>
-          <w:szCs w:val="28"/>
-        </w:rPr>
-        <w:t>ерется гамма-распределенная величина, знак которой выбирается случайно</w:t>
-      </w:r>
-      <w:r>
-        <w:rPr>
-          <w:sz w:val="28"/>
-          <w:szCs w:val="28"/>
-        </w:rPr>
-        <w:t>.</w:t>
-      </w:r>
-    </w:p>
-    <w:p>
-      <w:pPr>
-        <w:rPr>
-          <w:sz w:val="28"/>
-          <w:szCs w:val="28"/>
-        </w:rPr>
-      </w:pPr>
-      <w:r>
-        <w:rPr>
-          <w:sz w:val="28"/>
-          <w:szCs w:val="28"/>
-        </w:rPr>
-        <w:t xml:space="preserve">Таким образом, распределение становится симметричным относительно начала координат. </w:t>
-      </w:r>
-    </w:p>
-    <w:p>
-      <w:pPr>
-        <w:rPr>
-          <w:sz w:val="28"/>
-          <w:szCs w:val="28"/>
-        </w:rPr>
-      </w:pPr>
-      <w:r>
-        <w:rPr>
-          <w:sz w:val="28"/>
-          <w:szCs w:val="28"/>
-        </w:rPr>
-        <w:t xml:space="preserve">Основная идея распределения: </w:t>
-      </w:r>
-    </w:p>
-    <w:p>
-      <w:pPr>
-        <w:rPr>
-          <w:sz w:val="28"/>
-          <w:szCs w:val="28"/>
-        </w:rPr>
-      </w:pPr>
-      <w:r>
-        <w:rPr>
-          <w:sz w:val="28"/>
-          <w:szCs w:val="28"/>
-        </w:rPr>
-        <w:t>Говорят, что, е</w:t>
-      </w:r>
-      <w:r>
-        <w:rPr>
-          <w:sz w:val="28"/>
-          <w:szCs w:val="28"/>
-        </w:rPr>
-        <w:t xml:space="preserve">сли </w:t>
-      </w:r>
-      <w:r>
-        <w:rPr>
-          <w:sz w:val="28"/>
-          <w:szCs w:val="28"/>
-          <w:lang w:val="en-US"/>
-        </w:rPr>
-        <w:t>Y</w:t>
-      </w:r>
-      <w:r>
-        <w:rPr>
-          <w:sz w:val="28"/>
-          <w:szCs w:val="28"/>
-        </w:rPr>
-        <w:t xml:space="preserve"> – </w:t>
-      </w:r>
-      <w:r>
-        <w:rPr>
-          <w:sz w:val="28"/>
-          <w:szCs w:val="28"/>
-        </w:rPr>
-        <w:t xml:space="preserve">случайная величина с гамма-распределением, а знак выбирается случайно, то получается случайная величина </w:t>
-      </w:r>
-      <w:r>
-        <w:rPr>
-          <w:sz w:val="28"/>
-          <w:szCs w:val="28"/>
-          <w:lang w:val="en-US"/>
-        </w:rPr>
-        <w:t>X</w:t>
-      </w:r>
-      <w:r>
-        <w:rPr>
-          <w:sz w:val="28"/>
-          <w:szCs w:val="28"/>
-        </w:rPr>
-        <w:t>, имеющая двойное гамма-распределение</w:t>
-      </w:r>
-      <w:r>
-        <w:rPr>
-          <w:sz w:val="28"/>
-          <w:szCs w:val="28"/>
-        </w:rPr>
-        <w:t xml:space="preserve"> [</w:t>
-      </w:r>
-      <w:r>
-        <w:rPr>
-          <w:sz w:val="28"/>
-          <w:szCs w:val="28"/>
-        </w:rPr>
-        <w:t>2</w:t>
-      </w:r>
-      <w:r>
-        <w:rPr>
-          <w:sz w:val="28"/>
-          <w:szCs w:val="28"/>
-        </w:rPr>
-        <w:t xml:space="preserve">, </w:t>
-      </w:r>
-      <w:r>
-        <w:rPr>
-          <w:sz w:val="28"/>
-          <w:szCs w:val="28"/>
-        </w:rPr>
-        <w:t>с.</w:t>
-      </w:r>
-      <w:r>
-        <w:rPr>
-          <w:sz w:val="28"/>
-          <w:szCs w:val="28"/>
-        </w:rPr>
-        <w:t xml:space="preserve"> 111]</w:t>
-      </w:r>
-      <w:r>
-        <w:rPr>
-          <w:sz w:val="28"/>
-          <w:szCs w:val="28"/>
-        </w:rPr>
-        <w:t xml:space="preserve">. </w:t>
-      </w:r>
-    </w:p>
-    <w:p>
-      <w:pPr>
-        <w:rPr>
-          <w:sz w:val="28"/>
-          <w:szCs w:val="28"/>
-        </w:rPr>
-      </w:pPr>
-      <w:r>
-        <w:rPr>
-          <w:sz w:val="28"/>
-          <w:szCs w:val="28"/>
-        </w:rPr>
-        <w:t xml:space="preserve">Плотность такого распределения имеет вид: </w:t>
+      <w:r>
+        <w:rPr>
+          <w:sz w:val="28"/>
+          <w:szCs w:val="28"/>
+        </w:rPr>
+        <w:t>[</w:t>
+      </w:r>
+      <w:r>
+        <w:rPr>
+          <w:sz w:val="28"/>
+          <w:szCs w:val="28"/>
+        </w:rPr>
+        <w:t>3</w:t>
+      </w:r>
+      <w:r>
+        <w:rPr>
+          <w:sz w:val="28"/>
+          <w:szCs w:val="28"/>
+        </w:rPr>
+        <w:t>]</w:t>
+      </w:r>
+      <w:r>
+        <w:rPr>
+          <w:sz w:val="28"/>
+          <w:szCs w:val="28"/>
+        </w:rPr>
+        <w:t xml:space="preserve">: </w:t>
       </w:r>
       <w:r>
         <w:rPr>
@@ -2604,7 +2445,6 @@
         </w:rPr>
         <w:t xml:space="preserve">•  </w:t>
       </w:r>
-      <w:proofErr w:type="gramStart"/>
       <w:r>
         <w:rPr>
           <w:i/>
@@ -2619,15 +2459,7 @@
           <w:sz w:val="28"/>
           <w:szCs w:val="28"/>
         </w:rPr>
-        <w:t xml:space="preserve"> &gt;</w:t>
-      </w:r>
-      <w:proofErr w:type="gramEnd"/>
-      <w:r>
-        <w:rPr>
-          <w:sz w:val="28"/>
-          <w:szCs w:val="28"/>
-        </w:rPr>
-        <w:t xml:space="preserve"> 0 — параметр формы,</w:t>
+        <w:t xml:space="preserve"> &gt; 0 — параметр формы,</w:t>
       </w:r>
     </w:p>
     <w:p>
@@ -2645,7 +2477,6 @@
         </w:rPr>
         <w:t xml:space="preserve">•  </w:t>
       </w:r>
-      <w:proofErr w:type="gramStart"/>
       <w:r>
         <w:rPr>
           <w:i/>
@@ -2660,15 +2491,7 @@
           <w:sz w:val="28"/>
           <w:szCs w:val="28"/>
         </w:rPr>
-        <w:t xml:space="preserve"> &gt;</w:t>
-      </w:r>
-      <w:proofErr w:type="gramEnd"/>
-      <w:r>
-        <w:rPr>
-          <w:sz w:val="28"/>
-          <w:szCs w:val="28"/>
-        </w:rPr>
-        <w:t xml:space="preserve"> 0 — параметр масштаба,</w:t>
+        <w:t xml:space="preserve"> &gt; 0 — параметр масштаба,</w:t>
       </w:r>
     </w:p>
     <w:p>
@@ -2685,68 +2508,77 @@
         </w:rPr>
         <w:t xml:space="preserve">•  </w:t>
       </w:r>
-      <w:proofErr w:type="gramStart"/>
       <w:r>
         <w:rPr>
           <w:i/>
           <w:iCs/>
           <w:sz w:val="28"/>
           <w:szCs w:val="28"/>
-          <w:lang w:val="en-US"/>
-        </w:rPr>
-        <w:t>loc</w:t>
-      </w:r>
-      <w:r>
-        <w:rPr>
-          <w:sz w:val="28"/>
-          <w:szCs w:val="28"/>
-        </w:rPr>
-        <w:t xml:space="preserve"> &gt;</w:t>
-      </w:r>
-      <w:proofErr w:type="gramEnd"/>
-      <w:r>
-        <w:rPr>
-          <w:sz w:val="28"/>
-          <w:szCs w:val="28"/>
-        </w:rPr>
-        <w:t xml:space="preserve"> 0 — параметр </w:t>
-      </w:r>
-      <w:r>
-        <w:rPr>
-          <w:sz w:val="28"/>
-          <w:szCs w:val="28"/>
-        </w:rPr>
-        <w:t>смещения</w:t>
-      </w:r>
-      <w:r>
-        <w:rPr>
-          <w:sz w:val="28"/>
-          <w:szCs w:val="28"/>
-        </w:rPr>
-        <w:t>,</w:t>
-      </w:r>
-    </w:p>
-    <w:p>
-      <w:pPr>
-        <w:rPr>
-          <w:sz w:val="28"/>
-          <w:szCs w:val="28"/>
-        </w:rPr>
-      </w:pPr>
-      <w:r>
-        <w:rPr>
-          <w:sz w:val="28"/>
-          <w:szCs w:val="28"/>
-        </w:rPr>
-        <w:t xml:space="preserve">•  </w:t>
-      </w:r>
-      <w:r>
-        <w:rPr>
+        </w:rPr>
+        <w:t xml:space="preserve">loc </w:t>
+      </w:r>
+      <w:r>
+        <w:rPr>
+          <w:rFonts w:ascii="Cambria Math" w:hAnsi="Cambria Math" w:cs="Cambria Math"/>
           <w:i/>
           <w:iCs/>
           <w:sz w:val="28"/>
           <w:szCs w:val="28"/>
         </w:rPr>
+        <w:t>∈</w:t>
+      </w:r>
+      <w:r>
+        <w:rPr>
+          <w:i/>
+          <w:iCs/>
+          <w:sz w:val="28"/>
+          <w:szCs w:val="28"/>
+        </w:rPr>
+        <w:t xml:space="preserve"> ℝ</w:t>
+      </w:r>
+      <w:r>
+        <w:rPr>
+          <w:sz w:val="28"/>
+          <w:szCs w:val="28"/>
+        </w:rPr>
+        <w:t xml:space="preserve">— параметр </w:t>
+      </w:r>
+      <w:r>
+        <w:rPr>
+          <w:sz w:val="28"/>
+          <w:szCs w:val="28"/>
+        </w:rPr>
+        <w:t>смещения</w:t>
+      </w:r>
+      <w:r>
+        <w:rPr>
+          <w:sz w:val="28"/>
+          <w:szCs w:val="28"/>
+        </w:rPr>
+        <w:t>,</w:t>
+      </w:r>
+    </w:p>
+    <w:p>
+      <w:pPr>
+        <w:rPr>
+          <w:sz w:val="28"/>
+          <w:szCs w:val="28"/>
+        </w:rPr>
+      </w:pPr>
+      <w:r>
+        <w:rPr>
+          <w:sz w:val="28"/>
+          <w:szCs w:val="28"/>
+        </w:rPr>
+        <w:t xml:space="preserve">•  </w:t>
+      </w:r>
+      <w:r>
+        <w:rPr>
+          <w:i/>
+          <w:iCs/>
+          <w:sz w:val="28"/>
+          <w:szCs w:val="28"/>
+        </w:rPr>
         <w:t>Γ(α)</w:t>
       </w:r>
       <w:r>
@@ -2768,21 +2600,7 @@
           <w:sz w:val="28"/>
           <w:szCs w:val="28"/>
         </w:rPr>
-        <w:t>2</w:t>
-      </w:r>
-      <w:r>
-        <w:rPr>
-          <w:sz w:val="28"/>
-          <w:szCs w:val="28"/>
-        </w:rPr>
-        <w:t xml:space="preserve">, </w:t>
-      </w:r>
-      <w:r>
-        <w:rPr>
-          <w:sz w:val="28"/>
-          <w:szCs w:val="28"/>
-        </w:rPr>
-        <w:t>с 112</w:t>
+        <w:t>3</w:t>
       </w:r>
       <w:r>
         <w:rPr>
@@ -2900,55 +2718,7 @@
           <w:sz w:val="28"/>
           <w:szCs w:val="28"/>
         </w:rPr>
-        <w:t xml:space="preserve"> что двойное гамма-распределение не является специализированным инструментом информационной безопасности, его свойства находят применение в ряде смежных задач. В частности, как показано в работе </w:t>
-      </w:r>
-      <w:proofErr w:type="spellStart"/>
-      <w:r>
-        <w:rPr>
-          <w:sz w:val="28"/>
-          <w:szCs w:val="28"/>
-        </w:rPr>
-        <w:t>Bahashwan</w:t>
-      </w:r>
-      <w:proofErr w:type="spellEnd"/>
-      <w:r>
-        <w:rPr>
-          <w:sz w:val="28"/>
-          <w:szCs w:val="28"/>
-        </w:rPr>
-        <w:t xml:space="preserve">, </w:t>
-      </w:r>
-      <w:proofErr w:type="spellStart"/>
-      <w:r>
-        <w:rPr>
-          <w:sz w:val="28"/>
-          <w:szCs w:val="28"/>
-        </w:rPr>
-        <w:t>Kalantan</w:t>
-      </w:r>
-      <w:proofErr w:type="spellEnd"/>
-      <w:r>
-        <w:rPr>
-          <w:sz w:val="28"/>
-          <w:szCs w:val="28"/>
-        </w:rPr>
-        <w:t xml:space="preserve"> и </w:t>
-      </w:r>
-      <w:proofErr w:type="spellStart"/>
-      <w:r>
-        <w:rPr>
-          <w:sz w:val="28"/>
-          <w:szCs w:val="28"/>
-        </w:rPr>
-        <w:t>Adham</w:t>
-      </w:r>
-      <w:proofErr w:type="spellEnd"/>
-      <w:r>
-        <w:rPr>
-          <w:sz w:val="28"/>
-          <w:szCs w:val="28"/>
-        </w:rPr>
-        <w:t xml:space="preserve"> [</w:t>
+        <w:t xml:space="preserve"> что двойное гамма-распределение не является специализированным инструментом информационной безопасности, его свойства находят применение в ряде смежных задач. В частности, как показано в работе Bahashwan, Kalantan и Adham [</w:t>
       </w:r>
       <w:r>
         <w:rPr>
@@ -2962,7 +2732,7 @@
           <w:sz w:val="28"/>
           <w:szCs w:val="28"/>
         </w:rPr>
-        <w:t xml:space="preserve">], метод главных компонент (PCA), основанный на двойном гамма-распределении для моделирования шума, демонстрирует повышенную устойчивость к выбросам </w:t>
+        <w:t xml:space="preserve">], метод главных компонент (PCA), основанный на двойном гамма-распределении для моделирования шума, демонстрирует повышенную устойчивость к выбросам по сравнению с классическим гауссовским PCA. Данное свойство актуально при анализе сетевого трафика, где наблюдаемые данные, как правило, содержат выбросы и нештатные значения, характерные для атак типа DoS или аномального поведения пользователей. Применение устойчивых к шуму </w:t>
       </w:r>
       <w:r>
         <w:rPr>
@@ -2970,23 +2740,7 @@
           <w:szCs w:val="28"/>
         </w:rPr>
         <w:lastRenderedPageBreak/>
-        <w:t xml:space="preserve">по сравнению с классическим гауссовским PCA. Данное свойство актуально при анализе сетевого трафика, где наблюдаемые данные, как правило, содержат выбросы и нештатные значения, характерные для атак типа </w:t>
-      </w:r>
-      <w:proofErr w:type="spellStart"/>
-      <w:r>
-        <w:rPr>
-          <w:sz w:val="28"/>
-          <w:szCs w:val="28"/>
-        </w:rPr>
-        <w:t>DoS</w:t>
-      </w:r>
-      <w:proofErr w:type="spellEnd"/>
-      <w:r>
-        <w:rPr>
-          <w:sz w:val="28"/>
-          <w:szCs w:val="28"/>
-        </w:rPr>
-        <w:t xml:space="preserve"> или аномального поведения пользователей. Применение устойчивых к шуму и выбросам методов снижения размерности позволяет выделять информативные признаки из зашумлённых данных, что является одним из ключевых этапов в системах обнаружения вторжений (IDS). Таким образом, двойное гамма-распределение представляет интерес как статистическая основа для построения устойчивых к шуму алгоритмов анализа данных в задачах информационной безопасности.</w:t>
+        <w:t>и выбросам методов снижения размерности позволяет выделять информативные признаки из зашумлённых данных, что является одним из ключевых этапов в системах обнаружения вторжений (IDS). Таким образом, двойное гамма-распределение представляет интерес как статистическая основа для построения устойчивых к шуму алгоритмов анализа данных в задачах информационной безопасности.</w:t>
       </w:r>
     </w:p>
     <w:p>
@@ -3092,18 +2846,27 @@
           <w:bCs/>
           <w:sz w:val="28"/>
           <w:szCs w:val="28"/>
+        </w:rPr>
+      </w:pPr>
+      <w:r>
+        <w:rPr>
+          <w:b/>
+          <w:bCs/>
+          <w:sz w:val="28"/>
+          <w:szCs w:val="28"/>
           <w:lang w:val="en-US"/>
         </w:rPr>
-      </w:pPr>
-      <w:r>
-        <w:rPr>
-          <w:b/>
-          <w:bCs/>
-          <w:sz w:val="32"/>
-          <w:szCs w:val="32"/>
+        <w:t xml:space="preserve">[1] Pearson K. Tables of the Incomplete Gamma-Function / computed by the staff of the Department of Applied Statistics, University of London. — </w:t>
+      </w:r>
+      <w:r>
+        <w:rPr>
+          <w:b/>
+          <w:bCs/>
+          <w:sz w:val="28"/>
+          <w:szCs w:val="28"/>
           <w:lang w:val="en-US"/>
         </w:rPr>
-        <w:t xml:space="preserve">[1] </w:t>
+        <w:t>London:</w:t>
       </w:r>
       <w:r>
         <w:rPr>
@@ -3113,8 +2876,21 @@
           <w:szCs w:val="28"/>
           <w:lang w:val="en-US"/>
         </w:rPr>
-        <w:t>Pearson K. Tables of the Incomplete Gamma-Function / computed by the staff of the Department of Applied Statistics, University of London</w:t>
-      </w:r>
+        <w:t xml:space="preserve"> University of London, 1922. — URL: </w:t>
+      </w:r>
+      <w:hyperlink r:id="rId6" w:history="1">
+        <w:r>
+          <w:rPr>
+            <w:rStyle w:val="ac"/>
+            <w:b/>
+            <w:bCs/>
+            <w:sz w:val="28"/>
+            <w:szCs w:val="28"/>
+            <w:lang w:val="en-US"/>
+          </w:rPr>
+          <w:t>https://archive.org/details/tablesofincomple00pearrich</w:t>
+        </w:r>
+      </w:hyperlink>
       <w:r>
         <w:rPr>
           <w:b/>
@@ -3123,11 +2899,18 @@
           <w:szCs w:val="28"/>
           <w:lang w:val="en-US"/>
         </w:rPr>
-        <w:t>.</w:t>
-      </w:r>
-    </w:p>
-    <w:p>
-      <w:pPr>
+        <w:t xml:space="preserve"> (</w:t>
+      </w:r>
+      <w:r>
+        <w:rPr>
+          <w:b/>
+          <w:bCs/>
+          <w:sz w:val="28"/>
+          <w:szCs w:val="28"/>
+        </w:rPr>
+        <w:t>дата</w:t>
+      </w:r>
+      <w:r>
         <w:rPr>
           <w:b/>
           <w:bCs/>
@@ -3135,7 +2918,17 @@
           <w:szCs w:val="28"/>
           <w:lang w:val="en-US"/>
         </w:rPr>
-      </w:pPr>
+        <w:t xml:space="preserve"> </w:t>
+      </w:r>
+      <w:r>
+        <w:rPr>
+          <w:b/>
+          <w:bCs/>
+          <w:sz w:val="28"/>
+          <w:szCs w:val="28"/>
+        </w:rPr>
+        <w:t>обращения</w:t>
+      </w:r>
       <w:r>
         <w:rPr>
           <w:b/>
@@ -3144,8 +2937,28 @@
           <w:szCs w:val="28"/>
           <w:lang w:val="en-US"/>
         </w:rPr>
-        <w:t xml:space="preserve">[2] </w:t>
-      </w:r>
+        <w:t>: 06.05.2026).</w:t>
+      </w:r>
+    </w:p>
+    <w:p>
+      <w:pPr>
+        <w:rPr>
+          <w:b/>
+          <w:bCs/>
+          <w:sz w:val="28"/>
+          <w:szCs w:val="28"/>
+        </w:rPr>
+      </w:pPr>
+    </w:p>
+    <w:p>
+      <w:pPr>
+        <w:rPr>
+          <w:b/>
+          <w:bCs/>
+          <w:sz w:val="28"/>
+          <w:szCs w:val="28"/>
+        </w:rPr>
+      </w:pPr>
       <w:r>
         <w:rPr>
           <w:b/>
@@ -3154,18 +2967,8 @@
           <w:szCs w:val="28"/>
           <w:lang w:val="en-US"/>
         </w:rPr>
-        <w:t>Bain L. J., Engelhardt M. Introduction to Probability and Mathematical Statistics.</w:t>
-      </w:r>
-    </w:p>
-    <w:p>
-      <w:pPr>
-        <w:rPr>
-          <w:b/>
-          <w:bCs/>
-          <w:sz w:val="28"/>
-          <w:szCs w:val="28"/>
-        </w:rPr>
-      </w:pPr>
+        <w:t xml:space="preserve">[2] Bain L. J., Engelhardt M. Introduction to Probability and Mathematical Statistics. — 2nd ed. — </w:t>
+      </w:r>
       <w:r>
         <w:rPr>
           <w:b/>
@@ -3174,7 +2977,7 @@
           <w:szCs w:val="28"/>
           <w:lang w:val="en-US"/>
         </w:rPr>
-        <w:t>[3]</w:t>
+        <w:t>Belmont:</w:t>
       </w:r>
       <w:r>
         <w:rPr>
@@ -3184,10 +2987,21 @@
           <w:szCs w:val="28"/>
           <w:lang w:val="en-US"/>
         </w:rPr>
-        <w:t xml:space="preserve"> </w:t>
-      </w:r>
-      <w:proofErr w:type="spellStart"/>
-      <w:r>
+        <w:t xml:space="preserve"> Brooks/Cole, 1992. — 644 p.</w:t>
+      </w:r>
+    </w:p>
+    <w:p>
+      <w:pPr>
+        <w:rPr>
+          <w:b/>
+          <w:bCs/>
+          <w:sz w:val="28"/>
+          <w:szCs w:val="28"/>
+        </w:rPr>
+      </w:pPr>
+    </w:p>
+    <w:p>
+      <w:pPr>
         <w:rPr>
           <w:b/>
           <w:bCs/>
@@ -3195,9 +3009,7 @@
           <w:szCs w:val="28"/>
           <w:lang w:val="en-US"/>
         </w:rPr>
-        <w:t>Bahashwan</w:t>
-      </w:r>
-      <w:proofErr w:type="spellEnd"/>
+      </w:pPr>
       <w:r>
         <w:rPr>
           <w:b/>
@@ -3206,60 +3018,17 @@
           <w:szCs w:val="28"/>
           <w:lang w:val="en-US"/>
         </w:rPr>
-        <w:t xml:space="preserve"> A. O., </w:t>
-      </w:r>
-      <w:proofErr w:type="spellStart"/>
-      <w:r>
-        <w:rPr>
-          <w:b/>
-          <w:bCs/>
-          <w:sz w:val="28"/>
-          <w:szCs w:val="28"/>
+        <w:t>[3] Bahashwan A. O., Kalantan Z. I., Adham S. A. Double Gamma Principal Components Analysis // Applied Mathematical Sciences. — 2018. — Vol. 12, № 11. — P. 523–533. — DOI: 10.12988/ams.2018.8455.</w:t>
+      </w:r>
+    </w:p>
+    <w:p>
+      <w:pPr>
+        <w:rPr>
+          <w:b/>
+          <w:bCs/>
+          <w:sz w:val="32"/>
+          <w:szCs w:val="32"/>
           <w:lang w:val="en-US"/>
-        </w:rPr>
-        <w:t>Kalantan</w:t>
-      </w:r>
-      <w:proofErr w:type="spellEnd"/>
-      <w:r>
-        <w:rPr>
-          <w:b/>
-          <w:bCs/>
-          <w:sz w:val="28"/>
-          <w:szCs w:val="28"/>
-          <w:lang w:val="en-US"/>
-        </w:rPr>
-        <w:t xml:space="preserve"> Z. I., </w:t>
-      </w:r>
-      <w:proofErr w:type="spellStart"/>
-      <w:r>
-        <w:rPr>
-          <w:b/>
-          <w:bCs/>
-          <w:sz w:val="28"/>
-          <w:szCs w:val="28"/>
-          <w:lang w:val="en-US"/>
-        </w:rPr>
-        <w:t>Adham</w:t>
-      </w:r>
-      <w:proofErr w:type="spellEnd"/>
-      <w:r>
-        <w:rPr>
-          <w:b/>
-          <w:bCs/>
-          <w:sz w:val="28"/>
-          <w:szCs w:val="28"/>
-          <w:lang w:val="en-US"/>
-        </w:rPr>
-        <w:t xml:space="preserve"> S. A. Double Gamma Principal Components Analysis // Applied Mathematical Sciences. — 2018.</w:t>
-      </w:r>
-    </w:p>
-    <w:p>
-      <w:pPr>
-        <w:rPr>
-          <w:b/>
-          <w:bCs/>
-          <w:sz w:val="32"/>
-          <w:szCs w:val="32"/>
         </w:rPr>
       </w:pPr>
     </w:p>
@@ -4612,6 +4381,29 @@
       <w:spacing w:val="5"/>
     </w:rPr>
   </w:style>
+  <w:style w:type="character" w:styleId="ac">
+    <w:name w:val="Hyperlink"/>
+    <w:basedOn w:val="a0"/>
+    <w:uiPriority w:val="99"/>
+    <w:unhideWhenUsed/>
+    <w:rsid w:val="00B764C0"/>
+    <w:rPr>
+      <w:color w:val="467886" w:themeColor="hyperlink"/>
+      <w:u w:val="single"/>
+    </w:rPr>
+  </w:style>
+  <w:style w:type="character" w:styleId="ad">
+    <w:name w:val="Unresolved Mention"/>
+    <w:basedOn w:val="a0"/>
+    <w:uiPriority w:val="99"/>
+    <w:semiHidden/>
+    <w:unhideWhenUsed/>
+    <w:rsid w:val="00B764C0"/>
+    <w:rPr>
+      <w:color w:val="605E5C"/>
+      <w:shd w:val="clear" w:color="auto" w:fill="E1DFDD"/>
+    </w:rPr>
+  </w:style>
 </w:styles>
 </file>
 

</xml_diff>

<commit_message>
vault backup: 2026-05-06 05:04:21
</commit_message>
<xml_diff>
--- a/Учеба 4 семестр/Теория вероятности/Курсовая работа/Отчет, Код/Курсовая работа.docx
+++ b/Учеба 4 семестр/Теория вероятности/Курсовая работа/Отчет, Код/Курсовая работа.docx
@@ -32,15 +32,7 @@
           <w:szCs w:val="36"/>
           <w:u w:val="single"/>
         </w:rPr>
-        <w:t xml:space="preserve">Институт </w:t>
-      </w:r>
-      <w:r>
-        <w:rPr>
-          <w:sz w:val="36"/>
-          <w:szCs w:val="36"/>
-          <w:u w:val="single"/>
-        </w:rPr>
-        <w:t>компьютерных наук и кибербезопасности</w:t>
+        <w:t>Институт компьютерных наук и кибербезопасности</w:t>
       </w:r>
     </w:p>
     <w:p>
@@ -59,27 +51,7 @@
           <w:szCs w:val="36"/>
           <w:u w:val="single"/>
         </w:rPr>
-        <w:t>Кафедра «</w:t>
-      </w:r>
-      <w:r>
-        <w:rPr>
-          <w:b/>
-          <w:bCs/>
-          <w:sz w:val="36"/>
-          <w:szCs w:val="36"/>
-          <w:u w:val="single"/>
-        </w:rPr>
-        <w:t>Информационная безопасность компьютерных систем</w:t>
-      </w:r>
-      <w:r>
-        <w:rPr>
-          <w:b/>
-          <w:bCs/>
-          <w:sz w:val="36"/>
-          <w:szCs w:val="36"/>
-          <w:u w:val="single"/>
-        </w:rPr>
-        <w:t>»</w:t>
+        <w:t>Кафедра «Информационная безопасность компьютерных систем»</w:t>
       </w:r>
     </w:p>
     <w:p>
@@ -316,6 +288,7 @@
         </w:rPr>
         <w:tab/>
       </w:r>
+      <w:proofErr w:type="spellStart"/>
       <w:r>
         <w:rPr>
           <w:sz w:val="32"/>
@@ -323,6 +296,7 @@
         </w:rPr>
         <w:t>И.А.Эков</w:t>
       </w:r>
+      <w:proofErr w:type="spellEnd"/>
     </w:p>
     <w:p>
       <w:pPr>
@@ -363,12 +337,21 @@
         </w:rPr>
         <w:t>&lt;</w:t>
       </w:r>
-      <w:r>
-        <w:rPr>
-          <w:sz w:val="32"/>
-          <w:szCs w:val="32"/>
-        </w:rPr>
-        <w:t xml:space="preserve">подпись&gt;    </w:t>
+      <w:proofErr w:type="gramStart"/>
+      <w:r>
+        <w:rPr>
+          <w:sz w:val="32"/>
+          <w:szCs w:val="32"/>
+        </w:rPr>
+        <w:t xml:space="preserve">подпись&gt;   </w:t>
+      </w:r>
+      <w:proofErr w:type="gramEnd"/>
+      <w:r>
+        <w:rPr>
+          <w:sz w:val="32"/>
+          <w:szCs w:val="32"/>
+        </w:rPr>
+        <w:t xml:space="preserve"> </w:t>
       </w:r>
       <w:r>
         <w:rPr>
@@ -377,6 +360,7 @@
         </w:rPr>
         <w:tab/>
       </w:r>
+      <w:proofErr w:type="spellStart"/>
       <w:r>
         <w:rPr>
           <w:sz w:val="32"/>
@@ -384,6 +368,7 @@
         </w:rPr>
         <w:t>Р.А.Ажермачев</w:t>
       </w:r>
+      <w:proofErr w:type="spellEnd"/>
     </w:p>
     <w:p>
       <w:pPr>
@@ -463,6 +448,7 @@
         </w:rPr>
         <w:tab/>
       </w:r>
+      <w:proofErr w:type="spellStart"/>
       <w:r>
         <w:rPr>
           <w:sz w:val="32"/>
@@ -470,6 +456,7 @@
         </w:rPr>
         <w:t>О.А.Пахомова</w:t>
       </w:r>
+      <w:proofErr w:type="spellEnd"/>
     </w:p>
     <w:p>
       <w:pPr>
@@ -759,7 +746,13 @@
           <w:szCs w:val="24"/>
         </w:rPr>
         <w:tab/>
-        <w:t>12</w:t>
+      </w:r>
+      <w:r>
+        <w:rPr>
+          <w:sz w:val="24"/>
+          <w:szCs w:val="24"/>
+        </w:rPr>
+        <w:t>5</w:t>
       </w:r>
     </w:p>
     <w:p>
@@ -783,7 +776,13 @@
           <w:szCs w:val="24"/>
         </w:rPr>
         <w:tab/>
-        <w:t>12</w:t>
+      </w:r>
+      <w:r>
+        <w:rPr>
+          <w:sz w:val="24"/>
+          <w:szCs w:val="24"/>
+        </w:rPr>
+        <w:t>5</w:t>
       </w:r>
     </w:p>
     <w:p>
@@ -870,8 +869,17 @@
           <w:sz w:val="24"/>
           <w:szCs w:val="24"/>
         </w:rPr>
-        <w:t>3.2. Реализация на языке Python и анализ подвыборок</w:t>
-      </w:r>
+        <w:t xml:space="preserve">3.2. Реализация на языке Python и анализ </w:t>
+      </w:r>
+      <w:proofErr w:type="spellStart"/>
+      <w:r>
+        <w:rPr>
+          <w:sz w:val="24"/>
+          <w:szCs w:val="24"/>
+        </w:rPr>
+        <w:t>подвыборок</w:t>
+      </w:r>
+      <w:proofErr w:type="spellEnd"/>
       <w:r>
         <w:rPr>
           <w:sz w:val="24"/>
@@ -965,8 +973,17 @@
           <w:sz w:val="24"/>
           <w:szCs w:val="24"/>
         </w:rPr>
-        <w:t>4.2. Реализация на языке Python и анализ подвыборок</w:t>
-      </w:r>
+        <w:t xml:space="preserve">4.2. Реализация на языке Python и анализ </w:t>
+      </w:r>
+      <w:proofErr w:type="spellStart"/>
+      <w:r>
+        <w:rPr>
+          <w:sz w:val="24"/>
+          <w:szCs w:val="24"/>
+        </w:rPr>
+        <w:t>подвыборок</w:t>
+      </w:r>
+      <w:proofErr w:type="spellEnd"/>
       <w:r>
         <w:rPr>
           <w:sz w:val="24"/>
@@ -1682,14 +1699,7 @@
           <w:sz w:val="28"/>
           <w:szCs w:val="28"/>
         </w:rPr>
-        <w:t>Р</w:t>
-      </w:r>
-      <w:r>
-        <w:rPr>
-          <w:sz w:val="28"/>
-          <w:szCs w:val="28"/>
-        </w:rPr>
-        <w:t>еализовать функции вычисления основных статистик выборки</w:t>
+        <w:t>Реализовать функции вычисления основных статистик выборки</w:t>
       </w:r>
       <w:r>
         <w:rPr>
@@ -1849,7 +1859,23 @@
           <w:sz w:val="28"/>
           <w:szCs w:val="28"/>
         </w:rPr>
-        <w:t>Объектом исследования является выборка случайной величины, подчиняющейся двойному гамма распределению. Предметом исследования — статистические свойства данной выборки и методы её анализа.</w:t>
+        <w:t xml:space="preserve">Объектом исследования является выборка случайной величины, подчиняющейся </w:t>
+      </w:r>
+      <w:proofErr w:type="gramStart"/>
+      <w:r>
+        <w:rPr>
+          <w:sz w:val="28"/>
+          <w:szCs w:val="28"/>
+        </w:rPr>
+        <w:t>двойному</w:t>
+      </w:r>
+      <w:proofErr w:type="gramEnd"/>
+      <w:r>
+        <w:rPr>
+          <w:sz w:val="28"/>
+          <w:szCs w:val="28"/>
+        </w:rPr>
+        <w:t xml:space="preserve"> гамма распределению. Предметом исследования — статистические свойства данной выборки и методы её анализа.</w:t>
       </w:r>
     </w:p>
     <w:p>
@@ -1873,7 +1899,39 @@
           <w:sz w:val="28"/>
           <w:szCs w:val="28"/>
         </w:rPr>
-        <w:t>Работа выполнена с использованием языка программирования Python в среде Jupyter Notebook. Все вычисления реализованы самостоятельно, без применения готовых статистических библиотек там, где это оговорено заданием.</w:t>
+        <w:t xml:space="preserve">Работа выполнена с использованием языка программирования Python в среде </w:t>
+      </w:r>
+      <w:proofErr w:type="spellStart"/>
+      <w:r>
+        <w:rPr>
+          <w:sz w:val="28"/>
+          <w:szCs w:val="28"/>
+        </w:rPr>
+        <w:t>Jupyter</w:t>
+      </w:r>
+      <w:proofErr w:type="spellEnd"/>
+      <w:r>
+        <w:rPr>
+          <w:sz w:val="28"/>
+          <w:szCs w:val="28"/>
+        </w:rPr>
+        <w:t xml:space="preserve"> </w:t>
+      </w:r>
+      <w:proofErr w:type="spellStart"/>
+      <w:r>
+        <w:rPr>
+          <w:sz w:val="28"/>
+          <w:szCs w:val="28"/>
+        </w:rPr>
+        <w:t>Notebook</w:t>
+      </w:r>
+      <w:proofErr w:type="spellEnd"/>
+      <w:r>
+        <w:rPr>
+          <w:sz w:val="28"/>
+          <w:szCs w:val="28"/>
+        </w:rPr>
+        <w:t>. Все вычисления реализованы самостоятельно, без применения готовых статистических библиотек там, где это оговорено заданием.</w:t>
       </w:r>
     </w:p>
     <w:p>
@@ -2015,21 +2073,7 @@
           <w:sz w:val="28"/>
           <w:szCs w:val="28"/>
         </w:rPr>
-        <w:t>.</w:t>
-      </w:r>
-      <w:r>
-        <w:rPr>
-          <w:sz w:val="28"/>
-          <w:szCs w:val="28"/>
-        </w:rPr>
-        <w:t xml:space="preserve"> </w:t>
-      </w:r>
-      <w:r>
-        <w:rPr>
-          <w:sz w:val="28"/>
-          <w:szCs w:val="28"/>
-        </w:rPr>
-        <w:t xml:space="preserve">Гамма-распределение было систематизировано английским статистиком Карлом Пирсоном в рамках его системы распределений в 1890-х годах, хотя отдельные его формы встречались в работах более ранних </w:t>
+        <w:t xml:space="preserve">. Гамма-распределение было систематизировано английским статистиком Карлом Пирсоном в рамках его системы распределений в 1890-х годах, хотя отдельные его формы встречались в работах более ранних </w:t>
       </w:r>
       <w:r>
         <w:rPr>
@@ -2065,16 +2109,30 @@
         <w:rPr>
           <w:sz w:val="28"/>
           <w:szCs w:val="28"/>
-          <w:lang w:val="en-US"/>
-        </w:rPr>
-      </w:pPr>
-      <w:r>
-        <w:rPr>
-          <w:sz w:val="28"/>
-          <w:szCs w:val="28"/>
-        </w:rPr>
-        <w:t xml:space="preserve">Гамма-распределение определено только для неотрицательных значений случайной величины, что ограничивает его применимость при моделировании симметричных процессов. Для преодоления этого ограничения исследователями было предложено его естественное расширение на всю числовую ось — двойное гамма-распределение (также называемое отражённым гамма-распределением, англ. </w:t>
-      </w:r>
+        </w:rPr>
+      </w:pPr>
+      <w:r>
+        <w:rPr>
+          <w:sz w:val="28"/>
+          <w:szCs w:val="28"/>
+        </w:rPr>
+        <w:t>Гамма-распределение определено только для неотрицательных значений случайной величины, что ограничивает его применимость при моделировании симметричных процессов</w:t>
+      </w:r>
+      <w:r>
+        <w:rPr>
+          <w:sz w:val="28"/>
+          <w:szCs w:val="28"/>
+        </w:rPr>
+        <w:t xml:space="preserve"> [2]</w:t>
+      </w:r>
+      <w:r>
+        <w:rPr>
+          <w:sz w:val="28"/>
+          <w:szCs w:val="28"/>
+        </w:rPr>
+        <w:t xml:space="preserve">. Для преодоления этого ограничения исследователями было предложено его естественное расширение на всю числовую ось — двойное гамма-распределение (также называемое отражённым гамма-распределением, англ. </w:t>
+      </w:r>
+      <w:proofErr w:type="spellStart"/>
       <w:r>
         <w:rPr>
           <w:i/>
@@ -2082,8 +2140,49 @@
           <w:sz w:val="28"/>
           <w:szCs w:val="28"/>
         </w:rPr>
-        <w:t>reflected gamma distribution</w:t>
-      </w:r>
+        <w:t>reflected</w:t>
+      </w:r>
+      <w:proofErr w:type="spellEnd"/>
+      <w:r>
+        <w:rPr>
+          <w:i/>
+          <w:iCs/>
+          <w:sz w:val="28"/>
+          <w:szCs w:val="28"/>
+        </w:rPr>
+        <w:t xml:space="preserve"> </w:t>
+      </w:r>
+      <w:proofErr w:type="spellStart"/>
+      <w:r>
+        <w:rPr>
+          <w:i/>
+          <w:iCs/>
+          <w:sz w:val="28"/>
+          <w:szCs w:val="28"/>
+        </w:rPr>
+        <w:t>gamma</w:t>
+      </w:r>
+      <w:proofErr w:type="spellEnd"/>
+      <w:r>
+        <w:rPr>
+          <w:i/>
+          <w:iCs/>
+          <w:sz w:val="28"/>
+          <w:szCs w:val="28"/>
+        </w:rPr>
+        <w:t xml:space="preserve"> </w:t>
+      </w:r>
+      <w:proofErr w:type="spellStart"/>
+      <w:r>
+        <w:rPr>
+          <w:i/>
+          <w:iCs/>
+          <w:sz w:val="28"/>
+          <w:szCs w:val="28"/>
+        </w:rPr>
+        <w:t>distribution</w:t>
+      </w:r>
+      <w:proofErr w:type="spellEnd"/>
       <w:r>
         <w:rPr>
           <w:sz w:val="28"/>
@@ -2097,7 +2196,6 @@
         <w:rPr>
           <w:sz w:val="28"/>
           <w:szCs w:val="28"/>
-          <w:lang w:val="en-US"/>
         </w:rPr>
       </w:pPr>
       <w:r>
@@ -2107,20 +2205,12 @@
         </w:rPr>
         <w:t xml:space="preserve">Основная идея распределения: </w:t>
       </w:r>
-    </w:p>
-    <w:p>
-      <w:pPr>
-        <w:rPr>
-          <w:sz w:val="28"/>
-          <w:szCs w:val="28"/>
-        </w:rPr>
-      </w:pPr>
-      <w:r>
-        <w:rPr>
-          <w:sz w:val="28"/>
-          <w:szCs w:val="28"/>
-        </w:rPr>
-        <w:t>Е</w:t>
+      <w:r>
+        <w:rPr>
+          <w:sz w:val="28"/>
+          <w:szCs w:val="28"/>
+        </w:rPr>
+        <w:t>е</w:t>
       </w:r>
       <w:r>
         <w:rPr>
@@ -2193,42 +2283,7 @@
           <w:sz w:val="28"/>
           <w:szCs w:val="28"/>
         </w:rPr>
-        <w:t>Плотность такого распределения имеет вид</w:t>
-      </w:r>
-      <w:r>
-        <w:rPr>
-          <w:sz w:val="28"/>
-          <w:szCs w:val="28"/>
-        </w:rPr>
-        <w:t xml:space="preserve"> </w:t>
-      </w:r>
-      <w:r>
-        <w:rPr>
-          <w:sz w:val="28"/>
-          <w:szCs w:val="28"/>
-        </w:rPr>
-        <w:t>[</w:t>
-      </w:r>
-      <w:r>
-        <w:rPr>
-          <w:sz w:val="28"/>
-          <w:szCs w:val="28"/>
-        </w:rPr>
-        <w:t>3</w:t>
-      </w:r>
-      <w:r>
-        <w:rPr>
-          <w:sz w:val="28"/>
-          <w:szCs w:val="28"/>
-        </w:rPr>
-        <w:t>]</w:t>
-      </w:r>
-      <w:r>
-        <w:rPr>
-          <w:sz w:val="28"/>
-          <w:szCs w:val="28"/>
-        </w:rPr>
-        <w:t xml:space="preserve">: </w:t>
+        <w:t xml:space="preserve">Плотность такого распределения имеет вид: </w:t>
       </w:r>
       <w:r>
         <w:rPr>
@@ -2318,15 +2373,7 @@
                   <w:sz w:val="28"/>
                   <w:szCs w:val="28"/>
                 </w:rPr>
-                <m:t>|x</m:t>
-              </m:r>
-              <m:r>
-                <w:rPr>
-                  <w:rFonts w:ascii="Cambria Math" w:hAnsi="Cambria Math"/>
-                  <w:sz w:val="28"/>
-                  <w:szCs w:val="28"/>
-                </w:rPr>
-                <m:t>-</m:t>
+                <m:t>|x-</m:t>
               </m:r>
               <m:r>
                 <w:rPr>
@@ -2384,15 +2431,7 @@
                   <w:sz w:val="28"/>
                   <w:szCs w:val="28"/>
                 </w:rPr>
-                <m:t>-β|x</m:t>
-              </m:r>
-              <m:r>
-                <w:rPr>
-                  <w:rFonts w:ascii="Cambria Math" w:hAnsi="Cambria Math"/>
-                  <w:sz w:val="28"/>
-                  <w:szCs w:val="28"/>
-                </w:rPr>
-                <m:t>-</m:t>
+                <m:t>-β|x-</m:t>
               </m:r>
               <m:r>
                 <w:rPr>
@@ -2445,6 +2484,7 @@
         </w:rPr>
         <w:t xml:space="preserve">•  </w:t>
       </w:r>
+      <w:proofErr w:type="gramStart"/>
       <w:r>
         <w:rPr>
           <w:i/>
@@ -2459,15 +2499,22 @@
           <w:sz w:val="28"/>
           <w:szCs w:val="28"/>
         </w:rPr>
-        <w:t xml:space="preserve"> &gt; 0 — параметр формы,</w:t>
-      </w:r>
-    </w:p>
-    <w:p>
-      <w:pPr>
-        <w:rPr>
-          <w:sz w:val="28"/>
-          <w:szCs w:val="28"/>
-          <w:lang w:val="en-US"/>
+        <w:t xml:space="preserve"> &gt;</w:t>
+      </w:r>
+      <w:proofErr w:type="gramEnd"/>
+      <w:r>
+        <w:rPr>
+          <w:sz w:val="28"/>
+          <w:szCs w:val="28"/>
+        </w:rPr>
+        <w:t xml:space="preserve"> 0 — параметр формы,</w:t>
+      </w:r>
+    </w:p>
+    <w:p>
+      <w:pPr>
+        <w:rPr>
+          <w:sz w:val="28"/>
+          <w:szCs w:val="28"/>
         </w:rPr>
       </w:pPr>
       <w:r>
@@ -2477,6 +2524,7 @@
         </w:rPr>
         <w:t xml:space="preserve">•  </w:t>
       </w:r>
+      <w:proofErr w:type="gramStart"/>
       <w:r>
         <w:rPr>
           <w:i/>
@@ -2491,7 +2539,15 @@
           <w:sz w:val="28"/>
           <w:szCs w:val="28"/>
         </w:rPr>
-        <w:t xml:space="preserve"> &gt; 0 — параметр масштаба,</w:t>
+        <w:t xml:space="preserve"> &gt;</w:t>
+      </w:r>
+      <w:proofErr w:type="gramEnd"/>
+      <w:r>
+        <w:rPr>
+          <w:sz w:val="28"/>
+          <w:szCs w:val="28"/>
+        </w:rPr>
+        <w:t xml:space="preserve"> 0 — параметр масштаба,</w:t>
       </w:r>
     </w:p>
     <w:p>
@@ -2508,6 +2564,7 @@
         </w:rPr>
         <w:t xml:space="preserve">•  </w:t>
       </w:r>
+      <w:proofErr w:type="spellStart"/>
       <w:r>
         <w:rPr>
           <w:i/>
@@ -2515,7 +2572,17 @@
           <w:sz w:val="28"/>
           <w:szCs w:val="28"/>
         </w:rPr>
-        <w:t xml:space="preserve">loc </w:t>
+        <w:t>loc</w:t>
+      </w:r>
+      <w:proofErr w:type="spellEnd"/>
+      <w:r>
+        <w:rPr>
+          <w:i/>
+          <w:iCs/>
+          <w:sz w:val="28"/>
+          <w:szCs w:val="28"/>
+        </w:rPr>
+        <w:t xml:space="preserve"> </w:t>
       </w:r>
       <w:r>
         <w:rPr>
@@ -2672,211 +2739,2419 @@
           <w:sz w:val="28"/>
           <w:szCs w:val="28"/>
         </w:rPr>
-        <w:t xml:space="preserve">1.2. </w:t>
-      </w:r>
-      <w:r>
+        <w:t>1.2. Назначение и применение в научных исследованиях, в задачах информационной безопасности</w:t>
+      </w:r>
+    </w:p>
+    <w:p>
+      <w:pPr>
+        <w:rPr>
+          <w:sz w:val="24"/>
+          <w:szCs w:val="24"/>
+        </w:rPr>
+      </w:pPr>
+    </w:p>
+    <w:p>
+      <w:pPr>
+        <w:rPr>
+          <w:sz w:val="28"/>
+          <w:szCs w:val="28"/>
+        </w:rPr>
+      </w:pPr>
+      <w:r>
+        <w:rPr>
+          <w:sz w:val="28"/>
+          <w:szCs w:val="28"/>
+        </w:rPr>
+        <w:t xml:space="preserve">Несмотря на то, что двойное гамма-распределение не является специализированным инструментом информационной безопасности, его свойства находят применение в ряде смежных задач. В частности, как показано в работе </w:t>
+      </w:r>
+      <w:proofErr w:type="spellStart"/>
+      <w:r>
+        <w:rPr>
+          <w:sz w:val="28"/>
+          <w:szCs w:val="28"/>
+        </w:rPr>
+        <w:t>Bahashwan</w:t>
+      </w:r>
+      <w:proofErr w:type="spellEnd"/>
+      <w:r>
+        <w:rPr>
+          <w:sz w:val="28"/>
+          <w:szCs w:val="28"/>
+        </w:rPr>
+        <w:t xml:space="preserve">, </w:t>
+      </w:r>
+      <w:proofErr w:type="spellStart"/>
+      <w:r>
+        <w:rPr>
+          <w:sz w:val="28"/>
+          <w:szCs w:val="28"/>
+        </w:rPr>
+        <w:t>Kalantan</w:t>
+      </w:r>
+      <w:proofErr w:type="spellEnd"/>
+      <w:r>
+        <w:rPr>
+          <w:sz w:val="28"/>
+          <w:szCs w:val="28"/>
+        </w:rPr>
+        <w:t xml:space="preserve"> и </w:t>
+      </w:r>
+      <w:proofErr w:type="spellStart"/>
+      <w:r>
+        <w:rPr>
+          <w:sz w:val="28"/>
+          <w:szCs w:val="28"/>
+        </w:rPr>
+        <w:t>Adham</w:t>
+      </w:r>
+      <w:proofErr w:type="spellEnd"/>
+      <w:r>
+        <w:rPr>
+          <w:sz w:val="28"/>
+          <w:szCs w:val="28"/>
+        </w:rPr>
+        <w:t xml:space="preserve"> [</w:t>
+      </w:r>
+      <w:r>
+        <w:rPr>
+          <w:sz w:val="28"/>
+          <w:szCs w:val="28"/>
+        </w:rPr>
+        <w:t>3</w:t>
+      </w:r>
+      <w:r>
+        <w:rPr>
+          <w:sz w:val="28"/>
+          <w:szCs w:val="28"/>
+        </w:rPr>
+        <w:t xml:space="preserve">], метод главных компонент (PCA), основанный на двойном гамма-распределении для моделирования шума, демонстрирует повышенную устойчивость к выбросам по сравнению с классическим гауссовским PCA. Данное свойство актуально при анализе сетевого трафика, где наблюдаемые данные, как правило, содержат выбросы и нештатные значения, характерные для атак типа </w:t>
+      </w:r>
+      <w:proofErr w:type="spellStart"/>
+      <w:r>
+        <w:rPr>
+          <w:sz w:val="28"/>
+          <w:szCs w:val="28"/>
+        </w:rPr>
+        <w:t>DoS</w:t>
+      </w:r>
+      <w:proofErr w:type="spellEnd"/>
+      <w:r>
+        <w:rPr>
+          <w:sz w:val="28"/>
+          <w:szCs w:val="28"/>
+        </w:rPr>
+        <w:t xml:space="preserve"> или аномального поведения пользователей. Применение устойчивых к шуму и выбросам методов снижения размерности позволяет выделять </w:t>
+      </w:r>
+      <w:r>
+        <w:rPr>
+          <w:sz w:val="28"/>
+          <w:szCs w:val="28"/>
+        </w:rPr>
+        <w:lastRenderedPageBreak/>
+        <w:t>информативные признаки из зашумлённых данных, что является одним из ключевых этапов в системах обнаружения вторжений (IDS). Таким образом, двойное гамма-распределение представляет интерес как статистическая основа для построения устойчивых к шуму алгоритмов анализа данных в задачах информационной безопасности.</w:t>
+      </w:r>
+    </w:p>
+    <w:p>
+      <w:pPr>
+        <w:rPr>
+          <w:sz w:val="28"/>
+          <w:szCs w:val="28"/>
+        </w:rPr>
+      </w:pPr>
+    </w:p>
+    <w:p>
+      <w:pPr>
+        <w:pStyle w:val="a7"/>
+        <w:numPr>
+          <w:ilvl w:val="0"/>
+          <w:numId w:val="3"/>
+        </w:numPr>
+        <w:jc w:val="center"/>
         <w:rPr>
           <w:b/>
           <w:bCs/>
-          <w:sz w:val="28"/>
-          <w:szCs w:val="28"/>
-        </w:rPr>
-        <w:t>Назначение и применение в научных исследованиях, в задачах информационной безопасности</w:t>
-      </w:r>
-    </w:p>
-    <w:p>
-      <w:pPr>
-        <w:rPr>
-          <w:sz w:val="24"/>
-          <w:szCs w:val="24"/>
-        </w:rPr>
-      </w:pPr>
-    </w:p>
-    <w:p>
-      <w:pPr>
-        <w:rPr>
-          <w:sz w:val="28"/>
-          <w:szCs w:val="28"/>
-        </w:rPr>
-      </w:pPr>
-      <w:r>
-        <w:rPr>
-          <w:sz w:val="28"/>
-          <w:szCs w:val="28"/>
-        </w:rPr>
-        <w:t xml:space="preserve">Несмотря на </w:t>
-      </w:r>
-      <w:r>
-        <w:rPr>
-          <w:sz w:val="28"/>
-          <w:szCs w:val="28"/>
-        </w:rPr>
-        <w:t>то,</w:t>
-      </w:r>
-      <w:r>
-        <w:rPr>
-          <w:sz w:val="28"/>
-          <w:szCs w:val="28"/>
-        </w:rPr>
-        <w:t xml:space="preserve"> что двойное гамма-распределение не является специализированным инструментом информационной безопасности, его свойства находят применение в ряде смежных задач. В частности, как показано в работе Bahashwan, Kalantan и Adham [</w:t>
-      </w:r>
-      <w:r>
-        <w:rPr>
-          <w:sz w:val="28"/>
-          <w:szCs w:val="28"/>
-        </w:rPr>
-        <w:t>3</w:t>
-      </w:r>
-      <w:r>
-        <w:rPr>
-          <w:sz w:val="28"/>
-          <w:szCs w:val="28"/>
-        </w:rPr>
-        <w:t xml:space="preserve">], метод главных компонент (PCA), основанный на двойном гамма-распределении для моделирования шума, демонстрирует повышенную устойчивость к выбросам по сравнению с классическим гауссовским PCA. Данное свойство актуально при анализе сетевого трафика, где наблюдаемые данные, как правило, содержат выбросы и нештатные значения, характерные для атак типа DoS или аномального поведения пользователей. Применение устойчивых к шуму </w:t>
-      </w:r>
-      <w:r>
-        <w:rPr>
-          <w:sz w:val="28"/>
-          <w:szCs w:val="28"/>
-        </w:rPr>
-        <w:lastRenderedPageBreak/>
-        <w:t>и выбросам методов снижения размерности позволяет выделять информативные признаки из зашумлённых данных, что является одним из ключевых этапов в системах обнаружения вторжений (IDS). Таким образом, двойное гамма-распределение представляет интерес как статистическая основа для построения устойчивых к шуму алгоритмов анализа данных в задачах информационной безопасности.</w:t>
-      </w:r>
-    </w:p>
-    <w:p>
-      <w:pPr>
-        <w:rPr>
-          <w:sz w:val="28"/>
-          <w:szCs w:val="28"/>
-        </w:rPr>
-      </w:pPr>
-    </w:p>
-    <w:p>
-      <w:pPr>
-        <w:rPr>
-          <w:sz w:val="28"/>
-          <w:szCs w:val="28"/>
-        </w:rPr>
-      </w:pPr>
-    </w:p>
-    <w:p>
-      <w:pPr>
-        <w:jc w:val="center"/>
+          <w:sz w:val="36"/>
+          <w:szCs w:val="36"/>
+        </w:rPr>
+      </w:pPr>
+      <w:r>
         <w:rPr>
           <w:b/>
           <w:bCs/>
           <w:sz w:val="32"/>
           <w:szCs w:val="32"/>
-          <w:lang w:val="en-US"/>
-        </w:rPr>
-      </w:pPr>
-      <w:r>
+        </w:rPr>
+        <w:t>Статистики выборки</w:t>
+      </w:r>
+    </w:p>
+    <w:p>
+      <w:pPr>
+        <w:pStyle w:val="a7"/>
+        <w:numPr>
+          <w:ilvl w:val="1"/>
+          <w:numId w:val="3"/>
+        </w:numPr>
         <w:rPr>
           <w:b/>
           <w:bCs/>
-          <w:sz w:val="32"/>
-          <w:szCs w:val="32"/>
-        </w:rPr>
-        <w:t>Список</w:t>
-      </w:r>
+          <w:sz w:val="40"/>
+          <w:szCs w:val="40"/>
+        </w:rPr>
+      </w:pPr>
       <w:r>
         <w:rPr>
           <w:b/>
           <w:bCs/>
-          <w:sz w:val="32"/>
-          <w:szCs w:val="32"/>
-          <w:lang w:val="en-US"/>
-        </w:rPr>
-        <w:t xml:space="preserve"> </w:t>
-      </w:r>
-      <w:r>
+          <w:sz w:val="28"/>
+          <w:szCs w:val="28"/>
+        </w:rPr>
+        <w:t>Определение и реализация функций вычисления статистик</w:t>
+      </w:r>
+    </w:p>
+    <w:p>
+      <w:pPr>
+        <w:pStyle w:val="a7"/>
+        <w:ind w:left="1287"/>
         <w:rPr>
           <w:b/>
           <w:bCs/>
-          <w:sz w:val="32"/>
-          <w:szCs w:val="32"/>
-        </w:rPr>
-        <w:t>используемой</w:t>
-      </w:r>
-      <w:r>
+          <w:sz w:val="40"/>
+          <w:szCs w:val="40"/>
+        </w:rPr>
+      </w:pPr>
+    </w:p>
+    <w:p>
+      <w:pPr>
+        <w:rPr>
+          <w:sz w:val="28"/>
+          <w:szCs w:val="28"/>
+        </w:rPr>
+      </w:pPr>
+      <w:r>
+        <w:rPr>
+          <w:sz w:val="28"/>
+          <w:szCs w:val="28"/>
+        </w:rPr>
+        <w:t>В курсовой работе были реализованы следующие функции вычисления статистик выборки:</w:t>
+      </w:r>
+    </w:p>
+    <w:p>
+      <w:pPr>
+        <w:pStyle w:val="a7"/>
+        <w:numPr>
+          <w:ilvl w:val="0"/>
+          <w:numId w:val="6"/>
+        </w:numPr>
+        <w:rPr>
+          <w:sz w:val="28"/>
+          <w:szCs w:val="28"/>
+        </w:rPr>
+      </w:pPr>
+      <w:r>
+        <w:rPr>
+          <w:sz w:val="28"/>
+          <w:szCs w:val="28"/>
+        </w:rPr>
+        <w:t>Сумма выборки — это</w:t>
+      </w:r>
+      <w:r>
+        <w:rPr>
+          <w:sz w:val="28"/>
+          <w:szCs w:val="28"/>
+        </w:rPr>
+        <w:t xml:space="preserve"> сумма всех значений случайной величины в выборке.</w:t>
+      </w:r>
+    </w:p>
+    <w:p>
+      <w:pPr>
+        <w:pStyle w:val="a7"/>
+        <w:rPr>
+          <w:sz w:val="28"/>
+          <w:szCs w:val="28"/>
+        </w:rPr>
+      </w:pPr>
+    </w:p>
+    <w:p>
+      <w:pPr>
+        <w:pStyle w:val="a7"/>
+        <w:spacing w:before="100" w:beforeAutospacing="1" w:after="100" w:afterAutospacing="1"/>
+        <w:rPr>
+          <w:rFonts w:ascii="Courier New" w:hAnsi="Courier New" w:cs="Courier New"/>
+          <w:lang w:val="en-US"/>
+        </w:rPr>
+      </w:pPr>
+      <w:r>
+        <w:rPr>
+          <w:rFonts w:ascii="Courier New" w:hAnsi="Courier New" w:cs="Courier New"/>
+          <w:lang w:val="en-US"/>
+        </w:rPr>
+        <w:t xml:space="preserve">def </w:t>
+      </w:r>
+      <w:proofErr w:type="spellStart"/>
+      <w:r>
+        <w:rPr>
+          <w:rFonts w:ascii="Courier New" w:hAnsi="Courier New" w:cs="Courier New"/>
+          <w:lang w:val="en-US"/>
+        </w:rPr>
+        <w:t>all_summ</w:t>
+      </w:r>
+      <w:proofErr w:type="spellEnd"/>
+      <w:r>
+        <w:rPr>
+          <w:rFonts w:ascii="Courier New" w:hAnsi="Courier New" w:cs="Courier New"/>
+          <w:lang w:val="en-US"/>
+        </w:rPr>
+        <w:t>(X):</w:t>
+      </w:r>
+      <w:r>
+        <w:rPr>
+          <w:sz w:val="24"/>
+          <w:szCs w:val="24"/>
+          <w:lang w:val="en-US"/>
+        </w:rPr>
+        <w:br/>
+      </w:r>
+      <w:proofErr w:type="spellStart"/>
+      <w:r>
+        <w:rPr>
+          <w:rFonts w:ascii="Courier New" w:hAnsi="Courier New" w:cs="Courier New"/>
+          <w:lang w:val="en-US"/>
+        </w:rPr>
+        <w:t>summ</w:t>
+      </w:r>
+      <w:proofErr w:type="spellEnd"/>
+      <w:r>
+        <w:rPr>
+          <w:rFonts w:ascii="Courier New" w:hAnsi="Courier New" w:cs="Courier New"/>
+          <w:lang w:val="en-US"/>
+        </w:rPr>
+        <w:t xml:space="preserve"> = 0</w:t>
+      </w:r>
+      <w:r>
+        <w:rPr>
+          <w:sz w:val="24"/>
+          <w:szCs w:val="24"/>
+          <w:lang w:val="en-US"/>
+        </w:rPr>
+        <w:br/>
+      </w:r>
+      <w:r>
+        <w:rPr>
+          <w:rFonts w:ascii="Courier New" w:hAnsi="Courier New" w:cs="Courier New"/>
+          <w:lang w:val="en-US"/>
+        </w:rPr>
+        <w:t>for x in X:</w:t>
+      </w:r>
+      <w:r>
+        <w:rPr>
+          <w:sz w:val="24"/>
+          <w:szCs w:val="24"/>
+          <w:lang w:val="en-US"/>
+        </w:rPr>
+        <w:br/>
+      </w:r>
+      <w:proofErr w:type="spellStart"/>
+      <w:r>
+        <w:rPr>
+          <w:rFonts w:ascii="Courier New" w:hAnsi="Courier New" w:cs="Courier New"/>
+          <w:lang w:val="en-US"/>
+        </w:rPr>
+        <w:t>summ</w:t>
+      </w:r>
+      <w:proofErr w:type="spellEnd"/>
+      <w:r>
+        <w:rPr>
+          <w:rFonts w:ascii="Courier New" w:hAnsi="Courier New" w:cs="Courier New"/>
+          <w:lang w:val="en-US"/>
+        </w:rPr>
+        <w:t xml:space="preserve"> += x</w:t>
+      </w:r>
+      <w:r>
+        <w:rPr>
+          <w:sz w:val="24"/>
+          <w:szCs w:val="24"/>
+          <w:lang w:val="en-US"/>
+        </w:rPr>
+        <w:br/>
+      </w:r>
+      <w:r>
+        <w:rPr>
+          <w:rFonts w:ascii="Courier New" w:hAnsi="Courier New" w:cs="Courier New"/>
+          <w:lang w:val="en-US"/>
+        </w:rPr>
+        <w:t xml:space="preserve">return </w:t>
+      </w:r>
+      <w:proofErr w:type="spellStart"/>
+      <w:r>
+        <w:rPr>
+          <w:rFonts w:ascii="Courier New" w:hAnsi="Courier New" w:cs="Courier New"/>
+          <w:lang w:val="en-US"/>
+        </w:rPr>
+        <w:t>sum</w:t>
+      </w:r>
+      <w:r>
+        <w:rPr>
+          <w:rFonts w:ascii="Courier New" w:hAnsi="Courier New" w:cs="Courier New"/>
+          <w:lang w:val="en-US"/>
+        </w:rPr>
+        <w:t>m</w:t>
+      </w:r>
+      <w:proofErr w:type="spellEnd"/>
+    </w:p>
+    <w:p>
+      <w:pPr>
+        <w:pStyle w:val="a7"/>
+        <w:spacing w:before="100" w:beforeAutospacing="1" w:after="100" w:afterAutospacing="1"/>
+        <w:rPr>
+          <w:rFonts w:ascii="Courier New" w:hAnsi="Courier New" w:cs="Courier New"/>
+          <w:lang w:val="en-US"/>
+        </w:rPr>
+      </w:pPr>
+    </w:p>
+    <w:p>
+      <w:pPr>
+        <w:pStyle w:val="a7"/>
+        <w:numPr>
+          <w:ilvl w:val="0"/>
+          <w:numId w:val="6"/>
+        </w:numPr>
+        <w:spacing w:before="100" w:beforeAutospacing="1" w:after="100" w:afterAutospacing="1"/>
+        <w:rPr>
+          <w:sz w:val="28"/>
+          <w:szCs w:val="28"/>
+        </w:rPr>
+      </w:pPr>
+      <w:r>
+        <w:rPr>
+          <w:sz w:val="28"/>
+          <w:szCs w:val="28"/>
+        </w:rPr>
+        <w:t xml:space="preserve">Выборочное среднее </w:t>
+      </w:r>
+      <w:r>
+        <w:rPr>
+          <w:sz w:val="28"/>
+          <w:szCs w:val="28"/>
+        </w:rPr>
+        <w:t>— это среднее арифметическое всех элементов выборки</w:t>
+      </w:r>
+      <w:r>
+        <w:rPr>
+          <w:sz w:val="28"/>
+          <w:szCs w:val="28"/>
+        </w:rPr>
+        <w:t>.</w:t>
+      </w:r>
+    </w:p>
+    <w:p>
+      <w:pPr>
+        <w:pStyle w:val="a7"/>
+        <w:spacing w:before="100" w:beforeAutospacing="1" w:after="100" w:afterAutospacing="1"/>
+        <w:rPr>
+          <w:rFonts w:ascii="Courier New" w:hAnsi="Courier New" w:cs="Courier New"/>
+        </w:rPr>
+      </w:pPr>
+    </w:p>
+    <w:p>
+      <w:pPr>
+        <w:pStyle w:val="a7"/>
+        <w:spacing w:before="100" w:beforeAutospacing="1" w:after="100" w:afterAutospacing="1"/>
+        <w:rPr>
+          <w:sz w:val="24"/>
+          <w:szCs w:val="24"/>
+          <w:lang w:val="en-US"/>
+        </w:rPr>
+      </w:pPr>
+      <w:r>
+        <w:rPr>
+          <w:rFonts w:ascii="Courier New" w:hAnsi="Courier New" w:cs="Courier New"/>
+          <w:lang w:val="en-US"/>
+        </w:rPr>
+        <w:t xml:space="preserve">def </w:t>
+      </w:r>
+      <w:proofErr w:type="spellStart"/>
+      <w:r>
+        <w:rPr>
+          <w:rFonts w:ascii="Courier New" w:hAnsi="Courier New" w:cs="Courier New"/>
+          <w:lang w:val="en-US"/>
+        </w:rPr>
+        <w:t>viborochnoe_avarage</w:t>
+      </w:r>
+      <w:proofErr w:type="spellEnd"/>
+      <w:r>
+        <w:rPr>
+          <w:rFonts w:ascii="Courier New" w:hAnsi="Courier New" w:cs="Courier New"/>
+          <w:lang w:val="en-US"/>
+        </w:rPr>
+        <w:t>(X):</w:t>
+      </w:r>
+      <w:r>
+        <w:rPr>
+          <w:sz w:val="24"/>
+          <w:szCs w:val="24"/>
+          <w:lang w:val="en-US"/>
+        </w:rPr>
+        <w:br/>
+      </w:r>
+      <w:r>
+        <w:rPr>
+          <w:rFonts w:ascii="Courier New" w:hAnsi="Courier New" w:cs="Courier New"/>
+          <w:lang w:val="en-US"/>
+        </w:rPr>
+        <w:t xml:space="preserve">return </w:t>
+      </w:r>
+      <w:proofErr w:type="spellStart"/>
+      <w:r>
+        <w:rPr>
+          <w:rFonts w:ascii="Courier New" w:hAnsi="Courier New" w:cs="Courier New"/>
+          <w:lang w:val="en-US"/>
+        </w:rPr>
+        <w:t>all_summ</w:t>
+      </w:r>
+      <w:proofErr w:type="spellEnd"/>
+      <w:r>
+        <w:rPr>
+          <w:rFonts w:ascii="Courier New" w:hAnsi="Courier New" w:cs="Courier New"/>
+          <w:lang w:val="en-US"/>
+        </w:rPr>
+        <w:t xml:space="preserve">(X) / </w:t>
+      </w:r>
+      <w:proofErr w:type="spellStart"/>
+      <w:r>
+        <w:rPr>
+          <w:rFonts w:ascii="Courier New" w:hAnsi="Courier New" w:cs="Courier New"/>
+          <w:lang w:val="en-US"/>
+        </w:rPr>
+        <w:t>len</w:t>
+      </w:r>
+      <w:proofErr w:type="spellEnd"/>
+      <w:r>
+        <w:rPr>
+          <w:rFonts w:ascii="Courier New" w:hAnsi="Courier New" w:cs="Courier New"/>
+          <w:lang w:val="en-US"/>
+        </w:rPr>
+        <w:t>(X)</w:t>
+      </w:r>
+    </w:p>
+    <w:p>
+      <w:pPr>
+        <w:pStyle w:val="a7"/>
+        <w:spacing w:before="100" w:beforeAutospacing="1" w:after="100" w:afterAutospacing="1"/>
+        <w:rPr>
+          <w:sz w:val="28"/>
+          <w:szCs w:val="28"/>
+        </w:rPr>
+      </w:pPr>
+    </w:p>
+    <w:p>
+      <w:pPr>
+        <w:pStyle w:val="a7"/>
+        <w:numPr>
+          <w:ilvl w:val="0"/>
+          <w:numId w:val="6"/>
+        </w:numPr>
+        <w:spacing w:before="100" w:beforeAutospacing="1" w:after="100" w:afterAutospacing="1"/>
+        <w:rPr>
+          <w:sz w:val="28"/>
+          <w:szCs w:val="28"/>
+        </w:rPr>
+      </w:pPr>
+      <w:r>
+        <w:rPr>
+          <w:sz w:val="28"/>
+          <w:szCs w:val="28"/>
+        </w:rPr>
+        <w:t xml:space="preserve">Медиана </w:t>
+      </w:r>
+      <w:r>
+        <w:rPr>
+          <w:sz w:val="28"/>
+          <w:szCs w:val="28"/>
+        </w:rPr>
+        <w:t>— это значение, которое делит упорядоченную выборку пополам.</w:t>
+      </w:r>
+    </w:p>
+    <w:p>
+      <w:pPr>
+        <w:pStyle w:val="a7"/>
+        <w:spacing w:before="100" w:beforeAutospacing="1" w:after="100" w:afterAutospacing="1"/>
+        <w:rPr>
+          <w:rFonts w:ascii="Courier New" w:hAnsi="Courier New" w:cs="Courier New"/>
+        </w:rPr>
+      </w:pPr>
+    </w:p>
+    <w:p>
+      <w:pPr>
+        <w:pStyle w:val="a7"/>
+        <w:spacing w:before="100" w:beforeAutospacing="1" w:after="100" w:afterAutospacing="1"/>
+        <w:rPr>
+          <w:sz w:val="24"/>
+          <w:szCs w:val="24"/>
+          <w:lang w:val="en-US"/>
+        </w:rPr>
+      </w:pPr>
+      <w:r>
+        <w:rPr>
+          <w:rFonts w:ascii="Courier New" w:hAnsi="Courier New" w:cs="Courier New"/>
+          <w:lang w:val="en-US"/>
+        </w:rPr>
+        <w:t>def median(X):</w:t>
+      </w:r>
+      <w:r>
+        <w:rPr>
+          <w:sz w:val="24"/>
+          <w:szCs w:val="24"/>
+          <w:lang w:val="en-US"/>
+        </w:rPr>
+        <w:br/>
+      </w:r>
+      <w:proofErr w:type="spellStart"/>
+      <w:r>
+        <w:rPr>
+          <w:rFonts w:ascii="Courier New" w:hAnsi="Courier New" w:cs="Courier New"/>
+          <w:lang w:val="en-US"/>
+        </w:rPr>
+        <w:t>X_sorted</w:t>
+      </w:r>
+      <w:proofErr w:type="spellEnd"/>
+      <w:r>
+        <w:rPr>
+          <w:rFonts w:ascii="Courier New" w:hAnsi="Courier New" w:cs="Courier New"/>
+          <w:lang w:val="en-US"/>
+        </w:rPr>
+        <w:t xml:space="preserve"> = </w:t>
+      </w:r>
+      <w:proofErr w:type="spellStart"/>
+      <w:r>
+        <w:rPr>
+          <w:rFonts w:ascii="Courier New" w:hAnsi="Courier New" w:cs="Courier New"/>
+          <w:lang w:val="en-US"/>
+        </w:rPr>
+        <w:t>my_sort</w:t>
+      </w:r>
+      <w:proofErr w:type="spellEnd"/>
+      <w:r>
+        <w:rPr>
+          <w:rFonts w:ascii="Courier New" w:hAnsi="Courier New" w:cs="Courier New"/>
+          <w:lang w:val="en-US"/>
+        </w:rPr>
+        <w:t>(X)</w:t>
+      </w:r>
+      <w:r>
+        <w:rPr>
+          <w:sz w:val="24"/>
+          <w:szCs w:val="24"/>
+          <w:lang w:val="en-US"/>
+        </w:rPr>
+        <w:br/>
+      </w:r>
+      <w:r>
+        <w:rPr>
+          <w:rFonts w:ascii="Courier New" w:hAnsi="Courier New" w:cs="Courier New"/>
+          <w:lang w:val="en-US"/>
+        </w:rPr>
+        <w:t xml:space="preserve">n = </w:t>
+      </w:r>
+      <w:proofErr w:type="spellStart"/>
+      <w:r>
+        <w:rPr>
+          <w:rFonts w:ascii="Courier New" w:hAnsi="Courier New" w:cs="Courier New"/>
+          <w:lang w:val="en-US"/>
+        </w:rPr>
+        <w:t>len</w:t>
+      </w:r>
+      <w:proofErr w:type="spellEnd"/>
+      <w:r>
+        <w:rPr>
+          <w:rFonts w:ascii="Courier New" w:hAnsi="Courier New" w:cs="Courier New"/>
+          <w:lang w:val="en-US"/>
+        </w:rPr>
+        <w:t>(X)</w:t>
+      </w:r>
+      <w:r>
+        <w:rPr>
+          <w:sz w:val="24"/>
+          <w:szCs w:val="24"/>
+          <w:lang w:val="en-US"/>
+        </w:rPr>
+        <w:br/>
+      </w:r>
+      <w:r>
+        <w:rPr>
+          <w:sz w:val="24"/>
+          <w:szCs w:val="24"/>
+          <w:lang w:val="en-US"/>
+        </w:rPr>
+        <w:br/>
+      </w:r>
+      <w:r>
+        <w:rPr>
+          <w:rFonts w:ascii="Courier New" w:hAnsi="Courier New" w:cs="Courier New"/>
+          <w:lang w:val="en-US"/>
+        </w:rPr>
+        <w:t>if n % 2 == 1:</w:t>
+      </w:r>
+      <w:r>
+        <w:rPr>
+          <w:sz w:val="24"/>
+          <w:szCs w:val="24"/>
+          <w:lang w:val="en-US"/>
+        </w:rPr>
+        <w:br/>
+      </w:r>
+      <w:r>
+        <w:rPr>
+          <w:rFonts w:ascii="Courier New" w:hAnsi="Courier New" w:cs="Courier New"/>
+          <w:lang w:val="en-US"/>
+        </w:rPr>
+        <w:t xml:space="preserve">return </w:t>
+      </w:r>
+      <w:proofErr w:type="spellStart"/>
+      <w:r>
+        <w:rPr>
+          <w:rFonts w:ascii="Courier New" w:hAnsi="Courier New" w:cs="Courier New"/>
+          <w:lang w:val="en-US"/>
+        </w:rPr>
+        <w:t>X_</w:t>
+      </w:r>
+      <w:proofErr w:type="gramStart"/>
+      <w:r>
+        <w:rPr>
+          <w:rFonts w:ascii="Courier New" w:hAnsi="Courier New" w:cs="Courier New"/>
+          <w:lang w:val="en-US"/>
+        </w:rPr>
+        <w:t>sorted</w:t>
+      </w:r>
+      <w:proofErr w:type="spellEnd"/>
+      <w:r>
+        <w:rPr>
+          <w:rFonts w:ascii="Courier New" w:hAnsi="Courier New" w:cs="Courier New"/>
+          <w:lang w:val="en-US"/>
+        </w:rPr>
+        <w:t>[</w:t>
+      </w:r>
+      <w:proofErr w:type="gramEnd"/>
+      <w:r>
+        <w:rPr>
+          <w:rFonts w:ascii="Courier New" w:hAnsi="Courier New" w:cs="Courier New"/>
+          <w:lang w:val="en-US"/>
+        </w:rPr>
+        <w:t>n // 2]</w:t>
+      </w:r>
+      <w:r>
+        <w:rPr>
+          <w:sz w:val="24"/>
+          <w:szCs w:val="24"/>
+          <w:lang w:val="en-US"/>
+        </w:rPr>
+        <w:br/>
+      </w:r>
+      <w:r>
+        <w:rPr>
+          <w:rFonts w:ascii="Courier New" w:hAnsi="Courier New" w:cs="Courier New"/>
+          <w:lang w:val="en-US"/>
+        </w:rPr>
+        <w:t>else:</w:t>
+      </w:r>
+      <w:r>
+        <w:rPr>
+          <w:sz w:val="24"/>
+          <w:szCs w:val="24"/>
+          <w:lang w:val="en-US"/>
+        </w:rPr>
+        <w:br/>
+      </w:r>
+      <w:r>
+        <w:rPr>
+          <w:rFonts w:ascii="Courier New" w:hAnsi="Courier New" w:cs="Courier New"/>
+          <w:lang w:val="en-US"/>
+        </w:rPr>
+        <w:t>return (</w:t>
+      </w:r>
+      <w:proofErr w:type="spellStart"/>
+      <w:r>
+        <w:rPr>
+          <w:rFonts w:ascii="Courier New" w:hAnsi="Courier New" w:cs="Courier New"/>
+          <w:lang w:val="en-US"/>
+        </w:rPr>
+        <w:t>X_sorted</w:t>
+      </w:r>
+      <w:proofErr w:type="spellEnd"/>
+      <w:r>
+        <w:rPr>
+          <w:rFonts w:ascii="Courier New" w:hAnsi="Courier New" w:cs="Courier New"/>
+          <w:lang w:val="en-US"/>
+        </w:rPr>
+        <w:t xml:space="preserve">[n // 2 - 1] + </w:t>
+      </w:r>
+      <w:proofErr w:type="spellStart"/>
+      <w:r>
+        <w:rPr>
+          <w:rFonts w:ascii="Courier New" w:hAnsi="Courier New" w:cs="Courier New"/>
+          <w:lang w:val="en-US"/>
+        </w:rPr>
+        <w:t>X_sorted</w:t>
+      </w:r>
+      <w:proofErr w:type="spellEnd"/>
+      <w:r>
+        <w:rPr>
+          <w:rFonts w:ascii="Courier New" w:hAnsi="Courier New" w:cs="Courier New"/>
+          <w:lang w:val="en-US"/>
+        </w:rPr>
+        <w:t>[n // 2]) / 2</w:t>
+      </w:r>
+    </w:p>
+    <w:p>
+      <w:pPr>
+        <w:pStyle w:val="a7"/>
+        <w:spacing w:before="100" w:beforeAutospacing="1" w:after="100" w:afterAutospacing="1"/>
+        <w:rPr>
+          <w:sz w:val="28"/>
+          <w:szCs w:val="28"/>
+        </w:rPr>
+      </w:pPr>
+    </w:p>
+    <w:p>
+      <w:pPr>
+        <w:pStyle w:val="a7"/>
+        <w:numPr>
+          <w:ilvl w:val="0"/>
+          <w:numId w:val="6"/>
+        </w:numPr>
+        <w:spacing w:before="100" w:beforeAutospacing="1" w:after="100" w:afterAutospacing="1"/>
+        <w:rPr>
+          <w:sz w:val="28"/>
+          <w:szCs w:val="28"/>
+        </w:rPr>
+      </w:pPr>
+      <w:r>
+        <w:rPr>
+          <w:sz w:val="28"/>
+          <w:szCs w:val="28"/>
+        </w:rPr>
+        <w:t>Мода</w:t>
+      </w:r>
+      <w:r>
+        <w:rPr>
+          <w:sz w:val="24"/>
+          <w:szCs w:val="24"/>
+        </w:rPr>
+        <w:t xml:space="preserve"> </w:t>
+      </w:r>
+      <w:r>
+        <w:rPr>
+          <w:sz w:val="28"/>
+          <w:szCs w:val="28"/>
+        </w:rPr>
+        <w:t>— это значение, которое встречается в выборке чаще всего.</w:t>
+      </w:r>
+    </w:p>
+    <w:p>
+      <w:pPr>
+        <w:pStyle w:val="a7"/>
+        <w:spacing w:before="100" w:beforeAutospacing="1" w:after="100" w:afterAutospacing="1"/>
+        <w:rPr>
+          <w:rFonts w:ascii="Courier New" w:hAnsi="Courier New" w:cs="Courier New"/>
+        </w:rPr>
+      </w:pPr>
+    </w:p>
+    <w:p>
+      <w:pPr>
+        <w:pStyle w:val="a7"/>
+        <w:spacing w:before="100" w:beforeAutospacing="1" w:after="100" w:afterAutospacing="1"/>
+        <w:rPr>
+          <w:sz w:val="24"/>
+          <w:szCs w:val="24"/>
+          <w:lang w:val="en-US"/>
+        </w:rPr>
+      </w:pPr>
+      <w:r>
+        <w:rPr>
+          <w:rFonts w:ascii="Courier New" w:hAnsi="Courier New" w:cs="Courier New"/>
+          <w:lang w:val="en-US"/>
+        </w:rPr>
+        <w:t>def mode(X):</w:t>
+      </w:r>
+      <w:r>
+        <w:rPr>
+          <w:sz w:val="24"/>
+          <w:szCs w:val="24"/>
+          <w:lang w:val="en-US"/>
+        </w:rPr>
+        <w:br/>
+      </w:r>
+      <w:r>
+        <w:rPr>
+          <w:rFonts w:ascii="Courier New" w:hAnsi="Courier New" w:cs="Courier New"/>
+          <w:lang w:val="en-US"/>
+        </w:rPr>
+        <w:t>counts = {}</w:t>
+      </w:r>
+      <w:r>
+        <w:rPr>
+          <w:sz w:val="24"/>
+          <w:szCs w:val="24"/>
+          <w:lang w:val="en-US"/>
+        </w:rPr>
+        <w:br/>
+      </w:r>
+      <w:r>
+        <w:rPr>
+          <w:sz w:val="24"/>
+          <w:szCs w:val="24"/>
+          <w:lang w:val="en-US"/>
+        </w:rPr>
+        <w:br/>
+      </w:r>
+      <w:r>
+        <w:rPr>
+          <w:rFonts w:ascii="Courier New" w:hAnsi="Courier New" w:cs="Courier New"/>
+          <w:lang w:val="en-US"/>
+        </w:rPr>
+        <w:t>for x in X:</w:t>
+      </w:r>
+      <w:r>
+        <w:rPr>
+          <w:sz w:val="24"/>
+          <w:szCs w:val="24"/>
+          <w:lang w:val="en-US"/>
+        </w:rPr>
+        <w:br/>
+      </w:r>
+      <w:r>
+        <w:rPr>
+          <w:rFonts w:ascii="Courier New" w:hAnsi="Courier New" w:cs="Courier New"/>
+          <w:lang w:val="en-US"/>
+        </w:rPr>
+        <w:t>if x in counts:</w:t>
+      </w:r>
+      <w:r>
+        <w:rPr>
+          <w:sz w:val="24"/>
+          <w:szCs w:val="24"/>
+          <w:lang w:val="en-US"/>
+        </w:rPr>
+        <w:br/>
+      </w:r>
+      <w:r>
+        <w:rPr>
+          <w:rFonts w:ascii="Courier New" w:hAnsi="Courier New" w:cs="Courier New"/>
+          <w:lang w:val="en-US"/>
+        </w:rPr>
+        <w:t>counts[x] += 1</w:t>
+      </w:r>
+      <w:r>
+        <w:rPr>
+          <w:sz w:val="24"/>
+          <w:szCs w:val="24"/>
+          <w:lang w:val="en-US"/>
+        </w:rPr>
+        <w:br/>
+      </w:r>
+      <w:r>
+        <w:rPr>
+          <w:rFonts w:ascii="Courier New" w:hAnsi="Courier New" w:cs="Courier New"/>
+          <w:lang w:val="en-US"/>
+        </w:rPr>
+        <w:t>else:</w:t>
+      </w:r>
+      <w:r>
+        <w:rPr>
+          <w:sz w:val="24"/>
+          <w:szCs w:val="24"/>
+          <w:lang w:val="en-US"/>
+        </w:rPr>
+        <w:br/>
+      </w:r>
+      <w:r>
+        <w:rPr>
+          <w:rFonts w:ascii="Courier New" w:hAnsi="Courier New" w:cs="Courier New"/>
+          <w:lang w:val="en-US"/>
+        </w:rPr>
+        <w:t>counts[x] = 1</w:t>
+      </w:r>
+      <w:r>
+        <w:rPr>
+          <w:sz w:val="24"/>
+          <w:szCs w:val="24"/>
+          <w:lang w:val="en-US"/>
+        </w:rPr>
+        <w:br/>
+      </w:r>
+      <w:r>
+        <w:rPr>
+          <w:sz w:val="24"/>
+          <w:szCs w:val="24"/>
+          <w:lang w:val="en-US"/>
+        </w:rPr>
+        <w:br/>
+      </w:r>
+      <w:proofErr w:type="spellStart"/>
+      <w:r>
+        <w:rPr>
+          <w:rFonts w:ascii="Courier New" w:hAnsi="Courier New" w:cs="Courier New"/>
+          <w:lang w:val="en-US"/>
+        </w:rPr>
+        <w:t>max_count</w:t>
+      </w:r>
+      <w:proofErr w:type="spellEnd"/>
+      <w:r>
+        <w:rPr>
+          <w:rFonts w:ascii="Courier New" w:hAnsi="Courier New" w:cs="Courier New"/>
+          <w:lang w:val="en-US"/>
+        </w:rPr>
+        <w:t xml:space="preserve"> = 0</w:t>
+      </w:r>
+      <w:r>
+        <w:rPr>
+          <w:sz w:val="24"/>
+          <w:szCs w:val="24"/>
+          <w:lang w:val="en-US"/>
+        </w:rPr>
+        <w:br/>
+      </w:r>
+      <w:proofErr w:type="spellStart"/>
+      <w:r>
+        <w:rPr>
+          <w:rFonts w:ascii="Courier New" w:hAnsi="Courier New" w:cs="Courier New"/>
+          <w:lang w:val="en-US"/>
+        </w:rPr>
+        <w:t>mode_value</w:t>
+      </w:r>
+      <w:proofErr w:type="spellEnd"/>
+      <w:r>
+        <w:rPr>
+          <w:rFonts w:ascii="Courier New" w:hAnsi="Courier New" w:cs="Courier New"/>
+          <w:lang w:val="en-US"/>
+        </w:rPr>
+        <w:t xml:space="preserve"> = None</w:t>
+      </w:r>
+      <w:r>
+        <w:rPr>
+          <w:sz w:val="24"/>
+          <w:szCs w:val="24"/>
+          <w:lang w:val="en-US"/>
+        </w:rPr>
+        <w:br/>
+      </w:r>
+      <w:r>
+        <w:rPr>
+          <w:sz w:val="24"/>
+          <w:szCs w:val="24"/>
+          <w:lang w:val="en-US"/>
+        </w:rPr>
+        <w:br/>
+      </w:r>
+      <w:r>
+        <w:rPr>
+          <w:rFonts w:ascii="Courier New" w:hAnsi="Courier New" w:cs="Courier New"/>
+          <w:lang w:val="en-US"/>
+        </w:rPr>
+        <w:t>for key in counts:</w:t>
+      </w:r>
+      <w:r>
+        <w:rPr>
+          <w:sz w:val="24"/>
+          <w:szCs w:val="24"/>
+          <w:lang w:val="en-US"/>
+        </w:rPr>
+        <w:br/>
+      </w:r>
+      <w:r>
+        <w:rPr>
+          <w:rFonts w:ascii="Courier New" w:hAnsi="Courier New" w:cs="Courier New"/>
+          <w:lang w:val="en-US"/>
+        </w:rPr>
+        <w:lastRenderedPageBreak/>
+        <w:t xml:space="preserve">if counts[key] &gt; </w:t>
+      </w:r>
+      <w:proofErr w:type="spellStart"/>
+      <w:r>
+        <w:rPr>
+          <w:rFonts w:ascii="Courier New" w:hAnsi="Courier New" w:cs="Courier New"/>
+          <w:lang w:val="en-US"/>
+        </w:rPr>
+        <w:t>max_count</w:t>
+      </w:r>
+      <w:proofErr w:type="spellEnd"/>
+      <w:r>
+        <w:rPr>
+          <w:rFonts w:ascii="Courier New" w:hAnsi="Courier New" w:cs="Courier New"/>
+          <w:lang w:val="en-US"/>
+        </w:rPr>
+        <w:t>:</w:t>
+      </w:r>
+      <w:r>
+        <w:rPr>
+          <w:sz w:val="24"/>
+          <w:szCs w:val="24"/>
+          <w:lang w:val="en-US"/>
+        </w:rPr>
+        <w:br/>
+      </w:r>
+      <w:proofErr w:type="spellStart"/>
+      <w:r>
+        <w:rPr>
+          <w:rFonts w:ascii="Courier New" w:hAnsi="Courier New" w:cs="Courier New"/>
+          <w:lang w:val="en-US"/>
+        </w:rPr>
+        <w:t>max_count</w:t>
+      </w:r>
+      <w:proofErr w:type="spellEnd"/>
+      <w:r>
+        <w:rPr>
+          <w:rFonts w:ascii="Courier New" w:hAnsi="Courier New" w:cs="Courier New"/>
+          <w:lang w:val="en-US"/>
+        </w:rPr>
+        <w:t xml:space="preserve"> = counts[key]</w:t>
+      </w:r>
+      <w:r>
+        <w:rPr>
+          <w:sz w:val="24"/>
+          <w:szCs w:val="24"/>
+          <w:lang w:val="en-US"/>
+        </w:rPr>
+        <w:br/>
+      </w:r>
+      <w:proofErr w:type="spellStart"/>
+      <w:r>
+        <w:rPr>
+          <w:rFonts w:ascii="Courier New" w:hAnsi="Courier New" w:cs="Courier New"/>
+          <w:lang w:val="en-US"/>
+        </w:rPr>
+        <w:t>mode_value</w:t>
+      </w:r>
+      <w:proofErr w:type="spellEnd"/>
+      <w:r>
+        <w:rPr>
+          <w:rFonts w:ascii="Courier New" w:hAnsi="Courier New" w:cs="Courier New"/>
+          <w:lang w:val="en-US"/>
+        </w:rPr>
+        <w:t xml:space="preserve"> = key</w:t>
+      </w:r>
+      <w:r>
+        <w:rPr>
+          <w:sz w:val="24"/>
+          <w:szCs w:val="24"/>
+          <w:lang w:val="en-US"/>
+        </w:rPr>
+        <w:br/>
+      </w:r>
+      <w:r>
+        <w:rPr>
+          <w:sz w:val="24"/>
+          <w:szCs w:val="24"/>
+          <w:lang w:val="en-US"/>
+        </w:rPr>
+        <w:br/>
+      </w:r>
+      <w:r>
+        <w:rPr>
+          <w:rFonts w:ascii="Courier New" w:hAnsi="Courier New" w:cs="Courier New"/>
+          <w:lang w:val="en-US"/>
+        </w:rPr>
+        <w:t xml:space="preserve">return </w:t>
+      </w:r>
+      <w:proofErr w:type="spellStart"/>
+      <w:r>
+        <w:rPr>
+          <w:rFonts w:ascii="Courier New" w:hAnsi="Courier New" w:cs="Courier New"/>
+          <w:lang w:val="en-US"/>
+        </w:rPr>
+        <w:t>mode_value</w:t>
+      </w:r>
+      <w:proofErr w:type="spellEnd"/>
+    </w:p>
+    <w:p>
+      <w:pPr>
+        <w:pStyle w:val="a7"/>
+        <w:spacing w:before="100" w:beforeAutospacing="1" w:after="100" w:afterAutospacing="1"/>
+        <w:rPr>
+          <w:sz w:val="28"/>
+          <w:szCs w:val="28"/>
+        </w:rPr>
+      </w:pPr>
+    </w:p>
+    <w:p>
+      <w:pPr>
+        <w:pStyle w:val="a7"/>
+        <w:numPr>
+          <w:ilvl w:val="0"/>
+          <w:numId w:val="6"/>
+        </w:numPr>
+        <w:spacing w:before="100" w:beforeAutospacing="1" w:after="100" w:afterAutospacing="1"/>
+        <w:rPr>
+          <w:sz w:val="28"/>
+          <w:szCs w:val="28"/>
+        </w:rPr>
+      </w:pPr>
+      <w:r>
+        <w:rPr>
+          <w:sz w:val="28"/>
+          <w:szCs w:val="28"/>
+        </w:rPr>
+        <w:t>Размах выборки</w:t>
+      </w:r>
+      <w:r>
+        <w:rPr>
+          <w:sz w:val="24"/>
+          <w:szCs w:val="24"/>
+        </w:rPr>
+        <w:t xml:space="preserve"> </w:t>
+      </w:r>
+      <w:r>
+        <w:rPr>
+          <w:sz w:val="28"/>
+          <w:szCs w:val="28"/>
+        </w:rPr>
+        <w:t>— это разница между максимальным и минимальным значениями</w:t>
+      </w:r>
+    </w:p>
+    <w:p>
+      <w:pPr>
+        <w:pStyle w:val="a7"/>
+        <w:spacing w:before="100" w:beforeAutospacing="1" w:after="100" w:afterAutospacing="1"/>
+        <w:rPr>
+          <w:rFonts w:ascii="Courier New" w:hAnsi="Courier New" w:cs="Courier New"/>
+        </w:rPr>
+      </w:pPr>
+    </w:p>
+    <w:p>
+      <w:pPr>
+        <w:pStyle w:val="a7"/>
+        <w:spacing w:before="100" w:beforeAutospacing="1" w:after="100" w:afterAutospacing="1"/>
+        <w:rPr>
+          <w:sz w:val="24"/>
+          <w:szCs w:val="24"/>
+          <w:lang w:val="en-US"/>
+        </w:rPr>
+      </w:pPr>
+      <w:r>
+        <w:rPr>
+          <w:rFonts w:ascii="Courier New" w:hAnsi="Courier New" w:cs="Courier New"/>
+          <w:lang w:val="en-US"/>
+        </w:rPr>
+        <w:t xml:space="preserve">def </w:t>
+      </w:r>
+      <w:proofErr w:type="spellStart"/>
+      <w:r>
+        <w:rPr>
+          <w:rFonts w:ascii="Courier New" w:hAnsi="Courier New" w:cs="Courier New"/>
+          <w:lang w:val="en-US"/>
+        </w:rPr>
+        <w:t>sample_range</w:t>
+      </w:r>
+      <w:proofErr w:type="spellEnd"/>
+      <w:r>
+        <w:rPr>
+          <w:rFonts w:ascii="Courier New" w:hAnsi="Courier New" w:cs="Courier New"/>
+          <w:lang w:val="en-US"/>
+        </w:rPr>
+        <w:t>(X):</w:t>
+      </w:r>
+      <w:r>
+        <w:rPr>
+          <w:sz w:val="24"/>
+          <w:szCs w:val="24"/>
+          <w:lang w:val="en-US"/>
+        </w:rPr>
+        <w:br/>
+      </w:r>
+      <w:r>
+        <w:rPr>
+          <w:rFonts w:ascii="Courier New" w:hAnsi="Courier New" w:cs="Courier New"/>
+          <w:lang w:val="en-US"/>
+        </w:rPr>
+        <w:t>return max(X) - min(X)</w:t>
+      </w:r>
+    </w:p>
+    <w:p>
+      <w:pPr>
+        <w:pStyle w:val="a7"/>
+        <w:spacing w:before="100" w:beforeAutospacing="1" w:after="100" w:afterAutospacing="1"/>
+        <w:rPr>
+          <w:sz w:val="28"/>
+          <w:szCs w:val="28"/>
+        </w:rPr>
+      </w:pPr>
+    </w:p>
+    <w:p>
+      <w:pPr>
+        <w:pStyle w:val="a7"/>
+        <w:numPr>
+          <w:ilvl w:val="0"/>
+          <w:numId w:val="6"/>
+        </w:numPr>
+        <w:spacing w:before="100" w:beforeAutospacing="1" w:after="100" w:afterAutospacing="1"/>
+        <w:rPr>
+          <w:sz w:val="28"/>
+          <w:szCs w:val="28"/>
+        </w:rPr>
+      </w:pPr>
+      <w:r>
+        <w:rPr>
+          <w:sz w:val="28"/>
+          <w:szCs w:val="28"/>
+        </w:rPr>
+        <w:t xml:space="preserve">Смещенная дисперсия </w:t>
+      </w:r>
+      <w:r>
+        <w:rPr>
+          <w:sz w:val="28"/>
+          <w:szCs w:val="28"/>
+        </w:rPr>
+        <w:t>— это средний квадрат отклонений от среднего.</w:t>
+      </w:r>
+    </w:p>
+    <w:p>
+      <w:pPr>
+        <w:pStyle w:val="a7"/>
+        <w:spacing w:before="100" w:beforeAutospacing="1" w:after="100" w:afterAutospacing="1"/>
+        <w:rPr>
+          <w:rFonts w:ascii="Courier New" w:hAnsi="Courier New" w:cs="Courier New"/>
+        </w:rPr>
+      </w:pPr>
+    </w:p>
+    <w:p>
+      <w:pPr>
+        <w:pStyle w:val="a7"/>
+        <w:spacing w:before="100" w:beforeAutospacing="1" w:after="100" w:afterAutospacing="1"/>
+        <w:rPr>
+          <w:sz w:val="24"/>
+          <w:szCs w:val="24"/>
+          <w:lang w:val="en-US"/>
+        </w:rPr>
+      </w:pPr>
+      <w:r>
+        <w:rPr>
+          <w:rFonts w:ascii="Courier New" w:hAnsi="Courier New" w:cs="Courier New"/>
+          <w:lang w:val="en-US"/>
+        </w:rPr>
+        <w:t xml:space="preserve">def </w:t>
+      </w:r>
+      <w:proofErr w:type="spellStart"/>
+      <w:r>
+        <w:rPr>
+          <w:rFonts w:ascii="Courier New" w:hAnsi="Courier New" w:cs="Courier New"/>
+          <w:lang w:val="en-US"/>
+        </w:rPr>
+        <w:t>biased_variance</w:t>
+      </w:r>
+      <w:proofErr w:type="spellEnd"/>
+      <w:r>
+        <w:rPr>
+          <w:rFonts w:ascii="Courier New" w:hAnsi="Courier New" w:cs="Courier New"/>
+          <w:lang w:val="en-US"/>
+        </w:rPr>
+        <w:t>(X):</w:t>
+      </w:r>
+      <w:r>
+        <w:rPr>
+          <w:sz w:val="24"/>
+          <w:szCs w:val="24"/>
+          <w:lang w:val="en-US"/>
+        </w:rPr>
+        <w:br/>
+      </w:r>
+      <w:r>
+        <w:rPr>
+          <w:rFonts w:ascii="Courier New" w:hAnsi="Courier New" w:cs="Courier New"/>
+          <w:lang w:val="en-US"/>
+        </w:rPr>
+        <w:t xml:space="preserve">mean = </w:t>
+      </w:r>
+      <w:proofErr w:type="spellStart"/>
+      <w:r>
+        <w:rPr>
+          <w:rFonts w:ascii="Courier New" w:hAnsi="Courier New" w:cs="Courier New"/>
+          <w:lang w:val="en-US"/>
+        </w:rPr>
+        <w:t>viborochnoe_avarage</w:t>
+      </w:r>
+      <w:proofErr w:type="spellEnd"/>
+      <w:r>
+        <w:rPr>
+          <w:rFonts w:ascii="Courier New" w:hAnsi="Courier New" w:cs="Courier New"/>
+          <w:lang w:val="en-US"/>
+        </w:rPr>
+        <w:t>(X)</w:t>
+      </w:r>
+      <w:r>
+        <w:rPr>
+          <w:sz w:val="24"/>
+          <w:szCs w:val="24"/>
+          <w:lang w:val="en-US"/>
+        </w:rPr>
+        <w:br/>
+      </w:r>
+      <w:r>
+        <w:rPr>
+          <w:rFonts w:ascii="Courier New" w:hAnsi="Courier New" w:cs="Courier New"/>
+          <w:lang w:val="en-US"/>
+        </w:rPr>
+        <w:t>s = 0</w:t>
+      </w:r>
+      <w:r>
+        <w:rPr>
+          <w:sz w:val="24"/>
+          <w:szCs w:val="24"/>
+          <w:lang w:val="en-US"/>
+        </w:rPr>
+        <w:br/>
+      </w:r>
+      <w:r>
+        <w:rPr>
+          <w:sz w:val="24"/>
+          <w:szCs w:val="24"/>
+          <w:lang w:val="en-US"/>
+        </w:rPr>
+        <w:br/>
+      </w:r>
+      <w:r>
+        <w:rPr>
+          <w:rFonts w:ascii="Courier New" w:hAnsi="Courier New" w:cs="Courier New"/>
+          <w:lang w:val="en-US"/>
+        </w:rPr>
+        <w:t>for x in X:</w:t>
+      </w:r>
+      <w:r>
+        <w:rPr>
+          <w:sz w:val="24"/>
+          <w:szCs w:val="24"/>
+          <w:lang w:val="en-US"/>
+        </w:rPr>
+        <w:br/>
+      </w:r>
+      <w:r>
+        <w:rPr>
+          <w:rFonts w:ascii="Courier New" w:hAnsi="Courier New" w:cs="Courier New"/>
+          <w:lang w:val="en-US"/>
+        </w:rPr>
+        <w:t>s += (x - mean) ** 2</w:t>
+      </w:r>
+      <w:r>
+        <w:rPr>
+          <w:sz w:val="24"/>
+          <w:szCs w:val="24"/>
+          <w:lang w:val="en-US"/>
+        </w:rPr>
+        <w:br/>
+      </w:r>
+      <w:r>
+        <w:rPr>
+          <w:sz w:val="24"/>
+          <w:szCs w:val="24"/>
+          <w:lang w:val="en-US"/>
+        </w:rPr>
+        <w:br/>
+      </w:r>
+      <w:r>
+        <w:rPr>
+          <w:rFonts w:ascii="Courier New" w:hAnsi="Courier New" w:cs="Courier New"/>
+          <w:lang w:val="en-US"/>
+        </w:rPr>
+        <w:t xml:space="preserve">return s / </w:t>
+      </w:r>
+      <w:proofErr w:type="spellStart"/>
+      <w:r>
+        <w:rPr>
+          <w:rFonts w:ascii="Courier New" w:hAnsi="Courier New" w:cs="Courier New"/>
+          <w:lang w:val="en-US"/>
+        </w:rPr>
+        <w:t>len</w:t>
+      </w:r>
+      <w:proofErr w:type="spellEnd"/>
+      <w:r>
+        <w:rPr>
+          <w:rFonts w:ascii="Courier New" w:hAnsi="Courier New" w:cs="Courier New"/>
+          <w:lang w:val="en-US"/>
+        </w:rPr>
+        <w:t>(X)</w:t>
+      </w:r>
+    </w:p>
+    <w:p>
+      <w:pPr>
+        <w:pStyle w:val="a7"/>
+        <w:spacing w:before="100" w:beforeAutospacing="1" w:after="100" w:afterAutospacing="1"/>
+        <w:rPr>
+          <w:sz w:val="28"/>
+          <w:szCs w:val="28"/>
+          <w:lang w:val="en-US"/>
+        </w:rPr>
+      </w:pPr>
+    </w:p>
+    <w:p>
+      <w:pPr>
+        <w:pStyle w:val="a7"/>
+        <w:numPr>
+          <w:ilvl w:val="0"/>
+          <w:numId w:val="6"/>
+        </w:numPr>
+        <w:rPr>
+          <w:sz w:val="28"/>
+          <w:szCs w:val="28"/>
+        </w:rPr>
+      </w:pPr>
+      <w:r>
+        <w:rPr>
+          <w:sz w:val="28"/>
+          <w:szCs w:val="28"/>
+        </w:rPr>
+        <w:t xml:space="preserve">Несмещенная дисперсия </w:t>
+      </w:r>
+      <w:r>
+        <w:rPr>
+          <w:sz w:val="28"/>
+          <w:szCs w:val="28"/>
+        </w:rPr>
+        <w:t>— более точная оценка дисперсии, учитывающая малый размер выборки.</w:t>
+      </w:r>
+    </w:p>
+    <w:p>
+      <w:pPr>
+        <w:pStyle w:val="a7"/>
+        <w:spacing w:before="100" w:beforeAutospacing="1" w:after="100" w:afterAutospacing="1"/>
+        <w:rPr>
+          <w:rFonts w:ascii="Courier New" w:hAnsi="Courier New" w:cs="Courier New"/>
+        </w:rPr>
+      </w:pPr>
+    </w:p>
+    <w:p>
+      <w:pPr>
+        <w:pStyle w:val="a7"/>
+        <w:spacing w:before="100" w:beforeAutospacing="1" w:after="100" w:afterAutospacing="1"/>
+        <w:rPr>
+          <w:rFonts w:ascii="Courier New" w:hAnsi="Courier New" w:cs="Courier New"/>
+        </w:rPr>
+      </w:pPr>
+      <w:r>
+        <w:rPr>
+          <w:rFonts w:ascii="Courier New" w:hAnsi="Courier New" w:cs="Courier New"/>
+          <w:lang w:val="en-US"/>
+        </w:rPr>
+        <w:t xml:space="preserve">def </w:t>
+      </w:r>
+      <w:proofErr w:type="spellStart"/>
+      <w:r>
+        <w:rPr>
+          <w:rFonts w:ascii="Courier New" w:hAnsi="Courier New" w:cs="Courier New"/>
+          <w:lang w:val="en-US"/>
+        </w:rPr>
+        <w:t>unbiased_variance</w:t>
+      </w:r>
+      <w:proofErr w:type="spellEnd"/>
+      <w:r>
+        <w:rPr>
+          <w:rFonts w:ascii="Courier New" w:hAnsi="Courier New" w:cs="Courier New"/>
+          <w:lang w:val="en-US"/>
+        </w:rPr>
+        <w:t>(X):</w:t>
+      </w:r>
+      <w:r>
+        <w:rPr>
+          <w:sz w:val="24"/>
+          <w:szCs w:val="24"/>
+          <w:lang w:val="en-US"/>
+        </w:rPr>
+        <w:br/>
+      </w:r>
+      <w:r>
+        <w:rPr>
+          <w:rFonts w:ascii="Courier New" w:hAnsi="Courier New" w:cs="Courier New"/>
+          <w:lang w:val="en-US"/>
+        </w:rPr>
+        <w:t xml:space="preserve">mean = </w:t>
+      </w:r>
+      <w:proofErr w:type="spellStart"/>
+      <w:r>
+        <w:rPr>
+          <w:rFonts w:ascii="Courier New" w:hAnsi="Courier New" w:cs="Courier New"/>
+          <w:lang w:val="en-US"/>
+        </w:rPr>
+        <w:t>viborochnoe_avarage</w:t>
+      </w:r>
+      <w:proofErr w:type="spellEnd"/>
+      <w:r>
+        <w:rPr>
+          <w:rFonts w:ascii="Courier New" w:hAnsi="Courier New" w:cs="Courier New"/>
+          <w:lang w:val="en-US"/>
+        </w:rPr>
+        <w:t>(X)</w:t>
+      </w:r>
+      <w:r>
+        <w:rPr>
+          <w:sz w:val="24"/>
+          <w:szCs w:val="24"/>
+          <w:lang w:val="en-US"/>
+        </w:rPr>
+        <w:br/>
+      </w:r>
+      <w:r>
+        <w:rPr>
+          <w:rFonts w:ascii="Courier New" w:hAnsi="Courier New" w:cs="Courier New"/>
+          <w:lang w:val="en-US"/>
+        </w:rPr>
+        <w:t>s = 0</w:t>
+      </w:r>
+      <w:r>
+        <w:rPr>
+          <w:sz w:val="24"/>
+          <w:szCs w:val="24"/>
+          <w:lang w:val="en-US"/>
+        </w:rPr>
+        <w:br/>
+      </w:r>
+      <w:r>
+        <w:rPr>
+          <w:sz w:val="24"/>
+          <w:szCs w:val="24"/>
+          <w:lang w:val="en-US"/>
+        </w:rPr>
+        <w:br/>
+      </w:r>
+      <w:r>
+        <w:rPr>
+          <w:rFonts w:ascii="Courier New" w:hAnsi="Courier New" w:cs="Courier New"/>
+          <w:lang w:val="en-US"/>
+        </w:rPr>
+        <w:t>for x in X:</w:t>
+      </w:r>
+      <w:r>
+        <w:rPr>
+          <w:sz w:val="24"/>
+          <w:szCs w:val="24"/>
+          <w:lang w:val="en-US"/>
+        </w:rPr>
+        <w:br/>
+      </w:r>
+      <w:r>
+        <w:rPr>
+          <w:rFonts w:ascii="Courier New" w:hAnsi="Courier New" w:cs="Courier New"/>
+          <w:lang w:val="en-US"/>
+        </w:rPr>
+        <w:t>s += (x - mean) ** 2</w:t>
+      </w:r>
+      <w:r>
+        <w:rPr>
+          <w:sz w:val="24"/>
+          <w:szCs w:val="24"/>
+          <w:lang w:val="en-US"/>
+        </w:rPr>
+        <w:br/>
+      </w:r>
+      <w:r>
+        <w:rPr>
+          <w:sz w:val="24"/>
+          <w:szCs w:val="24"/>
+          <w:lang w:val="en-US"/>
+        </w:rPr>
+        <w:br/>
+      </w:r>
+      <w:r>
+        <w:rPr>
+          <w:rFonts w:ascii="Courier New" w:hAnsi="Courier New" w:cs="Courier New"/>
+          <w:lang w:val="en-US"/>
+        </w:rPr>
+        <w:t>return s / (</w:t>
+      </w:r>
+      <w:proofErr w:type="spellStart"/>
+      <w:r>
+        <w:rPr>
+          <w:rFonts w:ascii="Courier New" w:hAnsi="Courier New" w:cs="Courier New"/>
+          <w:lang w:val="en-US"/>
+        </w:rPr>
+        <w:t>len</w:t>
+      </w:r>
+      <w:proofErr w:type="spellEnd"/>
+      <w:r>
+        <w:rPr>
+          <w:rFonts w:ascii="Courier New" w:hAnsi="Courier New" w:cs="Courier New"/>
+          <w:lang w:val="en-US"/>
+        </w:rPr>
+        <w:t>(X) - 1)</w:t>
+      </w:r>
+    </w:p>
+    <w:p>
+      <w:pPr>
+        <w:pStyle w:val="a7"/>
+        <w:spacing w:before="100" w:beforeAutospacing="1" w:after="100" w:afterAutospacing="1"/>
+        <w:rPr>
+          <w:sz w:val="24"/>
+          <w:szCs w:val="24"/>
+        </w:rPr>
+      </w:pPr>
+    </w:p>
+    <w:p>
+      <w:pPr>
+        <w:pStyle w:val="a7"/>
+        <w:numPr>
+          <w:ilvl w:val="0"/>
+          <w:numId w:val="6"/>
+        </w:numPr>
+        <w:rPr>
+          <w:sz w:val="28"/>
+          <w:szCs w:val="28"/>
+        </w:rPr>
+      </w:pPr>
+      <w:r>
+        <w:rPr>
+          <w:sz w:val="28"/>
+          <w:szCs w:val="28"/>
+        </w:rPr>
+        <w:t xml:space="preserve">Начальный момент </w:t>
+      </w:r>
+      <w:r>
+        <w:rPr>
+          <w:sz w:val="28"/>
+          <w:szCs w:val="28"/>
+          <w:lang w:val="en-US"/>
+        </w:rPr>
+        <w:t>k</w:t>
+      </w:r>
+      <w:r>
+        <w:rPr>
+          <w:sz w:val="28"/>
+          <w:szCs w:val="28"/>
+        </w:rPr>
+        <w:t>-</w:t>
+      </w:r>
+      <w:r>
+        <w:rPr>
+          <w:sz w:val="28"/>
+          <w:szCs w:val="28"/>
+        </w:rPr>
+        <w:t xml:space="preserve">ого порядка. Показывает среднее значение степеней элементов выборки. </w:t>
+      </w:r>
+    </w:p>
+    <w:p>
+      <w:pPr>
+        <w:pStyle w:val="a7"/>
+        <w:spacing w:before="100" w:beforeAutospacing="1" w:after="100" w:afterAutospacing="1"/>
+        <w:rPr>
+          <w:rFonts w:ascii="Courier New" w:hAnsi="Courier New" w:cs="Courier New"/>
+        </w:rPr>
+      </w:pPr>
+    </w:p>
+    <w:p>
+      <w:pPr>
+        <w:pStyle w:val="a7"/>
+        <w:spacing w:before="100" w:beforeAutospacing="1" w:after="100" w:afterAutospacing="1"/>
+        <w:rPr>
+          <w:sz w:val="24"/>
+          <w:szCs w:val="24"/>
+          <w:lang w:val="en-US"/>
+        </w:rPr>
+      </w:pPr>
+      <w:r>
+        <w:rPr>
+          <w:rFonts w:ascii="Courier New" w:hAnsi="Courier New" w:cs="Courier New"/>
+          <w:lang w:val="en-US"/>
+        </w:rPr>
+        <w:t xml:space="preserve">def </w:t>
+      </w:r>
+      <w:proofErr w:type="spellStart"/>
+      <w:r>
+        <w:rPr>
+          <w:rFonts w:ascii="Courier New" w:hAnsi="Courier New" w:cs="Courier New"/>
+          <w:lang w:val="en-US"/>
+        </w:rPr>
+        <w:t>raw_</w:t>
+      </w:r>
+      <w:proofErr w:type="gramStart"/>
+      <w:r>
+        <w:rPr>
+          <w:rFonts w:ascii="Courier New" w:hAnsi="Courier New" w:cs="Courier New"/>
+          <w:lang w:val="en-US"/>
+        </w:rPr>
+        <w:t>moment</w:t>
+      </w:r>
+      <w:proofErr w:type="spellEnd"/>
+      <w:r>
+        <w:rPr>
+          <w:rFonts w:ascii="Courier New" w:hAnsi="Courier New" w:cs="Courier New"/>
+          <w:lang w:val="en-US"/>
+        </w:rPr>
+        <w:t>(</w:t>
+      </w:r>
+      <w:proofErr w:type="gramEnd"/>
+      <w:r>
+        <w:rPr>
+          <w:rFonts w:ascii="Courier New" w:hAnsi="Courier New" w:cs="Courier New"/>
+          <w:lang w:val="en-US"/>
+        </w:rPr>
+        <w:t>X, k):</w:t>
+      </w:r>
+      <w:r>
+        <w:rPr>
+          <w:sz w:val="24"/>
+          <w:szCs w:val="24"/>
+          <w:lang w:val="en-US"/>
+        </w:rPr>
+        <w:br/>
+      </w:r>
+      <w:r>
+        <w:rPr>
+          <w:rFonts w:ascii="Courier New" w:hAnsi="Courier New" w:cs="Courier New"/>
+          <w:lang w:val="en-US"/>
+        </w:rPr>
+        <w:t>s = 0</w:t>
+      </w:r>
+      <w:r>
+        <w:rPr>
+          <w:sz w:val="24"/>
+          <w:szCs w:val="24"/>
+          <w:lang w:val="en-US"/>
+        </w:rPr>
+        <w:br/>
+      </w:r>
+      <w:r>
+        <w:rPr>
+          <w:sz w:val="24"/>
+          <w:szCs w:val="24"/>
+          <w:lang w:val="en-US"/>
+        </w:rPr>
+        <w:br/>
+        <w:t>for x in X:</w:t>
+      </w:r>
+      <w:r>
+        <w:rPr>
+          <w:sz w:val="24"/>
+          <w:szCs w:val="24"/>
+          <w:lang w:val="en-US"/>
+        </w:rPr>
+        <w:br/>
+        <w:t>s += x ** k</w:t>
+      </w:r>
+      <w:r>
+        <w:rPr>
+          <w:sz w:val="24"/>
+          <w:szCs w:val="24"/>
+          <w:lang w:val="en-US"/>
+        </w:rPr>
+        <w:br/>
+      </w:r>
+      <w:r>
+        <w:rPr>
+          <w:sz w:val="24"/>
+          <w:szCs w:val="24"/>
+          <w:lang w:val="en-US"/>
+        </w:rPr>
+        <w:br/>
+        <w:t xml:space="preserve">return s / </w:t>
+      </w:r>
+      <w:proofErr w:type="spellStart"/>
+      <w:r>
+        <w:rPr>
+          <w:sz w:val="24"/>
+          <w:szCs w:val="24"/>
+          <w:lang w:val="en-US"/>
+        </w:rPr>
+        <w:t>len</w:t>
+      </w:r>
+      <w:proofErr w:type="spellEnd"/>
+      <w:r>
+        <w:rPr>
+          <w:sz w:val="24"/>
+          <w:szCs w:val="24"/>
+          <w:lang w:val="en-US"/>
+        </w:rPr>
+        <w:t>(X)</w:t>
+      </w:r>
+    </w:p>
+    <w:p>
+      <w:pPr>
+        <w:pStyle w:val="a7"/>
+        <w:rPr>
+          <w:sz w:val="28"/>
+          <w:szCs w:val="28"/>
+          <w:lang w:val="en-US"/>
+        </w:rPr>
+      </w:pPr>
+    </w:p>
+    <w:p>
+      <w:pPr>
+        <w:pStyle w:val="a7"/>
+        <w:numPr>
+          <w:ilvl w:val="0"/>
+          <w:numId w:val="6"/>
+        </w:numPr>
+        <w:rPr>
+          <w:sz w:val="28"/>
+          <w:szCs w:val="28"/>
+        </w:rPr>
+      </w:pPr>
+      <w:r>
+        <w:rPr>
+          <w:sz w:val="28"/>
+          <w:szCs w:val="28"/>
+        </w:rPr>
+        <w:t xml:space="preserve">Центральный момент </w:t>
+      </w:r>
+      <w:r>
+        <w:rPr>
+          <w:sz w:val="28"/>
+          <w:szCs w:val="28"/>
+          <w:lang w:val="en-US"/>
+        </w:rPr>
+        <w:t>k</w:t>
+      </w:r>
+      <w:r>
+        <w:rPr>
+          <w:sz w:val="28"/>
+          <w:szCs w:val="28"/>
+        </w:rPr>
+        <w:t>-</w:t>
+      </w:r>
+      <w:r>
+        <w:rPr>
+          <w:sz w:val="28"/>
+          <w:szCs w:val="28"/>
+        </w:rPr>
+        <w:t xml:space="preserve">ого порядка. Измеряет отклонение значений от среднего в степени </w:t>
+      </w:r>
+      <w:r>
+        <w:rPr>
+          <w:sz w:val="28"/>
+          <w:szCs w:val="28"/>
+          <w:lang w:val="en-US"/>
+        </w:rPr>
+        <w:t>k</w:t>
+      </w:r>
+      <w:r>
+        <w:rPr>
+          <w:sz w:val="28"/>
+          <w:szCs w:val="28"/>
+        </w:rPr>
+        <w:t xml:space="preserve">. </w:t>
+      </w:r>
+    </w:p>
+    <w:p>
+      <w:pPr>
+        <w:pStyle w:val="a7"/>
+        <w:spacing w:before="100" w:beforeAutospacing="1" w:after="100" w:afterAutospacing="1"/>
+        <w:rPr>
+          <w:rFonts w:ascii="Courier New" w:hAnsi="Courier New" w:cs="Courier New"/>
+        </w:rPr>
+      </w:pPr>
+    </w:p>
+    <w:p>
+      <w:pPr>
+        <w:pStyle w:val="a7"/>
+        <w:spacing w:before="100" w:beforeAutospacing="1" w:after="100" w:afterAutospacing="1"/>
+        <w:rPr>
+          <w:sz w:val="24"/>
+          <w:szCs w:val="24"/>
+          <w:lang w:val="en-US"/>
+        </w:rPr>
+      </w:pPr>
+      <w:r>
+        <w:rPr>
+          <w:rFonts w:ascii="Courier New" w:hAnsi="Courier New" w:cs="Courier New"/>
+          <w:lang w:val="en-US"/>
+        </w:rPr>
+        <w:t xml:space="preserve">def </w:t>
+      </w:r>
+      <w:proofErr w:type="spellStart"/>
+      <w:r>
+        <w:rPr>
+          <w:rFonts w:ascii="Courier New" w:hAnsi="Courier New" w:cs="Courier New"/>
+          <w:lang w:val="en-US"/>
+        </w:rPr>
+        <w:t>central_</w:t>
+      </w:r>
+      <w:proofErr w:type="gramStart"/>
+      <w:r>
+        <w:rPr>
+          <w:rFonts w:ascii="Courier New" w:hAnsi="Courier New" w:cs="Courier New"/>
+          <w:lang w:val="en-US"/>
+        </w:rPr>
+        <w:t>moment</w:t>
+      </w:r>
+      <w:proofErr w:type="spellEnd"/>
+      <w:r>
+        <w:rPr>
+          <w:rFonts w:ascii="Courier New" w:hAnsi="Courier New" w:cs="Courier New"/>
+          <w:lang w:val="en-US"/>
+        </w:rPr>
+        <w:t>(</w:t>
+      </w:r>
+      <w:proofErr w:type="gramEnd"/>
+      <w:r>
+        <w:rPr>
+          <w:rFonts w:ascii="Courier New" w:hAnsi="Courier New" w:cs="Courier New"/>
+          <w:lang w:val="en-US"/>
+        </w:rPr>
+        <w:t>X, k):</w:t>
+      </w:r>
+      <w:r>
+        <w:rPr>
+          <w:sz w:val="24"/>
+          <w:szCs w:val="24"/>
+          <w:lang w:val="en-US"/>
+        </w:rPr>
+        <w:br/>
+      </w:r>
+      <w:r>
+        <w:rPr>
+          <w:rFonts w:ascii="Courier New" w:hAnsi="Courier New" w:cs="Courier New"/>
+          <w:lang w:val="en-US"/>
+        </w:rPr>
+        <w:t xml:space="preserve">mean = </w:t>
+      </w:r>
+      <w:proofErr w:type="spellStart"/>
+      <w:r>
+        <w:rPr>
+          <w:rFonts w:ascii="Courier New" w:hAnsi="Courier New" w:cs="Courier New"/>
+          <w:lang w:val="en-US"/>
+        </w:rPr>
+        <w:t>viborochnoe_avarage</w:t>
+      </w:r>
+      <w:proofErr w:type="spellEnd"/>
+      <w:r>
+        <w:rPr>
+          <w:rFonts w:ascii="Courier New" w:hAnsi="Courier New" w:cs="Courier New"/>
+          <w:lang w:val="en-US"/>
+        </w:rPr>
+        <w:t>(X)</w:t>
+      </w:r>
+      <w:r>
+        <w:rPr>
+          <w:sz w:val="24"/>
+          <w:szCs w:val="24"/>
+          <w:lang w:val="en-US"/>
+        </w:rPr>
+        <w:br/>
+      </w:r>
+      <w:r>
+        <w:rPr>
+          <w:rFonts w:ascii="Courier New" w:hAnsi="Courier New" w:cs="Courier New"/>
+          <w:lang w:val="en-US"/>
+        </w:rPr>
+        <w:t>s = 0</w:t>
+      </w:r>
+      <w:r>
+        <w:rPr>
+          <w:sz w:val="24"/>
+          <w:szCs w:val="24"/>
+          <w:lang w:val="en-US"/>
+        </w:rPr>
+        <w:br/>
+      </w:r>
+      <w:r>
+        <w:rPr>
+          <w:sz w:val="24"/>
+          <w:szCs w:val="24"/>
+          <w:lang w:val="en-US"/>
+        </w:rPr>
+        <w:br/>
+        <w:t>for x in X:</w:t>
+      </w:r>
+      <w:r>
+        <w:rPr>
+          <w:sz w:val="24"/>
+          <w:szCs w:val="24"/>
+          <w:lang w:val="en-US"/>
+        </w:rPr>
+        <w:br/>
+        <w:t>s += (x - mean) ** k</w:t>
+      </w:r>
+      <w:r>
+        <w:rPr>
+          <w:sz w:val="24"/>
+          <w:szCs w:val="24"/>
+          <w:lang w:val="en-US"/>
+        </w:rPr>
+        <w:br/>
+      </w:r>
+      <w:r>
+        <w:rPr>
+          <w:sz w:val="24"/>
+          <w:szCs w:val="24"/>
+          <w:lang w:val="en-US"/>
+        </w:rPr>
+        <w:lastRenderedPageBreak/>
+        <w:br/>
+        <w:t xml:space="preserve">return s / </w:t>
+      </w:r>
+      <w:proofErr w:type="spellStart"/>
+      <w:r>
+        <w:rPr>
+          <w:sz w:val="24"/>
+          <w:szCs w:val="24"/>
+          <w:lang w:val="en-US"/>
+        </w:rPr>
+        <w:t>len</w:t>
+      </w:r>
+      <w:proofErr w:type="spellEnd"/>
+      <w:r>
+        <w:rPr>
+          <w:sz w:val="24"/>
+          <w:szCs w:val="24"/>
+          <w:lang w:val="en-US"/>
+        </w:rPr>
+        <w:t>(X)</w:t>
+      </w:r>
+    </w:p>
+    <w:p>
+      <w:pPr>
+        <w:pStyle w:val="a7"/>
+        <w:rPr>
+          <w:sz w:val="28"/>
+          <w:szCs w:val="28"/>
+        </w:rPr>
+      </w:pPr>
+    </w:p>
+    <w:p>
+      <w:pPr>
+        <w:pStyle w:val="a7"/>
+        <w:numPr>
+          <w:ilvl w:val="1"/>
+          <w:numId w:val="3"/>
+        </w:numPr>
+        <w:jc w:val="center"/>
         <w:rPr>
           <w:b/>
           <w:bCs/>
           <w:sz w:val="32"/>
           <w:szCs w:val="32"/>
-          <w:lang w:val="en-US"/>
-        </w:rPr>
-        <w:t xml:space="preserve"> </w:t>
-      </w:r>
+        </w:rPr>
+      </w:pPr>
       <w:r>
         <w:rPr>
           <w:b/>
           <w:bCs/>
-          <w:sz w:val="32"/>
-          <w:szCs w:val="32"/>
-        </w:rPr>
-        <w:t>л</w:t>
-      </w:r>
-      <w:r>
+          <w:sz w:val="28"/>
+          <w:szCs w:val="28"/>
+        </w:rPr>
+        <w:t>Результаты вычислений статистик</w:t>
+      </w:r>
+    </w:p>
+    <w:p>
+      <w:pPr>
+        <w:rPr>
+          <w:sz w:val="28"/>
+          <w:szCs w:val="28"/>
+        </w:rPr>
+      </w:pPr>
+    </w:p>
+    <w:p>
+      <w:pPr>
+        <w:rPr>
+          <w:sz w:val="28"/>
+          <w:szCs w:val="28"/>
+          <w:lang w:val="en-US"/>
+        </w:rPr>
+      </w:pPr>
+      <w:r>
+        <w:rPr>
+          <w:sz w:val="28"/>
+          <w:szCs w:val="28"/>
+        </w:rPr>
+        <w:t>Результат работы написанных функций был следующим</w:t>
+      </w:r>
+      <w:r>
+        <w:rPr>
+          <w:sz w:val="28"/>
+          <w:szCs w:val="28"/>
+        </w:rPr>
+        <w:t>:</w:t>
+      </w:r>
+    </w:p>
+    <w:p>
+      <w:pPr>
+        <w:rPr>
+          <w:sz w:val="28"/>
+          <w:szCs w:val="28"/>
+          <w:lang w:val="en-US"/>
+        </w:rPr>
+      </w:pPr>
+      <w:r>
+        <w:rPr>
+          <w:sz w:val="28"/>
+          <w:szCs w:val="28"/>
+        </w:rPr>
+        <w:t xml:space="preserve">Для </w:t>
+      </w:r>
+      <w:r>
+        <w:rPr>
+          <w:sz w:val="28"/>
+          <w:szCs w:val="28"/>
+          <w:lang w:val="en-US"/>
+        </w:rPr>
+        <w:t>k = 3:</w:t>
+      </w:r>
+    </w:p>
+    <w:p>
+      <w:pPr>
+        <w:rPr>
+          <w:sz w:val="28"/>
+          <w:szCs w:val="28"/>
+          <w:lang w:val="en-US"/>
+        </w:rPr>
+      </w:pPr>
+    </w:p>
+    <w:p>
+      <w:pPr>
+        <w:rPr>
+          <w:sz w:val="28"/>
+          <w:szCs w:val="28"/>
+        </w:rPr>
+      </w:pPr>
+      <w:r>
+        <w:rPr>
+          <w:sz w:val="28"/>
+          <w:szCs w:val="28"/>
+        </w:rPr>
+        <w:t>Количество элементов: 300</w:t>
+      </w:r>
+    </w:p>
+    <w:p>
+      <w:pPr>
+        <w:rPr>
+          <w:sz w:val="28"/>
+          <w:szCs w:val="28"/>
+        </w:rPr>
+      </w:pPr>
+      <w:r>
+        <w:rPr>
+          <w:sz w:val="28"/>
+          <w:szCs w:val="28"/>
+        </w:rPr>
+        <w:t>Сумма: 251.787422</w:t>
+      </w:r>
+    </w:p>
+    <w:p>
+      <w:pPr>
+        <w:rPr>
+          <w:sz w:val="28"/>
+          <w:szCs w:val="28"/>
+        </w:rPr>
+      </w:pPr>
+      <w:r>
+        <w:rPr>
+          <w:sz w:val="28"/>
+          <w:szCs w:val="28"/>
+        </w:rPr>
+        <w:t>Выборочное среднее: 0.8392914066666667</w:t>
+      </w:r>
+    </w:p>
+    <w:p>
+      <w:pPr>
+        <w:rPr>
+          <w:sz w:val="28"/>
+          <w:szCs w:val="28"/>
+        </w:rPr>
+      </w:pPr>
+      <w:r>
+        <w:rPr>
+          <w:sz w:val="28"/>
+          <w:szCs w:val="28"/>
+        </w:rPr>
+        <w:t>Медиана: 3.9813270000000003</w:t>
+      </w:r>
+    </w:p>
+    <w:p>
+      <w:pPr>
+        <w:rPr>
+          <w:sz w:val="28"/>
+          <w:szCs w:val="28"/>
+        </w:rPr>
+      </w:pPr>
+      <w:r>
+        <w:rPr>
+          <w:sz w:val="28"/>
+          <w:szCs w:val="28"/>
+        </w:rPr>
+        <w:t>Мода: -4.223468</w:t>
+      </w:r>
+    </w:p>
+    <w:p>
+      <w:pPr>
+        <w:rPr>
+          <w:sz w:val="28"/>
+          <w:szCs w:val="28"/>
+        </w:rPr>
+      </w:pPr>
+      <w:r>
+        <w:rPr>
+          <w:sz w:val="28"/>
+          <w:szCs w:val="28"/>
+        </w:rPr>
+        <w:t>Размах: 28.723799999999997</w:t>
+      </w:r>
+    </w:p>
+    <w:p>
+      <w:pPr>
+        <w:rPr>
+          <w:sz w:val="28"/>
+          <w:szCs w:val="28"/>
+        </w:rPr>
+      </w:pPr>
+      <w:r>
+        <w:rPr>
+          <w:sz w:val="28"/>
+          <w:szCs w:val="28"/>
+        </w:rPr>
+        <w:t>Смещённая дисперсия: 56.99760139626665</w:t>
+      </w:r>
+    </w:p>
+    <w:p>
+      <w:pPr>
+        <w:rPr>
+          <w:sz w:val="28"/>
+          <w:szCs w:val="28"/>
+        </w:rPr>
+      </w:pPr>
+      <w:r>
+        <w:rPr>
+          <w:sz w:val="28"/>
+          <w:szCs w:val="28"/>
+        </w:rPr>
+        <w:t>Несмещённая дисперсия: 57.188228825685606</w:t>
+      </w:r>
+    </w:p>
+    <w:p>
+      <w:pPr>
+        <w:rPr>
+          <w:sz w:val="28"/>
+          <w:szCs w:val="28"/>
+        </w:rPr>
+      </w:pPr>
+      <w:r>
+        <w:rPr>
+          <w:sz w:val="28"/>
+          <w:szCs w:val="28"/>
+        </w:rPr>
+        <w:t>Начальный момент 3-го порядка: 104.33700333162143</w:t>
+      </w:r>
+    </w:p>
+    <w:p>
+      <w:pPr>
+        <w:rPr>
+          <w:sz w:val="28"/>
+          <w:szCs w:val="28"/>
+          <w:lang w:val="en-US"/>
+        </w:rPr>
+      </w:pPr>
+      <w:r>
+        <w:rPr>
+          <w:sz w:val="28"/>
+          <w:szCs w:val="28"/>
+        </w:rPr>
+        <w:t>Центральный момент 3-го порядка: -39.76699314045393</w:t>
+      </w:r>
+    </w:p>
+    <w:p>
+      <w:pPr>
+        <w:rPr>
+          <w:sz w:val="28"/>
+          <w:szCs w:val="28"/>
+        </w:rPr>
+      </w:pPr>
+    </w:p>
+    <w:p>
+      <w:pPr>
+        <w:rPr>
+          <w:sz w:val="28"/>
+          <w:szCs w:val="28"/>
+        </w:rPr>
+      </w:pPr>
+    </w:p>
+    <w:p>
+      <w:pPr>
+        <w:jc w:val="center"/>
         <w:rPr>
           <w:b/>
           <w:bCs/>
           <w:sz w:val="32"/>
           <w:szCs w:val="32"/>
         </w:rPr>
-        <w:t>итературы</w:t>
-      </w:r>
-    </w:p>
-    <w:p>
-      <w:pPr>
-        <w:jc w:val="center"/>
+      </w:pPr>
+      <w:r>
         <w:rPr>
           <w:b/>
           <w:bCs/>
           <w:sz w:val="32"/>
           <w:szCs w:val="32"/>
-          <w:lang w:val="en-US"/>
-        </w:rPr>
-      </w:pPr>
-    </w:p>
-    <w:p>
-      <w:pPr>
+        </w:rPr>
+        <w:t>Список</w:t>
+      </w:r>
+      <w:r>
         <w:rPr>
           <w:b/>
           <w:bCs/>
-          <w:sz w:val="28"/>
-          <w:szCs w:val="28"/>
-        </w:rPr>
-      </w:pPr>
+          <w:sz w:val="32"/>
+          <w:szCs w:val="32"/>
+        </w:rPr>
+        <w:t xml:space="preserve"> </w:t>
+      </w:r>
       <w:r>
         <w:rPr>
           <w:b/>
           <w:bCs/>
-          <w:sz w:val="28"/>
-          <w:szCs w:val="28"/>
-          <w:lang w:val="en-US"/>
-        </w:rPr>
-        <w:t xml:space="preserve">[1] Pearson K. Tables of the Incomplete Gamma-Function / computed by the staff of the Department of Applied Statistics, University of London. — </w:t>
+          <w:sz w:val="32"/>
+          <w:szCs w:val="32"/>
+        </w:rPr>
+        <w:t>использованной</w:t>
       </w:r>
       <w:r>
         <w:rPr>
           <w:b/>
           <w:bCs/>
-          <w:sz w:val="28"/>
-          <w:szCs w:val="28"/>
-          <w:lang w:val="en-US"/>
-        </w:rPr>
-        <w:t>London:</w:t>
+          <w:sz w:val="32"/>
+          <w:szCs w:val="32"/>
+        </w:rPr>
+        <w:t xml:space="preserve"> </w:t>
       </w:r>
       <w:r>
         <w:rPr>
           <w:b/>
           <w:bCs/>
-          <w:sz w:val="28"/>
-          <w:szCs w:val="28"/>
-          <w:lang w:val="en-US"/>
-        </w:rPr>
-        <w:t xml:space="preserve"> University of London, 1922. — URL: </w:t>
+          <w:sz w:val="32"/>
+          <w:szCs w:val="32"/>
+        </w:rPr>
+        <w:t>л</w:t>
+      </w:r>
+      <w:r>
+        <w:rPr>
+          <w:b/>
+          <w:bCs/>
+          <w:sz w:val="32"/>
+          <w:szCs w:val="32"/>
+        </w:rPr>
+        <w:t>итературы</w:t>
+      </w:r>
+    </w:p>
+    <w:p>
+      <w:pPr>
+        <w:jc w:val="center"/>
+        <w:rPr>
+          <w:b/>
+          <w:bCs/>
+          <w:sz w:val="32"/>
+          <w:szCs w:val="32"/>
+        </w:rPr>
+      </w:pPr>
+    </w:p>
+    <w:p>
+      <w:pPr>
+        <w:rPr>
+          <w:b/>
+          <w:bCs/>
+          <w:sz w:val="28"/>
+          <w:szCs w:val="28"/>
+          <w:lang w:val="en-US"/>
+        </w:rPr>
+      </w:pPr>
+      <w:r>
+        <w:rPr>
+          <w:b/>
+          <w:bCs/>
+          <w:sz w:val="28"/>
+          <w:szCs w:val="28"/>
+          <w:lang w:val="en-US"/>
+        </w:rPr>
+        <w:t xml:space="preserve">[1] Pearson K. Tables of the Incomplete Gamma-Function / computed by the staff of the Department of Applied Statistics, University of London. — London: University of London, 1922. — URL: </w:t>
       </w:r>
       <w:hyperlink r:id="rId6" w:history="1">
         <w:r>
@@ -2947,6 +5222,7 @@
           <w:bCs/>
           <w:sz w:val="28"/>
           <w:szCs w:val="28"/>
+          <w:lang w:val="en-US"/>
         </w:rPr>
       </w:pPr>
     </w:p>
@@ -2957,6 +5233,7 @@
           <w:bCs/>
           <w:sz w:val="28"/>
           <w:szCs w:val="28"/>
+          <w:lang w:val="en-US"/>
         </w:rPr>
       </w:pPr>
       <w:r>
@@ -2967,9 +5244,11 @@
           <w:szCs w:val="28"/>
           <w:lang w:val="en-US"/>
         </w:rPr>
-        <w:t xml:space="preserve">[2] Bain L. J., Engelhardt M. Introduction to Probability and Mathematical Statistics. — 2nd ed. — </w:t>
-      </w:r>
-      <w:r>
+        <w:t>[2] Bain L. J., Engelhardt M. Introduction to Probability and Mathematical Statistics. — 2nd ed. — Belmont: Brooks/Cole, 1992. — 644 p.</w:t>
+      </w:r>
+    </w:p>
+    <w:p>
+      <w:pPr>
         <w:rPr>
           <w:b/>
           <w:bCs/>
@@ -2977,9 +5256,10 @@
           <w:szCs w:val="28"/>
           <w:lang w:val="en-US"/>
         </w:rPr>
-        <w:t>Belmont:</w:t>
-      </w:r>
-      <w:r>
+      </w:pPr>
+    </w:p>
+    <w:p>
+      <w:pPr>
         <w:rPr>
           <w:b/>
           <w:bCs/>
@@ -2987,21 +5267,19 @@
           <w:szCs w:val="28"/>
           <w:lang w:val="en-US"/>
         </w:rPr>
-        <w:t xml:space="preserve"> Brooks/Cole, 1992. — 644 p.</w:t>
-      </w:r>
-    </w:p>
-    <w:p>
-      <w:pPr>
+      </w:pPr>
+      <w:r>
         <w:rPr>
           <w:b/>
           <w:bCs/>
           <w:sz w:val="28"/>
           <w:szCs w:val="28"/>
-        </w:rPr>
-      </w:pPr>
-    </w:p>
-    <w:p>
-      <w:pPr>
+          <w:lang w:val="en-US"/>
+        </w:rPr>
+        <w:t xml:space="preserve">[3] </w:t>
+      </w:r>
+      <w:proofErr w:type="spellStart"/>
+      <w:r>
         <w:rPr>
           <w:b/>
           <w:bCs/>
@@ -3009,7 +5287,9 @@
           <w:szCs w:val="28"/>
           <w:lang w:val="en-US"/>
         </w:rPr>
-      </w:pPr>
+        <w:t>Bahashwan</w:t>
+      </w:r>
+      <w:proofErr w:type="spellEnd"/>
       <w:r>
         <w:rPr>
           <w:b/>
@@ -3018,7 +5298,51 @@
           <w:szCs w:val="28"/>
           <w:lang w:val="en-US"/>
         </w:rPr>
-        <w:t>[3] Bahashwan A. O., Kalantan Z. I., Adham S. A. Double Gamma Principal Components Analysis // Applied Mathematical Sciences. — 2018. — Vol. 12, № 11. — P. 523–533. — DOI: 10.12988/ams.2018.8455.</w:t>
+        <w:t xml:space="preserve"> A. O., </w:t>
+      </w:r>
+      <w:proofErr w:type="spellStart"/>
+      <w:r>
+        <w:rPr>
+          <w:b/>
+          <w:bCs/>
+          <w:sz w:val="28"/>
+          <w:szCs w:val="28"/>
+          <w:lang w:val="en-US"/>
+        </w:rPr>
+        <w:t>Kalantan</w:t>
+      </w:r>
+      <w:proofErr w:type="spellEnd"/>
+      <w:r>
+        <w:rPr>
+          <w:b/>
+          <w:bCs/>
+          <w:sz w:val="28"/>
+          <w:szCs w:val="28"/>
+          <w:lang w:val="en-US"/>
+        </w:rPr>
+        <w:t xml:space="preserve"> Z. I., </w:t>
+      </w:r>
+      <w:proofErr w:type="spellStart"/>
+      <w:r>
+        <w:rPr>
+          <w:b/>
+          <w:bCs/>
+          <w:sz w:val="28"/>
+          <w:szCs w:val="28"/>
+          <w:lang w:val="en-US"/>
+        </w:rPr>
+        <w:t>Adham</w:t>
+      </w:r>
+      <w:proofErr w:type="spellEnd"/>
+      <w:r>
+        <w:rPr>
+          <w:b/>
+          <w:bCs/>
+          <w:sz w:val="28"/>
+          <w:szCs w:val="28"/>
+          <w:lang w:val="en-US"/>
+        </w:rPr>
+        <w:t xml:space="preserve"> S. A. Double Gamma Principal Components Analysis // Applied Mathematical Sciences. — 2018. — Vol. 12, № 11. — P. 523–533. — DOI: 10.12988/ams.2018.8455.</w:t>
       </w:r>
     </w:p>
     <w:p>
@@ -3045,6 +5369,121 @@
 <file path=word/numbering.xml><?xml version="1.0" encoding="utf-8"?>
 <w:numbering xmlns:wpc="http://schemas.microsoft.com/office/word/2010/wordprocessingCanvas" xmlns:cx="http://schemas.microsoft.com/office/drawing/2014/chartex" xmlns:cx1="http://schemas.microsoft.com/office/drawing/2015/9/8/chartex" xmlns:cx2="http://schemas.microsoft.com/office/drawing/2015/10/21/chartex" xmlns:cx3="http://schemas.microsoft.com/office/drawing/2016/5/9/chartex" xmlns:cx4="http://schemas.microsoft.com/office/drawing/2016/5/10/chartex" xmlns:cx5="http://schemas.microsoft.com/office/drawing/2016/5/11/chartex" xmlns:cx6="http://schemas.microsoft.com/office/drawing/2016/5/12/chartex" xmlns:cx7="http://schemas.microsoft.com/office/drawing/2016/5/13/chartex" xmlns:cx8="http://schemas.microsoft.com/office/drawing/2016/5/14/chartex" xmlns:mc="http://schemas.openxmlformats.org/markup-compatibility/2006" xmlns:aink="http://schemas.microsoft.com/office/drawing/2016/ink" xmlns:am3d="http://schemas.microsoft.com/office/drawing/2017/model3d" xmlns:o="urn:schemas-microsoft-com:office:office" xmlns:oel="http://schemas.microsoft.com/office/2019/extlst" xmlns:r="http://schemas.openxmlformats.org/officeDocument/2006/relationships" xmlns:m="http://schemas.openxmlformats.org/officeDocument/2006/math" xmlns:v="urn:schemas-microsoft-com:vml" xmlns:wp14="http://schemas.microsoft.com/office/word/2010/wordprocessingDrawing" xmlns:wp="http://schemas.openxmlformats.org/drawingml/2006/wordprocessingDrawing" xmlns:w10="urn:schemas-microsoft-com:office:word" xmlns:w="http://schemas.openxmlformats.org/wordprocessingml/2006/main" xmlns:w14="http://schemas.microsoft.com/office/word/2010/wordml" xmlns:w15="http://schemas.microsoft.com/office/word/2012/wordml" xmlns:w16cex="http://schemas.microsoft.com/office/word/2018/wordml/cex" xmlns:w16cid="http://schemas.microsoft.com/office/word/2016/wordml/cid" xmlns:w16="http://schemas.microsoft.com/office/word/2018/wordml" xmlns:w16sdtdh="http://schemas.microsoft.com/office/word/2020/wordml/sdtdatahash" xmlns:w16se="http://schemas.microsoft.com/office/word/2015/wordml/symex" xmlns:wpg="http://schemas.microsoft.com/office/word/2010/wordprocessingGroup" xmlns:wpi="http://schemas.microsoft.com/office/word/2010/wordprocessingInk" xmlns:wne="http://schemas.microsoft.com/office/word/2006/wordml" xmlns:wps="http://schemas.microsoft.com/office/word/2010/wordprocessingShape" mc:Ignorable="w14 w15 w16se w16cid w16 w16cex w16sdtdh wp14">
   <w:abstractNum w:abstractNumId="0" w15:restartNumberingAfterBreak="0">
+    <w:nsid w:val="04A97111"/>
+    <w:multiLevelType w:val="multilevel"/>
+    <w:tmpl w:val="C58AB752"/>
+    <w:lvl w:ilvl="0">
+      <w:start w:val="2"/>
+      <w:numFmt w:val="decimal"/>
+      <w:lvlText w:val="%1."/>
+      <w:lvlJc w:val="left"/>
+      <w:pPr>
+        <w:ind w:left="552" w:hanging="552"/>
+      </w:pPr>
+      <w:rPr>
+        <w:rFonts w:hint="default"/>
+      </w:rPr>
+    </w:lvl>
+    <w:lvl w:ilvl="1">
+      <w:start w:val="2"/>
+      <w:numFmt w:val="decimal"/>
+      <w:lvlText w:val="%1.%2."/>
+      <w:lvlJc w:val="left"/>
+      <w:pPr>
+        <w:ind w:left="1287" w:hanging="720"/>
+      </w:pPr>
+      <w:rPr>
+        <w:rFonts w:hint="default"/>
+        <w:sz w:val="28"/>
+        <w:szCs w:val="28"/>
+      </w:rPr>
+    </w:lvl>
+    <w:lvl w:ilvl="2">
+      <w:start w:val="1"/>
+      <w:numFmt w:val="decimal"/>
+      <w:lvlText w:val="%1.%2.%3."/>
+      <w:lvlJc w:val="left"/>
+      <w:pPr>
+        <w:ind w:left="1800" w:hanging="1080"/>
+      </w:pPr>
+      <w:rPr>
+        <w:rFonts w:hint="default"/>
+      </w:rPr>
+    </w:lvl>
+    <w:lvl w:ilvl="3">
+      <w:start w:val="1"/>
+      <w:numFmt w:val="decimal"/>
+      <w:lvlText w:val="%1.%2.%3.%4."/>
+      <w:lvlJc w:val="left"/>
+      <w:pPr>
+        <w:ind w:left="2160" w:hanging="1080"/>
+      </w:pPr>
+      <w:rPr>
+        <w:rFonts w:hint="default"/>
+      </w:rPr>
+    </w:lvl>
+    <w:lvl w:ilvl="4">
+      <w:start w:val="1"/>
+      <w:numFmt w:val="decimal"/>
+      <w:lvlText w:val="%1.%2.%3.%4.%5."/>
+      <w:lvlJc w:val="left"/>
+      <w:pPr>
+        <w:ind w:left="2880" w:hanging="1440"/>
+      </w:pPr>
+      <w:rPr>
+        <w:rFonts w:hint="default"/>
+      </w:rPr>
+    </w:lvl>
+    <w:lvl w:ilvl="5">
+      <w:start w:val="1"/>
+      <w:numFmt w:val="decimal"/>
+      <w:lvlText w:val="%1.%2.%3.%4.%5.%6."/>
+      <w:lvlJc w:val="left"/>
+      <w:pPr>
+        <w:ind w:left="3600" w:hanging="1800"/>
+      </w:pPr>
+      <w:rPr>
+        <w:rFonts w:hint="default"/>
+      </w:rPr>
+    </w:lvl>
+    <w:lvl w:ilvl="6">
+      <w:start w:val="1"/>
+      <w:numFmt w:val="decimal"/>
+      <w:lvlText w:val="%1.%2.%3.%4.%5.%6.%7."/>
+      <w:lvlJc w:val="left"/>
+      <w:pPr>
+        <w:ind w:left="4320" w:hanging="2160"/>
+      </w:pPr>
+      <w:rPr>
+        <w:rFonts w:hint="default"/>
+      </w:rPr>
+    </w:lvl>
+    <w:lvl w:ilvl="7">
+      <w:start w:val="1"/>
+      <w:numFmt w:val="decimal"/>
+      <w:lvlText w:val="%1.%2.%3.%4.%5.%6.%7.%8."/>
+      <w:lvlJc w:val="left"/>
+      <w:pPr>
+        <w:ind w:left="4680" w:hanging="2160"/>
+      </w:pPr>
+      <w:rPr>
+        <w:rFonts w:hint="default"/>
+      </w:rPr>
+    </w:lvl>
+    <w:lvl w:ilvl="8">
+      <w:start w:val="1"/>
+      <w:numFmt w:val="decimal"/>
+      <w:lvlText w:val="%1.%2.%3.%4.%5.%6.%7.%8.%9."/>
+      <w:lvlJc w:val="left"/>
+      <w:pPr>
+        <w:ind w:left="5400" w:hanging="2520"/>
+      </w:pPr>
+      <w:rPr>
+        <w:rFonts w:hint="default"/>
+      </w:rPr>
+    </w:lvl>
+  </w:abstractNum>
+  <w:abstractNum w:abstractNumId="1" w15:restartNumberingAfterBreak="0">
     <w:nsid w:val="09332B4A"/>
     <w:multiLevelType w:val="hybridMultilevel"/>
     <w:tmpl w:val="8A86C9C0"/>
@@ -3133,7 +5572,7 @@
       </w:pPr>
     </w:lvl>
   </w:abstractNum>
-  <w:abstractNum w:abstractNumId="1" w15:restartNumberingAfterBreak="0">
+  <w:abstractNum w:abstractNumId="2" w15:restartNumberingAfterBreak="0">
     <w:nsid w:val="20760212"/>
     <w:multiLevelType w:val="hybridMultilevel"/>
     <w:tmpl w:val="46A21DE2"/>
@@ -3222,7 +5661,129 @@
       </w:pPr>
     </w:lvl>
   </w:abstractNum>
-  <w:abstractNum w:abstractNumId="2" w15:restartNumberingAfterBreak="0">
+  <w:abstractNum w:abstractNumId="3" w15:restartNumberingAfterBreak="0">
+    <w:nsid w:val="42B83D0D"/>
+    <w:multiLevelType w:val="multilevel"/>
+    <w:tmpl w:val="B858AC80"/>
+    <w:lvl w:ilvl="0">
+      <w:start w:val="2"/>
+      <w:numFmt w:val="decimal"/>
+      <w:lvlText w:val="%1"/>
+      <w:lvlJc w:val="left"/>
+      <w:pPr>
+        <w:ind w:left="360" w:hanging="360"/>
+      </w:pPr>
+      <w:rPr>
+        <w:rFonts w:hint="default"/>
+        <w:sz w:val="28"/>
+      </w:rPr>
+    </w:lvl>
+    <w:lvl w:ilvl="1">
+      <w:start w:val="1"/>
+      <w:numFmt w:val="decimal"/>
+      <w:lvlText w:val="%1.%2"/>
+      <w:lvlJc w:val="left"/>
+      <w:pPr>
+        <w:ind w:left="1287" w:hanging="720"/>
+      </w:pPr>
+      <w:rPr>
+        <w:rFonts w:hint="default"/>
+        <w:sz w:val="28"/>
+      </w:rPr>
+    </w:lvl>
+    <w:lvl w:ilvl="2">
+      <w:start w:val="1"/>
+      <w:numFmt w:val="decimal"/>
+      <w:lvlText w:val="%1.%2.%3"/>
+      <w:lvlJc w:val="left"/>
+      <w:pPr>
+        <w:ind w:left="2214" w:hanging="1080"/>
+      </w:pPr>
+      <w:rPr>
+        <w:rFonts w:hint="default"/>
+        <w:sz w:val="28"/>
+      </w:rPr>
+    </w:lvl>
+    <w:lvl w:ilvl="3">
+      <w:start w:val="1"/>
+      <w:numFmt w:val="decimal"/>
+      <w:lvlText w:val="%1.%2.%3.%4"/>
+      <w:lvlJc w:val="left"/>
+      <w:pPr>
+        <w:ind w:left="3141" w:hanging="1440"/>
+      </w:pPr>
+      <w:rPr>
+        <w:rFonts w:hint="default"/>
+        <w:sz w:val="28"/>
+      </w:rPr>
+    </w:lvl>
+    <w:lvl w:ilvl="4">
+      <w:start w:val="1"/>
+      <w:numFmt w:val="decimal"/>
+      <w:lvlText w:val="%1.%2.%3.%4.%5"/>
+      <w:lvlJc w:val="left"/>
+      <w:pPr>
+        <w:ind w:left="3708" w:hanging="1440"/>
+      </w:pPr>
+      <w:rPr>
+        <w:rFonts w:hint="default"/>
+        <w:sz w:val="28"/>
+      </w:rPr>
+    </w:lvl>
+    <w:lvl w:ilvl="5">
+      <w:start w:val="1"/>
+      <w:numFmt w:val="decimal"/>
+      <w:lvlText w:val="%1.%2.%3.%4.%5.%6"/>
+      <w:lvlJc w:val="left"/>
+      <w:pPr>
+        <w:ind w:left="4635" w:hanging="1800"/>
+      </w:pPr>
+      <w:rPr>
+        <w:rFonts w:hint="default"/>
+        <w:sz w:val="28"/>
+      </w:rPr>
+    </w:lvl>
+    <w:lvl w:ilvl="6">
+      <w:start w:val="1"/>
+      <w:numFmt w:val="decimal"/>
+      <w:lvlText w:val="%1.%2.%3.%4.%5.%6.%7"/>
+      <w:lvlJc w:val="left"/>
+      <w:pPr>
+        <w:ind w:left="5562" w:hanging="2160"/>
+      </w:pPr>
+      <w:rPr>
+        <w:rFonts w:hint="default"/>
+        <w:sz w:val="28"/>
+      </w:rPr>
+    </w:lvl>
+    <w:lvl w:ilvl="7">
+      <w:start w:val="1"/>
+      <w:numFmt w:val="decimal"/>
+      <w:lvlText w:val="%1.%2.%3.%4.%5.%6.%7.%8"/>
+      <w:lvlJc w:val="left"/>
+      <w:pPr>
+        <w:ind w:left="6489" w:hanging="2520"/>
+      </w:pPr>
+      <w:rPr>
+        <w:rFonts w:hint="default"/>
+        <w:sz w:val="28"/>
+      </w:rPr>
+    </w:lvl>
+    <w:lvl w:ilvl="8">
+      <w:start w:val="1"/>
+      <w:numFmt w:val="decimal"/>
+      <w:lvlText w:val="%1.%2.%3.%4.%5.%6.%7.%8.%9"/>
+      <w:lvlJc w:val="left"/>
+      <w:pPr>
+        <w:ind w:left="7416" w:hanging="2880"/>
+      </w:pPr>
+      <w:rPr>
+        <w:rFonts w:hint="default"/>
+        <w:sz w:val="28"/>
+      </w:rPr>
+    </w:lvl>
+  </w:abstractNum>
+  <w:abstractNum w:abstractNumId="4" w15:restartNumberingAfterBreak="0">
     <w:nsid w:val="447579D3"/>
     <w:multiLevelType w:val="multilevel"/>
     <w:tmpl w:val="E062D2CE"/>
@@ -3351,10 +5912,10 @@
       </w:rPr>
     </w:lvl>
   </w:abstractNum>
-  <w:abstractNum w:abstractNumId="3" w15:restartNumberingAfterBreak="0">
-    <w:nsid w:val="591A7815"/>
+  <w:abstractNum w:abstractNumId="5" w15:restartNumberingAfterBreak="0">
+    <w:nsid w:val="4F5A6620"/>
     <w:multiLevelType w:val="hybridMultilevel"/>
-    <w:tmpl w:val="FC7A57BA"/>
+    <w:tmpl w:val="59BCE0F2"/>
     <w:lvl w:ilvl="0" w:tplc="0419000F">
       <w:start w:val="1"/>
       <w:numFmt w:val="decimal"/>
@@ -3440,17 +6001,115 @@
       </w:pPr>
     </w:lvl>
   </w:abstractNum>
+  <w:abstractNum w:abstractNumId="6" w15:restartNumberingAfterBreak="0">
+    <w:nsid w:val="591A7815"/>
+    <w:multiLevelType w:val="hybridMultilevel"/>
+    <w:tmpl w:val="FC7A57BA"/>
+    <w:lvl w:ilvl="0" w:tplc="0419000F">
+      <w:start w:val="1"/>
+      <w:numFmt w:val="decimal"/>
+      <w:lvlText w:val="%1."/>
+      <w:lvlJc w:val="left"/>
+      <w:pPr>
+        <w:ind w:left="720" w:hanging="360"/>
+      </w:pPr>
+      <w:rPr>
+        <w:rFonts w:hint="default"/>
+      </w:rPr>
+    </w:lvl>
+    <w:lvl w:ilvl="1" w:tplc="04190019" w:tentative="1">
+      <w:start w:val="1"/>
+      <w:numFmt w:val="lowerLetter"/>
+      <w:lvlText w:val="%2."/>
+      <w:lvlJc w:val="left"/>
+      <w:pPr>
+        <w:ind w:left="1440" w:hanging="360"/>
+      </w:pPr>
+    </w:lvl>
+    <w:lvl w:ilvl="2" w:tplc="0419001B" w:tentative="1">
+      <w:start w:val="1"/>
+      <w:numFmt w:val="lowerRoman"/>
+      <w:lvlText w:val="%3."/>
+      <w:lvlJc w:val="right"/>
+      <w:pPr>
+        <w:ind w:left="2160" w:hanging="180"/>
+      </w:pPr>
+    </w:lvl>
+    <w:lvl w:ilvl="3" w:tplc="0419000F" w:tentative="1">
+      <w:start w:val="1"/>
+      <w:numFmt w:val="decimal"/>
+      <w:lvlText w:val="%4."/>
+      <w:lvlJc w:val="left"/>
+      <w:pPr>
+        <w:ind w:left="2880" w:hanging="360"/>
+      </w:pPr>
+    </w:lvl>
+    <w:lvl w:ilvl="4" w:tplc="04190019" w:tentative="1">
+      <w:start w:val="1"/>
+      <w:numFmt w:val="lowerLetter"/>
+      <w:lvlText w:val="%5."/>
+      <w:lvlJc w:val="left"/>
+      <w:pPr>
+        <w:ind w:left="3600" w:hanging="360"/>
+      </w:pPr>
+    </w:lvl>
+    <w:lvl w:ilvl="5" w:tplc="0419001B" w:tentative="1">
+      <w:start w:val="1"/>
+      <w:numFmt w:val="lowerRoman"/>
+      <w:lvlText w:val="%6."/>
+      <w:lvlJc w:val="right"/>
+      <w:pPr>
+        <w:ind w:left="4320" w:hanging="180"/>
+      </w:pPr>
+    </w:lvl>
+    <w:lvl w:ilvl="6" w:tplc="0419000F" w:tentative="1">
+      <w:start w:val="1"/>
+      <w:numFmt w:val="decimal"/>
+      <w:lvlText w:val="%7."/>
+      <w:lvlJc w:val="left"/>
+      <w:pPr>
+        <w:ind w:left="5040" w:hanging="360"/>
+      </w:pPr>
+    </w:lvl>
+    <w:lvl w:ilvl="7" w:tplc="04190019" w:tentative="1">
+      <w:start w:val="1"/>
+      <w:numFmt w:val="lowerLetter"/>
+      <w:lvlText w:val="%8."/>
+      <w:lvlJc w:val="left"/>
+      <w:pPr>
+        <w:ind w:left="5760" w:hanging="360"/>
+      </w:pPr>
+    </w:lvl>
+    <w:lvl w:ilvl="8" w:tplc="0419001B" w:tentative="1">
+      <w:start w:val="1"/>
+      <w:numFmt w:val="lowerRoman"/>
+      <w:lvlText w:val="%9."/>
+      <w:lvlJc w:val="right"/>
+      <w:pPr>
+        <w:ind w:left="6480" w:hanging="180"/>
+      </w:pPr>
+    </w:lvl>
+  </w:abstractNum>
   <w:num w:numId="1" w16cid:durableId="765272132">
-    <w:abstractNumId w:val="3"/>
+    <w:abstractNumId w:val="6"/>
   </w:num>
   <w:num w:numId="2" w16cid:durableId="1280603550">
+    <w:abstractNumId w:val="1"/>
+  </w:num>
+  <w:num w:numId="3" w16cid:durableId="435517487">
+    <w:abstractNumId w:val="4"/>
+  </w:num>
+  <w:num w:numId="4" w16cid:durableId="718240523">
+    <w:abstractNumId w:val="2"/>
+  </w:num>
+  <w:num w:numId="5" w16cid:durableId="395593643">
     <w:abstractNumId w:val="0"/>
   </w:num>
-  <w:num w:numId="3" w16cid:durableId="435517487">
-    <w:abstractNumId w:val="2"/>
+  <w:num w:numId="6" w16cid:durableId="2027636951">
+    <w:abstractNumId w:val="5"/>
   </w:num>
-  <w:num w:numId="4" w16cid:durableId="718240523">
-    <w:abstractNumId w:val="1"/>
+  <w:num w:numId="7" w16cid:durableId="749816692">
+    <w:abstractNumId w:val="3"/>
   </w:num>
 </w:numbering>
 </file>
@@ -4404,6 +7063,31 @@
       <w:shd w:val="clear" w:color="auto" w:fill="E1DFDD"/>
     </w:rPr>
   </w:style>
+  <w:style w:type="paragraph" w:styleId="ae">
+    <w:name w:val="Normal (Web)"/>
+    <w:basedOn w:val="a"/>
+    <w:uiPriority w:val="99"/>
+    <w:semiHidden/>
+    <w:unhideWhenUsed/>
+    <w:rsid w:val="00DF15C2"/>
+    <w:rPr>
+      <w:sz w:val="24"/>
+      <w:szCs w:val="24"/>
+    </w:rPr>
+  </w:style>
+  <w:style w:type="character" w:styleId="HTML">
+    <w:name w:val="HTML Code"/>
+    <w:basedOn w:val="a0"/>
+    <w:uiPriority w:val="99"/>
+    <w:semiHidden/>
+    <w:unhideWhenUsed/>
+    <w:rsid w:val="00DF15C2"/>
+    <w:rPr>
+      <w:rFonts w:ascii="Courier New" w:eastAsia="Times New Roman" w:hAnsi="Courier New" w:cs="Courier New"/>
+      <w:sz w:val="20"/>
+      <w:szCs w:val="20"/>
+    </w:rPr>
+  </w:style>
 </w:styles>
 </file>
 

</xml_diff>

<commit_message>
vault backup: 2026-05-06 05:14:32
</commit_message>
<xml_diff>
--- a/Учеба 4 семестр/Теория вероятности/Курсовая работа/Отчет, Код/Курсовая работа.docx
+++ b/Учеба 4 семестр/Теория вероятности/Курсовая работа/Отчет, Код/Курсовая работа.docx
@@ -335,23 +335,7 @@
           <w:sz w:val="32"/>
           <w:szCs w:val="32"/>
         </w:rPr>
-        <w:t>&lt;</w:t>
-      </w:r>
-      <w:proofErr w:type="gramStart"/>
-      <w:r>
-        <w:rPr>
-          <w:sz w:val="32"/>
-          <w:szCs w:val="32"/>
-        </w:rPr>
-        <w:t xml:space="preserve">подпись&gt;   </w:t>
-      </w:r>
-      <w:proofErr w:type="gramEnd"/>
-      <w:r>
-        <w:rPr>
-          <w:sz w:val="32"/>
-          <w:szCs w:val="32"/>
-        </w:rPr>
-        <w:t xml:space="preserve"> </w:t>
+        <w:t xml:space="preserve">&lt;подпись&gt;    </w:t>
       </w:r>
       <w:r>
         <w:rPr>
@@ -1859,23 +1843,7 @@
           <w:sz w:val="28"/>
           <w:szCs w:val="28"/>
         </w:rPr>
-        <w:t xml:space="preserve">Объектом исследования является выборка случайной величины, подчиняющейся </w:t>
-      </w:r>
-      <w:proofErr w:type="gramStart"/>
-      <w:r>
-        <w:rPr>
-          <w:sz w:val="28"/>
-          <w:szCs w:val="28"/>
-        </w:rPr>
-        <w:t>двойному</w:t>
-      </w:r>
-      <w:proofErr w:type="gramEnd"/>
-      <w:r>
-        <w:rPr>
-          <w:sz w:val="28"/>
-          <w:szCs w:val="28"/>
-        </w:rPr>
-        <w:t xml:space="preserve"> гамма распределению. Предметом исследования — статистические свойства данной выборки и методы её анализа.</w:t>
+        <w:t>Объектом исследования является выборка случайной величины, подчиняющейся двойному гамма распределению. Предметом исследования — статистические свойства данной выборки и методы её анализа.</w:t>
       </w:r>
     </w:p>
     <w:p>
@@ -2283,7 +2251,42 @@
           <w:sz w:val="28"/>
           <w:szCs w:val="28"/>
         </w:rPr>
-        <w:t xml:space="preserve">Плотность такого распределения имеет вид: </w:t>
+        <w:t>Плотность такого распределения имеет вид</w:t>
+      </w:r>
+      <w:r>
+        <w:rPr>
+          <w:sz w:val="28"/>
+          <w:szCs w:val="28"/>
+        </w:rPr>
+        <w:t xml:space="preserve"> </w:t>
+      </w:r>
+      <w:r>
+        <w:rPr>
+          <w:sz w:val="28"/>
+          <w:szCs w:val="28"/>
+        </w:rPr>
+        <w:t>[</w:t>
+      </w:r>
+      <w:r>
+        <w:rPr>
+          <w:sz w:val="28"/>
+          <w:szCs w:val="28"/>
+        </w:rPr>
+        <w:t>3</w:t>
+      </w:r>
+      <w:r>
+        <w:rPr>
+          <w:sz w:val="28"/>
+          <w:szCs w:val="28"/>
+        </w:rPr>
+        <w:t>]</w:t>
+      </w:r>
+      <w:r>
+        <w:rPr>
+          <w:sz w:val="28"/>
+          <w:szCs w:val="28"/>
+        </w:rPr>
+        <w:t xml:space="preserve">: </w:t>
       </w:r>
       <w:r>
         <w:rPr>
@@ -2484,7 +2487,6 @@
         </w:rPr>
         <w:t xml:space="preserve">•  </w:t>
       </w:r>
-      <w:proofErr w:type="gramStart"/>
       <w:r>
         <w:rPr>
           <w:i/>
@@ -2499,15 +2501,7 @@
           <w:sz w:val="28"/>
           <w:szCs w:val="28"/>
         </w:rPr>
-        <w:t xml:space="preserve"> &gt;</w:t>
-      </w:r>
-      <w:proofErr w:type="gramEnd"/>
-      <w:r>
-        <w:rPr>
-          <w:sz w:val="28"/>
-          <w:szCs w:val="28"/>
-        </w:rPr>
-        <w:t xml:space="preserve"> 0 — параметр формы,</w:t>
+        <w:t xml:space="preserve"> &gt; 0 — параметр формы,</w:t>
       </w:r>
     </w:p>
     <w:p>
@@ -2524,7 +2518,6 @@
         </w:rPr>
         <w:t xml:space="preserve">•  </w:t>
       </w:r>
-      <w:proofErr w:type="gramStart"/>
       <w:r>
         <w:rPr>
           <w:i/>
@@ -2539,15 +2532,7 @@
           <w:sz w:val="28"/>
           <w:szCs w:val="28"/>
         </w:rPr>
-        <w:t xml:space="preserve"> &gt;</w:t>
-      </w:r>
-      <w:proofErr w:type="gramEnd"/>
-      <w:r>
-        <w:rPr>
-          <w:sz w:val="28"/>
-          <w:szCs w:val="28"/>
-        </w:rPr>
-        <w:t xml:space="preserve"> 0 — параметр масштаба,</w:t>
+        <w:t xml:space="preserve"> &gt; 0 — параметр масштаба,</w:t>
       </w:r>
     </w:p>
     <w:p>
@@ -2660,21 +2645,7 @@
           <w:sz w:val="28"/>
           <w:szCs w:val="28"/>
         </w:rPr>
-        <w:t xml:space="preserve"> [</w:t>
-      </w:r>
-      <w:r>
-        <w:rPr>
-          <w:sz w:val="28"/>
-          <w:szCs w:val="28"/>
-        </w:rPr>
-        <w:t>3</w:t>
-      </w:r>
-      <w:r>
-        <w:rPr>
-          <w:sz w:val="28"/>
-          <w:szCs w:val="28"/>
-        </w:rPr>
-        <w:t>]</w:t>
+        <w:t xml:space="preserve"> </w:t>
       </w:r>
     </w:p>
     <w:p>
@@ -3412,15 +3383,7 @@
           <w:rFonts w:ascii="Courier New" w:hAnsi="Courier New" w:cs="Courier New"/>
           <w:lang w:val="en-US"/>
         </w:rPr>
-        <w:t>X_</w:t>
-      </w:r>
-      <w:proofErr w:type="gramStart"/>
-      <w:r>
-        <w:rPr>
-          <w:rFonts w:ascii="Courier New" w:hAnsi="Courier New" w:cs="Courier New"/>
-          <w:lang w:val="en-US"/>
-        </w:rPr>
-        <w:t>sorted</w:t>
+        <w:t>X_sorted</w:t>
       </w:r>
       <w:proofErr w:type="spellEnd"/>
       <w:r>
@@ -3428,15 +3391,7 @@
           <w:rFonts w:ascii="Courier New" w:hAnsi="Courier New" w:cs="Courier New"/>
           <w:lang w:val="en-US"/>
         </w:rPr>
-        <w:t>[</w:t>
-      </w:r>
-      <w:proofErr w:type="gramEnd"/>
-      <w:r>
-        <w:rPr>
-          <w:rFonts w:ascii="Courier New" w:hAnsi="Courier New" w:cs="Courier New"/>
-          <w:lang w:val="en-US"/>
-        </w:rPr>
-        <w:t>n // 2]</w:t>
+        <w:t>[n // 2]</w:t>
       </w:r>
       <w:r>
         <w:rPr>
@@ -4455,15 +4410,7 @@
           <w:rFonts w:ascii="Courier New" w:hAnsi="Courier New" w:cs="Courier New"/>
           <w:lang w:val="en-US"/>
         </w:rPr>
-        <w:t>raw_</w:t>
-      </w:r>
-      <w:proofErr w:type="gramStart"/>
-      <w:r>
-        <w:rPr>
-          <w:rFonts w:ascii="Courier New" w:hAnsi="Courier New" w:cs="Courier New"/>
-          <w:lang w:val="en-US"/>
-        </w:rPr>
-        <w:t>moment</w:t>
+        <w:t>raw_moment</w:t>
       </w:r>
       <w:proofErr w:type="spellEnd"/>
       <w:r>
@@ -4471,15 +4418,7 @@
           <w:rFonts w:ascii="Courier New" w:hAnsi="Courier New" w:cs="Courier New"/>
           <w:lang w:val="en-US"/>
         </w:rPr>
-        <w:t>(</w:t>
-      </w:r>
-      <w:proofErr w:type="gramEnd"/>
-      <w:r>
-        <w:rPr>
-          <w:rFonts w:ascii="Courier New" w:hAnsi="Courier New" w:cs="Courier New"/>
-          <w:lang w:val="en-US"/>
-        </w:rPr>
-        <w:t>X, k):</w:t>
+        <w:t>(X, k):</w:t>
       </w:r>
       <w:r>
         <w:rPr>
@@ -4657,15 +4596,7 @@
           <w:rFonts w:ascii="Courier New" w:hAnsi="Courier New" w:cs="Courier New"/>
           <w:lang w:val="en-US"/>
         </w:rPr>
-        <w:t>central_</w:t>
-      </w:r>
-      <w:proofErr w:type="gramStart"/>
-      <w:r>
-        <w:rPr>
-          <w:rFonts w:ascii="Courier New" w:hAnsi="Courier New" w:cs="Courier New"/>
-          <w:lang w:val="en-US"/>
-        </w:rPr>
-        <w:t>moment</w:t>
+        <w:t>central_moment</w:t>
       </w:r>
       <w:proofErr w:type="spellEnd"/>
       <w:r>
@@ -4673,15 +4604,7 @@
           <w:rFonts w:ascii="Courier New" w:hAnsi="Courier New" w:cs="Courier New"/>
           <w:lang w:val="en-US"/>
         </w:rPr>
-        <w:t>(</w:t>
-      </w:r>
-      <w:proofErr w:type="gramEnd"/>
-      <w:r>
-        <w:rPr>
-          <w:rFonts w:ascii="Courier New" w:hAnsi="Courier New" w:cs="Courier New"/>
-          <w:lang w:val="en-US"/>
-        </w:rPr>
-        <w:t>X, k):</w:t>
+        <w:t>(X, k):</w:t>
       </w:r>
       <w:r>
         <w:rPr>
@@ -4839,54 +4762,21 @@
         <w:rPr>
           <w:sz w:val="28"/>
           <w:szCs w:val="28"/>
-          <w:lang w:val="en-US"/>
-        </w:rPr>
-      </w:pPr>
-      <w:r>
-        <w:rPr>
-          <w:sz w:val="28"/>
-          <w:szCs w:val="28"/>
-        </w:rPr>
-        <w:t>Результат работы написанных функций был следующим</w:t>
-      </w:r>
-      <w:r>
-        <w:rPr>
-          <w:sz w:val="28"/>
-          <w:szCs w:val="28"/>
-        </w:rPr>
-        <w:t>:</w:t>
-      </w:r>
-    </w:p>
-    <w:p>
-      <w:pPr>
-        <w:rPr>
-          <w:sz w:val="28"/>
-          <w:szCs w:val="28"/>
-          <w:lang w:val="en-US"/>
-        </w:rPr>
-      </w:pPr>
-      <w:r>
-        <w:rPr>
-          <w:sz w:val="28"/>
-          <w:szCs w:val="28"/>
-        </w:rPr>
-        <w:t xml:space="preserve">Для </w:t>
-      </w:r>
-      <w:r>
-        <w:rPr>
-          <w:sz w:val="28"/>
-          <w:szCs w:val="28"/>
-          <w:lang w:val="en-US"/>
-        </w:rPr>
-        <w:t>k = 3:</w:t>
-      </w:r>
-    </w:p>
-    <w:p>
-      <w:pPr>
-        <w:rPr>
-          <w:sz w:val="28"/>
-          <w:szCs w:val="28"/>
-          <w:lang w:val="en-US"/>
+        </w:rPr>
+      </w:pPr>
+      <w:r>
+        <w:rPr>
+          <w:sz w:val="28"/>
+          <w:szCs w:val="28"/>
+        </w:rPr>
+        <w:t>Результаты работы реализованных функций для предоставленной выборки объёмом n = 300 при k = 3:</w:t>
+      </w:r>
+    </w:p>
+    <w:p>
+      <w:pPr>
+        <w:rPr>
+          <w:sz w:val="28"/>
+          <w:szCs w:val="28"/>
         </w:rPr>
       </w:pPr>
     </w:p>

</xml_diff>

<commit_message>
vault backup: 2026-05-06 12:30:32
</commit_message>
<xml_diff>
--- a/Учеба 4 семестр/Теория вероятности/Курсовая работа/Отчет, Код/Курсовая работа.docx
+++ b/Учеба 4 семестр/Теория вероятности/Курсовая работа/Отчет, Код/Курсовая работа.docx
@@ -51,7 +51,27 @@
           <w:szCs w:val="36"/>
           <w:u w:val="single"/>
         </w:rPr>
-        <w:t>Кафедра «Информационная безопасность компьютерных систем»</w:t>
+        <w:t>Кафедра «</w:t>
+      </w:r>
+      <w:r>
+        <w:rPr>
+          <w:b/>
+          <w:bCs/>
+          <w:sz w:val="36"/>
+          <w:szCs w:val="36"/>
+          <w:u w:val="single"/>
+        </w:rPr>
+        <w:t>Высшая школа кибербезопасности</w:t>
+      </w:r>
+      <w:r>
+        <w:rPr>
+          <w:b/>
+          <w:bCs/>
+          <w:sz w:val="36"/>
+          <w:szCs w:val="36"/>
+          <w:u w:val="single"/>
+        </w:rPr>
+        <w:t>»</w:t>
       </w:r>
     </w:p>
     <w:p>
@@ -587,7 +607,6 @@
           <w:sz w:val="32"/>
           <w:szCs w:val="32"/>
         </w:rPr>
-        <w:lastRenderedPageBreak/>
         <w:t>СОДЕРЖАНИЕ</w:t>
       </w:r>
     </w:p>
@@ -603,6 +622,7 @@
           <w:sz w:val="24"/>
           <w:szCs w:val="24"/>
         </w:rPr>
+        <w:lastRenderedPageBreak/>
         <w:t>Введение</w:t>
       </w:r>
       <w:r>
@@ -790,7 +810,13 @@
           <w:szCs w:val="24"/>
         </w:rPr>
         <w:tab/>
-        <w:t>15</w:t>
+      </w:r>
+      <w:r>
+        <w:rPr>
+          <w:sz w:val="24"/>
+          <w:szCs w:val="24"/>
+        </w:rPr>
+        <w:t>7</w:t>
       </w:r>
     </w:p>
     <w:p>
@@ -813,7 +839,13 @@
           <w:szCs w:val="24"/>
         </w:rPr>
         <w:tab/>
-        <w:t>18</w:t>
+      </w:r>
+      <w:r>
+        <w:rPr>
+          <w:sz w:val="24"/>
+          <w:szCs w:val="24"/>
+        </w:rPr>
+        <w:t>7</w:t>
       </w:r>
     </w:p>
     <w:p>
@@ -837,7 +869,13 @@
           <w:szCs w:val="24"/>
         </w:rPr>
         <w:tab/>
-        <w:t>18</w:t>
+      </w:r>
+      <w:r>
+        <w:rPr>
+          <w:sz w:val="24"/>
+          <w:szCs w:val="24"/>
+        </w:rPr>
+        <w:t>7</w:t>
       </w:r>
     </w:p>
     <w:p>
@@ -853,24 +891,58 @@
           <w:sz w:val="24"/>
           <w:szCs w:val="24"/>
         </w:rPr>
-        <w:t xml:space="preserve">3.2. Реализация на языке Python и анализ </w:t>
-      </w:r>
-      <w:proofErr w:type="spellStart"/>
-      <w:r>
-        <w:rPr>
-          <w:sz w:val="24"/>
-          <w:szCs w:val="24"/>
-        </w:rPr>
-        <w:t>подвыборок</w:t>
-      </w:r>
-      <w:proofErr w:type="spellEnd"/>
+        <w:t xml:space="preserve">3.2. Реализация </w:t>
+      </w:r>
+      <w:r>
+        <w:rPr>
+          <w:sz w:val="24"/>
+          <w:szCs w:val="24"/>
+        </w:rPr>
+        <w:t xml:space="preserve">эмпирической функции </w:t>
+      </w:r>
+      <w:r>
+        <w:rPr>
+          <w:sz w:val="24"/>
+          <w:szCs w:val="24"/>
+        </w:rPr>
+        <w:t>на языке Python</w:t>
+      </w:r>
       <w:r>
         <w:rPr>
           <w:sz w:val="24"/>
           <w:szCs w:val="24"/>
         </w:rPr>
         <w:tab/>
-        <w:t>20</w:t>
+      </w:r>
+      <w:r>
+        <w:rPr>
+          <w:sz w:val="24"/>
+          <w:szCs w:val="24"/>
+        </w:rPr>
+        <w:t>9</w:t>
+      </w:r>
+    </w:p>
+    <w:p>
+      <w:pPr>
+        <w:tabs>
+          <w:tab w:val="right" w:leader="dot" w:pos="9000"/>
+        </w:tabs>
+        <w:spacing w:before="40" w:after="40" w:line="276" w:lineRule="auto"/>
+      </w:pPr>
+      <w:r>
+        <w:rPr>
+          <w:sz w:val="24"/>
+          <w:szCs w:val="24"/>
+        </w:rPr>
+        <w:t>4. Гистограмма</w:t>
+      </w:r>
+      <w:r>
+        <w:rPr>
+          <w:sz w:val="24"/>
+          <w:szCs w:val="24"/>
+        </w:rPr>
+        <w:tab/>
+        <w:t>26</w:t>
       </w:r>
     </w:p>
     <w:p>
@@ -886,30 +958,7 @@
           <w:sz w:val="24"/>
           <w:szCs w:val="24"/>
         </w:rPr>
-        <w:t>3.3. Выводы о виде эмпирической функции распределения</w:t>
-      </w:r>
-      <w:r>
-        <w:rPr>
-          <w:sz w:val="24"/>
-          <w:szCs w:val="24"/>
-        </w:rPr>
-        <w:tab/>
-        <w:t>24</w:t>
-      </w:r>
-    </w:p>
-    <w:p>
-      <w:pPr>
-        <w:tabs>
-          <w:tab w:val="right" w:leader="dot" w:pos="9000"/>
-        </w:tabs>
-        <w:spacing w:before="40" w:after="40" w:line="276" w:lineRule="auto"/>
-      </w:pPr>
-      <w:r>
-        <w:rPr>
-          <w:sz w:val="24"/>
-          <w:szCs w:val="24"/>
-        </w:rPr>
-        <w:t>4. Гистограмма</w:t>
+        <w:t>4.1. Определение и алгоритм построения</w:t>
       </w:r>
       <w:r>
         <w:rPr>
@@ -933,15 +982,24 @@
           <w:sz w:val="24"/>
           <w:szCs w:val="24"/>
         </w:rPr>
-        <w:t>4.1. Определение и алгоритм построения</w:t>
-      </w:r>
+        <w:t xml:space="preserve">4.2. Реализация на языке Python и анализ </w:t>
+      </w:r>
+      <w:proofErr w:type="spellStart"/>
+      <w:r>
+        <w:rPr>
+          <w:sz w:val="24"/>
+          <w:szCs w:val="24"/>
+        </w:rPr>
+        <w:t>подвыборок</w:t>
+      </w:r>
+      <w:proofErr w:type="spellEnd"/>
       <w:r>
         <w:rPr>
           <w:sz w:val="24"/>
           <w:szCs w:val="24"/>
         </w:rPr>
         <w:tab/>
-        <w:t>26</w:t>
+        <w:t>28</w:t>
       </w:r>
     </w:p>
     <w:p>
@@ -957,24 +1015,38 @@
           <w:sz w:val="24"/>
           <w:szCs w:val="24"/>
         </w:rPr>
-        <w:t xml:space="preserve">4.2. Реализация на языке Python и анализ </w:t>
-      </w:r>
-      <w:proofErr w:type="spellStart"/>
-      <w:r>
-        <w:rPr>
-          <w:sz w:val="24"/>
-          <w:szCs w:val="24"/>
-        </w:rPr>
-        <w:t>подвыборок</w:t>
-      </w:r>
-      <w:proofErr w:type="spellEnd"/>
+        <w:t>4.3. Выводы о виде гистограммы</w:t>
+      </w:r>
       <w:r>
         <w:rPr>
           <w:sz w:val="24"/>
           <w:szCs w:val="24"/>
         </w:rPr>
         <w:tab/>
-        <w:t>28</w:t>
+        <w:t>31</w:t>
+      </w:r>
+    </w:p>
+    <w:p>
+      <w:pPr>
+        <w:tabs>
+          <w:tab w:val="right" w:leader="dot" w:pos="9000"/>
+        </w:tabs>
+        <w:spacing w:before="40" w:after="40" w:line="276" w:lineRule="auto"/>
+      </w:pPr>
+      <w:r>
+        <w:rPr>
+          <w:sz w:val="24"/>
+          <w:szCs w:val="24"/>
+        </w:rPr>
+        <w:t>5. Теоретическая функция двойного гамма распределения</w:t>
+      </w:r>
+      <w:r>
+        <w:rPr>
+          <w:sz w:val="24"/>
+          <w:szCs w:val="24"/>
+        </w:rPr>
+        <w:tab/>
+        <w:t>33</w:t>
       </w:r>
     </w:p>
     <w:p>
@@ -990,30 +1062,7 @@
           <w:sz w:val="24"/>
           <w:szCs w:val="24"/>
         </w:rPr>
-        <w:t>4.3. Выводы о виде гистограммы</w:t>
-      </w:r>
-      <w:r>
-        <w:rPr>
-          <w:sz w:val="24"/>
-          <w:szCs w:val="24"/>
-        </w:rPr>
-        <w:tab/>
-        <w:t>31</w:t>
-      </w:r>
-    </w:p>
-    <w:p>
-      <w:pPr>
-        <w:tabs>
-          <w:tab w:val="right" w:leader="dot" w:pos="9000"/>
-        </w:tabs>
-        <w:spacing w:before="40" w:after="40" w:line="276" w:lineRule="auto"/>
-      </w:pPr>
-      <w:r>
-        <w:rPr>
-          <w:sz w:val="24"/>
-          <w:szCs w:val="24"/>
-        </w:rPr>
-        <w:t>5. Теоретическая функция двойного гамма распределения</w:t>
+        <w:t>5.1. Параметры двойного гамма распределения</w:t>
       </w:r>
       <w:r>
         <w:rPr>
@@ -1037,7 +1086,7 @@
           <w:sz w:val="24"/>
           <w:szCs w:val="24"/>
         </w:rPr>
-        <w:t>5.1. Параметры двойного гамма распределения</w:t>
+        <w:t>5.2. Реализация теоретической функции распределения</w:t>
       </w:r>
       <w:r>
         <w:rPr>
@@ -1045,7 +1094,7 @@
           <w:szCs w:val="24"/>
         </w:rPr>
         <w:tab/>
-        <w:t>33</w:t>
+        <w:t>35</w:t>
       </w:r>
     </w:p>
     <w:p>
@@ -1061,7 +1110,7 @@
           <w:sz w:val="24"/>
           <w:szCs w:val="24"/>
         </w:rPr>
-        <w:t>5.2. Реализация теоретической функции распределения</w:t>
+        <w:t>5.3. Влияние параметров на вид функции распределения</w:t>
       </w:r>
       <w:r>
         <w:rPr>
@@ -1069,7 +1118,30 @@
           <w:szCs w:val="24"/>
         </w:rPr>
         <w:tab/>
-        <w:t>35</w:t>
+        <w:t>37</w:t>
+      </w:r>
+    </w:p>
+    <w:p>
+      <w:pPr>
+        <w:tabs>
+          <w:tab w:val="right" w:leader="dot" w:pos="9000"/>
+        </w:tabs>
+        <w:spacing w:before="40" w:after="40" w:line="276" w:lineRule="auto"/>
+      </w:pPr>
+      <w:r>
+        <w:rPr>
+          <w:sz w:val="24"/>
+          <w:szCs w:val="24"/>
+        </w:rPr>
+        <w:t>6. Точечные оценки параметров распределения</w:t>
+      </w:r>
+      <w:r>
+        <w:rPr>
+          <w:sz w:val="24"/>
+          <w:szCs w:val="24"/>
+        </w:rPr>
+        <w:tab/>
+        <w:t>40</w:t>
       </w:r>
     </w:p>
     <w:p>
@@ -1085,30 +1157,7 @@
           <w:sz w:val="24"/>
           <w:szCs w:val="24"/>
         </w:rPr>
-        <w:t>5.3. Влияние параметров на вид функции распределения</w:t>
-      </w:r>
-      <w:r>
-        <w:rPr>
-          <w:sz w:val="24"/>
-          <w:szCs w:val="24"/>
-        </w:rPr>
-        <w:tab/>
-        <w:t>37</w:t>
-      </w:r>
-    </w:p>
-    <w:p>
-      <w:pPr>
-        <w:tabs>
-          <w:tab w:val="right" w:leader="dot" w:pos="9000"/>
-        </w:tabs>
-        <w:spacing w:before="40" w:after="40" w:line="276" w:lineRule="auto"/>
-      </w:pPr>
-      <w:r>
-        <w:rPr>
-          <w:sz w:val="24"/>
-          <w:szCs w:val="24"/>
-        </w:rPr>
-        <w:t>6. Точечные оценки параметров распределения</w:t>
+        <w:t>6.1. Оценка методом моментов</w:t>
       </w:r>
       <w:r>
         <w:rPr>
@@ -1132,7 +1181,7 @@
           <w:sz w:val="24"/>
           <w:szCs w:val="24"/>
         </w:rPr>
-        <w:t>6.1. Оценка методом моментов</w:t>
+        <w:t>6.2. Оценка методом максимального правдоподобия</w:t>
       </w:r>
       <w:r>
         <w:rPr>
@@ -1140,7 +1189,7 @@
           <w:szCs w:val="24"/>
         </w:rPr>
         <w:tab/>
-        <w:t>40</w:t>
+        <w:t>43</w:t>
       </w:r>
     </w:p>
     <w:p>
@@ -1156,7 +1205,7 @@
           <w:sz w:val="24"/>
           <w:szCs w:val="24"/>
         </w:rPr>
-        <w:t>6.2. Оценка методом максимального правдоподобия</w:t>
+        <w:t>6.3. Свойства полученных оценок</w:t>
       </w:r>
       <w:r>
         <w:rPr>
@@ -1164,7 +1213,7 @@
           <w:szCs w:val="24"/>
         </w:rPr>
         <w:tab/>
-        <w:t>43</w:t>
+        <w:t>46</w:t>
       </w:r>
     </w:p>
     <w:p>
@@ -1180,7 +1229,7 @@
           <w:sz w:val="24"/>
           <w:szCs w:val="24"/>
         </w:rPr>
-        <w:t>6.3. Свойства полученных оценок</w:t>
+        <w:t>6.4. Сравнение оценок и эмпирической функции распределения</w:t>
       </w:r>
       <w:r>
         <w:rPr>
@@ -1188,7 +1237,53 @@
           <w:szCs w:val="24"/>
         </w:rPr>
         <w:tab/>
-        <w:t>46</w:t>
+        <w:t>49</w:t>
+      </w:r>
+    </w:p>
+    <w:p>
+      <w:pPr>
+        <w:tabs>
+          <w:tab w:val="right" w:leader="dot" w:pos="9000"/>
+        </w:tabs>
+        <w:spacing w:before="40" w:after="40" w:line="276" w:lineRule="auto"/>
+      </w:pPr>
+      <w:r>
+        <w:rPr>
+          <w:sz w:val="24"/>
+          <w:szCs w:val="24"/>
+        </w:rPr>
+        <w:t>7. Интервальные оценки параметров распределения</w:t>
+      </w:r>
+      <w:r>
+        <w:rPr>
+          <w:sz w:val="24"/>
+          <w:szCs w:val="24"/>
+        </w:rPr>
+        <w:tab/>
+        <w:t>52</w:t>
+      </w:r>
+    </w:p>
+    <w:p>
+      <w:pPr>
+        <w:tabs>
+          <w:tab w:val="right" w:leader="dot" w:pos="9000"/>
+        </w:tabs>
+        <w:spacing w:before="40" w:after="40" w:line="276" w:lineRule="auto"/>
+      </w:pPr>
+      <w:r>
+        <w:rPr>
+          <w:sz w:val="24"/>
+          <w:szCs w:val="24"/>
+        </w:rPr>
+        <w:t>8. Статистические критерии</w:t>
+      </w:r>
+      <w:r>
+        <w:rPr>
+          <w:sz w:val="24"/>
+          <w:szCs w:val="24"/>
+        </w:rPr>
+        <w:tab/>
+        <w:t>56</w:t>
       </w:r>
     </w:p>
     <w:p>
@@ -1204,53 +1299,7 @@
           <w:sz w:val="24"/>
           <w:szCs w:val="24"/>
         </w:rPr>
-        <w:t>6.4. Сравнение оценок и эмпирической функции распределения</w:t>
-      </w:r>
-      <w:r>
-        <w:rPr>
-          <w:sz w:val="24"/>
-          <w:szCs w:val="24"/>
-        </w:rPr>
-        <w:tab/>
-        <w:t>49</w:t>
-      </w:r>
-    </w:p>
-    <w:p>
-      <w:pPr>
-        <w:tabs>
-          <w:tab w:val="right" w:leader="dot" w:pos="9000"/>
-        </w:tabs>
-        <w:spacing w:before="40" w:after="40" w:line="276" w:lineRule="auto"/>
-      </w:pPr>
-      <w:r>
-        <w:rPr>
-          <w:sz w:val="24"/>
-          <w:szCs w:val="24"/>
-        </w:rPr>
-        <w:t>7. Интервальные оценки параметров распределения</w:t>
-      </w:r>
-      <w:r>
-        <w:rPr>
-          <w:sz w:val="24"/>
-          <w:szCs w:val="24"/>
-        </w:rPr>
-        <w:tab/>
-        <w:t>52</w:t>
-      </w:r>
-    </w:p>
-    <w:p>
-      <w:pPr>
-        <w:tabs>
-          <w:tab w:val="right" w:leader="dot" w:pos="9000"/>
-        </w:tabs>
-        <w:spacing w:before="40" w:after="40" w:line="276" w:lineRule="auto"/>
-      </w:pPr>
-      <w:r>
-        <w:rPr>
-          <w:sz w:val="24"/>
-          <w:szCs w:val="24"/>
-        </w:rPr>
-        <w:t>8. Статистические критерии</w:t>
+        <w:t>8.1. Гипотезы о параметрах распределения</w:t>
       </w:r>
       <w:r>
         <w:rPr>
@@ -1274,7 +1323,7 @@
           <w:sz w:val="24"/>
           <w:szCs w:val="24"/>
         </w:rPr>
-        <w:t>8.1. Гипотезы о параметрах распределения</w:t>
+        <w:t>8.2. Гипотезы о виде распределения (критерии Колмогорова и χ²)</w:t>
       </w:r>
       <w:r>
         <w:rPr>
@@ -1282,7 +1331,7 @@
           <w:szCs w:val="24"/>
         </w:rPr>
         <w:tab/>
-        <w:t>56</w:t>
+        <w:t>60</w:t>
       </w:r>
     </w:p>
     <w:p>
@@ -1298,7 +1347,7 @@
           <w:sz w:val="24"/>
           <w:szCs w:val="24"/>
         </w:rPr>
-        <w:t>8.2. Гипотезы о виде распределения (критерии Колмогорова и χ²)</w:t>
+        <w:t>8.3. Гипотезы об однородности выборок</w:t>
       </w:r>
       <w:r>
         <w:rPr>
@@ -1306,7 +1355,7 @@
           <w:szCs w:val="24"/>
         </w:rPr>
         <w:tab/>
-        <w:t>60</w:t>
+        <w:t>64</w:t>
       </w:r>
     </w:p>
     <w:p>
@@ -1315,14 +1364,13 @@
           <w:tab w:val="right" w:leader="dot" w:pos="9000"/>
         </w:tabs>
         <w:spacing w:before="40" w:after="40" w:line="276" w:lineRule="auto"/>
-        <w:ind w:left="360"/>
-      </w:pPr>
-      <w:r>
-        <w:rPr>
-          <w:sz w:val="24"/>
-          <w:szCs w:val="24"/>
-        </w:rPr>
-        <w:t>8.3. Гипотезы об однородности выборок</w:t>
+      </w:pPr>
+      <w:r>
+        <w:rPr>
+          <w:sz w:val="24"/>
+          <w:szCs w:val="24"/>
+        </w:rPr>
+        <w:t>Заключение</w:t>
       </w:r>
       <w:r>
         <w:rPr>
@@ -1330,7 +1378,7 @@
           <w:szCs w:val="24"/>
         </w:rPr>
         <w:tab/>
-        <w:t>64</w:t>
+        <w:t>68</w:t>
       </w:r>
     </w:p>
     <w:p>
@@ -1345,7 +1393,7 @@
           <w:sz w:val="24"/>
           <w:szCs w:val="24"/>
         </w:rPr>
-        <w:t>Заключение</w:t>
+        <w:t>Список использованной литературы</w:t>
       </w:r>
       <w:r>
         <w:rPr>
@@ -1353,7 +1401,7 @@
           <w:szCs w:val="24"/>
         </w:rPr>
         <w:tab/>
-        <w:t>68</w:t>
+        <w:t>70</w:t>
       </w:r>
     </w:p>
     <w:p>
@@ -1368,29 +1416,6 @@
           <w:sz w:val="24"/>
           <w:szCs w:val="24"/>
         </w:rPr>
-        <w:t>Список использованной литературы</w:t>
-      </w:r>
-      <w:r>
-        <w:rPr>
-          <w:sz w:val="24"/>
-          <w:szCs w:val="24"/>
-        </w:rPr>
-        <w:tab/>
-        <w:t>70</w:t>
-      </w:r>
-    </w:p>
-    <w:p>
-      <w:pPr>
-        <w:tabs>
-          <w:tab w:val="right" w:leader="dot" w:pos="9000"/>
-        </w:tabs>
-        <w:spacing w:before="40" w:after="40" w:line="276" w:lineRule="auto"/>
-      </w:pPr>
-      <w:r>
-        <w:rPr>
-          <w:sz w:val="24"/>
-          <w:szCs w:val="24"/>
-        </w:rPr>
         <w:t>Приложение. Исходный код программы на языке Python</w:t>
       </w:r>
       <w:r>
@@ -1470,31 +1495,38 @@
           <w:sz w:val="32"/>
           <w:szCs w:val="32"/>
         </w:rPr>
+        <w:t>Введение</w:t>
+      </w:r>
+    </w:p>
+    <w:p>
+      <w:pPr>
+        <w:rPr>
+          <w:sz w:val="28"/>
+          <w:szCs w:val="28"/>
+        </w:rPr>
+      </w:pPr>
+    </w:p>
+    <w:p>
+      <w:pPr>
+        <w:rPr>
+          <w:sz w:val="28"/>
+          <w:szCs w:val="28"/>
+        </w:rPr>
+      </w:pPr>
+      <w:r>
+        <w:rPr>
+          <w:sz w:val="28"/>
+          <w:szCs w:val="28"/>
+        </w:rPr>
+        <w:t xml:space="preserve">Теория вероятностей и математическая статистика являются фундаментальными дисциплинами, лежащими в основе анализа данных, </w:t>
+      </w:r>
+      <w:r>
+        <w:rPr>
+          <w:sz w:val="28"/>
+          <w:szCs w:val="28"/>
+        </w:rPr>
         <w:lastRenderedPageBreak/>
-        <w:t>Введение</w:t>
-      </w:r>
-    </w:p>
-    <w:p>
-      <w:pPr>
-        <w:rPr>
-          <w:sz w:val="28"/>
-          <w:szCs w:val="28"/>
-        </w:rPr>
-      </w:pPr>
-    </w:p>
-    <w:p>
-      <w:pPr>
-        <w:rPr>
-          <w:sz w:val="28"/>
-          <w:szCs w:val="28"/>
-        </w:rPr>
-      </w:pPr>
-      <w:r>
-        <w:rPr>
-          <w:sz w:val="28"/>
-          <w:szCs w:val="28"/>
-        </w:rPr>
-        <w:t>Теория вероятностей и математическая статистика являются фундаментальными дисциплинами, лежащими в основе анализа данных, машинного обучения и информационной безопасности.</w:t>
+        <w:t>машинного обучения и информационной безопасности.</w:t>
       </w:r>
       <w:r>
         <w:rPr>
@@ -1969,7 +2001,6 @@
           <w:sz w:val="32"/>
           <w:szCs w:val="32"/>
         </w:rPr>
-        <w:lastRenderedPageBreak/>
         <w:t>Исследование двойного гамма распределения</w:t>
       </w:r>
     </w:p>
@@ -2020,6 +2051,7 @@
           <w:sz w:val="28"/>
           <w:szCs w:val="28"/>
         </w:rPr>
+        <w:lastRenderedPageBreak/>
         <w:t>Истоки двойного гамма-распределения связаны с историей классического гамма-</w:t>
       </w:r>
       <w:r>
@@ -2108,7 +2140,16 @@
           <w:sz w:val="28"/>
           <w:szCs w:val="28"/>
         </w:rPr>
-        <w:t>reflected</w:t>
+        <w:t>R</w:t>
+      </w:r>
+      <w:r>
+        <w:rPr>
+          <w:i/>
+          <w:iCs/>
+          <w:sz w:val="28"/>
+          <w:szCs w:val="28"/>
+        </w:rPr>
+        <w:t>eflected</w:t>
       </w:r>
       <w:proofErr w:type="spellEnd"/>
       <w:r>
@@ -2695,6 +2736,11 @@
     </w:p>
     <w:p>
       <w:pPr>
+        <w:pStyle w:val="a7"/>
+        <w:numPr>
+          <w:ilvl w:val="1"/>
+          <w:numId w:val="3"/>
+        </w:numPr>
         <w:jc w:val="center"/>
         <w:rPr>
           <w:b/>
@@ -2710,7 +2756,7 @@
           <w:sz w:val="28"/>
           <w:szCs w:val="28"/>
         </w:rPr>
-        <w:t>1.2. Назначение и применение в научных исследованиях, в задачах информационной безопасности</w:t>
+        <w:t>Назначение и применение в научных исследованиях, в задачах информационной безопасности</w:t>
       </w:r>
     </w:p>
     <w:p>
@@ -2811,7 +2857,7 @@
           <w:sz w:val="28"/>
           <w:szCs w:val="28"/>
         </w:rPr>
-        <w:t xml:space="preserve"> или аномального поведения пользователей. Применение устойчивых к шуму и выбросам методов снижения размерности позволяет выделять </w:t>
+        <w:t xml:space="preserve"> или аномального поведения пользователей. Применение устойчивых к шуму и выбросам методов снижения размерности позволяет выделять информативные признаки из зашумлённых данных, что является одним из ключевых этапов в системах обнаружения вторжений (IDS). Таким образом, двойное гамма-распределение представляет интерес как статистическая </w:t>
       </w:r>
       <w:r>
         <w:rPr>
@@ -2819,7 +2865,7 @@
           <w:szCs w:val="28"/>
         </w:rPr>
         <w:lastRenderedPageBreak/>
-        <w:t>информативные признаки из зашумлённых данных, что является одним из ключевых этапов в системах обнаружения вторжений (IDS). Таким образом, двойное гамма-распределение представляет интерес как статистическая основа для построения устойчивых к шуму алгоритмов анализа данных в задачах информационной безопасности.</w:t>
+        <w:t>основа для построения устойчивых к шуму алгоритмов анализа данных в задачах информационной безопасности.</w:t>
       </w:r>
     </w:p>
     <w:p>
@@ -2956,7 +3002,14 @@
           <w:rFonts w:ascii="Courier New" w:hAnsi="Courier New" w:cs="Courier New"/>
           <w:lang w:val="en-US"/>
         </w:rPr>
-        <w:t xml:space="preserve">def </w:t>
+        <w:t>D</w:t>
+      </w:r>
+      <w:r>
+        <w:rPr>
+          <w:rFonts w:ascii="Courier New" w:hAnsi="Courier New" w:cs="Courier New"/>
+          <w:lang w:val="en-US"/>
+        </w:rPr>
+        <w:t xml:space="preserve">ef </w:t>
       </w:r>
       <w:proofErr w:type="spellStart"/>
       <w:r>
@@ -2982,13 +3035,20 @@
         </w:rPr>
         <w:br/>
       </w:r>
+      <w:r>
+        <w:rPr>
+          <w:rFonts w:ascii="Courier New" w:hAnsi="Courier New" w:cs="Courier New"/>
+          <w:lang w:val="en-US"/>
+        </w:rPr>
+        <w:pgNum/>
+      </w:r>
       <w:proofErr w:type="spellStart"/>
       <w:r>
         <w:rPr>
           <w:rFonts w:ascii="Courier New" w:hAnsi="Courier New" w:cs="Courier New"/>
           <w:lang w:val="en-US"/>
         </w:rPr>
-        <w:t>summ</w:t>
+        <w:t>ve</w:t>
       </w:r>
       <w:proofErr w:type="spellEnd"/>
       <w:r>
@@ -3021,13 +3081,20 @@
         </w:rPr>
         <w:br/>
       </w:r>
+      <w:r>
+        <w:rPr>
+          <w:rFonts w:ascii="Courier New" w:hAnsi="Courier New" w:cs="Courier New"/>
+          <w:lang w:val="en-US"/>
+        </w:rPr>
+        <w:pgNum/>
+      </w:r>
       <w:proofErr w:type="spellStart"/>
       <w:r>
         <w:rPr>
           <w:rFonts w:ascii="Courier New" w:hAnsi="Courier New" w:cs="Courier New"/>
           <w:lang w:val="en-US"/>
         </w:rPr>
-        <w:t>summ</w:t>
+        <w:t>ve</w:t>
       </w:r>
       <w:proofErr w:type="spellEnd"/>
       <w:r>
@@ -3052,20 +3119,20 @@
         </w:rPr>
         <w:t xml:space="preserve">return </w:t>
       </w:r>
+      <w:r>
+        <w:rPr>
+          <w:rFonts w:ascii="Courier New" w:hAnsi="Courier New" w:cs="Courier New"/>
+          <w:lang w:val="en-US"/>
+        </w:rPr>
+        <w:pgNum/>
+      </w:r>
       <w:proofErr w:type="spellStart"/>
       <w:r>
         <w:rPr>
           <w:rFonts w:ascii="Courier New" w:hAnsi="Courier New" w:cs="Courier New"/>
           <w:lang w:val="en-US"/>
         </w:rPr>
-        <w:t>sum</w:t>
-      </w:r>
-      <w:r>
-        <w:rPr>
-          <w:rFonts w:ascii="Courier New" w:hAnsi="Courier New" w:cs="Courier New"/>
-          <w:lang w:val="en-US"/>
-        </w:rPr>
-        <w:t>m</w:t>
+        <w:t>ve</w:t>
       </w:r>
       <w:proofErr w:type="spellEnd"/>
     </w:p>
@@ -3138,7 +3205,14 @@
           <w:rFonts w:ascii="Courier New" w:hAnsi="Courier New" w:cs="Courier New"/>
           <w:lang w:val="en-US"/>
         </w:rPr>
-        <w:t xml:space="preserve">def </w:t>
+        <w:t>D</w:t>
+      </w:r>
+      <w:r>
+        <w:rPr>
+          <w:rFonts w:ascii="Courier New" w:hAnsi="Courier New" w:cs="Courier New"/>
+          <w:lang w:val="en-US"/>
+        </w:rPr>
+        <w:t xml:space="preserve">ef </w:t>
       </w:r>
       <w:proofErr w:type="spellStart"/>
       <w:r>
@@ -3211,6 +3285,7 @@
         <w:rPr>
           <w:sz w:val="28"/>
           <w:szCs w:val="28"/>
+          <w:lang w:val="en-US"/>
         </w:rPr>
       </w:pPr>
     </w:p>
@@ -3266,7 +3341,14 @@
           <w:rFonts w:ascii="Courier New" w:hAnsi="Courier New" w:cs="Courier New"/>
           <w:lang w:val="en-US"/>
         </w:rPr>
-        <w:t>def median(X):</w:t>
+        <w:t>D</w:t>
+      </w:r>
+      <w:r>
+        <w:rPr>
+          <w:rFonts w:ascii="Courier New" w:hAnsi="Courier New" w:cs="Courier New"/>
+          <w:lang w:val="en-US"/>
+        </w:rPr>
+        <w:t>ef median(X):</w:t>
       </w:r>
       <w:r>
         <w:rPr>
@@ -3437,7 +3519,21 @@
           <w:rFonts w:ascii="Courier New" w:hAnsi="Courier New" w:cs="Courier New"/>
           <w:lang w:val="en-US"/>
         </w:rPr>
-        <w:t xml:space="preserve">[n // 2 - 1] + </w:t>
+        <w:t xml:space="preserve">[n // 2 </w:t>
+      </w:r>
+      <w:r>
+        <w:rPr>
+          <w:rFonts w:ascii="Courier New" w:hAnsi="Courier New" w:cs="Courier New"/>
+          <w:lang w:val="en-US"/>
+        </w:rPr>
+        <w:t>–</w:t>
+      </w:r>
+      <w:r>
+        <w:rPr>
+          <w:rFonts w:ascii="Courier New" w:hAnsi="Courier New" w:cs="Courier New"/>
+          <w:lang w:val="en-US"/>
+        </w:rPr>
+        <w:t xml:space="preserve"> 1] + </w:t>
       </w:r>
       <w:proofErr w:type="spellStart"/>
       <w:r>
@@ -3463,6 +3559,7 @@
         <w:rPr>
           <w:sz w:val="28"/>
           <w:szCs w:val="28"/>
+          <w:lang w:val="en-US"/>
         </w:rPr>
       </w:pPr>
     </w:p>
@@ -3525,7 +3622,14 @@
           <w:rFonts w:ascii="Courier New" w:hAnsi="Courier New" w:cs="Courier New"/>
           <w:lang w:val="en-US"/>
         </w:rPr>
-        <w:t>def mode(X):</w:t>
+        <w:t>D</w:t>
+      </w:r>
+      <w:r>
+        <w:rPr>
+          <w:rFonts w:ascii="Courier New" w:hAnsi="Courier New" w:cs="Courier New"/>
+          <w:lang w:val="en-US"/>
+        </w:rPr>
+        <w:t>ef mode(X):</w:t>
       </w:r>
       <w:r>
         <w:rPr>
@@ -3717,87 +3821,87 @@
           <w:rFonts w:ascii="Courier New" w:hAnsi="Courier New" w:cs="Courier New"/>
           <w:lang w:val="en-US"/>
         </w:rPr>
+        <w:t xml:space="preserve">if counts[key] &gt; </w:t>
+      </w:r>
+      <w:proofErr w:type="spellStart"/>
+      <w:r>
+        <w:rPr>
+          <w:rFonts w:ascii="Courier New" w:hAnsi="Courier New" w:cs="Courier New"/>
+          <w:lang w:val="en-US"/>
+        </w:rPr>
+        <w:t>max_count</w:t>
+      </w:r>
+      <w:proofErr w:type="spellEnd"/>
+      <w:r>
+        <w:rPr>
+          <w:rFonts w:ascii="Courier New" w:hAnsi="Courier New" w:cs="Courier New"/>
+          <w:lang w:val="en-US"/>
+        </w:rPr>
+        <w:t>:</w:t>
+      </w:r>
+      <w:r>
+        <w:rPr>
+          <w:sz w:val="24"/>
+          <w:szCs w:val="24"/>
+          <w:lang w:val="en-US"/>
+        </w:rPr>
+        <w:br/>
+      </w:r>
+      <w:proofErr w:type="spellStart"/>
+      <w:r>
+        <w:rPr>
+          <w:rFonts w:ascii="Courier New" w:hAnsi="Courier New" w:cs="Courier New"/>
+          <w:lang w:val="en-US"/>
+        </w:rPr>
+        <w:t>max_count</w:t>
+      </w:r>
+      <w:proofErr w:type="spellEnd"/>
+      <w:r>
+        <w:rPr>
+          <w:rFonts w:ascii="Courier New" w:hAnsi="Courier New" w:cs="Courier New"/>
+          <w:lang w:val="en-US"/>
+        </w:rPr>
+        <w:t xml:space="preserve"> = counts[key]</w:t>
+      </w:r>
+      <w:r>
+        <w:rPr>
+          <w:sz w:val="24"/>
+          <w:szCs w:val="24"/>
+          <w:lang w:val="en-US"/>
+        </w:rPr>
+        <w:br/>
+      </w:r>
+      <w:proofErr w:type="spellStart"/>
+      <w:r>
+        <w:rPr>
+          <w:rFonts w:ascii="Courier New" w:hAnsi="Courier New" w:cs="Courier New"/>
+          <w:lang w:val="en-US"/>
+        </w:rPr>
+        <w:t>mode_value</w:t>
+      </w:r>
+      <w:proofErr w:type="spellEnd"/>
+      <w:r>
+        <w:rPr>
+          <w:rFonts w:ascii="Courier New" w:hAnsi="Courier New" w:cs="Courier New"/>
+          <w:lang w:val="en-US"/>
+        </w:rPr>
+        <w:t xml:space="preserve"> = key</w:t>
+      </w:r>
+      <w:r>
+        <w:rPr>
+          <w:sz w:val="24"/>
+          <w:szCs w:val="24"/>
+          <w:lang w:val="en-US"/>
+        </w:rPr>
+        <w:br/>
+      </w:r>
+      <w:r>
+        <w:rPr>
+          <w:sz w:val="24"/>
+          <w:szCs w:val="24"/>
+          <w:lang w:val="en-US"/>
+        </w:rPr>
         <w:lastRenderedPageBreak/>
-        <w:t xml:space="preserve">if counts[key] &gt; </w:t>
-      </w:r>
-      <w:proofErr w:type="spellStart"/>
-      <w:r>
-        <w:rPr>
-          <w:rFonts w:ascii="Courier New" w:hAnsi="Courier New" w:cs="Courier New"/>
-          <w:lang w:val="en-US"/>
-        </w:rPr>
-        <w:t>max_count</w:t>
-      </w:r>
-      <w:proofErr w:type="spellEnd"/>
-      <w:r>
-        <w:rPr>
-          <w:rFonts w:ascii="Courier New" w:hAnsi="Courier New" w:cs="Courier New"/>
-          <w:lang w:val="en-US"/>
-        </w:rPr>
-        <w:t>:</w:t>
-      </w:r>
-      <w:r>
-        <w:rPr>
-          <w:sz w:val="24"/>
-          <w:szCs w:val="24"/>
-          <w:lang w:val="en-US"/>
-        </w:rPr>
-        <w:br/>
-      </w:r>
-      <w:proofErr w:type="spellStart"/>
-      <w:r>
-        <w:rPr>
-          <w:rFonts w:ascii="Courier New" w:hAnsi="Courier New" w:cs="Courier New"/>
-          <w:lang w:val="en-US"/>
-        </w:rPr>
-        <w:t>max_count</w:t>
-      </w:r>
-      <w:proofErr w:type="spellEnd"/>
-      <w:r>
-        <w:rPr>
-          <w:rFonts w:ascii="Courier New" w:hAnsi="Courier New" w:cs="Courier New"/>
-          <w:lang w:val="en-US"/>
-        </w:rPr>
-        <w:t xml:space="preserve"> = counts[key]</w:t>
-      </w:r>
-      <w:r>
-        <w:rPr>
-          <w:sz w:val="24"/>
-          <w:szCs w:val="24"/>
-          <w:lang w:val="en-US"/>
-        </w:rPr>
-        <w:br/>
-      </w:r>
-      <w:proofErr w:type="spellStart"/>
-      <w:r>
-        <w:rPr>
-          <w:rFonts w:ascii="Courier New" w:hAnsi="Courier New" w:cs="Courier New"/>
-          <w:lang w:val="en-US"/>
-        </w:rPr>
-        <w:t>mode_value</w:t>
-      </w:r>
-      <w:proofErr w:type="spellEnd"/>
-      <w:r>
-        <w:rPr>
-          <w:rFonts w:ascii="Courier New" w:hAnsi="Courier New" w:cs="Courier New"/>
-          <w:lang w:val="en-US"/>
-        </w:rPr>
-        <w:t xml:space="preserve"> = key</w:t>
-      </w:r>
-      <w:r>
-        <w:rPr>
-          <w:sz w:val="24"/>
-          <w:szCs w:val="24"/>
-          <w:lang w:val="en-US"/>
-        </w:rPr>
-        <w:br/>
-      </w:r>
-      <w:r>
-        <w:rPr>
-          <w:sz w:val="24"/>
-          <w:szCs w:val="24"/>
-          <w:lang w:val="en-US"/>
-        </w:rPr>
         <w:br/>
       </w:r>
       <w:r>
@@ -3824,6 +3928,7 @@
         <w:rPr>
           <w:sz w:val="28"/>
           <w:szCs w:val="28"/>
+          <w:lang w:val="en-US"/>
         </w:rPr>
       </w:pPr>
     </w:p>
@@ -3917,7 +4022,21 @@
           <w:rFonts w:ascii="Courier New" w:hAnsi="Courier New" w:cs="Courier New"/>
           <w:lang w:val="en-US"/>
         </w:rPr>
-        <w:t>return max(X) - min(X)</w:t>
+        <w:t xml:space="preserve">return max(X) </w:t>
+      </w:r>
+      <w:r>
+        <w:rPr>
+          <w:rFonts w:ascii="Courier New" w:hAnsi="Courier New" w:cs="Courier New"/>
+          <w:lang w:val="en-US"/>
+        </w:rPr>
+        <w:t>–</w:t>
+      </w:r>
+      <w:r>
+        <w:rPr>
+          <w:rFonts w:ascii="Courier New" w:hAnsi="Courier New" w:cs="Courier New"/>
+          <w:lang w:val="en-US"/>
+        </w:rPr>
+        <w:t xml:space="preserve"> min(X)</w:t>
       </w:r>
     </w:p>
     <w:p>
@@ -3927,6 +4046,7 @@
         <w:rPr>
           <w:sz w:val="28"/>
           <w:szCs w:val="28"/>
+          <w:lang w:val="en-US"/>
         </w:rPr>
       </w:pPr>
     </w:p>
@@ -3982,7 +4102,14 @@
           <w:rFonts w:ascii="Courier New" w:hAnsi="Courier New" w:cs="Courier New"/>
           <w:lang w:val="en-US"/>
         </w:rPr>
-        <w:t xml:space="preserve">def </w:t>
+        <w:t>D</w:t>
+      </w:r>
+      <w:r>
+        <w:rPr>
+          <w:rFonts w:ascii="Courier New" w:hAnsi="Courier New" w:cs="Courier New"/>
+          <w:lang w:val="en-US"/>
+        </w:rPr>
+        <w:t xml:space="preserve">ef </w:t>
       </w:r>
       <w:proofErr w:type="spellStart"/>
       <w:r>
@@ -4177,14 +4304,22 @@
         <w:spacing w:before="100" w:beforeAutospacing="1" w:after="100" w:afterAutospacing="1"/>
         <w:rPr>
           <w:rFonts w:ascii="Courier New" w:hAnsi="Courier New" w:cs="Courier New"/>
-        </w:rPr>
-      </w:pPr>
-      <w:r>
-        <w:rPr>
-          <w:rFonts w:ascii="Courier New" w:hAnsi="Courier New" w:cs="Courier New"/>
-          <w:lang w:val="en-US"/>
-        </w:rPr>
-        <w:t xml:space="preserve">def </w:t>
+          <w:lang w:val="en-US"/>
+        </w:rPr>
+      </w:pPr>
+      <w:r>
+        <w:rPr>
+          <w:rFonts w:ascii="Courier New" w:hAnsi="Courier New" w:cs="Courier New"/>
+          <w:lang w:val="en-US"/>
+        </w:rPr>
+        <w:t>D</w:t>
+      </w:r>
+      <w:r>
+        <w:rPr>
+          <w:rFonts w:ascii="Courier New" w:hAnsi="Courier New" w:cs="Courier New"/>
+          <w:lang w:val="en-US"/>
+        </w:rPr>
+        <w:t xml:space="preserve">ef </w:t>
       </w:r>
       <w:proofErr w:type="spellStart"/>
       <w:r>
@@ -4323,7 +4458,21 @@
           <w:rFonts w:ascii="Courier New" w:hAnsi="Courier New" w:cs="Courier New"/>
           <w:lang w:val="en-US"/>
         </w:rPr>
-        <w:t>(X) - 1)</w:t>
+        <w:t xml:space="preserve">(X) </w:t>
+      </w:r>
+      <w:r>
+        <w:rPr>
+          <w:rFonts w:ascii="Courier New" w:hAnsi="Courier New" w:cs="Courier New"/>
+          <w:lang w:val="en-US"/>
+        </w:rPr>
+        <w:t>–</w:t>
+      </w:r>
+      <w:r>
+        <w:rPr>
+          <w:rFonts w:ascii="Courier New" w:hAnsi="Courier New" w:cs="Courier New"/>
+          <w:lang w:val="en-US"/>
+        </w:rPr>
+        <w:t xml:space="preserve"> 1)</w:t>
       </w:r>
     </w:p>
     <w:p>
@@ -4333,6 +4482,7 @@
         <w:rPr>
           <w:sz w:val="24"/>
           <w:szCs w:val="24"/>
+          <w:lang w:val="en-US"/>
         </w:rPr>
       </w:pPr>
     </w:p>
@@ -4402,7 +4552,14 @@
           <w:rFonts w:ascii="Courier New" w:hAnsi="Courier New" w:cs="Courier New"/>
           <w:lang w:val="en-US"/>
         </w:rPr>
-        <w:t xml:space="preserve">def </w:t>
+        <w:t>D</w:t>
+      </w:r>
+      <w:r>
+        <w:rPr>
+          <w:rFonts w:ascii="Courier New" w:hAnsi="Courier New" w:cs="Courier New"/>
+          <w:lang w:val="en-US"/>
+        </w:rPr>
+        <w:t xml:space="preserve">ef </w:t>
       </w:r>
       <w:proofErr w:type="spellStart"/>
       <w:r>
@@ -4588,7 +4745,14 @@
           <w:rFonts w:ascii="Courier New" w:hAnsi="Courier New" w:cs="Courier New"/>
           <w:lang w:val="en-US"/>
         </w:rPr>
-        <w:t xml:space="preserve">def </w:t>
+        <w:t>D</w:t>
+      </w:r>
+      <w:r>
+        <w:rPr>
+          <w:rFonts w:ascii="Courier New" w:hAnsi="Courier New" w:cs="Courier New"/>
+          <w:lang w:val="en-US"/>
+        </w:rPr>
+        <w:t xml:space="preserve">ef </w:t>
       </w:r>
       <w:proofErr w:type="spellStart"/>
       <w:r>
@@ -4692,7 +4856,6 @@
           <w:szCs w:val="24"/>
           <w:lang w:val="en-US"/>
         </w:rPr>
-        <w:lastRenderedPageBreak/>
         <w:br/>
         <w:t xml:space="preserve">return s / </w:t>
       </w:r>
@@ -4721,6 +4884,7 @@
         <w:rPr>
           <w:sz w:val="28"/>
           <w:szCs w:val="28"/>
+          <w:lang w:val="en-US"/>
         </w:rPr>
       </w:pPr>
     </w:p>
@@ -4920,7 +5084,6 @@
         <w:rPr>
           <w:sz w:val="28"/>
           <w:szCs w:val="28"/>
-          <w:lang w:val="en-US"/>
         </w:rPr>
       </w:pPr>
       <w:r>
@@ -4941,109 +5104,2278 @@
     </w:p>
     <w:p>
       <w:pPr>
-        <w:rPr>
-          <w:sz w:val="28"/>
-          <w:szCs w:val="28"/>
-        </w:rPr>
-      </w:pPr>
-    </w:p>
-    <w:p>
-      <w:pPr>
+        <w:pStyle w:val="a7"/>
+        <w:numPr>
+          <w:ilvl w:val="0"/>
+          <w:numId w:val="3"/>
+        </w:numPr>
         <w:jc w:val="center"/>
+        <w:rPr>
+          <w:b/>
+          <w:bCs/>
+          <w:sz w:val="36"/>
+          <w:szCs w:val="36"/>
+          <w:lang w:val="en-US"/>
+        </w:rPr>
+      </w:pPr>
+      <w:r>
         <w:rPr>
           <w:b/>
           <w:bCs/>
           <w:sz w:val="32"/>
           <w:szCs w:val="32"/>
         </w:rPr>
-      </w:pPr>
-      <w:r>
+        <w:t>Эмпирическая функция распределения</w:t>
+      </w:r>
+    </w:p>
+    <w:p>
+      <w:pPr>
+        <w:pStyle w:val="a7"/>
+        <w:numPr>
+          <w:ilvl w:val="1"/>
+          <w:numId w:val="3"/>
+        </w:numPr>
+        <w:jc w:val="center"/>
         <w:rPr>
           <w:b/>
           <w:bCs/>
           <w:sz w:val="32"/>
           <w:szCs w:val="32"/>
         </w:rPr>
-        <w:t>Список</w:t>
-      </w:r>
-      <w:r>
+      </w:pPr>
+      <w:r>
+        <w:rPr>
+          <w:b/>
+          <w:bCs/>
+          <w:sz w:val="28"/>
+          <w:szCs w:val="28"/>
+        </w:rPr>
+        <w:t>Определение и алгоритм построения</w:t>
+      </w:r>
+    </w:p>
+    <w:p>
+      <w:pPr>
+        <w:pStyle w:val="a7"/>
+        <w:ind w:left="780"/>
         <w:rPr>
           <w:b/>
           <w:bCs/>
           <w:sz w:val="32"/>
           <w:szCs w:val="32"/>
         </w:rPr>
-        <w:t xml:space="preserve"> </w:t>
-      </w:r>
-      <w:r>
+      </w:pPr>
+    </w:p>
+    <w:p>
+      <w:pPr>
+        <w:spacing w:line="360" w:lineRule="auto"/>
+        <w:ind w:firstLine="720"/>
+      </w:pPr>
+      <w:r>
+        <w:rPr>
+          <w:sz w:val="28"/>
+          <w:szCs w:val="28"/>
+        </w:rPr>
+        <w:t>Пусть X</w:t>
+      </w:r>
+      <w:r>
+        <w:rPr>
+          <w:sz w:val="28"/>
+          <w:szCs w:val="28"/>
+          <w:vertAlign w:val="subscript"/>
+        </w:rPr>
+        <w:t>1</w:t>
+      </w:r>
+      <w:r>
+        <w:rPr>
+          <w:sz w:val="28"/>
+          <w:szCs w:val="28"/>
+        </w:rPr>
+        <w:t xml:space="preserve">, …, </w:t>
+      </w:r>
+      <w:proofErr w:type="spellStart"/>
+      <w:r>
+        <w:rPr>
+          <w:sz w:val="28"/>
+          <w:szCs w:val="28"/>
+        </w:rPr>
+        <w:t>X</w:t>
+      </w:r>
+      <w:r>
+        <w:rPr>
+          <w:sz w:val="28"/>
+          <w:szCs w:val="28"/>
+          <w:vertAlign w:val="subscript"/>
+        </w:rPr>
+        <w:t>n</w:t>
+      </w:r>
+      <w:proofErr w:type="spellEnd"/>
+      <w:r>
+        <w:rPr>
+          <w:sz w:val="28"/>
+          <w:szCs w:val="28"/>
+        </w:rPr>
+        <w:t xml:space="preserve"> — выборка из распределения F</w:t>
+      </w:r>
+      <w:r>
+        <w:rPr>
+          <w:i/>
+          <w:iCs/>
+          <w:sz w:val="28"/>
+          <w:szCs w:val="28"/>
+        </w:rPr>
+        <w:t>X</w:t>
+      </w:r>
+      <w:r>
+        <w:rPr>
+          <w:sz w:val="28"/>
+          <w:szCs w:val="28"/>
+        </w:rPr>
+        <w:t>(x), X</w:t>
+      </w:r>
+      <w:r>
+        <w:rPr>
+          <w:sz w:val="28"/>
+          <w:szCs w:val="28"/>
+          <w:vertAlign w:val="subscript"/>
+        </w:rPr>
+        <w:t>(1)</w:t>
+      </w:r>
+      <w:r>
+        <w:rPr>
+          <w:sz w:val="28"/>
+          <w:szCs w:val="28"/>
+        </w:rPr>
+        <w:t>, …, X</w:t>
+      </w:r>
+      <w:r>
+        <w:rPr>
+          <w:sz w:val="28"/>
+          <w:szCs w:val="28"/>
+          <w:vertAlign w:val="subscript"/>
+        </w:rPr>
+        <w:t>(n)</w:t>
+      </w:r>
+      <w:r>
+        <w:rPr>
+          <w:sz w:val="28"/>
+          <w:szCs w:val="28"/>
+        </w:rPr>
+        <w:t xml:space="preserve"> — вариационный ряд, </w:t>
+      </w:r>
+      <w:proofErr w:type="spellStart"/>
+      <w:r>
+        <w:rPr>
+          <w:sz w:val="28"/>
+          <w:szCs w:val="28"/>
+        </w:rPr>
+        <w:t>N</w:t>
+      </w:r>
+      <w:r>
+        <w:rPr>
+          <w:sz w:val="28"/>
+          <w:szCs w:val="28"/>
+          <w:vertAlign w:val="subscript"/>
+        </w:rPr>
+        <w:t>n</w:t>
+      </w:r>
+      <w:proofErr w:type="spellEnd"/>
+      <w:r>
+        <w:rPr>
+          <w:sz w:val="28"/>
+          <w:szCs w:val="28"/>
+        </w:rPr>
+        <w:t>(x) — эмпирическая частота (число элементов выборки, меньших x).</w:t>
+      </w:r>
+    </w:p>
+    <w:p>
+      <w:pPr>
+        <w:spacing w:line="360" w:lineRule="auto"/>
+      </w:pPr>
+    </w:p>
+    <w:p>
+      <w:pPr>
+        <w:spacing w:line="360" w:lineRule="auto"/>
+        <w:ind w:firstLine="720"/>
+      </w:pPr>
+      <w:r>
+        <w:rPr>
+          <w:sz w:val="28"/>
+          <w:szCs w:val="28"/>
+        </w:rPr>
+        <w:t xml:space="preserve">Случайная величина </w:t>
+      </w:r>
+      <w:proofErr w:type="spellStart"/>
+      <w:r>
+        <w:rPr>
+          <w:sz w:val="28"/>
+          <w:szCs w:val="28"/>
+        </w:rPr>
+        <w:t>F</w:t>
+      </w:r>
+      <w:r>
+        <w:rPr>
+          <w:sz w:val="28"/>
+          <w:szCs w:val="28"/>
+          <w:vertAlign w:val="subscript"/>
+        </w:rPr>
+        <w:t>n</w:t>
+      </w:r>
+      <w:proofErr w:type="spellEnd"/>
+      <w:r>
+        <w:rPr>
+          <w:sz w:val="28"/>
+          <w:szCs w:val="28"/>
+        </w:rPr>
+        <w:t xml:space="preserve">(x) = </w:t>
+      </w:r>
+      <w:proofErr w:type="spellStart"/>
+      <w:r>
+        <w:rPr>
+          <w:sz w:val="28"/>
+          <w:szCs w:val="28"/>
+        </w:rPr>
+        <w:t>N</w:t>
+      </w:r>
+      <w:r>
+        <w:rPr>
+          <w:sz w:val="28"/>
+          <w:szCs w:val="28"/>
+          <w:vertAlign w:val="subscript"/>
+        </w:rPr>
+        <w:t>n</w:t>
+      </w:r>
+      <w:proofErr w:type="spellEnd"/>
+      <w:r>
+        <w:rPr>
+          <w:sz w:val="28"/>
+          <w:szCs w:val="28"/>
+        </w:rPr>
+        <w:t xml:space="preserve">(x) / n, называемая </w:t>
+      </w:r>
+      <w:r>
+        <w:rPr>
+          <w:b/>
+          <w:bCs/>
+          <w:sz w:val="28"/>
+          <w:szCs w:val="28"/>
+        </w:rPr>
+        <w:t>эмпирической функцией распределения</w:t>
+      </w:r>
+      <w:r>
+        <w:rPr>
+          <w:sz w:val="28"/>
+          <w:szCs w:val="28"/>
+        </w:rPr>
+        <w:t>, — это относительная частота числа элементов выборки X</w:t>
+      </w:r>
+      <w:r>
+        <w:rPr>
+          <w:sz w:val="28"/>
+          <w:szCs w:val="28"/>
+          <w:vertAlign w:val="subscript"/>
+        </w:rPr>
+        <w:t>1</w:t>
+      </w:r>
+      <w:r>
+        <w:rPr>
+          <w:sz w:val="28"/>
+          <w:szCs w:val="28"/>
+        </w:rPr>
+        <w:t xml:space="preserve">, …, </w:t>
+      </w:r>
+      <w:proofErr w:type="spellStart"/>
+      <w:r>
+        <w:rPr>
+          <w:sz w:val="28"/>
+          <w:szCs w:val="28"/>
+        </w:rPr>
+        <w:t>X</w:t>
+      </w:r>
+      <w:r>
+        <w:rPr>
+          <w:sz w:val="28"/>
+          <w:szCs w:val="28"/>
+          <w:vertAlign w:val="subscript"/>
+        </w:rPr>
+        <w:t>n</w:t>
+      </w:r>
+      <w:proofErr w:type="spellEnd"/>
+      <w:r>
+        <w:rPr>
+          <w:sz w:val="28"/>
+          <w:szCs w:val="28"/>
+        </w:rPr>
+        <w:t xml:space="preserve">, удовлетворяющих условию </w:t>
+      </w:r>
+      <w:proofErr w:type="spellStart"/>
+      <w:r>
+        <w:rPr>
+          <w:sz w:val="28"/>
+          <w:szCs w:val="28"/>
+        </w:rPr>
+        <w:t>X</w:t>
+      </w:r>
+      <w:r>
+        <w:rPr>
+          <w:sz w:val="28"/>
+          <w:szCs w:val="28"/>
+          <w:vertAlign w:val="subscript"/>
+        </w:rPr>
+        <w:t>i</w:t>
+      </w:r>
+      <w:proofErr w:type="spellEnd"/>
+      <w:r>
+        <w:rPr>
+          <w:sz w:val="28"/>
+          <w:szCs w:val="28"/>
+        </w:rPr>
+        <w:t xml:space="preserve"> &lt; x [4].</w:t>
+      </w:r>
+    </w:p>
+    <w:p>
+      <w:pPr>
+        <w:spacing w:line="360" w:lineRule="auto"/>
+      </w:pPr>
+    </w:p>
+    <w:p>
+      <w:pPr>
+        <w:spacing w:before="120" w:after="120" w:line="360" w:lineRule="auto"/>
+        <w:jc w:val="center"/>
+      </w:pPr>
+      <m:oMathPara>
+        <m:oMath>
+          <m:sSub>
+            <m:sSubPr>
+              <m:ctrlPr>
+                <w:rPr>
+                  <w:rFonts w:ascii="Cambria Math" w:hAnsi="Cambria Math"/>
+                  <w:sz w:val="28"/>
+                  <w:szCs w:val="28"/>
+                </w:rPr>
+              </m:ctrlPr>
+            </m:sSubPr>
+            <m:e>
+              <m:r>
+                <w:rPr>
+                  <w:rFonts w:ascii="Cambria Math" w:hAnsi="Cambria Math"/>
+                  <w:sz w:val="28"/>
+                  <w:szCs w:val="28"/>
+                </w:rPr>
+                <m:t>F</m:t>
+              </m:r>
+            </m:e>
+            <m:sub>
+              <m:r>
+                <w:rPr>
+                  <w:rFonts w:ascii="Cambria Math" w:hAnsi="Cambria Math"/>
+                  <w:sz w:val="28"/>
+                  <w:szCs w:val="28"/>
+                </w:rPr>
+                <m:t>n</m:t>
+              </m:r>
+            </m:sub>
+          </m:sSub>
+          <m:r>
+            <w:rPr>
+              <w:rFonts w:ascii="Cambria Math" w:hAnsi="Cambria Math"/>
+              <w:sz w:val="28"/>
+              <w:szCs w:val="28"/>
+            </w:rPr>
+            <m:t>(x) = </m:t>
+          </m:r>
+          <m:f>
+            <m:fPr>
+              <m:ctrlPr>
+                <w:rPr>
+                  <w:rFonts w:ascii="Cambria Math" w:hAnsi="Cambria Math"/>
+                  <w:sz w:val="28"/>
+                  <w:szCs w:val="28"/>
+                </w:rPr>
+              </m:ctrlPr>
+            </m:fPr>
+            <m:num>
+              <m:sSub>
+                <m:sSubPr>
+                  <m:ctrlPr>
+                    <w:rPr>
+                      <w:rFonts w:ascii="Cambria Math" w:hAnsi="Cambria Math"/>
+                      <w:sz w:val="28"/>
+                      <w:szCs w:val="28"/>
+                    </w:rPr>
+                  </m:ctrlPr>
+                </m:sSubPr>
+                <m:e>
+                  <m:r>
+                    <w:rPr>
+                      <w:rFonts w:ascii="Cambria Math" w:hAnsi="Cambria Math"/>
+                      <w:sz w:val="28"/>
+                      <w:szCs w:val="28"/>
+                    </w:rPr>
+                    <m:t>N</m:t>
+                  </m:r>
+                </m:e>
+                <m:sub>
+                  <m:r>
+                    <w:rPr>
+                      <w:rFonts w:ascii="Cambria Math" w:hAnsi="Cambria Math"/>
+                      <w:sz w:val="28"/>
+                      <w:szCs w:val="28"/>
+                    </w:rPr>
+                    <m:t>n</m:t>
+                  </m:r>
+                </m:sub>
+              </m:sSub>
+              <m:r>
+                <w:rPr>
+                  <w:rFonts w:ascii="Cambria Math" w:hAnsi="Cambria Math"/>
+                  <w:sz w:val="28"/>
+                  <w:szCs w:val="28"/>
+                </w:rPr>
+                <m:t>(x)</m:t>
+              </m:r>
+            </m:num>
+            <m:den>
+              <m:r>
+                <w:rPr>
+                  <w:rFonts w:ascii="Cambria Math" w:hAnsi="Cambria Math"/>
+                  <w:sz w:val="28"/>
+                  <w:szCs w:val="28"/>
+                </w:rPr>
+                <m:t>n</m:t>
+              </m:r>
+            </m:den>
+          </m:f>
+        </m:oMath>
+      </m:oMathPara>
+    </w:p>
+    <w:p>
+      <w:pPr>
+        <w:spacing w:line="360" w:lineRule="auto"/>
+        <w:ind w:firstLine="720"/>
+      </w:pPr>
+      <w:r>
+        <w:rPr>
+          <w:sz w:val="28"/>
+          <w:szCs w:val="28"/>
+        </w:rPr>
+        <w:t xml:space="preserve">С помощью функции единичного скачка (функции </w:t>
+      </w:r>
+      <w:proofErr w:type="spellStart"/>
+      <w:r>
+        <w:rPr>
+          <w:sz w:val="28"/>
+          <w:szCs w:val="28"/>
+        </w:rPr>
+        <w:t>Хевисайда</w:t>
+      </w:r>
+      <w:proofErr w:type="spellEnd"/>
+      <w:r>
+        <w:rPr>
+          <w:sz w:val="28"/>
+          <w:szCs w:val="28"/>
+        </w:rPr>
+        <w:t>) эмпирическую функцию распределения можно записать в виде [4]:</w:t>
+      </w:r>
+    </w:p>
+    <w:p>
+      <w:pPr>
+        <w:spacing w:line="360" w:lineRule="auto"/>
+      </w:pPr>
+    </w:p>
+    <w:p>
+      <w:pPr>
+        <w:spacing w:before="120" w:after="120" w:line="360" w:lineRule="auto"/>
+        <w:jc w:val="center"/>
+      </w:pPr>
+      <m:oMathPara>
+        <m:oMath>
+          <m:sSub>
+            <m:sSubPr>
+              <m:ctrlPr>
+                <w:rPr>
+                  <w:rFonts w:ascii="Cambria Math" w:hAnsi="Cambria Math"/>
+                  <w:sz w:val="28"/>
+                  <w:szCs w:val="28"/>
+                </w:rPr>
+              </m:ctrlPr>
+            </m:sSubPr>
+            <m:e>
+              <m:r>
+                <w:rPr>
+                  <w:rFonts w:ascii="Cambria Math" w:hAnsi="Cambria Math"/>
+                  <w:sz w:val="28"/>
+                  <w:szCs w:val="28"/>
+                </w:rPr>
+                <m:t>F</m:t>
+              </m:r>
+            </m:e>
+            <m:sub>
+              <m:r>
+                <w:rPr>
+                  <w:rFonts w:ascii="Cambria Math" w:hAnsi="Cambria Math"/>
+                  <w:sz w:val="28"/>
+                  <w:szCs w:val="28"/>
+                </w:rPr>
+                <m:t>n</m:t>
+              </m:r>
+            </m:sub>
+          </m:sSub>
+          <m:r>
+            <w:rPr>
+              <w:rFonts w:ascii="Cambria Math" w:hAnsi="Cambria Math"/>
+              <w:sz w:val="28"/>
+              <w:szCs w:val="28"/>
+            </w:rPr>
+            <m:t>(x) = </m:t>
+          </m:r>
+          <m:f>
+            <m:fPr>
+              <m:ctrlPr>
+                <w:rPr>
+                  <w:rFonts w:ascii="Cambria Math" w:hAnsi="Cambria Math"/>
+                  <w:sz w:val="28"/>
+                  <w:szCs w:val="28"/>
+                </w:rPr>
+              </m:ctrlPr>
+            </m:fPr>
+            <m:num>
+              <m:r>
+                <w:rPr>
+                  <w:rFonts w:ascii="Cambria Math" w:hAnsi="Cambria Math"/>
+                  <w:sz w:val="28"/>
+                  <w:szCs w:val="28"/>
+                </w:rPr>
+                <m:t>1</m:t>
+              </m:r>
+            </m:num>
+            <m:den>
+              <m:r>
+                <w:rPr>
+                  <w:rFonts w:ascii="Cambria Math" w:hAnsi="Cambria Math"/>
+                  <w:sz w:val="28"/>
+                  <w:szCs w:val="28"/>
+                </w:rPr>
+                <m:t>n</m:t>
+              </m:r>
+            </m:den>
+          </m:f>
+          <m:r>
+            <w:rPr>
+              <w:rFonts w:ascii="Cambria Math" w:hAnsi="Cambria Math"/>
+              <w:sz w:val="28"/>
+              <w:szCs w:val="28"/>
+            </w:rPr>
+            <m:t> </m:t>
+          </m:r>
+          <m:nary>
+            <m:naryPr>
+              <m:chr m:val="∑"/>
+              <m:limLoc m:val="undOvr"/>
+              <m:ctrlPr>
+                <w:rPr>
+                  <w:rFonts w:ascii="Cambria Math" w:hAnsi="Cambria Math"/>
+                  <w:sz w:val="28"/>
+                  <w:szCs w:val="28"/>
+                </w:rPr>
+              </m:ctrlPr>
+            </m:naryPr>
+            <m:sub>
+              <m:r>
+                <w:rPr>
+                  <w:rFonts w:ascii="Cambria Math" w:hAnsi="Cambria Math"/>
+                  <w:sz w:val="28"/>
+                  <w:szCs w:val="28"/>
+                </w:rPr>
+                <m:t>k = 1</m:t>
+              </m:r>
+            </m:sub>
+            <m:sup>
+              <m:r>
+                <w:rPr>
+                  <w:rFonts w:ascii="Cambria Math" w:hAnsi="Cambria Math"/>
+                  <w:sz w:val="28"/>
+                  <w:szCs w:val="28"/>
+                </w:rPr>
+                <m:t>n</m:t>
+              </m:r>
+            </m:sup>
+            <m:e>
+              <m:r>
+                <w:rPr>
+                  <w:rFonts w:ascii="Cambria Math" w:hAnsi="Cambria Math"/>
+                  <w:sz w:val="28"/>
+                  <w:szCs w:val="28"/>
+                </w:rPr>
+                <m:t xml:space="preserve">e(x - </m:t>
+              </m:r>
+              <m:sSub>
+                <m:sSubPr>
+                  <m:ctrlPr>
+                    <w:rPr>
+                      <w:rFonts w:ascii="Cambria Math" w:hAnsi="Cambria Math"/>
+                      <w:sz w:val="28"/>
+                      <w:szCs w:val="28"/>
+                    </w:rPr>
+                  </m:ctrlPr>
+                </m:sSubPr>
+                <m:e>
+                  <m:r>
+                    <w:rPr>
+                      <w:rFonts w:ascii="Cambria Math" w:hAnsi="Cambria Math"/>
+                      <w:sz w:val="28"/>
+                      <w:szCs w:val="28"/>
+                    </w:rPr>
+                    <m:t>X</m:t>
+                  </m:r>
+                </m:e>
+                <m:sub>
+                  <m:r>
+                    <w:rPr>
+                      <w:rFonts w:ascii="Cambria Math" w:hAnsi="Cambria Math"/>
+                      <w:sz w:val="28"/>
+                      <w:szCs w:val="28"/>
+                    </w:rPr>
+                    <m:t>k</m:t>
+                  </m:r>
+                </m:sub>
+              </m:sSub>
+              <m:r>
+                <w:rPr>
+                  <w:rFonts w:ascii="Cambria Math" w:hAnsi="Cambria Math"/>
+                  <w:sz w:val="28"/>
+                  <w:szCs w:val="28"/>
+                </w:rPr>
+                <m:t>)</m:t>
+              </m:r>
+            </m:e>
+          </m:nary>
+        </m:oMath>
+      </m:oMathPara>
+    </w:p>
+    <w:p>
+      <w:pPr>
+        <w:spacing w:line="360" w:lineRule="auto"/>
+        <w:ind w:firstLine="720"/>
+      </w:pPr>
+      <w:r>
+        <w:rPr>
+          <w:sz w:val="28"/>
+          <w:szCs w:val="28"/>
+        </w:rPr>
+        <w:t xml:space="preserve">где функция </w:t>
+      </w:r>
+      <w:proofErr w:type="spellStart"/>
+      <w:r>
+        <w:rPr>
+          <w:sz w:val="28"/>
+          <w:szCs w:val="28"/>
+        </w:rPr>
+        <w:t>Хевисайда</w:t>
+      </w:r>
+      <w:proofErr w:type="spellEnd"/>
+      <w:r>
+        <w:rPr>
+          <w:sz w:val="28"/>
+          <w:szCs w:val="28"/>
+        </w:rPr>
+        <w:t xml:space="preserve"> e(x) определяется следующим образом:</w:t>
+      </w:r>
+    </w:p>
+    <w:p>
+      <w:pPr>
+        <w:spacing w:line="360" w:lineRule="auto"/>
+      </w:pPr>
+    </w:p>
+    <w:p>
+      <w:pPr>
+        <w:spacing w:before="120" w:after="120" w:line="360" w:lineRule="auto"/>
+        <w:jc w:val="center"/>
+      </w:pPr>
+      <m:oMathPara>
+        <m:oMath>
+          <m:r>
+            <w:rPr>
+              <w:rFonts w:ascii="Cambria Math" w:hAnsi="Cambria Math"/>
+              <w:sz w:val="28"/>
+              <w:szCs w:val="28"/>
+            </w:rPr>
+            <w:lastRenderedPageBreak/>
+            <m:t>e(x) = </m:t>
+          </m:r>
+          <m:d>
+            <m:dPr>
+              <m:begChr m:val="{"/>
+              <m:endChr m:val=""/>
+              <m:ctrlPr>
+                <w:rPr>
+                  <w:rFonts w:ascii="Cambria Math" w:hAnsi="Cambria Math"/>
+                  <w:sz w:val="28"/>
+                  <w:szCs w:val="28"/>
+                </w:rPr>
+              </m:ctrlPr>
+            </m:dPr>
+            <m:e>
+              <m:eqArr>
+                <m:eqArrPr>
+                  <m:ctrlPr>
+                    <w:rPr>
+                      <w:rFonts w:ascii="Cambria Math" w:hAnsi="Cambria Math"/>
+                      <w:sz w:val="28"/>
+                      <w:szCs w:val="28"/>
+                    </w:rPr>
+                  </m:ctrlPr>
+                </m:eqArrPr>
+                <m:e>
+                  <m:r>
+                    <w:rPr>
+                      <w:rFonts w:ascii="Cambria Math" w:hAnsi="Cambria Math"/>
+                      <w:sz w:val="28"/>
+                      <w:szCs w:val="28"/>
+                    </w:rPr>
+                    <m:t>0, x &lt; 0</m:t>
+                  </m:r>
+                </m:e>
+                <m:e>
+                  <m:r>
+                    <w:rPr>
+                      <w:rFonts w:ascii="Cambria Math" w:hAnsi="Cambria Math"/>
+                      <w:sz w:val="28"/>
+                      <w:szCs w:val="28"/>
+                    </w:rPr>
+                    <m:t>1, x ≥ 0</m:t>
+                  </m:r>
+                </m:e>
+              </m:eqArr>
+            </m:e>
+          </m:d>
+        </m:oMath>
+      </m:oMathPara>
+    </w:p>
+    <w:p>
+      <w:pPr>
+        <w:spacing w:line="360" w:lineRule="auto"/>
+      </w:pPr>
+    </w:p>
+    <w:p>
+      <w:pPr>
+        <w:spacing w:line="360" w:lineRule="auto"/>
+        <w:ind w:firstLine="720"/>
+      </w:pPr>
+      <w:r>
+        <w:rPr>
+          <w:b/>
+          <w:bCs/>
+          <w:sz w:val="28"/>
+          <w:szCs w:val="28"/>
+        </w:rPr>
+        <w:t>Свойства</w:t>
+      </w:r>
+      <w:r>
+        <w:rPr>
+          <w:sz w:val="28"/>
+          <w:szCs w:val="28"/>
+        </w:rPr>
+        <w:t xml:space="preserve"> эмпирической функции распределения [4]:</w:t>
+      </w:r>
+    </w:p>
+    <w:p>
+      <w:pPr>
+        <w:spacing w:line="360" w:lineRule="auto"/>
+      </w:pPr>
+    </w:p>
+    <w:p>
+      <w:pPr>
+        <w:spacing w:line="360" w:lineRule="auto"/>
+        <w:ind w:left="720" w:hanging="360"/>
+      </w:pPr>
+      <w:r>
+        <w:rPr>
+          <w:sz w:val="28"/>
+          <w:szCs w:val="28"/>
+        </w:rPr>
+        <w:t>–</w:t>
+      </w:r>
+      <w:r>
+        <w:rPr>
+          <w:sz w:val="28"/>
+          <w:szCs w:val="28"/>
+        </w:rPr>
+        <w:tab/>
+        <w:t>Fₙ(x) является кусочно-постоянной (ступенчатой) функцией, принимающей значения на отрезке [0; 1].</w:t>
+      </w:r>
+    </w:p>
+    <w:p>
+      <w:pPr>
+        <w:spacing w:line="360" w:lineRule="auto"/>
+        <w:ind w:left="720" w:hanging="360"/>
+      </w:pPr>
+      <w:r>
+        <w:rPr>
+          <w:sz w:val="28"/>
+          <w:szCs w:val="28"/>
+        </w:rPr>
+        <w:t>–</w:t>
+      </w:r>
+      <w:r>
+        <w:rPr>
+          <w:sz w:val="28"/>
+          <w:szCs w:val="28"/>
+        </w:rPr>
+        <w:tab/>
+        <w:t>Множество возможных значений Fₙ(x): 0, 1/n, 2/n, …, 1.</w:t>
+      </w:r>
+    </w:p>
+    <w:p>
+      <w:pPr>
+        <w:spacing w:line="360" w:lineRule="auto"/>
+        <w:ind w:left="720" w:hanging="360"/>
+      </w:pPr>
+      <w:r>
+        <w:rPr>
+          <w:sz w:val="28"/>
+          <w:szCs w:val="28"/>
+        </w:rPr>
+        <w:t>–</w:t>
+      </w:r>
+      <w:r>
+        <w:rPr>
+          <w:sz w:val="28"/>
+          <w:szCs w:val="28"/>
+        </w:rPr>
+        <w:tab/>
+        <w:t xml:space="preserve">В каждой точке </w:t>
+      </w:r>
+      <w:proofErr w:type="spellStart"/>
+      <w:r>
+        <w:rPr>
+          <w:sz w:val="28"/>
+          <w:szCs w:val="28"/>
+        </w:rPr>
+        <w:t>x₍m</w:t>
+      </w:r>
+      <w:proofErr w:type="spellEnd"/>
+      <w:r>
+        <w:rPr>
+          <w:sz w:val="28"/>
+          <w:szCs w:val="28"/>
+        </w:rPr>
+        <w:t xml:space="preserve">₎ функция имеет скачок величиной nₘ/n, где nₘ — число совпадающих элементов выборки, равных </w:t>
+      </w:r>
+      <w:proofErr w:type="spellStart"/>
+      <w:r>
+        <w:rPr>
+          <w:sz w:val="28"/>
+          <w:szCs w:val="28"/>
+        </w:rPr>
+        <w:t>x₍m</w:t>
+      </w:r>
+      <w:proofErr w:type="spellEnd"/>
+      <w:r>
+        <w:rPr>
+          <w:sz w:val="28"/>
+          <w:szCs w:val="28"/>
+        </w:rPr>
+        <w:t>₎.</w:t>
+      </w:r>
+    </w:p>
+    <w:p>
+      <w:pPr>
+        <w:spacing w:line="360" w:lineRule="auto"/>
+        <w:ind w:left="720" w:hanging="360"/>
+      </w:pPr>
+      <w:r>
+        <w:rPr>
+          <w:sz w:val="28"/>
+          <w:szCs w:val="28"/>
+        </w:rPr>
+        <w:t>–</w:t>
+      </w:r>
+      <w:r>
+        <w:rPr>
+          <w:sz w:val="28"/>
+          <w:szCs w:val="28"/>
+        </w:rPr>
+        <w:tab/>
+        <w:t>При n → ∞ эмпирическая функция распределения сходится по вероятности к теоретической: Fₙ(x) →ᵖ Fᴫ(x) для любого x.</w:t>
+      </w:r>
+    </w:p>
+    <w:p>
+      <w:pPr>
+        <w:spacing w:line="360" w:lineRule="auto"/>
+      </w:pPr>
+    </w:p>
+    <w:p>
+      <w:pPr>
+        <w:spacing w:line="360" w:lineRule="auto"/>
+        <w:ind w:firstLine="720"/>
+      </w:pPr>
+      <w:r>
+        <w:rPr>
+          <w:b/>
+          <w:bCs/>
+          <w:sz w:val="28"/>
+          <w:szCs w:val="28"/>
+        </w:rPr>
+        <w:t>Теорема Гливенко</w:t>
+      </w:r>
+      <w:r>
+        <w:rPr>
+          <w:sz w:val="28"/>
+          <w:szCs w:val="28"/>
+        </w:rPr>
+        <w:t xml:space="preserve">. Отклонение эмпирической функции распределения </w:t>
+      </w:r>
+      <w:proofErr w:type="spellStart"/>
+      <w:r>
+        <w:rPr>
+          <w:sz w:val="28"/>
+          <w:szCs w:val="28"/>
+        </w:rPr>
+        <w:t>F</w:t>
+      </w:r>
+      <w:r>
+        <w:rPr>
+          <w:sz w:val="28"/>
+          <w:szCs w:val="28"/>
+          <w:vertAlign w:val="subscript"/>
+        </w:rPr>
+        <w:t>n</w:t>
+      </w:r>
+      <w:proofErr w:type="spellEnd"/>
+      <w:r>
+        <w:rPr>
+          <w:sz w:val="28"/>
+          <w:szCs w:val="28"/>
+        </w:rPr>
+        <w:t>(x) от теоретической функции распределения F</w:t>
+      </w:r>
+      <w:r>
+        <w:rPr>
+          <w:i/>
+          <w:iCs/>
+          <w:sz w:val="28"/>
+          <w:szCs w:val="28"/>
+        </w:rPr>
+        <w:t>X</w:t>
+      </w:r>
+      <w:r>
+        <w:rPr>
+          <w:sz w:val="28"/>
+          <w:szCs w:val="28"/>
+        </w:rPr>
+        <w:t>(x) с вероятностью 1 стремится к нулю равномерно по всей числовой оси:</w:t>
+      </w:r>
+    </w:p>
+    <w:p>
+      <w:pPr>
+        <w:spacing w:line="360" w:lineRule="auto"/>
+      </w:pPr>
+    </w:p>
+    <w:p>
+      <w:pPr>
+        <w:spacing w:before="120" w:after="120" w:line="360" w:lineRule="auto"/>
+        <w:jc w:val="center"/>
+      </w:pPr>
+      <m:oMathPara>
+        <m:oMath>
+          <m:r>
+            <w:rPr>
+              <w:rFonts w:ascii="Cambria Math" w:hAnsi="Cambria Math"/>
+              <w:sz w:val="28"/>
+              <w:szCs w:val="28"/>
+            </w:rPr>
+            <m:t>P</m:t>
+          </m:r>
+          <m:d>
+            <m:dPr>
+              <m:ctrlPr>
+                <w:rPr>
+                  <w:rFonts w:ascii="Cambria Math" w:hAnsi="Cambria Math"/>
+                  <w:sz w:val="28"/>
+                  <w:szCs w:val="28"/>
+                </w:rPr>
+              </m:ctrlPr>
+            </m:dPr>
+            <m:e>
+              <m:func>
+                <m:funcPr>
+                  <m:ctrlPr>
+                    <w:rPr>
+                      <w:rFonts w:ascii="Cambria Math" w:hAnsi="Cambria Math"/>
+                      <w:sz w:val="28"/>
+                      <w:szCs w:val="28"/>
+                    </w:rPr>
+                  </m:ctrlPr>
+                </m:funcPr>
+                <m:fName>
+                  <m:r>
+                    <w:rPr>
+                      <w:rFonts w:ascii="Cambria Math" w:hAnsi="Cambria Math"/>
+                      <w:sz w:val="28"/>
+                      <w:szCs w:val="28"/>
+                    </w:rPr>
+                    <m:t>sup</m:t>
+                  </m:r>
+                </m:fName>
+                <m:e>
+                  <m:d>
+                    <m:dPr>
+                      <m:begChr m:val="|"/>
+                      <m:endChr m:val="|"/>
+                      <m:ctrlPr>
+                        <w:rPr>
+                          <w:rFonts w:ascii="Cambria Math" w:hAnsi="Cambria Math"/>
+                          <w:sz w:val="28"/>
+                          <w:szCs w:val="28"/>
+                        </w:rPr>
+                      </m:ctrlPr>
+                    </m:dPr>
+                    <m:e>
+                      <m:sSub>
+                        <m:sSubPr>
+                          <m:ctrlPr>
+                            <w:rPr>
+                              <w:rFonts w:ascii="Cambria Math" w:hAnsi="Cambria Math"/>
+                              <w:sz w:val="28"/>
+                              <w:szCs w:val="28"/>
+                            </w:rPr>
+                          </m:ctrlPr>
+                        </m:sSubPr>
+                        <m:e>
+                          <m:r>
+                            <w:rPr>
+                              <w:rFonts w:ascii="Cambria Math" w:hAnsi="Cambria Math"/>
+                              <w:sz w:val="28"/>
+                              <w:szCs w:val="28"/>
+                            </w:rPr>
+                            <m:t>F</m:t>
+                          </m:r>
+                        </m:e>
+                        <m:sub>
+                          <m:r>
+                            <w:rPr>
+                              <w:rFonts w:ascii="Cambria Math" w:hAnsi="Cambria Math"/>
+                              <w:sz w:val="28"/>
+                              <w:szCs w:val="28"/>
+                            </w:rPr>
+                            <m:t>n</m:t>
+                          </m:r>
+                        </m:sub>
+                      </m:sSub>
+                      <m:r>
+                        <w:rPr>
+                          <w:rFonts w:ascii="Cambria Math" w:hAnsi="Cambria Math"/>
+                          <w:sz w:val="28"/>
+                          <w:szCs w:val="28"/>
+                        </w:rPr>
+                        <m:t>(x) - </m:t>
+                      </m:r>
+                      <m:sSub>
+                        <m:sSubPr>
+                          <m:ctrlPr>
+                            <w:rPr>
+                              <w:rFonts w:ascii="Cambria Math" w:hAnsi="Cambria Math"/>
+                              <w:sz w:val="28"/>
+                              <w:szCs w:val="28"/>
+                            </w:rPr>
+                          </m:ctrlPr>
+                        </m:sSubPr>
+                        <m:e>
+                          <m:r>
+                            <w:rPr>
+                              <w:rFonts w:ascii="Cambria Math" w:hAnsi="Cambria Math"/>
+                              <w:sz w:val="28"/>
+                              <w:szCs w:val="28"/>
+                            </w:rPr>
+                            <m:t>F</m:t>
+                          </m:r>
+                        </m:e>
+                        <m:sub>
+                          <m:r>
+                            <w:rPr>
+                              <w:rFonts w:ascii="Cambria Math" w:hAnsi="Cambria Math"/>
+                              <w:sz w:val="28"/>
+                              <w:szCs w:val="28"/>
+                            </w:rPr>
+                            <m:t>X</m:t>
+                          </m:r>
+                        </m:sub>
+                      </m:sSub>
+                      <m:r>
+                        <w:rPr>
+                          <w:rFonts w:ascii="Cambria Math" w:hAnsi="Cambria Math"/>
+                          <w:sz w:val="28"/>
+                          <w:szCs w:val="28"/>
+                        </w:rPr>
+                        <m:t>(x)</m:t>
+                      </m:r>
+                    </m:e>
+                  </m:d>
+                </m:e>
+              </m:func>
+              <m:r>
+                <w:rPr>
+                  <w:rFonts w:ascii="Cambria Math" w:hAnsi="Cambria Math"/>
+                  <w:sz w:val="28"/>
+                  <w:szCs w:val="28"/>
+                </w:rPr>
+                <m:t> ≥ ε</m:t>
+              </m:r>
+            </m:e>
+          </m:d>
+          <m:r>
+            <w:rPr>
+              <w:rFonts w:ascii="Cambria Math" w:hAnsi="Cambria Math"/>
+              <w:sz w:val="28"/>
+              <w:szCs w:val="28"/>
+            </w:rPr>
+            <m:t> ⟶ 0  при n → ∞</m:t>
+          </m:r>
+        </m:oMath>
+      </m:oMathPara>
+    </w:p>
+    <w:p>
+      <w:pPr>
+        <w:spacing w:line="360" w:lineRule="auto"/>
+      </w:pPr>
+    </w:p>
+    <w:p>
+      <w:pPr>
+        <w:spacing w:line="360" w:lineRule="auto"/>
+        <w:ind w:firstLine="720"/>
+        <w:jc w:val="center"/>
+      </w:pPr>
+      <w:r>
+        <w:rPr>
+          <w:b/>
+          <w:bCs/>
+          <w:sz w:val="28"/>
+          <w:szCs w:val="28"/>
+        </w:rPr>
+        <w:t>Алгоритм построения эмпирической функции распределения</w:t>
+      </w:r>
+      <w:r>
+        <w:rPr>
+          <w:sz w:val="28"/>
+          <w:szCs w:val="28"/>
+        </w:rPr>
+        <w:t>:</w:t>
+      </w:r>
+    </w:p>
+    <w:p>
+      <w:pPr>
+        <w:spacing w:line="360" w:lineRule="auto"/>
+      </w:pPr>
+    </w:p>
+    <w:p>
+      <w:pPr>
+        <w:spacing w:line="360" w:lineRule="auto"/>
+        <w:ind w:left="720" w:hanging="360"/>
+      </w:pPr>
+      <w:r>
+        <w:rPr>
+          <w:sz w:val="28"/>
+          <w:szCs w:val="28"/>
+        </w:rPr>
+        <w:t>1.</w:t>
+      </w:r>
+      <w:r>
+        <w:rPr>
+          <w:sz w:val="28"/>
+          <w:szCs w:val="28"/>
+        </w:rPr>
+        <w:tab/>
+        <w:t>Упорядочить элементы выборки по возрастанию, получив вариационный ряд x₍₁₎ ≤ x₍₂₎ ≤ … ≤ x₍ₙ₎.</w:t>
+      </w:r>
+    </w:p>
+    <w:p>
+      <w:pPr>
+        <w:spacing w:line="360" w:lineRule="auto"/>
+        <w:ind w:left="720" w:hanging="360"/>
+      </w:pPr>
+      <w:r>
+        <w:rPr>
+          <w:sz w:val="28"/>
+          <w:szCs w:val="28"/>
+        </w:rPr>
+        <w:t>2.</w:t>
+      </w:r>
+      <w:r>
+        <w:rPr>
+          <w:sz w:val="28"/>
+          <w:szCs w:val="28"/>
+        </w:rPr>
+        <w:tab/>
+        <w:t>Для каждого фиксированного x определить количество Nₙ(x) элементов выборки, строго меньших x.</w:t>
+      </w:r>
+    </w:p>
+    <w:p>
+      <w:pPr>
+        <w:spacing w:line="360" w:lineRule="auto"/>
+        <w:ind w:left="720" w:hanging="360"/>
+      </w:pPr>
+      <w:r>
+        <w:rPr>
+          <w:sz w:val="28"/>
+          <w:szCs w:val="28"/>
+        </w:rPr>
+        <w:t>3.</w:t>
+      </w:r>
+      <w:r>
+        <w:rPr>
+          <w:sz w:val="28"/>
+          <w:szCs w:val="28"/>
+        </w:rPr>
+        <w:tab/>
+        <w:t>Вычислить значение эмпирической функции распределения по формуле Fₙ(x) = Nₙ(x) / n.</w:t>
+      </w:r>
+    </w:p>
+    <w:p>
+      <w:pPr>
+        <w:spacing w:line="360" w:lineRule="auto"/>
+        <w:ind w:left="720" w:hanging="360"/>
+      </w:pPr>
+      <w:r>
+        <w:rPr>
+          <w:sz w:val="28"/>
+          <w:szCs w:val="28"/>
+        </w:rPr>
+        <w:t>4.</w:t>
+      </w:r>
+      <w:r>
+        <w:rPr>
+          <w:sz w:val="28"/>
+          <w:szCs w:val="28"/>
+        </w:rPr>
+        <w:tab/>
+        <w:t>Построить ступенчатый график функции:</w:t>
+      </w:r>
+    </w:p>
+    <w:p>
+      <w:pPr>
+        <w:spacing w:line="360" w:lineRule="auto"/>
+      </w:pPr>
+    </w:p>
+    <w:p>
+      <w:pPr>
+        <w:rPr>
+          <w:sz w:val="28"/>
+          <w:szCs w:val="28"/>
+        </w:rPr>
+      </w:pPr>
+      <m:oMathPara>
+        <m:oMath>
+          <m:sSub>
+            <m:sSubPr>
+              <m:ctrlPr>
+                <w:rPr>
+                  <w:rFonts w:ascii="Cambria Math" w:hAnsi="Cambria Math"/>
+                  <w:sz w:val="28"/>
+                  <w:szCs w:val="28"/>
+                </w:rPr>
+              </m:ctrlPr>
+            </m:sSubPr>
+            <m:e>
+              <m:r>
+                <w:rPr>
+                  <w:rFonts w:ascii="Cambria Math" w:hAnsi="Cambria Math"/>
+                  <w:sz w:val="28"/>
+                  <w:szCs w:val="28"/>
+                </w:rPr>
+                <m:t>F</m:t>
+              </m:r>
+            </m:e>
+            <m:sub>
+              <m:r>
+                <w:rPr>
+                  <w:rFonts w:ascii="Cambria Math" w:hAnsi="Cambria Math"/>
+                  <w:sz w:val="28"/>
+                  <w:szCs w:val="28"/>
+                </w:rPr>
+                <m:t>n</m:t>
+              </m:r>
+            </m:sub>
+          </m:sSub>
+          <m:r>
+            <w:rPr>
+              <w:rFonts w:ascii="Cambria Math" w:hAnsi="Cambria Math"/>
+              <w:sz w:val="28"/>
+              <w:szCs w:val="28"/>
+            </w:rPr>
+            <m:t>(x) = </m:t>
+          </m:r>
+          <m:d>
+            <m:dPr>
+              <m:begChr m:val="{"/>
+              <m:endChr m:val=""/>
+              <m:ctrlPr>
+                <w:rPr>
+                  <w:rFonts w:ascii="Cambria Math" w:hAnsi="Cambria Math"/>
+                  <w:sz w:val="28"/>
+                  <w:szCs w:val="28"/>
+                </w:rPr>
+              </m:ctrlPr>
+            </m:dPr>
+            <m:e>
+              <m:eqArr>
+                <m:eqArrPr>
+                  <m:ctrlPr>
+                    <w:rPr>
+                      <w:rFonts w:ascii="Cambria Math" w:hAnsi="Cambria Math"/>
+                      <w:sz w:val="28"/>
+                      <w:szCs w:val="28"/>
+                    </w:rPr>
+                  </m:ctrlPr>
+                </m:eqArrPr>
+                <m:e>
+                  <m:r>
+                    <w:rPr>
+                      <w:rFonts w:ascii="Cambria Math" w:hAnsi="Cambria Math"/>
+                      <w:sz w:val="28"/>
+                      <w:szCs w:val="28"/>
+                    </w:rPr>
+                    <m:t>0, x ≤ x₍₁₎</m:t>
+                  </m:r>
+                </m:e>
+                <m:e>
+                  <m:r>
+                    <w:rPr>
+                      <w:rFonts w:ascii="Cambria Math" w:hAnsi="Cambria Math"/>
+                      <w:sz w:val="28"/>
+                      <w:szCs w:val="28"/>
+                    </w:rPr>
+                    <m:t>k/n, x₍ᵏ₎ &lt; x ≤ x₍ᵏ₊₁₎, k = 1,…,n-1</m:t>
+                  </m:r>
+                </m:e>
+                <m:e>
+                  <m:r>
+                    <w:rPr>
+                      <w:rFonts w:ascii="Cambria Math" w:hAnsi="Cambria Math"/>
+                      <w:sz w:val="28"/>
+                      <w:szCs w:val="28"/>
+                    </w:rPr>
+                    <m:t>1, x &gt; x₍ₙ₎</m:t>
+                  </m:r>
+                </m:e>
+              </m:eqArr>
+            </m:e>
+          </m:d>
+        </m:oMath>
+      </m:oMathPara>
+    </w:p>
+    <w:p>
+      <w:pPr>
+        <w:rPr>
+          <w:sz w:val="28"/>
+          <w:szCs w:val="28"/>
+        </w:rPr>
+      </w:pPr>
+    </w:p>
+    <w:p>
+      <w:pPr>
         <w:rPr>
           <w:b/>
           <w:bCs/>
           <w:sz w:val="32"/>
           <w:szCs w:val="32"/>
         </w:rPr>
-        <w:t>использованной</w:t>
-      </w:r>
-      <w:r>
+      </w:pPr>
+    </w:p>
+    <w:p>
+      <w:pPr>
+        <w:pStyle w:val="a7"/>
+        <w:numPr>
+          <w:ilvl w:val="1"/>
+          <w:numId w:val="3"/>
+        </w:numPr>
+        <w:jc w:val="center"/>
         <w:rPr>
           <w:b/>
           <w:bCs/>
           <w:sz w:val="32"/>
           <w:szCs w:val="32"/>
         </w:rPr>
+      </w:pPr>
+      <w:r>
+        <w:rPr>
+          <w:b/>
+          <w:bCs/>
+          <w:sz w:val="28"/>
+          <w:szCs w:val="28"/>
+        </w:rPr>
+        <w:t>Реализация</w:t>
+      </w:r>
+      <w:r>
+        <w:rPr>
+          <w:b/>
+          <w:bCs/>
+          <w:sz w:val="28"/>
+          <w:szCs w:val="28"/>
+        </w:rPr>
+        <w:t xml:space="preserve"> эмпирической функции</w:t>
+      </w:r>
+      <w:r>
+        <w:rPr>
+          <w:b/>
+          <w:bCs/>
+          <w:sz w:val="28"/>
+          <w:szCs w:val="28"/>
+        </w:rPr>
+        <w:t xml:space="preserve"> на языке Python</w:t>
+      </w:r>
+      <w:r>
+        <w:rPr>
+          <w:b/>
+          <w:bCs/>
+          <w:sz w:val="28"/>
+          <w:szCs w:val="28"/>
+        </w:rPr>
+        <w:t xml:space="preserve"> и выводы</w:t>
+      </w:r>
+    </w:p>
+    <w:p>
+      <w:pPr>
+        <w:pStyle w:val="a7"/>
+        <w:spacing w:before="100" w:beforeAutospacing="1" w:after="100" w:afterAutospacing="1"/>
+        <w:rPr>
+          <w:rFonts w:ascii="Courier New" w:hAnsi="Courier New" w:cs="Courier New"/>
+        </w:rPr>
+      </w:pPr>
+    </w:p>
+    <w:p>
+      <w:pPr>
+        <w:spacing w:before="100" w:beforeAutospacing="1" w:after="100" w:afterAutospacing="1"/>
+        <w:rPr>
+          <w:sz w:val="28"/>
+          <w:szCs w:val="28"/>
+        </w:rPr>
+      </w:pPr>
+      <w:r>
+        <w:rPr>
+          <w:sz w:val="28"/>
+          <w:szCs w:val="28"/>
+        </w:rPr>
+        <w:t>Реализация</w:t>
+      </w:r>
+      <w:r>
+        <w:rPr>
+          <w:sz w:val="28"/>
+          <w:szCs w:val="28"/>
+        </w:rPr>
         <w:t xml:space="preserve"> </w:t>
       </w:r>
       <w:r>
+        <w:rPr>
+          <w:sz w:val="28"/>
+          <w:szCs w:val="28"/>
+        </w:rPr>
+        <w:t>эмпирической</w:t>
+      </w:r>
+      <w:r>
+        <w:rPr>
+          <w:sz w:val="28"/>
+          <w:szCs w:val="28"/>
+        </w:rPr>
+        <w:t xml:space="preserve"> </w:t>
+      </w:r>
+      <w:r>
+        <w:rPr>
+          <w:sz w:val="28"/>
+          <w:szCs w:val="28"/>
+        </w:rPr>
+        <w:t>функции</w:t>
+      </w:r>
+      <w:r>
+        <w:rPr>
+          <w:sz w:val="28"/>
+          <w:szCs w:val="28"/>
+        </w:rPr>
+        <w:t xml:space="preserve"> </w:t>
+      </w:r>
+      <w:r>
+        <w:rPr>
+          <w:sz w:val="28"/>
+          <w:szCs w:val="28"/>
+        </w:rPr>
+        <w:t>выглядит следующим образом:</w:t>
+      </w:r>
+    </w:p>
+    <w:p>
+      <w:pPr>
+        <w:pStyle w:val="a7"/>
+        <w:spacing w:before="100" w:beforeAutospacing="1" w:after="100" w:afterAutospacing="1"/>
+        <w:rPr>
+          <w:sz w:val="24"/>
+          <w:szCs w:val="24"/>
+          <w:lang w:val="en-US"/>
+        </w:rPr>
+      </w:pPr>
+      <w:r>
+        <w:rPr>
+          <w:rFonts w:ascii="Courier New" w:hAnsi="Courier New" w:cs="Courier New"/>
+          <w:lang w:val="en-US"/>
+        </w:rPr>
+        <w:t xml:space="preserve">def </w:t>
+      </w:r>
+      <w:proofErr w:type="spellStart"/>
+      <w:r>
+        <w:rPr>
+          <w:rFonts w:ascii="Courier New" w:hAnsi="Courier New" w:cs="Courier New"/>
+          <w:lang w:val="en-US"/>
+        </w:rPr>
+        <w:t>empirical_cdf_value</w:t>
+      </w:r>
+      <w:proofErr w:type="spellEnd"/>
+      <w:r>
+        <w:rPr>
+          <w:rFonts w:ascii="Courier New" w:hAnsi="Courier New" w:cs="Courier New"/>
+          <w:lang w:val="en-US"/>
+        </w:rPr>
+        <w:t>(X, x):</w:t>
+      </w:r>
+      <w:r>
+        <w:rPr>
+          <w:sz w:val="24"/>
+          <w:szCs w:val="24"/>
+          <w:lang w:val="en-US"/>
+        </w:rPr>
+        <w:br/>
+      </w:r>
+      <w:r>
+        <w:rPr>
+          <w:rFonts w:ascii="Courier New" w:hAnsi="Courier New" w:cs="Courier New"/>
+          <w:lang w:val="en-US"/>
+        </w:rPr>
+        <w:t xml:space="preserve">n = </w:t>
+      </w:r>
+      <w:proofErr w:type="spellStart"/>
+      <w:r>
+        <w:rPr>
+          <w:rFonts w:ascii="Courier New" w:hAnsi="Courier New" w:cs="Courier New"/>
+          <w:lang w:val="en-US"/>
+        </w:rPr>
+        <w:t>len</w:t>
+      </w:r>
+      <w:proofErr w:type="spellEnd"/>
+      <w:r>
+        <w:rPr>
+          <w:rFonts w:ascii="Courier New" w:hAnsi="Courier New" w:cs="Courier New"/>
+          <w:lang w:val="en-US"/>
+        </w:rPr>
+        <w:t>(X)</w:t>
+      </w:r>
+      <w:r>
+        <w:rPr>
+          <w:sz w:val="24"/>
+          <w:szCs w:val="24"/>
+          <w:lang w:val="en-US"/>
+        </w:rPr>
+        <w:br/>
+      </w:r>
+      <w:r>
+        <w:rPr>
+          <w:rFonts w:ascii="Courier New" w:hAnsi="Courier New" w:cs="Courier New"/>
+          <w:lang w:val="en-US"/>
+        </w:rPr>
+        <w:t>count = 0</w:t>
+      </w:r>
+      <w:r>
+        <w:rPr>
+          <w:sz w:val="24"/>
+          <w:szCs w:val="24"/>
+          <w:lang w:val="en-US"/>
+        </w:rPr>
+        <w:br/>
+      </w:r>
+      <w:r>
+        <w:rPr>
+          <w:sz w:val="24"/>
+          <w:szCs w:val="24"/>
+          <w:lang w:val="en-US"/>
+        </w:rPr>
+        <w:br/>
+        <w:t>for value in X:</w:t>
+      </w:r>
+      <w:r>
+        <w:rPr>
+          <w:sz w:val="24"/>
+          <w:szCs w:val="24"/>
+          <w:lang w:val="en-US"/>
+        </w:rPr>
+        <w:br/>
+        <w:t>if value &lt;= x:</w:t>
+      </w:r>
+      <w:r>
+        <w:rPr>
+          <w:sz w:val="24"/>
+          <w:szCs w:val="24"/>
+          <w:lang w:val="en-US"/>
+        </w:rPr>
+        <w:br/>
+        <w:t>count += 1</w:t>
+      </w:r>
+      <w:r>
+        <w:rPr>
+          <w:sz w:val="24"/>
+          <w:szCs w:val="24"/>
+          <w:lang w:val="en-US"/>
+        </w:rPr>
+        <w:br/>
+      </w:r>
+      <w:r>
+        <w:rPr>
+          <w:sz w:val="24"/>
+          <w:szCs w:val="24"/>
+          <w:lang w:val="en-US"/>
+        </w:rPr>
+        <w:br/>
+        <w:t>return count / n</w:t>
+      </w:r>
+    </w:p>
+    <w:p>
+      <w:pPr>
+        <w:pStyle w:val="a7"/>
+        <w:ind w:left="780"/>
         <w:rPr>
           <w:b/>
           <w:bCs/>
           <w:sz w:val="32"/>
           <w:szCs w:val="32"/>
         </w:rPr>
-        <w:t>л</w:t>
-      </w:r>
-      <w:r>
+      </w:pPr>
+    </w:p>
+    <w:p>
+      <w:pPr>
+        <w:rPr>
+          <w:sz w:val="28"/>
+          <w:szCs w:val="28"/>
+        </w:rPr>
+      </w:pPr>
+      <w:r>
+        <w:rPr>
+          <w:sz w:val="28"/>
+          <w:szCs w:val="28"/>
+        </w:rPr>
+        <w:t>Вывод эмпирической функции сохранили в .</w:t>
+      </w:r>
+      <w:r>
+        <w:rPr>
+          <w:sz w:val="28"/>
+          <w:szCs w:val="28"/>
+          <w:lang w:val="en-US"/>
+        </w:rPr>
+        <w:t>csv</w:t>
+      </w:r>
+      <w:r>
+        <w:rPr>
+          <w:sz w:val="28"/>
+          <w:szCs w:val="28"/>
+        </w:rPr>
+        <w:t xml:space="preserve"> формат, для удобства были сделаны графики:</w:t>
+      </w:r>
+    </w:p>
+    <w:p>
+      <w:pPr>
+        <w:jc w:val="center"/>
+        <w:rPr>
+          <w:sz w:val="28"/>
+          <w:szCs w:val="28"/>
+        </w:rPr>
+      </w:pPr>
+      <w:r>
+        <w:rPr>
+          <w:sz w:val="28"/>
+          <w:szCs w:val="28"/>
+        </w:rPr>
+        <w:drawing>
+          <wp:inline distT="0" distB="0" distL="0" distR="0" wp14:anchorId="0ABD80F2" wp14:editId="637E1AB5">
+            <wp:extent cx="5940425" cy="3277870"/>
+            <wp:effectExtent l="0" t="0" r="3175" b="0"/>
+            <wp:docPr id="1" name="Рисунок 1"/>
+            <wp:cNvGraphicFramePr>
+              <a:graphicFrameLocks xmlns:a="http://schemas.openxmlformats.org/drawingml/2006/main" noChangeAspect="1"/>
+            </wp:cNvGraphicFramePr>
+            <a:graphic xmlns:a="http://schemas.openxmlformats.org/drawingml/2006/main">
+              <a:graphicData uri="http://schemas.openxmlformats.org/drawingml/2006/picture">
+                <pic:pic xmlns:pic="http://schemas.openxmlformats.org/drawingml/2006/picture">
+                  <pic:nvPicPr>
+                    <pic:cNvPr id="1" name=""/>
+                    <pic:cNvPicPr/>
+                  </pic:nvPicPr>
+                  <pic:blipFill>
+                    <a:blip r:embed="rId6"/>
+                    <a:stretch>
+                      <a:fillRect/>
+                    </a:stretch>
+                  </pic:blipFill>
+                  <pic:spPr>
+                    <a:xfrm>
+                      <a:off x="0" y="0"/>
+                      <a:ext cx="5940425" cy="3277870"/>
+                    </a:xfrm>
+                    <a:prstGeom prst="rect">
+                      <a:avLst/>
+                    </a:prstGeom>
+                  </pic:spPr>
+                </pic:pic>
+              </a:graphicData>
+            </a:graphic>
+          </wp:inline>
+        </w:drawing>
+      </w:r>
+    </w:p>
+    <w:p>
+      <w:pPr>
+        <w:jc w:val="center"/>
+        <w:rPr>
+          <w:sz w:val="28"/>
+          <w:szCs w:val="28"/>
+        </w:rPr>
+      </w:pPr>
+      <w:r>
+        <w:rPr>
+          <w:sz w:val="28"/>
+          <w:szCs w:val="28"/>
+        </w:rPr>
+        <w:t xml:space="preserve">Рисунок 1. График эмпирической функции распределения для </w:t>
+      </w:r>
+      <w:proofErr w:type="spellStart"/>
+      <w:r>
+        <w:rPr>
+          <w:sz w:val="28"/>
+          <w:szCs w:val="28"/>
+        </w:rPr>
+        <w:t>подвыборки</w:t>
+      </w:r>
+      <w:proofErr w:type="spellEnd"/>
+      <w:r>
+        <w:rPr>
+          <w:sz w:val="28"/>
+          <w:szCs w:val="28"/>
+        </w:rPr>
+        <w:t xml:space="preserve"> из 10 элементов. </w:t>
+      </w:r>
+    </w:p>
+    <w:p>
+      <w:pPr>
+        <w:jc w:val="center"/>
+        <w:rPr>
+          <w:sz w:val="28"/>
+          <w:szCs w:val="28"/>
+        </w:rPr>
+      </w:pPr>
+      <w:r>
+        <w:rPr>
+          <w:sz w:val="28"/>
+          <w:szCs w:val="28"/>
+        </w:rPr>
+        <w:lastRenderedPageBreak/>
+        <w:drawing>
+          <wp:inline distT="0" distB="0" distL="0" distR="0" wp14:anchorId="2C187376" wp14:editId="4BACFE4D">
+            <wp:extent cx="5940425" cy="2942590"/>
+            <wp:effectExtent l="0" t="0" r="3175" b="0"/>
+            <wp:docPr id="2" name="Рисунок 2"/>
+            <wp:cNvGraphicFramePr>
+              <a:graphicFrameLocks xmlns:a="http://schemas.openxmlformats.org/drawingml/2006/main" noChangeAspect="1"/>
+            </wp:cNvGraphicFramePr>
+            <a:graphic xmlns:a="http://schemas.openxmlformats.org/drawingml/2006/main">
+              <a:graphicData uri="http://schemas.openxmlformats.org/drawingml/2006/picture">
+                <pic:pic xmlns:pic="http://schemas.openxmlformats.org/drawingml/2006/picture">
+                  <pic:nvPicPr>
+                    <pic:cNvPr id="1" name=""/>
+                    <pic:cNvPicPr/>
+                  </pic:nvPicPr>
+                  <pic:blipFill>
+                    <a:blip r:embed="rId7"/>
+                    <a:stretch>
+                      <a:fillRect/>
+                    </a:stretch>
+                  </pic:blipFill>
+                  <pic:spPr>
+                    <a:xfrm>
+                      <a:off x="0" y="0"/>
+                      <a:ext cx="5940425" cy="2942590"/>
+                    </a:xfrm>
+                    <a:prstGeom prst="rect">
+                      <a:avLst/>
+                    </a:prstGeom>
+                  </pic:spPr>
+                </pic:pic>
+              </a:graphicData>
+            </a:graphic>
+          </wp:inline>
+        </w:drawing>
+      </w:r>
+    </w:p>
+    <w:p>
+      <w:pPr>
+        <w:jc w:val="center"/>
+        <w:rPr>
+          <w:sz w:val="28"/>
+          <w:szCs w:val="28"/>
+        </w:rPr>
+      </w:pPr>
+      <w:r>
+        <w:rPr>
+          <w:sz w:val="28"/>
+          <w:szCs w:val="28"/>
+        </w:rPr>
+        <w:t xml:space="preserve">Рисунок </w:t>
+      </w:r>
+      <w:r>
+        <w:rPr>
+          <w:sz w:val="28"/>
+          <w:szCs w:val="28"/>
+        </w:rPr>
+        <w:t>2</w:t>
+      </w:r>
+      <w:r>
+        <w:rPr>
+          <w:sz w:val="28"/>
+          <w:szCs w:val="28"/>
+        </w:rPr>
+        <w:t xml:space="preserve">. График эмпирической функции распределения для </w:t>
+      </w:r>
+      <w:proofErr w:type="spellStart"/>
+      <w:r>
+        <w:rPr>
+          <w:sz w:val="28"/>
+          <w:szCs w:val="28"/>
+        </w:rPr>
+        <w:t>подвыборки</w:t>
+      </w:r>
+      <w:proofErr w:type="spellEnd"/>
+      <w:r>
+        <w:rPr>
+          <w:sz w:val="28"/>
+          <w:szCs w:val="28"/>
+        </w:rPr>
+        <w:t xml:space="preserve"> из 10</w:t>
+      </w:r>
+      <w:r>
+        <w:rPr>
+          <w:sz w:val="28"/>
+          <w:szCs w:val="28"/>
+        </w:rPr>
+        <w:t>0</w:t>
+      </w:r>
+      <w:r>
+        <w:rPr>
+          <w:sz w:val="28"/>
+          <w:szCs w:val="28"/>
+        </w:rPr>
+        <w:t xml:space="preserve"> элементов. </w:t>
+      </w:r>
+    </w:p>
+    <w:p>
+      <w:pPr>
+        <w:jc w:val="center"/>
+        <w:rPr>
+          <w:sz w:val="28"/>
+          <w:szCs w:val="28"/>
+        </w:rPr>
+      </w:pPr>
+    </w:p>
+    <w:p>
+      <w:pPr>
+        <w:jc w:val="center"/>
+        <w:rPr>
+          <w:sz w:val="28"/>
+          <w:szCs w:val="28"/>
+        </w:rPr>
+      </w:pPr>
+      <w:r>
+        <w:rPr>
+          <w:sz w:val="28"/>
+          <w:szCs w:val="28"/>
+        </w:rPr>
+        <w:drawing>
+          <wp:inline distT="0" distB="0" distL="0" distR="0" wp14:anchorId="41D7A4F1" wp14:editId="50DE0ED2">
+            <wp:extent cx="5940425" cy="2705735"/>
+            <wp:effectExtent l="0" t="0" r="3175" b="0"/>
+            <wp:docPr id="3" name="Рисунок 3"/>
+            <wp:cNvGraphicFramePr>
+              <a:graphicFrameLocks xmlns:a="http://schemas.openxmlformats.org/drawingml/2006/main" noChangeAspect="1"/>
+            </wp:cNvGraphicFramePr>
+            <a:graphic xmlns:a="http://schemas.openxmlformats.org/drawingml/2006/main">
+              <a:graphicData uri="http://schemas.openxmlformats.org/drawingml/2006/picture">
+                <pic:pic xmlns:pic="http://schemas.openxmlformats.org/drawingml/2006/picture">
+                  <pic:nvPicPr>
+                    <pic:cNvPr id="1" name=""/>
+                    <pic:cNvPicPr/>
+                  </pic:nvPicPr>
+                  <pic:blipFill>
+                    <a:blip r:embed="rId8"/>
+                    <a:stretch>
+                      <a:fillRect/>
+                    </a:stretch>
+                  </pic:blipFill>
+                  <pic:spPr>
+                    <a:xfrm>
+                      <a:off x="0" y="0"/>
+                      <a:ext cx="5940425" cy="2705735"/>
+                    </a:xfrm>
+                    <a:prstGeom prst="rect">
+                      <a:avLst/>
+                    </a:prstGeom>
+                  </pic:spPr>
+                </pic:pic>
+              </a:graphicData>
+            </a:graphic>
+          </wp:inline>
+        </w:drawing>
+      </w:r>
+    </w:p>
+    <w:p>
+      <w:pPr>
+        <w:jc w:val="center"/>
+        <w:rPr>
+          <w:sz w:val="28"/>
+          <w:szCs w:val="28"/>
+        </w:rPr>
+      </w:pPr>
+      <w:r>
+        <w:rPr>
+          <w:sz w:val="28"/>
+          <w:szCs w:val="28"/>
+        </w:rPr>
+        <w:t xml:space="preserve">Рисунок </w:t>
+      </w:r>
+      <w:r>
+        <w:rPr>
+          <w:sz w:val="28"/>
+          <w:szCs w:val="28"/>
+        </w:rPr>
+        <w:t>3</w:t>
+      </w:r>
+      <w:r>
+        <w:rPr>
+          <w:sz w:val="28"/>
+          <w:szCs w:val="28"/>
+        </w:rPr>
+        <w:t xml:space="preserve">. График эмпирической функции распределения для </w:t>
+      </w:r>
+      <w:proofErr w:type="spellStart"/>
+      <w:r>
+        <w:rPr>
+          <w:sz w:val="28"/>
+          <w:szCs w:val="28"/>
+        </w:rPr>
+        <w:t>подвыборки</w:t>
+      </w:r>
+      <w:proofErr w:type="spellEnd"/>
+      <w:r>
+        <w:rPr>
+          <w:sz w:val="28"/>
+          <w:szCs w:val="28"/>
+        </w:rPr>
+        <w:t xml:space="preserve"> из </w:t>
+      </w:r>
+      <w:r>
+        <w:rPr>
+          <w:sz w:val="28"/>
+          <w:szCs w:val="28"/>
+        </w:rPr>
+        <w:t>2</w:t>
+      </w:r>
+      <w:r>
+        <w:rPr>
+          <w:sz w:val="28"/>
+          <w:szCs w:val="28"/>
+        </w:rPr>
+        <w:t>00 элементов</w:t>
+      </w:r>
+      <w:r>
+        <w:rPr>
+          <w:sz w:val="28"/>
+          <w:szCs w:val="28"/>
+        </w:rPr>
+        <w:t>.</w:t>
+      </w:r>
+    </w:p>
+    <w:p>
+      <w:pPr>
+        <w:rPr>
+          <w:sz w:val="28"/>
+          <w:szCs w:val="28"/>
+        </w:rPr>
+      </w:pPr>
+    </w:p>
+    <w:p>
+      <w:pPr>
+        <w:jc w:val="center"/>
+        <w:rPr>
+          <w:sz w:val="28"/>
+          <w:szCs w:val="28"/>
+        </w:rPr>
+      </w:pPr>
+      <w:r>
+        <w:rPr>
+          <w:noProof/>
+          <w:sz w:val="28"/>
+          <w:szCs w:val="28"/>
+        </w:rPr>
+        <w:lastRenderedPageBreak/>
+        <w:drawing>
+          <wp:inline distT="0" distB="0" distL="0" distR="0" wp14:anchorId="3C5FCC68" wp14:editId="6985D4DE">
+            <wp:extent cx="5105400" cy="3627120"/>
+            <wp:effectExtent l="0" t="0" r="0" b="0"/>
+            <wp:docPr id="8" name="Рисунок 8"/>
+            <wp:cNvGraphicFramePr>
+              <a:graphicFrameLocks xmlns:a="http://schemas.openxmlformats.org/drawingml/2006/main" noChangeAspect="1"/>
+            </wp:cNvGraphicFramePr>
+            <a:graphic xmlns:a="http://schemas.openxmlformats.org/drawingml/2006/main">
+              <a:graphicData uri="http://schemas.openxmlformats.org/drawingml/2006/picture">
+                <pic:pic xmlns:pic="http://schemas.openxmlformats.org/drawingml/2006/picture">
+                  <pic:nvPicPr>
+                    <pic:cNvPr id="0" name="Picture 16"/>
+                    <pic:cNvPicPr>
+                      <a:picLocks noChangeAspect="1" noChangeArrowheads="1"/>
+                    </pic:cNvPicPr>
+                  </pic:nvPicPr>
+                  <pic:blipFill>
+                    <a:blip r:embed="rId9" cstate="print">
+                      <a:extLst>
+                        <a:ext uri="{28A0092B-C50C-407E-A947-70E740481C1C}">
+                          <a14:useLocalDpi xmlns:a14="http://schemas.microsoft.com/office/drawing/2010/main" val="0"/>
+                        </a:ext>
+                      </a:extLst>
+                    </a:blip>
+                    <a:srcRect/>
+                    <a:stretch>
+                      <a:fillRect/>
+                    </a:stretch>
+                  </pic:blipFill>
+                  <pic:spPr bwMode="auto">
+                    <a:xfrm>
+                      <a:off x="0" y="0"/>
+                      <a:ext cx="5105400" cy="3627120"/>
+                    </a:xfrm>
+                    <a:prstGeom prst="rect">
+                      <a:avLst/>
+                    </a:prstGeom>
+                    <a:noFill/>
+                    <a:ln>
+                      <a:noFill/>
+                    </a:ln>
+                  </pic:spPr>
+                </pic:pic>
+              </a:graphicData>
+            </a:graphic>
+          </wp:inline>
+        </w:drawing>
+      </w:r>
+    </w:p>
+    <w:p>
+      <w:pPr>
+        <w:jc w:val="center"/>
+        <w:rPr>
+          <w:sz w:val="28"/>
+          <w:szCs w:val="28"/>
+        </w:rPr>
+      </w:pPr>
+      <w:r>
+        <w:rPr>
+          <w:sz w:val="28"/>
+          <w:szCs w:val="28"/>
+        </w:rPr>
+        <w:t xml:space="preserve">Рисунок 4. График теоретической функции </w:t>
+      </w:r>
+      <w:proofErr w:type="spellStart"/>
+      <w:r>
+        <w:rPr>
+          <w:sz w:val="28"/>
+          <w:szCs w:val="28"/>
+        </w:rPr>
+        <w:t>распределния</w:t>
+      </w:r>
+      <w:proofErr w:type="spellEnd"/>
+      <w:r>
+        <w:rPr>
+          <w:sz w:val="28"/>
+          <w:szCs w:val="28"/>
+        </w:rPr>
+        <w:t>.</w:t>
+      </w:r>
+    </w:p>
+    <w:p>
+      <w:pPr>
+        <w:jc w:val="center"/>
+        <w:rPr>
+          <w:sz w:val="28"/>
+          <w:szCs w:val="28"/>
+        </w:rPr>
+      </w:pPr>
+    </w:p>
+    <w:p>
+      <w:pPr>
+        <w:rPr>
+          <w:sz w:val="28"/>
+          <w:szCs w:val="28"/>
+        </w:rPr>
+      </w:pPr>
+      <w:r>
+        <w:rPr>
+          <w:sz w:val="28"/>
+          <w:szCs w:val="28"/>
+        </w:rPr>
+        <w:t xml:space="preserve">После этого, сделаем вывод о получившихся графиках и теоретическим значением эмпирической функции распределения: можно заметить, что </w:t>
+      </w:r>
+      <w:r>
+        <w:rPr>
+          <w:sz w:val="28"/>
+          <w:szCs w:val="28"/>
+        </w:rPr>
+        <w:t xml:space="preserve">чем больше количество элементов в </w:t>
+      </w:r>
+      <w:proofErr w:type="spellStart"/>
+      <w:r>
+        <w:rPr>
+          <w:sz w:val="28"/>
+          <w:szCs w:val="28"/>
+        </w:rPr>
+        <w:t>подвыборке</w:t>
+      </w:r>
+      <w:proofErr w:type="spellEnd"/>
+      <w:r>
+        <w:rPr>
+          <w:sz w:val="28"/>
+          <w:szCs w:val="28"/>
+        </w:rPr>
+        <w:t xml:space="preserve">, тем сильнее график, который получили в ходе выполнения работы, совпадает с теоретическим графиком функции распределения. </w:t>
+      </w:r>
+    </w:p>
+    <w:p>
+      <w:pPr>
+        <w:jc w:val="center"/>
+        <w:rPr>
+          <w:sz w:val="28"/>
+          <w:szCs w:val="28"/>
+        </w:rPr>
+      </w:pPr>
+    </w:p>
+    <w:p>
+      <w:pPr>
+        <w:pStyle w:val="a7"/>
+        <w:ind w:left="780"/>
+        <w:rPr>
+          <w:sz w:val="32"/>
+          <w:szCs w:val="32"/>
+        </w:rPr>
+      </w:pPr>
+      <w:r>
+        <w:rPr>
+          <w:sz w:val="32"/>
+          <w:szCs w:val="32"/>
+        </w:rPr>
+        <w:t xml:space="preserve"> </w:t>
+      </w:r>
+    </w:p>
+    <w:p>
+      <w:pPr>
+        <w:rPr>
+          <w:sz w:val="28"/>
+          <w:szCs w:val="28"/>
+        </w:rPr>
+      </w:pPr>
+    </w:p>
+    <w:p>
+      <w:pPr>
+        <w:jc w:val="center"/>
         <w:rPr>
           <w:b/>
           <w:bCs/>
           <w:sz w:val="32"/>
           <w:szCs w:val="32"/>
         </w:rPr>
-        <w:t>итературы</w:t>
-      </w:r>
-    </w:p>
-    <w:p>
-      <w:pPr>
-        <w:jc w:val="center"/>
+      </w:pPr>
+      <w:r>
         <w:rPr>
           <w:b/>
           <w:bCs/>
           <w:sz w:val="32"/>
           <w:szCs w:val="32"/>
         </w:rPr>
-      </w:pPr>
-    </w:p>
-    <w:p>
-      <w:pPr>
+        <w:t>Список</w:t>
+      </w:r>
+      <w:r>
         <w:rPr>
           <w:b/>
           <w:bCs/>
-          <w:sz w:val="28"/>
-          <w:szCs w:val="28"/>
-          <w:lang w:val="en-US"/>
-        </w:rPr>
-      </w:pPr>
+          <w:sz w:val="32"/>
+          <w:szCs w:val="32"/>
+        </w:rPr>
+        <w:t xml:space="preserve"> </w:t>
+      </w:r>
       <w:r>
         <w:rPr>
           <w:b/>
           <w:bCs/>
+          <w:sz w:val="32"/>
+          <w:szCs w:val="32"/>
+        </w:rPr>
+        <w:t>использованной</w:t>
+      </w:r>
+      <w:r>
+        <w:rPr>
+          <w:b/>
+          <w:bCs/>
+          <w:sz w:val="32"/>
+          <w:szCs w:val="32"/>
+        </w:rPr>
+        <w:t xml:space="preserve"> </w:t>
+      </w:r>
+      <w:r>
+        <w:rPr>
+          <w:b/>
+          <w:bCs/>
+          <w:sz w:val="32"/>
+          <w:szCs w:val="32"/>
+        </w:rPr>
+        <w:t>л</w:t>
+      </w:r>
+      <w:r>
+        <w:rPr>
+          <w:b/>
+          <w:bCs/>
+          <w:sz w:val="32"/>
+          <w:szCs w:val="32"/>
+        </w:rPr>
+        <w:t>итературы</w:t>
+      </w:r>
+    </w:p>
+    <w:p>
+      <w:pPr>
+        <w:jc w:val="center"/>
+        <w:rPr>
+          <w:b/>
+          <w:bCs/>
+          <w:sz w:val="32"/>
+          <w:szCs w:val="32"/>
+        </w:rPr>
+      </w:pPr>
+    </w:p>
+    <w:p>
+      <w:pPr>
+        <w:rPr>
+          <w:b/>
+          <w:bCs/>
+          <w:sz w:val="28"/>
+          <w:szCs w:val="28"/>
+          <w:lang w:val="en-US"/>
+        </w:rPr>
+      </w:pPr>
+      <w:r>
+        <w:rPr>
+          <w:b/>
+          <w:bCs/>
           <w:sz w:val="28"/>
           <w:szCs w:val="28"/>
           <w:lang w:val="en-US"/>
         </w:rPr>
         <w:t xml:space="preserve">[1] Pearson K. Tables of the Incomplete Gamma-Function / computed by the staff of the Department of Applied Statistics, University of London. — London: University of London, 1922. — URL: </w:t>
       </w:r>
-      <w:hyperlink r:id="rId6" w:history="1">
+      <w:hyperlink r:id="rId10" w:history="1">
         <w:r>
           <w:rPr>
             <w:rStyle w:val="ac"/>
@@ -5242,9 +7574,154 @@
           <w:bCs/>
           <w:sz w:val="32"/>
           <w:szCs w:val="32"/>
-          <w:lang w:val="en-US"/>
-        </w:rPr>
-      </w:pPr>
+        </w:rPr>
+      </w:pPr>
+    </w:p>
+    <w:p>
+      <w:pPr>
+        <w:rPr>
+          <w:b/>
+          <w:bCs/>
+          <w:sz w:val="28"/>
+          <w:szCs w:val="28"/>
+        </w:rPr>
+      </w:pPr>
+      <w:r>
+        <w:rPr>
+          <w:b/>
+          <w:bCs/>
+          <w:sz w:val="28"/>
+          <w:szCs w:val="28"/>
+        </w:rPr>
+        <w:lastRenderedPageBreak/>
+        <w:t xml:space="preserve">[4] </w:t>
+      </w:r>
+      <w:proofErr w:type="spellStart"/>
+      <w:r>
+        <w:rPr>
+          <w:b/>
+          <w:bCs/>
+          <w:sz w:val="28"/>
+          <w:szCs w:val="28"/>
+        </w:rPr>
+        <w:t>Положинцев</w:t>
+      </w:r>
+      <w:proofErr w:type="spellEnd"/>
+      <w:r>
+        <w:rPr>
+          <w:b/>
+          <w:bCs/>
+          <w:sz w:val="28"/>
+          <w:szCs w:val="28"/>
+        </w:rPr>
+        <w:t xml:space="preserve"> Б. И. Теория вероятностей и математическая статистика. Введение в математическую </w:t>
+      </w:r>
+      <w:r>
+        <w:rPr>
+          <w:b/>
+          <w:bCs/>
+          <w:sz w:val="28"/>
+          <w:szCs w:val="28"/>
+        </w:rPr>
+        <w:t>статистику:</w:t>
+      </w:r>
+      <w:r>
+        <w:rPr>
+          <w:b/>
+          <w:bCs/>
+          <w:sz w:val="28"/>
+          <w:szCs w:val="28"/>
+        </w:rPr>
+        <w:t xml:space="preserve"> учебное пособие </w:t>
+      </w:r>
+      <w:r>
+        <w:rPr>
+          <w:b/>
+          <w:bCs/>
+          <w:sz w:val="28"/>
+          <w:szCs w:val="28"/>
+        </w:rPr>
+        <w:t xml:space="preserve">  </w:t>
+      </w:r>
+      <w:r>
+        <w:rPr>
+          <w:b/>
+          <w:bCs/>
+          <w:sz w:val="28"/>
+          <w:szCs w:val="28"/>
+        </w:rPr>
+        <w:t xml:space="preserve">Б. И. </w:t>
+      </w:r>
+      <w:proofErr w:type="spellStart"/>
+      <w:r>
+        <w:rPr>
+          <w:b/>
+          <w:bCs/>
+          <w:sz w:val="28"/>
+          <w:szCs w:val="28"/>
+        </w:rPr>
+        <w:t>Положинцев</w:t>
+      </w:r>
+      <w:proofErr w:type="spellEnd"/>
+      <w:r>
+        <w:rPr>
+          <w:b/>
+          <w:bCs/>
+          <w:sz w:val="28"/>
+          <w:szCs w:val="28"/>
+        </w:rPr>
+        <w:t>. – Санкт-</w:t>
+      </w:r>
+      <w:r>
+        <w:rPr>
+          <w:b/>
+          <w:bCs/>
+          <w:sz w:val="28"/>
+          <w:szCs w:val="28"/>
+        </w:rPr>
+        <w:t>Петербург:</w:t>
+      </w:r>
+      <w:r>
+        <w:rPr>
+          <w:b/>
+          <w:bCs/>
+          <w:sz w:val="28"/>
+          <w:szCs w:val="28"/>
+        </w:rPr>
+        <w:t xml:space="preserve"> </w:t>
+      </w:r>
+      <w:proofErr w:type="spellStart"/>
+      <w:r>
+        <w:rPr>
+          <w:b/>
+          <w:bCs/>
+          <w:sz w:val="28"/>
+          <w:szCs w:val="28"/>
+        </w:rPr>
+        <w:t>СПбПУ</w:t>
+      </w:r>
+      <w:proofErr w:type="spellEnd"/>
+      <w:r>
+        <w:rPr>
+          <w:b/>
+          <w:bCs/>
+          <w:sz w:val="28"/>
+          <w:szCs w:val="28"/>
+        </w:rPr>
+        <w:t xml:space="preserve">, 2016. – 95 с. – URL: </w:t>
+      </w:r>
+      <w:hyperlink r:id="rId11" w:history="1">
+        <w:r>
+          <w:rPr>
+            <w:rStyle w:val="ac"/>
+            <w:b/>
+            <w:bCs/>
+            <w:sz w:val="28"/>
+            <w:szCs w:val="28"/>
+          </w:rPr>
+          <w:t>https://elib.spbstu.ru/dl/2/s16-286.pdf/download/s16-286.pdf</w:t>
+        </w:r>
+      </w:hyperlink>
     </w:p>
     <w:sectPr>
       <w:pgSz w:w="11906" w:h="16838"/>
@@ -6404,7 +8881,7 @@
   <w:style w:type="paragraph" w:default="1" w:styleId="a">
     <w:name w:val="Normal"/>
     <w:qFormat/>
-    <w:rsid w:val="008F6500"/>
+    <w:rsid w:val="00547062"/>
     <w:pPr>
       <w:spacing w:after="0" w:line="240" w:lineRule="auto"/>
     </w:pPr>

</xml_diff>

<commit_message>
vault backup: 2026-05-06 12:40:46
</commit_message>
<xml_diff>
--- a/Учеба 4 семестр/Теория вероятности/Курсовая работа/Отчет, Код/Курсовая работа.docx
+++ b/Учеба 4 семестр/Теория вероятности/Курсовая работа/Отчет, Код/Курсовая работа.docx
@@ -355,7 +355,23 @@
           <w:sz w:val="32"/>
           <w:szCs w:val="32"/>
         </w:rPr>
-        <w:t xml:space="preserve">&lt;подпись&gt;    </w:t>
+        <w:t>&lt;</w:t>
+      </w:r>
+      <w:proofErr w:type="gramStart"/>
+      <w:r>
+        <w:rPr>
+          <w:sz w:val="32"/>
+          <w:szCs w:val="32"/>
+        </w:rPr>
+        <w:t xml:space="preserve">подпись&gt;   </w:t>
+      </w:r>
+      <w:proofErr w:type="gramEnd"/>
+      <w:r>
+        <w:rPr>
+          <w:sz w:val="32"/>
+          <w:szCs w:val="32"/>
+        </w:rPr>
+        <w:t xml:space="preserve"> </w:t>
       </w:r>
       <w:r>
         <w:rPr>
@@ -1875,7 +1891,23 @@
           <w:sz w:val="28"/>
           <w:szCs w:val="28"/>
         </w:rPr>
-        <w:t>Объектом исследования является выборка случайной величины, подчиняющейся двойному гамма распределению. Предметом исследования — статистические свойства данной выборки и методы её анализа.</w:t>
+        <w:t xml:space="preserve">Объектом исследования является выборка случайной величины, подчиняющейся </w:t>
+      </w:r>
+      <w:proofErr w:type="gramStart"/>
+      <w:r>
+        <w:rPr>
+          <w:sz w:val="28"/>
+          <w:szCs w:val="28"/>
+        </w:rPr>
+        <w:t>двойному</w:t>
+      </w:r>
+      <w:proofErr w:type="gramEnd"/>
+      <w:r>
+        <w:rPr>
+          <w:sz w:val="28"/>
+          <w:szCs w:val="28"/>
+        </w:rPr>
+        <w:t xml:space="preserve"> гамма распределению. Предметом исследования — статистические свойства данной выборки и методы её анализа.</w:t>
       </w:r>
     </w:p>
     <w:p>
@@ -2528,6 +2560,7 @@
         </w:rPr>
         <w:t xml:space="preserve">•  </w:t>
       </w:r>
+      <w:proofErr w:type="gramStart"/>
       <w:r>
         <w:rPr>
           <w:i/>
@@ -2542,7 +2575,15 @@
           <w:sz w:val="28"/>
           <w:szCs w:val="28"/>
         </w:rPr>
-        <w:t xml:space="preserve"> &gt; 0 — параметр формы,</w:t>
+        <w:t xml:space="preserve"> &gt;</w:t>
+      </w:r>
+      <w:proofErr w:type="gramEnd"/>
+      <w:r>
+        <w:rPr>
+          <w:sz w:val="28"/>
+          <w:szCs w:val="28"/>
+        </w:rPr>
+        <w:t xml:space="preserve"> 0 — параметр формы,</w:t>
       </w:r>
     </w:p>
     <w:p>
@@ -2559,6 +2600,7 @@
         </w:rPr>
         <w:t xml:space="preserve">•  </w:t>
       </w:r>
+      <w:proofErr w:type="gramStart"/>
       <w:r>
         <w:rPr>
           <w:i/>
@@ -2573,7 +2615,15 @@
           <w:sz w:val="28"/>
           <w:szCs w:val="28"/>
         </w:rPr>
-        <w:t xml:space="preserve"> &gt; 0 — параметр масштаба,</w:t>
+        <w:t xml:space="preserve"> &gt;</w:t>
+      </w:r>
+      <w:proofErr w:type="gramEnd"/>
+      <w:r>
+        <w:rPr>
+          <w:sz w:val="28"/>
+          <w:szCs w:val="28"/>
+        </w:rPr>
+        <w:t xml:space="preserve"> 0 — параметр масштаба,</w:t>
       </w:r>
     </w:p>
     <w:p>
@@ -3035,20 +3085,13 @@
         </w:rPr>
         <w:br/>
       </w:r>
-      <w:r>
-        <w:rPr>
-          <w:rFonts w:ascii="Courier New" w:hAnsi="Courier New" w:cs="Courier New"/>
-          <w:lang w:val="en-US"/>
-        </w:rPr>
-        <w:pgNum/>
-      </w:r>
       <w:proofErr w:type="spellStart"/>
       <w:r>
         <w:rPr>
           <w:rFonts w:ascii="Courier New" w:hAnsi="Courier New" w:cs="Courier New"/>
           <w:lang w:val="en-US"/>
         </w:rPr>
-        <w:t>ve</w:t>
+        <w:t>summ</w:t>
       </w:r>
       <w:proofErr w:type="spellEnd"/>
       <w:r>
@@ -3081,20 +3124,13 @@
         </w:rPr>
         <w:br/>
       </w:r>
-      <w:r>
-        <w:rPr>
-          <w:rFonts w:ascii="Courier New" w:hAnsi="Courier New" w:cs="Courier New"/>
-          <w:lang w:val="en-US"/>
-        </w:rPr>
-        <w:pgNum/>
-      </w:r>
       <w:proofErr w:type="spellStart"/>
       <w:r>
         <w:rPr>
           <w:rFonts w:ascii="Courier New" w:hAnsi="Courier New" w:cs="Courier New"/>
           <w:lang w:val="en-US"/>
         </w:rPr>
-        <w:t>ve</w:t>
+        <w:t>summ</w:t>
       </w:r>
       <w:proofErr w:type="spellEnd"/>
       <w:r>
@@ -3119,20 +3155,13 @@
         </w:rPr>
         <w:t xml:space="preserve">return </w:t>
       </w:r>
-      <w:r>
-        <w:rPr>
-          <w:rFonts w:ascii="Courier New" w:hAnsi="Courier New" w:cs="Courier New"/>
-          <w:lang w:val="en-US"/>
-        </w:rPr>
-        <w:pgNum/>
-      </w:r>
       <w:proofErr w:type="spellStart"/>
       <w:r>
         <w:rPr>
           <w:rFonts w:ascii="Courier New" w:hAnsi="Courier New" w:cs="Courier New"/>
           <w:lang w:val="en-US"/>
         </w:rPr>
-        <w:t>ve</w:t>
+        <w:t>summ</w:t>
       </w:r>
       <w:proofErr w:type="spellEnd"/>
     </w:p>
@@ -3465,7 +3494,15 @@
           <w:rFonts w:ascii="Courier New" w:hAnsi="Courier New" w:cs="Courier New"/>
           <w:lang w:val="en-US"/>
         </w:rPr>
-        <w:t>X_sorted</w:t>
+        <w:t>X_</w:t>
+      </w:r>
+      <w:proofErr w:type="gramStart"/>
+      <w:r>
+        <w:rPr>
+          <w:rFonts w:ascii="Courier New" w:hAnsi="Courier New" w:cs="Courier New"/>
+          <w:lang w:val="en-US"/>
+        </w:rPr>
+        <w:t>sorted</w:t>
       </w:r>
       <w:proofErr w:type="spellEnd"/>
       <w:r>
@@ -3473,7 +3510,15 @@
           <w:rFonts w:ascii="Courier New" w:hAnsi="Courier New" w:cs="Courier New"/>
           <w:lang w:val="en-US"/>
         </w:rPr>
-        <w:t>[n // 2]</w:t>
+        <w:t>[</w:t>
+      </w:r>
+      <w:proofErr w:type="gramEnd"/>
+      <w:r>
+        <w:rPr>
+          <w:rFonts w:ascii="Courier New" w:hAnsi="Courier New" w:cs="Courier New"/>
+          <w:lang w:val="en-US"/>
+        </w:rPr>
+        <w:t>n // 2]</w:t>
       </w:r>
       <w:r>
         <w:rPr>
@@ -4567,7 +4612,15 @@
           <w:rFonts w:ascii="Courier New" w:hAnsi="Courier New" w:cs="Courier New"/>
           <w:lang w:val="en-US"/>
         </w:rPr>
-        <w:t>raw_moment</w:t>
+        <w:t>raw_</w:t>
+      </w:r>
+      <w:proofErr w:type="gramStart"/>
+      <w:r>
+        <w:rPr>
+          <w:rFonts w:ascii="Courier New" w:hAnsi="Courier New" w:cs="Courier New"/>
+          <w:lang w:val="en-US"/>
+        </w:rPr>
+        <w:t>moment</w:t>
       </w:r>
       <w:proofErr w:type="spellEnd"/>
       <w:r>
@@ -4575,7 +4628,15 @@
           <w:rFonts w:ascii="Courier New" w:hAnsi="Courier New" w:cs="Courier New"/>
           <w:lang w:val="en-US"/>
         </w:rPr>
-        <w:t>(X, k):</w:t>
+        <w:t>(</w:t>
+      </w:r>
+      <w:proofErr w:type="gramEnd"/>
+      <w:r>
+        <w:rPr>
+          <w:rFonts w:ascii="Courier New" w:hAnsi="Courier New" w:cs="Courier New"/>
+          <w:lang w:val="en-US"/>
+        </w:rPr>
+        <w:t>X, k):</w:t>
       </w:r>
       <w:r>
         <w:rPr>
@@ -4760,7 +4821,15 @@
           <w:rFonts w:ascii="Courier New" w:hAnsi="Courier New" w:cs="Courier New"/>
           <w:lang w:val="en-US"/>
         </w:rPr>
-        <w:t>central_moment</w:t>
+        <w:t>central_</w:t>
+      </w:r>
+      <w:proofErr w:type="gramStart"/>
+      <w:r>
+        <w:rPr>
+          <w:rFonts w:ascii="Courier New" w:hAnsi="Courier New" w:cs="Courier New"/>
+          <w:lang w:val="en-US"/>
+        </w:rPr>
+        <w:t>moment</w:t>
       </w:r>
       <w:proofErr w:type="spellEnd"/>
       <w:r>
@@ -4768,7 +4837,15 @@
           <w:rFonts w:ascii="Courier New" w:hAnsi="Courier New" w:cs="Courier New"/>
           <w:lang w:val="en-US"/>
         </w:rPr>
-        <w:t>(X, k):</w:t>
+        <w:t>(</w:t>
+      </w:r>
+      <w:proofErr w:type="gramEnd"/>
+      <w:r>
+        <w:rPr>
+          <w:rFonts w:ascii="Courier New" w:hAnsi="Courier New" w:cs="Courier New"/>
+          <w:lang w:val="en-US"/>
+        </w:rPr>
+        <w:t>X, k):</w:t>
       </w:r>
       <w:r>
         <w:rPr>
@@ -5230,7 +5307,15 @@
           <w:sz w:val="28"/>
           <w:szCs w:val="28"/>
         </w:rPr>
-        <w:t>(x), X</w:t>
+        <w:t xml:space="preserve">(x), </w:t>
+      </w:r>
+      <w:proofErr w:type="gramStart"/>
+      <w:r>
+        <w:rPr>
+          <w:sz w:val="28"/>
+          <w:szCs w:val="28"/>
+        </w:rPr>
+        <w:t>X</w:t>
       </w:r>
       <w:r>
         <w:rPr>
@@ -5238,7 +5323,16 @@
           <w:szCs w:val="28"/>
           <w:vertAlign w:val="subscript"/>
         </w:rPr>
-        <w:t>(1)</w:t>
+        <w:t>(</w:t>
+      </w:r>
+      <w:proofErr w:type="gramEnd"/>
+      <w:r>
+        <w:rPr>
+          <w:sz w:val="28"/>
+          <w:szCs w:val="28"/>
+          <w:vertAlign w:val="subscript"/>
+        </w:rPr>
+        <w:t>1)</w:t>
       </w:r>
       <w:r>
         <w:rPr>
@@ -5429,7 +5523,23 @@
           <w:sz w:val="28"/>
           <w:szCs w:val="28"/>
         </w:rPr>
-        <w:t xml:space="preserve"> &lt; x [4].</w:t>
+        <w:t xml:space="preserve"> </w:t>
+      </w:r>
+      <w:proofErr w:type="gramStart"/>
+      <w:r>
+        <w:rPr>
+          <w:sz w:val="28"/>
+          <w:szCs w:val="28"/>
+        </w:rPr>
+        <w:t>&lt; x</w:t>
+      </w:r>
+      <w:proofErr w:type="gramEnd"/>
+      <w:r>
+        <w:rPr>
+          <w:sz w:val="28"/>
+          <w:szCs w:val="28"/>
+        </w:rPr>
+        <w:t xml:space="preserve"> [4].</w:t>
       </w:r>
     </w:p>
     <w:p>
@@ -6623,7 +6733,15 @@
           <w:rFonts w:ascii="Courier New" w:hAnsi="Courier New" w:cs="Courier New"/>
           <w:lang w:val="en-US"/>
         </w:rPr>
-        <w:t>empirical_cdf_value</w:t>
+        <w:t>empirical_cdf_</w:t>
+      </w:r>
+      <w:proofErr w:type="gramStart"/>
+      <w:r>
+        <w:rPr>
+          <w:rFonts w:ascii="Courier New" w:hAnsi="Courier New" w:cs="Courier New"/>
+          <w:lang w:val="en-US"/>
+        </w:rPr>
+        <w:t>value</w:t>
       </w:r>
       <w:proofErr w:type="spellEnd"/>
       <w:r>
@@ -6631,7 +6749,15 @@
           <w:rFonts w:ascii="Courier New" w:hAnsi="Courier New" w:cs="Courier New"/>
           <w:lang w:val="en-US"/>
         </w:rPr>
-        <w:t>(X, x):</w:t>
+        <w:t>(</w:t>
+      </w:r>
+      <w:proofErr w:type="gramEnd"/>
+      <w:r>
+        <w:rPr>
+          <w:rFonts w:ascii="Courier New" w:hAnsi="Courier New" w:cs="Courier New"/>
+          <w:lang w:val="en-US"/>
+        </w:rPr>
+        <w:t>X, x):</w:t>
       </w:r>
       <w:r>
         <w:rPr>
@@ -6703,7 +6829,23 @@
           <w:lang w:val="en-US"/>
         </w:rPr>
         <w:br/>
-        <w:t>if value &lt;= x:</w:t>
+        <w:t>if value &lt;</w:t>
+      </w:r>
+      <w:r>
+        <w:rPr>
+          <w:sz w:val="24"/>
+          <w:szCs w:val="24"/>
+          <w:lang w:val="en-US"/>
+        </w:rPr>
+        <w:t xml:space="preserve"> </w:t>
+      </w:r>
+      <w:r>
+        <w:rPr>
+          <w:sz w:val="24"/>
+          <w:szCs w:val="24"/>
+          <w:lang w:val="en-US"/>
+        </w:rPr>
+        <w:t xml:space="preserve"> x:</w:t>
       </w:r>
       <w:r>
         <w:rPr>
@@ -6741,6 +6883,7 @@
           <w:bCs/>
           <w:sz w:val="32"/>
           <w:szCs w:val="32"/>
+          <w:lang w:val="en-US"/>
         </w:rPr>
       </w:pPr>
     </w:p>
@@ -7212,6 +7355,7 @@
         <w:rPr>
           <w:sz w:val="28"/>
           <w:szCs w:val="28"/>
+          <w:lang w:val="en-US"/>
         </w:rPr>
       </w:pPr>
       <w:r>
@@ -7358,13 +7502,22 @@
     <w:p>
       <w:pPr>
         <w:rPr>
+          <w:sz w:val="28"/>
+          <w:szCs w:val="28"/>
+          <w:lang w:val="en-US"/>
+        </w:rPr>
+      </w:pPr>
+      <w:r>
+        <w:rPr>
           <w:b/>
           <w:bCs/>
           <w:sz w:val="28"/>
           <w:szCs w:val="28"/>
           <w:lang w:val="en-US"/>
         </w:rPr>
-      </w:pPr>
+        <w:t xml:space="preserve">[1] Pearson K. Tables of the Incomplete Gamma-Function / computed by the staff of the Department of Applied Statistics, University of London. — </w:t>
+      </w:r>
+      <w:proofErr w:type="gramStart"/>
       <w:r>
         <w:rPr>
           <w:b/>
@@ -7373,14 +7526,51 @@
           <w:szCs w:val="28"/>
           <w:lang w:val="en-US"/>
         </w:rPr>
-        <w:t xml:space="preserve">[1] Pearson K. Tables of the Incomplete Gamma-Function / computed by the staff of the Department of Applied Statistics, University of London. — London: University of London, 1922. — URL: </w:t>
+        <w:t>London</w:t>
+      </w:r>
+      <w:r>
+        <w:rPr>
+          <w:b/>
+          <w:bCs/>
+          <w:sz w:val="28"/>
+          <w:szCs w:val="28"/>
+          <w:lang w:val="en-US"/>
+        </w:rPr>
+        <w:t xml:space="preserve"> </w:t>
+      </w:r>
+      <w:r>
+        <w:rPr>
+          <w:b/>
+          <w:bCs/>
+          <w:sz w:val="28"/>
+          <w:szCs w:val="28"/>
+          <w:lang w:val="en-US"/>
+        </w:rPr>
+        <w:t>:</w:t>
+      </w:r>
+      <w:proofErr w:type="gramEnd"/>
+      <w:r>
+        <w:rPr>
+          <w:b/>
+          <w:bCs/>
+          <w:sz w:val="28"/>
+          <w:szCs w:val="28"/>
+          <w:lang w:val="en-US"/>
+        </w:rPr>
+        <w:t xml:space="preserve"> University of London, 1922. — URL</w:t>
+      </w:r>
+      <w:r>
+        <w:rPr>
+          <w:sz w:val="28"/>
+          <w:szCs w:val="28"/>
+          <w:lang w:val="en-US"/>
+        </w:rPr>
+        <w:t xml:space="preserve">: </w:t>
       </w:r>
       <w:hyperlink r:id="rId10" w:history="1">
         <w:r>
           <w:rPr>
             <w:rStyle w:val="ac"/>
-            <w:b/>
-            <w:bCs/>
             <w:sz w:val="28"/>
             <w:szCs w:val="28"/>
             <w:lang w:val="en-US"/>
@@ -7390,23 +7580,43 @@
       </w:hyperlink>
       <w:r>
         <w:rPr>
+          <w:sz w:val="28"/>
+          <w:szCs w:val="28"/>
+          <w:lang w:val="en-US"/>
+        </w:rPr>
+        <w:t xml:space="preserve"> </w:t>
+      </w:r>
+    </w:p>
+    <w:p>
+      <w:pPr>
+        <w:rPr>
+          <w:sz w:val="28"/>
+          <w:szCs w:val="28"/>
+          <w:lang w:val="en-US"/>
+        </w:rPr>
+      </w:pPr>
+    </w:p>
+    <w:p>
+      <w:pPr>
+        <w:rPr>
           <w:b/>
           <w:bCs/>
           <w:sz w:val="28"/>
           <w:szCs w:val="28"/>
           <w:lang w:val="en-US"/>
         </w:rPr>
-        <w:t xml:space="preserve"> (</w:t>
-      </w:r>
+      </w:pPr>
       <w:r>
         <w:rPr>
           <w:b/>
           <w:bCs/>
           <w:sz w:val="28"/>
           <w:szCs w:val="28"/>
-        </w:rPr>
-        <w:t>дата</w:t>
-      </w:r>
+          <w:lang w:val="en-US"/>
+        </w:rPr>
+        <w:t xml:space="preserve">[2] Bain L. J., Engelhardt M. Introduction to Probability and Mathematical Statistics. — 2nd ed. — </w:t>
+      </w:r>
+      <w:proofErr w:type="gramStart"/>
       <w:r>
         <w:rPr>
           <w:b/>
@@ -7415,7 +7625,7 @@
           <w:szCs w:val="28"/>
           <w:lang w:val="en-US"/>
         </w:rPr>
-        <w:t xml:space="preserve"> </w:t>
+        <w:t>Belmont</w:t>
       </w:r>
       <w:r>
         <w:rPr>
@@ -7423,8 +7633,9 @@
           <w:bCs/>
           <w:sz w:val="28"/>
           <w:szCs w:val="28"/>
-        </w:rPr>
-        <w:t>обращения</w:t>
+          <w:lang w:val="en-US"/>
+        </w:rPr>
+        <w:t xml:space="preserve"> </w:t>
       </w:r>
       <w:r>
         <w:rPr>
@@ -7434,11 +7645,10 @@
           <w:szCs w:val="28"/>
           <w:lang w:val="en-US"/>
         </w:rPr>
-        <w:t>: 06.05.2026).</w:t>
-      </w:r>
-    </w:p>
-    <w:p>
-      <w:pPr>
+        <w:t>:</w:t>
+      </w:r>
+      <w:proofErr w:type="gramEnd"/>
+      <w:r>
         <w:rPr>
           <w:b/>
           <w:bCs/>
@@ -7446,6 +7656,15 @@
           <w:szCs w:val="28"/>
           <w:lang w:val="en-US"/>
         </w:rPr>
+        <w:t xml:space="preserve"> Brooks/Cole, 1992. — 644 p.</w:t>
+      </w:r>
+    </w:p>
+    <w:p>
+      <w:pPr>
+        <w:rPr>
+          <w:sz w:val="28"/>
+          <w:szCs w:val="28"/>
+        </w:rPr>
       </w:pPr>
     </w:p>
     <w:p>
@@ -7455,7 +7674,6 @@
           <w:bCs/>
           <w:sz w:val="28"/>
           <w:szCs w:val="28"/>
-          <w:lang w:val="en-US"/>
         </w:rPr>
       </w:pPr>
       <w:r>
@@ -7466,11 +7684,10 @@
           <w:szCs w:val="28"/>
           <w:lang w:val="en-US"/>
         </w:rPr>
-        <w:t>[2] Bain L. J., Engelhardt M. Introduction to Probability and Mathematical Statistics. — 2nd ed. — Belmont: Brooks/Cole, 1992. — 644 p.</w:t>
-      </w:r>
-    </w:p>
-    <w:p>
-      <w:pPr>
+        <w:t xml:space="preserve">[3] </w:t>
+      </w:r>
+      <w:proofErr w:type="spellStart"/>
+      <w:r>
         <w:rPr>
           <w:b/>
           <w:bCs/>
@@ -7478,10 +7695,10 @@
           <w:szCs w:val="28"/>
           <w:lang w:val="en-US"/>
         </w:rPr>
-      </w:pPr>
-    </w:p>
-    <w:p>
-      <w:pPr>
+        <w:t>Bahashwan</w:t>
+      </w:r>
+      <w:proofErr w:type="spellEnd"/>
+      <w:r>
         <w:rPr>
           <w:b/>
           <w:bCs/>
@@ -7489,7 +7706,9 @@
           <w:szCs w:val="28"/>
           <w:lang w:val="en-US"/>
         </w:rPr>
-      </w:pPr>
+        <w:t xml:space="preserve"> A. O., </w:t>
+      </w:r>
+      <w:proofErr w:type="spellStart"/>
       <w:r>
         <w:rPr>
           <w:b/>
@@ -7498,9 +7717,9 @@
           <w:szCs w:val="28"/>
           <w:lang w:val="en-US"/>
         </w:rPr>
-        <w:t xml:space="preserve">[3] </w:t>
-      </w:r>
-      <w:proofErr w:type="spellStart"/>
+        <w:t>Kalantan</w:t>
+      </w:r>
+      <w:proofErr w:type="spellEnd"/>
       <w:r>
         <w:rPr>
           <w:b/>
@@ -7509,9 +7728,9 @@
           <w:szCs w:val="28"/>
           <w:lang w:val="en-US"/>
         </w:rPr>
-        <w:t>Bahashwan</w:t>
-      </w:r>
-      <w:proofErr w:type="spellEnd"/>
+        <w:t xml:space="preserve"> Z. I., </w:t>
+      </w:r>
+      <w:proofErr w:type="spellStart"/>
       <w:r>
         <w:rPr>
           <w:b/>
@@ -7520,9 +7739,9 @@
           <w:szCs w:val="28"/>
           <w:lang w:val="en-US"/>
         </w:rPr>
-        <w:t xml:space="preserve"> A. O., </w:t>
-      </w:r>
-      <w:proofErr w:type="spellStart"/>
+        <w:t>Adham</w:t>
+      </w:r>
+      <w:proofErr w:type="spellEnd"/>
       <w:r>
         <w:rPr>
           <w:b/>
@@ -7531,18 +7750,33 @@
           <w:szCs w:val="28"/>
           <w:lang w:val="en-US"/>
         </w:rPr>
-        <w:t>Kalantan</w:t>
-      </w:r>
-      <w:proofErr w:type="spellEnd"/>
+        <w:t xml:space="preserve"> S. A. Double Gamma Principal Components Analysis // Applied Mathematical Sciences. — 2018. — Vol. 12, № 11. — P. 523–533. </w:t>
+      </w:r>
+    </w:p>
+    <w:p>
+      <w:pPr>
+        <w:rPr>
+          <w:sz w:val="32"/>
+          <w:szCs w:val="32"/>
+          <w:lang w:val="en-US"/>
+        </w:rPr>
+      </w:pPr>
+    </w:p>
+    <w:p>
+      <w:pPr>
+        <w:rPr>
+          <w:sz w:val="28"/>
+          <w:szCs w:val="28"/>
+        </w:rPr>
+      </w:pPr>
       <w:r>
         <w:rPr>
           <w:b/>
           <w:bCs/>
           <w:sz w:val="28"/>
           <w:szCs w:val="28"/>
-          <w:lang w:val="en-US"/>
-        </w:rPr>
-        <w:t xml:space="preserve"> Z. I., </w:t>
+        </w:rPr>
+        <w:t xml:space="preserve">[4] </w:t>
       </w:r>
       <w:proofErr w:type="spellStart"/>
       <w:r>
@@ -7551,9 +7785,8 @@
           <w:bCs/>
           <w:sz w:val="28"/>
           <w:szCs w:val="28"/>
-          <w:lang w:val="en-US"/>
-        </w:rPr>
-        <w:t>Adham</w:t>
+        </w:rPr>
+        <w:t>Положинцев</w:t>
       </w:r>
       <w:proofErr w:type="spellEnd"/>
       <w:r>
@@ -7562,30 +7795,28 @@
           <w:bCs/>
           <w:sz w:val="28"/>
           <w:szCs w:val="28"/>
-          <w:lang w:val="en-US"/>
-        </w:rPr>
-        <w:t xml:space="preserve"> S. A. Double Gamma Principal Components Analysis // Applied Mathematical Sciences. — 2018. — Vol. 12, № 11. — P. 523–533. — DOI: 10.12988/ams.2018.8455.</w:t>
-      </w:r>
-    </w:p>
-    <w:p>
-      <w:pPr>
+        </w:rPr>
+        <w:t xml:space="preserve"> Б. И. Теория вероятностей и математическая статистика. Введение в математическую </w:t>
+      </w:r>
+      <w:r>
         <w:rPr>
           <w:b/>
           <w:bCs/>
-          <w:sz w:val="32"/>
-          <w:szCs w:val="32"/>
-        </w:rPr>
-      </w:pPr>
-    </w:p>
-    <w:p>
-      <w:pPr>
+          <w:sz w:val="28"/>
+          <w:szCs w:val="28"/>
+        </w:rPr>
+        <w:t>статистику:</w:t>
+      </w:r>
+      <w:r>
         <w:rPr>
           <w:b/>
           <w:bCs/>
           <w:sz w:val="28"/>
           <w:szCs w:val="28"/>
         </w:rPr>
-      </w:pPr>
+        <w:t xml:space="preserve"> учебное пособие </w:t>
+      </w:r>
+      <w:proofErr w:type="gramStart"/>
       <w:r>
         <w:rPr>
           <w:b/>
@@ -7593,10 +7824,8 @@
           <w:sz w:val="28"/>
           <w:szCs w:val="28"/>
         </w:rPr>
-        <w:lastRenderedPageBreak/>
-        <w:t xml:space="preserve">[4] </w:t>
-      </w:r>
-      <w:proofErr w:type="spellStart"/>
+        <w:t>/</w:t>
+      </w:r>
       <w:r>
         <w:rPr>
           <w:b/>
@@ -7604,9 +7833,8 @@
           <w:sz w:val="28"/>
           <w:szCs w:val="28"/>
         </w:rPr>
-        <w:t>Положинцев</w:t>
-      </w:r>
-      <w:proofErr w:type="spellEnd"/>
+        <w:t xml:space="preserve">  </w:t>
+      </w:r>
       <w:r>
         <w:rPr>
           <w:b/>
@@ -7614,8 +7842,10 @@
           <w:sz w:val="28"/>
           <w:szCs w:val="28"/>
         </w:rPr>
-        <w:t xml:space="preserve"> Б. И. Теория вероятностей и математическая статистика. Введение в математическую </w:t>
-      </w:r>
+        <w:lastRenderedPageBreak/>
+        <w:t>Б.</w:t>
+      </w:r>
+      <w:proofErr w:type="gramEnd"/>
       <w:r>
         <w:rPr>
           <w:b/>
@@ -7623,8 +7853,9 @@
           <w:sz w:val="28"/>
           <w:szCs w:val="28"/>
         </w:rPr>
-        <w:t>статистику:</w:t>
-      </w:r>
+        <w:t xml:space="preserve"> И. </w:t>
+      </w:r>
+      <w:proofErr w:type="spellStart"/>
       <w:r>
         <w:rPr>
           <w:b/>
@@ -7632,8 +7863,9 @@
           <w:sz w:val="28"/>
           <w:szCs w:val="28"/>
         </w:rPr>
-        <w:t xml:space="preserve"> учебное пособие </w:t>
-      </w:r>
+        <w:t>Положинцев</w:t>
+      </w:r>
+      <w:proofErr w:type="spellEnd"/>
       <w:r>
         <w:rPr>
           <w:b/>
@@ -7641,7 +7873,7 @@
           <w:sz w:val="28"/>
           <w:szCs w:val="28"/>
         </w:rPr>
-        <w:t xml:space="preserve">  </w:t>
+        <w:t>. – Санкт-</w:t>
       </w:r>
       <w:r>
         <w:rPr>
@@ -7650,9 +7882,8 @@
           <w:sz w:val="28"/>
           <w:szCs w:val="28"/>
         </w:rPr>
-        <w:t xml:space="preserve">Б. И. </w:t>
-      </w:r>
-      <w:proofErr w:type="spellStart"/>
+        <w:t>Петербург:</w:t>
+      </w:r>
       <w:r>
         <w:rPr>
           <w:b/>
@@ -7660,9 +7891,9 @@
           <w:sz w:val="28"/>
           <w:szCs w:val="28"/>
         </w:rPr>
-        <w:t>Положинцев</w:t>
-      </w:r>
-      <w:proofErr w:type="spellEnd"/>
+        <w:t xml:space="preserve"> </w:t>
+      </w:r>
+      <w:proofErr w:type="spellStart"/>
       <w:r>
         <w:rPr>
           <w:b/>
@@ -7670,8 +7901,9 @@
           <w:sz w:val="28"/>
           <w:szCs w:val="28"/>
         </w:rPr>
-        <w:t>. – Санкт-</w:t>
-      </w:r>
+        <w:t>СПбПУ</w:t>
+      </w:r>
+      <w:proofErr w:type="spellEnd"/>
       <w:r>
         <w:rPr>
           <w:b/>
@@ -7679,43 +7911,19 @@
           <w:sz w:val="28"/>
           <w:szCs w:val="28"/>
         </w:rPr>
-        <w:t>Петербург:</w:t>
-      </w:r>
-      <w:r>
-        <w:rPr>
-          <w:b/>
-          <w:bCs/>
+        <w:t>, 2016. – 95 с. – URL:</w:t>
+      </w:r>
+      <w:r>
+        <w:rPr>
           <w:sz w:val="28"/>
           <w:szCs w:val="28"/>
         </w:rPr>
         <w:t xml:space="preserve"> </w:t>
-      </w:r>
-      <w:proofErr w:type="spellStart"/>
-      <w:r>
-        <w:rPr>
-          <w:b/>
-          <w:bCs/>
-          <w:sz w:val="28"/>
-          <w:szCs w:val="28"/>
-        </w:rPr>
-        <w:t>СПбПУ</w:t>
-      </w:r>
-      <w:proofErr w:type="spellEnd"/>
-      <w:r>
-        <w:rPr>
-          <w:b/>
-          <w:bCs/>
-          <w:sz w:val="28"/>
-          <w:szCs w:val="28"/>
-        </w:rPr>
-        <w:t xml:space="preserve">, 2016. – 95 с. – URL: </w:t>
       </w:r>
       <w:hyperlink r:id="rId11" w:history="1">
         <w:r>
           <w:rPr>
             <w:rStyle w:val="ac"/>
-            <w:b/>
-            <w:bCs/>
             <w:sz w:val="28"/>
             <w:szCs w:val="28"/>
           </w:rPr>

</xml_diff>

<commit_message>
vault backup: 2026-05-07 15:35:43
</commit_message>
<xml_diff>
--- a/Учеба 4 семестр/Теория вероятности/Курсовая работа/Отчет, Код/Курсовая работа.docx
+++ b/Учеба 4 семестр/Теория вероятности/Курсовая работа/Отчет, Код/Курсовая работа.docx
@@ -958,7 +958,13 @@
           <w:szCs w:val="24"/>
         </w:rPr>
         <w:tab/>
-        <w:t>26</w:t>
+      </w:r>
+      <w:r>
+        <w:rPr>
+          <w:sz w:val="24"/>
+          <w:szCs w:val="24"/>
+        </w:rPr>
+        <w:t>12</w:t>
       </w:r>
     </w:p>
     <w:p>
@@ -968,6 +974,9 @@
         </w:tabs>
         <w:spacing w:before="40" w:after="40" w:line="276" w:lineRule="auto"/>
         <w:ind w:left="360"/>
+        <w:rPr>
+          <w:lang w:val="en-US"/>
+        </w:rPr>
       </w:pPr>
       <w:r>
         <w:rPr>
@@ -982,7 +991,14 @@
           <w:szCs w:val="24"/>
         </w:rPr>
         <w:tab/>
-        <w:t>26</w:t>
+      </w:r>
+      <w:r>
+        <w:rPr>
+          <w:sz w:val="24"/>
+          <w:szCs w:val="24"/>
+          <w:lang w:val="en-US"/>
+        </w:rPr>
+        <w:t>12</w:t>
       </w:r>
     </w:p>
     <w:p>
@@ -5398,9 +5414,10 @@
         </w:rPr>
         <w:t xml:space="preserve">Случайная величина </w:t>
       </w:r>
-      <w:proofErr w:type="spellStart"/>
-      <w:r>
-        <w:rPr>
+      <w:r>
+        <w:rPr>
+          <w:i/>
+          <w:iCs/>
           <w:sz w:val="28"/>
           <w:szCs w:val="28"/>
         </w:rPr>
@@ -5410,41 +5427,79 @@
         <w:rPr>
           <w:sz w:val="28"/>
           <w:szCs w:val="28"/>
-          <w:vertAlign w:val="subscript"/>
+        </w:rPr>
+        <w:t>ₙ(</w:t>
+      </w:r>
+      <w:r>
+        <w:rPr>
+          <w:i/>
+          <w:iCs/>
+          <w:sz w:val="28"/>
+          <w:szCs w:val="28"/>
+        </w:rPr>
+        <w:t>x</w:t>
+      </w:r>
+      <w:r>
+        <w:rPr>
+          <w:sz w:val="28"/>
+          <w:szCs w:val="28"/>
+        </w:rPr>
+        <w:t xml:space="preserve">) = </w:t>
+      </w:r>
+      <w:r>
+        <w:rPr>
+          <w:i/>
+          <w:iCs/>
+          <w:sz w:val="28"/>
+          <w:szCs w:val="28"/>
+        </w:rPr>
+        <w:t>N</w:t>
+      </w:r>
+      <w:r>
+        <w:rPr>
+          <w:sz w:val="28"/>
+          <w:szCs w:val="28"/>
+        </w:rPr>
+        <w:t>ₙ(</w:t>
+      </w:r>
+      <w:r>
+        <w:rPr>
+          <w:i/>
+          <w:iCs/>
+          <w:sz w:val="28"/>
+          <w:szCs w:val="28"/>
+        </w:rPr>
+        <w:t>x</w:t>
+      </w:r>
+      <w:r>
+        <w:rPr>
+          <w:sz w:val="28"/>
+          <w:szCs w:val="28"/>
+        </w:rPr>
+        <w:t xml:space="preserve">) / </w:t>
+      </w:r>
+      <w:r>
+        <w:rPr>
+          <w:i/>
+          <w:iCs/>
+          <w:sz w:val="28"/>
+          <w:szCs w:val="28"/>
         </w:rPr>
         <w:t>n</w:t>
       </w:r>
-      <w:proofErr w:type="spellEnd"/>
-      <w:r>
-        <w:rPr>
-          <w:sz w:val="28"/>
-          <w:szCs w:val="28"/>
-        </w:rPr>
-        <w:t xml:space="preserve">(x) = </w:t>
-      </w:r>
-      <w:proofErr w:type="spellStart"/>
-      <w:r>
-        <w:rPr>
-          <w:sz w:val="28"/>
-          <w:szCs w:val="28"/>
-        </w:rPr>
-        <w:t>N</w:t>
-      </w:r>
-      <w:r>
-        <w:rPr>
-          <w:sz w:val="28"/>
-          <w:szCs w:val="28"/>
-          <w:vertAlign w:val="subscript"/>
-        </w:rPr>
-        <w:t>n</w:t>
-      </w:r>
-      <w:proofErr w:type="spellEnd"/>
-      <w:r>
-        <w:rPr>
-          <w:sz w:val="28"/>
-          <w:szCs w:val="28"/>
-        </w:rPr>
-        <w:t xml:space="preserve">(x) / n, называемая </w:t>
+      <w:r>
+        <w:rPr>
+          <w:sz w:val="28"/>
+          <w:szCs w:val="28"/>
+        </w:rPr>
+        <w:t xml:space="preserve">, </w:t>
+      </w:r>
+      <w:r>
+        <w:rPr>
+          <w:sz w:val="28"/>
+          <w:szCs w:val="28"/>
+        </w:rPr>
+        <w:t xml:space="preserve">называемая </w:t>
       </w:r>
       <w:r>
         <w:rPr>
@@ -5499,11 +5554,19 @@
           <w:sz w:val="28"/>
           <w:szCs w:val="28"/>
         </w:rPr>
-        <w:t xml:space="preserve">, удовлетворяющих условию </w:t>
-      </w:r>
-      <w:proofErr w:type="spellStart"/>
-      <w:r>
-        <w:rPr>
+        <w:t xml:space="preserve">, удовлетворяющих </w:t>
+      </w:r>
+      <w:r>
+        <w:rPr>
+          <w:sz w:val="28"/>
+          <w:szCs w:val="28"/>
+        </w:rPr>
+        <w:t xml:space="preserve">условию </w:t>
+      </w:r>
+      <w:r>
+        <w:rPr>
+          <w:i/>
+          <w:iCs/>
           <w:sz w:val="28"/>
           <w:szCs w:val="28"/>
         </w:rPr>
@@ -5513,11 +5576,27 @@
         <w:rPr>
           <w:sz w:val="28"/>
           <w:szCs w:val="28"/>
-          <w:vertAlign w:val="subscript"/>
-        </w:rPr>
-        <w:t>i</w:t>
-      </w:r>
-      <w:proofErr w:type="spellEnd"/>
+        </w:rPr>
+        <w:t xml:space="preserve">ᵢ </w:t>
+      </w:r>
+      <w:proofErr w:type="gramStart"/>
+      <w:r>
+        <w:rPr>
+          <w:sz w:val="28"/>
+          <w:szCs w:val="28"/>
+        </w:rPr>
+        <w:t xml:space="preserve">&lt; </w:t>
+      </w:r>
+      <w:r>
+        <w:rPr>
+          <w:i/>
+          <w:iCs/>
+          <w:sz w:val="28"/>
+          <w:szCs w:val="28"/>
+        </w:rPr>
+        <w:t>x</w:t>
+      </w:r>
+      <w:proofErr w:type="gramEnd"/>
       <w:r>
         <w:rPr>
           <w:sz w:val="28"/>
@@ -5525,21 +5604,12 @@
         </w:rPr>
         <w:t xml:space="preserve"> </w:t>
       </w:r>
-      <w:proofErr w:type="gramStart"/>
-      <w:r>
-        <w:rPr>
-          <w:sz w:val="28"/>
-          <w:szCs w:val="28"/>
-        </w:rPr>
-        <w:t>&lt; x</w:t>
-      </w:r>
-      <w:proofErr w:type="gramEnd"/>
-      <w:r>
-        <w:rPr>
-          <w:sz w:val="28"/>
-          <w:szCs w:val="28"/>
-        </w:rPr>
-        <w:t xml:space="preserve"> [4].</w:t>
+      <w:r>
+        <w:rPr>
+          <w:sz w:val="28"/>
+          <w:szCs w:val="28"/>
+        </w:rPr>
+        <w:t>[4].</w:t>
       </w:r>
     </w:p>
     <w:p>
@@ -6106,7 +6176,28 @@
           <w:szCs w:val="28"/>
         </w:rPr>
         <w:tab/>
-        <w:t>При n → ∞ эмпирическая функция распределения сходится по вероятности к теоретической: Fₙ(x) →ᵖ Fᴫ(x) для любого x.</w:t>
+        <w:t>При n → ∞ эмпирическая функция распределения сходится по вероятности к теоретической:</w:t>
+      </w:r>
+      <w:r>
+        <w:rPr>
+          <w:sz w:val="28"/>
+          <w:szCs w:val="28"/>
+        </w:rPr>
+        <w:t xml:space="preserve"> </w:t>
+      </w:r>
+      <w:r>
+        <w:rPr>
+          <w:sz w:val="28"/>
+          <w:szCs w:val="28"/>
+        </w:rPr>
+        <w:t>Fₙ(x) →ᵖ Fₓ(x)</w:t>
+      </w:r>
+      <w:r>
+        <w:rPr>
+          <w:sz w:val="28"/>
+          <w:szCs w:val="28"/>
+        </w:rPr>
+        <w:t xml:space="preserve"> для любого x.</w:t>
       </w:r>
     </w:p>
     <w:p>
@@ -6118,6 +6209,11 @@
       <w:pPr>
         <w:spacing w:line="360" w:lineRule="auto"/>
         <w:ind w:firstLine="720"/>
+        <w:rPr>
+          <w:sz w:val="28"/>
+          <w:szCs w:val="28"/>
+          <w:lang w:val="en-US"/>
+        </w:rPr>
       </w:pPr>
       <w:r>
         <w:rPr>
@@ -6133,53 +6229,30 @@
           <w:sz w:val="28"/>
           <w:szCs w:val="28"/>
         </w:rPr>
-        <w:t xml:space="preserve">. Отклонение эмпирической функции распределения </w:t>
-      </w:r>
-      <w:proofErr w:type="spellStart"/>
-      <w:r>
-        <w:rPr>
-          <w:sz w:val="28"/>
-          <w:szCs w:val="28"/>
-        </w:rPr>
-        <w:t>F</w:t>
-      </w:r>
-      <w:r>
-        <w:rPr>
-          <w:sz w:val="28"/>
-          <w:szCs w:val="28"/>
-          <w:vertAlign w:val="subscript"/>
-        </w:rPr>
-        <w:t>n</w:t>
-      </w:r>
-      <w:proofErr w:type="spellEnd"/>
-      <w:r>
-        <w:rPr>
-          <w:sz w:val="28"/>
-          <w:szCs w:val="28"/>
-        </w:rPr>
-        <w:t>(x) от теоретической функции распределения F</w:t>
-      </w:r>
-      <w:r>
-        <w:rPr>
-          <w:i/>
-          <w:iCs/>
-          <w:sz w:val="28"/>
-          <w:szCs w:val="28"/>
-        </w:rPr>
-        <w:t>X</w:t>
-      </w:r>
-      <w:r>
-        <w:rPr>
-          <w:sz w:val="28"/>
-          <w:szCs w:val="28"/>
-        </w:rPr>
-        <w:t>(x) с вероятностью 1 стремится к нулю равномерно по всей числовой оси:</w:t>
-      </w:r>
-    </w:p>
-    <w:p>
-      <w:pPr>
-        <w:spacing w:line="360" w:lineRule="auto"/>
-      </w:pPr>
+        <w:t xml:space="preserve">. </w:t>
+      </w:r>
+      <w:r>
+        <w:rPr>
+          <w:sz w:val="28"/>
+          <w:szCs w:val="28"/>
+        </w:rPr>
+        <w:t>Отклонение ЭФР Fₙ(x) от теоретической функции Fₓ(x) с вероятностью 1 стремится к нулю равномерно по всей числовой оси</w:t>
+      </w:r>
+      <w:r>
+        <w:rPr>
+          <w:sz w:val="28"/>
+          <w:szCs w:val="28"/>
+          <w:lang w:val="en-US"/>
+        </w:rPr>
+        <w:t xml:space="preserve"> [4]</w:t>
+      </w:r>
+      <w:r>
+        <w:rPr>
+          <w:sz w:val="28"/>
+          <w:szCs w:val="28"/>
+        </w:rPr>
+        <w:t>:</w:t>
+      </w:r>
     </w:p>
     <w:p>
       <w:pPr>
@@ -6544,7 +6617,16 @@
                       <w:sz w:val="28"/>
                       <w:szCs w:val="28"/>
                     </w:rPr>
-                    <m:t>0, x ≤ x₍₁₎</m:t>
+                    <m:t>0,   x ≤ x(</m:t>
+                  </m:r>
+                  <m:r>
+                    <w:rPr>
+                      <w:rFonts w:ascii="Cambria Math" w:hAnsi="Cambria Math"/>
+                      <w:sz w:val="28"/>
+                      <w:szCs w:val="28"/>
+                      <w:lang w:val="en-US"/>
+                    </w:rPr>
+                    <m:t>1)</m:t>
                   </m:r>
                 </m:e>
                 <m:e>
@@ -6554,7 +6636,7 @@
                       <w:sz w:val="28"/>
                       <w:szCs w:val="28"/>
                     </w:rPr>
-                    <m:t>k/n, x₍ᵏ₎ &lt; x ≤ x₍ᵏ₊₁₎, k = 1,…,n-1</m:t>
+                    <m:t>k∕n,   x(k) &lt; x ≤ x(k+1),  k = 1,…,n-1</m:t>
                   </m:r>
                 </m:e>
                 <m:e>
@@ -6564,7 +6646,16 @@
                       <w:sz w:val="28"/>
                       <w:szCs w:val="28"/>
                     </w:rPr>
-                    <m:t>1, x &gt; x₍ₙ₎</m:t>
+                    <m:t>1,   x &gt; x(</m:t>
+                  </m:r>
+                  <m:r>
+                    <w:rPr>
+                      <w:rFonts w:ascii="Cambria Math" w:hAnsi="Cambria Math"/>
+                      <w:sz w:val="28"/>
+                      <w:szCs w:val="28"/>
+                      <w:lang w:val="en-US"/>
+                    </w:rPr>
+                    <m:t>n)</m:t>
                   </m:r>
                 </m:e>
               </m:eqArr>
@@ -6584,6 +6675,14 @@
     <w:p>
       <w:pPr>
         <w:rPr>
+          <w:sz w:val="28"/>
+          <w:szCs w:val="28"/>
+        </w:rPr>
+      </w:pPr>
+    </w:p>
+    <w:p>
+      <w:pPr>
+        <w:rPr>
           <w:b/>
           <w:bCs/>
           <w:sz w:val="32"/>
@@ -6713,11 +6812,9 @@
     <w:p>
       <w:pPr>
         <w:pStyle w:val="a7"/>
-        <w:spacing w:before="100" w:beforeAutospacing="1" w:after="100" w:afterAutospacing="1"/>
-        <w:rPr>
-          <w:sz w:val="24"/>
-          <w:szCs w:val="24"/>
-          <w:lang w:val="en-US"/>
+        <w:ind w:left="780"/>
+        <w:rPr>
+          <w:rFonts w:ascii="Courier New" w:hAnsi="Courier New" w:cs="Courier New"/>
         </w:rPr>
       </w:pPr>
       <w:r>
@@ -6761,18 +6858,11 @@
       </w:r>
       <w:r>
         <w:rPr>
-          <w:sz w:val="24"/>
-          <w:szCs w:val="24"/>
+          <w:rFonts w:ascii="Courier New" w:hAnsi="Courier New" w:cs="Courier New"/>
           <w:lang w:val="en-US"/>
         </w:rPr>
         <w:br/>
-      </w:r>
-      <w:r>
-        <w:rPr>
-          <w:rFonts w:ascii="Courier New" w:hAnsi="Courier New" w:cs="Courier New"/>
-          <w:lang w:val="en-US"/>
-        </w:rPr>
-        <w:t xml:space="preserve">n = </w:t>
+        <w:t xml:space="preserve">    n = </w:t>
       </w:r>
       <w:proofErr w:type="spellStart"/>
       <w:r>
@@ -6792,86 +6882,138 @@
       </w:r>
       <w:r>
         <w:rPr>
-          <w:sz w:val="24"/>
-          <w:szCs w:val="24"/>
+          <w:rFonts w:ascii="Courier New" w:hAnsi="Courier New" w:cs="Courier New"/>
           <w:lang w:val="en-US"/>
         </w:rPr>
         <w:br/>
-      </w:r>
-      <w:r>
-        <w:rPr>
-          <w:rFonts w:ascii="Courier New" w:hAnsi="Courier New" w:cs="Courier New"/>
-          <w:lang w:val="en-US"/>
-        </w:rPr>
-        <w:t>count = 0</w:t>
-      </w:r>
-      <w:r>
-        <w:rPr>
-          <w:sz w:val="24"/>
-          <w:szCs w:val="24"/>
+        <w:t xml:space="preserve">    count = 0</w:t>
+      </w:r>
+      <w:r>
+        <w:rPr>
+          <w:rFonts w:ascii="Courier New" w:hAnsi="Courier New" w:cs="Courier New"/>
           <w:lang w:val="en-US"/>
         </w:rPr>
         <w:br/>
-      </w:r>
-      <w:r>
-        <w:rPr>
-          <w:sz w:val="24"/>
-          <w:szCs w:val="24"/>
+        <w:t xml:space="preserve">    for value in X:</w:t>
+      </w:r>
+      <w:r>
+        <w:rPr>
+          <w:rFonts w:ascii="Courier New" w:hAnsi="Courier New" w:cs="Courier New"/>
           <w:lang w:val="en-US"/>
         </w:rPr>
         <w:br/>
-        <w:t>for value in X:</w:t>
-      </w:r>
-      <w:r>
-        <w:rPr>
-          <w:sz w:val="24"/>
-          <w:szCs w:val="24"/>
+        <w:t xml:space="preserve">        if value &lt; x:   # </w:t>
+      </w:r>
+      <w:proofErr w:type="spellStart"/>
+      <w:r>
+        <w:rPr>
+          <w:rFonts w:ascii="Courier New" w:hAnsi="Courier New" w:cs="Courier New"/>
+          <w:lang w:val="en-US"/>
+        </w:rPr>
+        <w:t>строгое</w:t>
+      </w:r>
+      <w:proofErr w:type="spellEnd"/>
+      <w:r>
+        <w:rPr>
+          <w:rFonts w:ascii="Courier New" w:hAnsi="Courier New" w:cs="Courier New"/>
+          <w:lang w:val="en-US"/>
+        </w:rPr>
+        <w:t xml:space="preserve"> </w:t>
+      </w:r>
+      <w:proofErr w:type="spellStart"/>
+      <w:r>
+        <w:rPr>
+          <w:rFonts w:ascii="Courier New" w:hAnsi="Courier New" w:cs="Courier New"/>
+          <w:lang w:val="en-US"/>
+        </w:rPr>
+        <w:t>неравенство</w:t>
+      </w:r>
+      <w:proofErr w:type="spellEnd"/>
+      <w:r>
+        <w:rPr>
+          <w:rFonts w:ascii="Courier New" w:hAnsi="Courier New" w:cs="Courier New"/>
+          <w:lang w:val="en-US"/>
+        </w:rPr>
+        <w:t xml:space="preserve"> </w:t>
+      </w:r>
+      <w:proofErr w:type="spellStart"/>
+      <w:r>
+        <w:rPr>
+          <w:rFonts w:ascii="Courier New" w:hAnsi="Courier New" w:cs="Courier New"/>
+          <w:lang w:val="en-US"/>
+        </w:rPr>
+        <w:t>по</w:t>
+      </w:r>
+      <w:proofErr w:type="spellEnd"/>
+      <w:r>
+        <w:rPr>
+          <w:rFonts w:ascii="Courier New" w:hAnsi="Courier New" w:cs="Courier New"/>
+          <w:lang w:val="en-US"/>
+        </w:rPr>
+        <w:t xml:space="preserve"> </w:t>
+      </w:r>
+      <w:proofErr w:type="spellStart"/>
+      <w:r>
+        <w:rPr>
+          <w:rFonts w:ascii="Courier New" w:hAnsi="Courier New" w:cs="Courier New"/>
+          <w:lang w:val="en-US"/>
+        </w:rPr>
+        <w:t>определению</w:t>
+      </w:r>
+      <w:proofErr w:type="spellEnd"/>
+      <w:r>
+        <w:rPr>
+          <w:rFonts w:ascii="Courier New" w:hAnsi="Courier New" w:cs="Courier New"/>
           <w:lang w:val="en-US"/>
         </w:rPr>
         <w:br/>
-        <w:t>if value &lt;</w:t>
-      </w:r>
-      <w:r>
-        <w:rPr>
-          <w:sz w:val="24"/>
-          <w:szCs w:val="24"/>
-          <w:lang w:val="en-US"/>
+        <w:t xml:space="preserve">            count</w:t>
+      </w:r>
+      <w:r>
+        <w:rPr>
+          <w:rFonts w:ascii="Courier New" w:hAnsi="Courier New" w:cs="Courier New"/>
+        </w:rPr>
+        <w:t xml:space="preserve"> += 1</w:t>
+      </w:r>
+      <w:r>
+        <w:rPr>
+          <w:rFonts w:ascii="Courier New" w:hAnsi="Courier New" w:cs="Courier New"/>
+        </w:rPr>
+        <w:br/>
+        <w:t xml:space="preserve">    </w:t>
+      </w:r>
+      <w:r>
+        <w:rPr>
+          <w:rFonts w:ascii="Courier New" w:hAnsi="Courier New" w:cs="Courier New"/>
+          <w:lang w:val="en-US"/>
+        </w:rPr>
+        <w:t>return</w:t>
+      </w:r>
+      <w:r>
+        <w:rPr>
+          <w:rFonts w:ascii="Courier New" w:hAnsi="Courier New" w:cs="Courier New"/>
         </w:rPr>
         <w:t xml:space="preserve"> </w:t>
       </w:r>
       <w:r>
         <w:rPr>
-          <w:sz w:val="24"/>
-          <w:szCs w:val="24"/>
-          <w:lang w:val="en-US"/>
-        </w:rPr>
-        <w:t xml:space="preserve"> x:</w:t>
-      </w:r>
-      <w:r>
-        <w:rPr>
-          <w:sz w:val="24"/>
-          <w:szCs w:val="24"/>
-          <w:lang w:val="en-US"/>
-        </w:rPr>
-        <w:br/>
-        <w:t>count += 1</w:t>
-      </w:r>
-      <w:r>
-        <w:rPr>
-          <w:sz w:val="24"/>
-          <w:szCs w:val="24"/>
-          <w:lang w:val="en-US"/>
-        </w:rPr>
-        <w:br/>
-      </w:r>
-      <w:r>
-        <w:rPr>
-          <w:sz w:val="24"/>
-          <w:szCs w:val="24"/>
-          <w:lang w:val="en-US"/>
-        </w:rPr>
-        <w:br/>
-        <w:t>return count / n</w:t>
+          <w:rFonts w:ascii="Courier New" w:hAnsi="Courier New" w:cs="Courier New"/>
+          <w:lang w:val="en-US"/>
+        </w:rPr>
+        <w:t>count</w:t>
+      </w:r>
+      <w:r>
+        <w:rPr>
+          <w:rFonts w:ascii="Courier New" w:hAnsi="Courier New" w:cs="Courier New"/>
+        </w:rPr>
+        <w:t xml:space="preserve"> / </w:t>
+      </w:r>
+      <w:r>
+        <w:rPr>
+          <w:rFonts w:ascii="Courier New" w:hAnsi="Courier New" w:cs="Courier New"/>
+          <w:lang w:val="en-US"/>
+        </w:rPr>
+        <w:t>n</w:t>
       </w:r>
     </w:p>
     <w:p>
@@ -6883,38 +7025,54 @@
           <w:bCs/>
           <w:sz w:val="32"/>
           <w:szCs w:val="32"/>
-          <w:lang w:val="en-US"/>
-        </w:rPr>
-      </w:pPr>
-    </w:p>
-    <w:p>
-      <w:pPr>
-        <w:rPr>
-          <w:sz w:val="28"/>
-          <w:szCs w:val="28"/>
-        </w:rPr>
-      </w:pPr>
-      <w:r>
-        <w:rPr>
-          <w:sz w:val="28"/>
-          <w:szCs w:val="28"/>
-        </w:rPr>
-        <w:t>Вывод эмпирической функции сохранили в .</w:t>
-      </w:r>
-      <w:r>
-        <w:rPr>
-          <w:sz w:val="28"/>
-          <w:szCs w:val="28"/>
-          <w:lang w:val="en-US"/>
-        </w:rPr>
-        <w:t>csv</w:t>
-      </w:r>
-      <w:r>
-        <w:rPr>
-          <w:sz w:val="28"/>
-          <w:szCs w:val="28"/>
-        </w:rPr>
-        <w:t xml:space="preserve"> формат, для удобства были сделаны графики:</w:t>
+        </w:rPr>
+      </w:pPr>
+    </w:p>
+    <w:p>
+      <w:pPr>
+        <w:rPr>
+          <w:sz w:val="28"/>
+          <w:szCs w:val="28"/>
+        </w:rPr>
+      </w:pPr>
+      <w:r>
+        <w:rPr>
+          <w:sz w:val="28"/>
+          <w:szCs w:val="28"/>
+        </w:rPr>
+        <w:t xml:space="preserve">Для анализа поведения ЭФР были сформированы три случайные </w:t>
+      </w:r>
+      <w:proofErr w:type="spellStart"/>
+      <w:r>
+        <w:rPr>
+          <w:sz w:val="28"/>
+          <w:szCs w:val="28"/>
+        </w:rPr>
+        <w:t>подвыборки</w:t>
+      </w:r>
+      <w:proofErr w:type="spellEnd"/>
+      <w:r>
+        <w:rPr>
+          <w:sz w:val="28"/>
+          <w:szCs w:val="28"/>
+        </w:rPr>
+        <w:t xml:space="preserve"> размером 10, 100 и 200 элементов из исходной выборки X объёмом n = 300. Для каждой </w:t>
+      </w:r>
+      <w:proofErr w:type="spellStart"/>
+      <w:r>
+        <w:rPr>
+          <w:sz w:val="28"/>
+          <w:szCs w:val="28"/>
+        </w:rPr>
+        <w:t>подвыборки</w:t>
+      </w:r>
+      <w:proofErr w:type="spellEnd"/>
+      <w:r>
+        <w:rPr>
+          <w:sz w:val="28"/>
+          <w:szCs w:val="28"/>
+        </w:rPr>
+        <w:t xml:space="preserve"> построен ступенчатый график ЭФР совместно с теоретической функцией двойного гамма-распределения.</w:t>
       </w:r>
     </w:p>
     <w:p>
@@ -6927,14 +7085,15 @@
       </w:pPr>
       <w:r>
         <w:rPr>
+          <w:noProof/>
           <w:sz w:val="28"/>
           <w:szCs w:val="28"/>
         </w:rPr>
         <w:drawing>
-          <wp:inline distT="0" distB="0" distL="0" distR="0" wp14:anchorId="0ABD80F2" wp14:editId="637E1AB5">
-            <wp:extent cx="5940425" cy="3277870"/>
-            <wp:effectExtent l="0" t="0" r="3175" b="0"/>
-            <wp:docPr id="1" name="Рисунок 1"/>
+          <wp:inline distT="0" distB="0" distL="0" distR="0" wp14:anchorId="5A80D6B0" wp14:editId="0921EBC2">
+            <wp:extent cx="5935980" cy="3756660"/>
+            <wp:effectExtent l="0" t="0" r="7620" b="0"/>
+            <wp:docPr id="9" name="Рисунок 9"/>
             <wp:cNvGraphicFramePr>
               <a:graphicFrameLocks xmlns:a="http://schemas.openxmlformats.org/drawingml/2006/main" noChangeAspect="1"/>
             </wp:cNvGraphicFramePr>
@@ -6942,23 +7101,36 @@
               <a:graphicData uri="http://schemas.openxmlformats.org/drawingml/2006/picture">
                 <pic:pic xmlns:pic="http://schemas.openxmlformats.org/drawingml/2006/picture">
                   <pic:nvPicPr>
-                    <pic:cNvPr id="1" name=""/>
-                    <pic:cNvPicPr/>
+                    <pic:cNvPr id="0" name="Picture 17"/>
+                    <pic:cNvPicPr>
+                      <a:picLocks noChangeAspect="1" noChangeArrowheads="1"/>
+                    </pic:cNvPicPr>
                   </pic:nvPicPr>
                   <pic:blipFill>
-                    <a:blip r:embed="rId6"/>
+                    <a:blip r:embed="rId6" cstate="print">
+                      <a:extLst>
+                        <a:ext uri="{28A0092B-C50C-407E-A947-70E740481C1C}">
+                          <a14:useLocalDpi xmlns:a14="http://schemas.microsoft.com/office/drawing/2010/main" val="0"/>
+                        </a:ext>
+                      </a:extLst>
+                    </a:blip>
+                    <a:srcRect/>
                     <a:stretch>
                       <a:fillRect/>
                     </a:stretch>
                   </pic:blipFill>
-                  <pic:spPr>
+                  <pic:spPr bwMode="auto">
                     <a:xfrm>
                       <a:off x="0" y="0"/>
-                      <a:ext cx="5940425" cy="3277870"/>
+                      <a:ext cx="5935980" cy="3756660"/>
                     </a:xfrm>
                     <a:prstGeom prst="rect">
                       <a:avLst/>
                     </a:prstGeom>
+                    <a:noFill/>
+                    <a:ln>
+                      <a:noFill/>
+                    </a:ln>
                   </pic:spPr>
                 </pic:pic>
               </a:graphicData>
@@ -7009,15 +7181,14 @@
       </w:pPr>
       <w:r>
         <w:rPr>
-          <w:sz w:val="28"/>
-          <w:szCs w:val="28"/>
+          <w:noProof/>
         </w:rPr>
         <w:lastRenderedPageBreak/>
         <w:drawing>
-          <wp:inline distT="0" distB="0" distL="0" distR="0" wp14:anchorId="2C187376" wp14:editId="4BACFE4D">
-            <wp:extent cx="5940425" cy="2942590"/>
-            <wp:effectExtent l="0" t="0" r="3175" b="0"/>
-            <wp:docPr id="2" name="Рисунок 2"/>
+          <wp:inline distT="0" distB="0" distL="0" distR="0" wp14:anchorId="36F54E68" wp14:editId="43395295">
+            <wp:extent cx="5940425" cy="3762375"/>
+            <wp:effectExtent l="0" t="0" r="3175" b="9525"/>
+            <wp:docPr id="10" name="Рисунок 10"/>
             <wp:cNvGraphicFramePr>
               <a:graphicFrameLocks xmlns:a="http://schemas.openxmlformats.org/drawingml/2006/main" noChangeAspect="1"/>
             </wp:cNvGraphicFramePr>
@@ -7025,23 +7196,36 @@
               <a:graphicData uri="http://schemas.openxmlformats.org/drawingml/2006/picture">
                 <pic:pic xmlns:pic="http://schemas.openxmlformats.org/drawingml/2006/picture">
                   <pic:nvPicPr>
-                    <pic:cNvPr id="1" name=""/>
-                    <pic:cNvPicPr/>
+                    <pic:cNvPr id="0" name="Picture 18"/>
+                    <pic:cNvPicPr>
+                      <a:picLocks noChangeAspect="1" noChangeArrowheads="1"/>
+                    </pic:cNvPicPr>
                   </pic:nvPicPr>
                   <pic:blipFill>
-                    <a:blip r:embed="rId7"/>
+                    <a:blip r:embed="rId7" cstate="print">
+                      <a:extLst>
+                        <a:ext uri="{28A0092B-C50C-407E-A947-70E740481C1C}">
+                          <a14:useLocalDpi xmlns:a14="http://schemas.microsoft.com/office/drawing/2010/main" val="0"/>
+                        </a:ext>
+                      </a:extLst>
+                    </a:blip>
+                    <a:srcRect/>
                     <a:stretch>
                       <a:fillRect/>
                     </a:stretch>
                   </pic:blipFill>
-                  <pic:spPr>
+                  <pic:spPr bwMode="auto">
                     <a:xfrm>
                       <a:off x="0" y="0"/>
-                      <a:ext cx="5940425" cy="2942590"/>
+                      <a:ext cx="5940425" cy="3762375"/>
                     </a:xfrm>
                     <a:prstGeom prst="rect">
                       <a:avLst/>
                     </a:prstGeom>
+                    <a:noFill/>
+                    <a:ln>
+                      <a:noFill/>
+                    </a:ln>
                   </pic:spPr>
                 </pic:pic>
               </a:graphicData>
@@ -7129,14 +7313,13 @@
       </w:pPr>
       <w:r>
         <w:rPr>
-          <w:sz w:val="28"/>
-          <w:szCs w:val="28"/>
+          <w:noProof/>
         </w:rPr>
         <w:drawing>
-          <wp:inline distT="0" distB="0" distL="0" distR="0" wp14:anchorId="41D7A4F1" wp14:editId="50DE0ED2">
-            <wp:extent cx="5940425" cy="2705735"/>
-            <wp:effectExtent l="0" t="0" r="3175" b="0"/>
-            <wp:docPr id="3" name="Рисунок 3"/>
+          <wp:inline distT="0" distB="0" distL="0" distR="0" wp14:anchorId="24EDEFEB" wp14:editId="24F0C16E">
+            <wp:extent cx="5940425" cy="3762375"/>
+            <wp:effectExtent l="0" t="0" r="3175" b="9525"/>
+            <wp:docPr id="11" name="Рисунок 11"/>
             <wp:cNvGraphicFramePr>
               <a:graphicFrameLocks xmlns:a="http://schemas.openxmlformats.org/drawingml/2006/main" noChangeAspect="1"/>
             </wp:cNvGraphicFramePr>
@@ -7144,23 +7327,36 @@
               <a:graphicData uri="http://schemas.openxmlformats.org/drawingml/2006/picture">
                 <pic:pic xmlns:pic="http://schemas.openxmlformats.org/drawingml/2006/picture">
                   <pic:nvPicPr>
-                    <pic:cNvPr id="1" name=""/>
-                    <pic:cNvPicPr/>
+                    <pic:cNvPr id="0" name="Picture 20"/>
+                    <pic:cNvPicPr>
+                      <a:picLocks noChangeAspect="1" noChangeArrowheads="1"/>
+                    </pic:cNvPicPr>
                   </pic:nvPicPr>
                   <pic:blipFill>
-                    <a:blip r:embed="rId8"/>
+                    <a:blip r:embed="rId8" cstate="print">
+                      <a:extLst>
+                        <a:ext uri="{28A0092B-C50C-407E-A947-70E740481C1C}">
+                          <a14:useLocalDpi xmlns:a14="http://schemas.microsoft.com/office/drawing/2010/main" val="0"/>
+                        </a:ext>
+                      </a:extLst>
+                    </a:blip>
+                    <a:srcRect/>
                     <a:stretch>
                       <a:fillRect/>
                     </a:stretch>
                   </pic:blipFill>
-                  <pic:spPr>
+                  <pic:spPr bwMode="auto">
                     <a:xfrm>
                       <a:off x="0" y="0"/>
-                      <a:ext cx="5940425" cy="2705735"/>
+                      <a:ext cx="5940425" cy="3762375"/>
                     </a:xfrm>
                     <a:prstGeom prst="rect">
                       <a:avLst/>
                     </a:prstGeom>
+                    <a:noFill/>
+                    <a:ln>
+                      <a:noFill/>
+                    </a:ln>
                   </pic:spPr>
                 </pic:pic>
               </a:graphicData>
@@ -7355,22 +7551,55 @@
         <w:rPr>
           <w:sz w:val="28"/>
           <w:szCs w:val="28"/>
-          <w:lang w:val="en-US"/>
-        </w:rPr>
-      </w:pPr>
-      <w:r>
-        <w:rPr>
-          <w:sz w:val="28"/>
-          <w:szCs w:val="28"/>
-        </w:rPr>
-        <w:t xml:space="preserve">После этого, сделаем вывод о получившихся графиках и теоретическим значением эмпирической функции распределения: можно заметить, что </w:t>
-      </w:r>
-      <w:r>
-        <w:rPr>
-          <w:sz w:val="28"/>
-          <w:szCs w:val="28"/>
-        </w:rPr>
-        <w:t xml:space="preserve">чем больше количество элементов в </w:t>
+        </w:rPr>
+      </w:pPr>
+      <w:r>
+        <w:rPr>
+          <w:sz w:val="28"/>
+          <w:szCs w:val="28"/>
+        </w:rPr>
+        <w:t>Анализ построенных графиков позволяет сделать следующие выводы</w:t>
+      </w:r>
+      <w:r>
+        <w:rPr>
+          <w:sz w:val="28"/>
+          <w:szCs w:val="28"/>
+        </w:rPr>
+        <w:t>.</w:t>
+      </w:r>
+    </w:p>
+    <w:p>
+      <w:pPr>
+        <w:rPr>
+          <w:sz w:val="28"/>
+          <w:szCs w:val="28"/>
+        </w:rPr>
+      </w:pPr>
+    </w:p>
+    <w:p>
+      <w:pPr>
+        <w:spacing w:line="432" w:lineRule="auto"/>
+        <w:rPr>
+          <w:sz w:val="28"/>
+          <w:szCs w:val="28"/>
+          <w:lang w:val="en-US"/>
+        </w:rPr>
+      </w:pPr>
+      <w:r>
+        <w:rPr>
+          <w:b/>
+          <w:bCs/>
+          <w:sz w:val="28"/>
+          <w:szCs w:val="28"/>
+        </w:rPr>
+        <w:t>Сходимость к теоретической кривой</w:t>
+      </w:r>
+      <w:r>
+        <w:rPr>
+          <w:sz w:val="28"/>
+          <w:szCs w:val="28"/>
+        </w:rPr>
+        <w:t xml:space="preserve">. При увеличении объёма </w:t>
       </w:r>
       <w:proofErr w:type="spellStart"/>
       <w:r>
@@ -7378,7 +7607,7 @@
           <w:sz w:val="28"/>
           <w:szCs w:val="28"/>
         </w:rPr>
-        <w:t>подвыборке</w:t>
+        <w:t>подвыборки</w:t>
       </w:r>
       <w:proofErr w:type="spellEnd"/>
       <w:r>
@@ -7386,34 +7615,277 @@
           <w:sz w:val="28"/>
           <w:szCs w:val="28"/>
         </w:rPr>
-        <w:t xml:space="preserve">, тем сильнее график, который получили в ходе выполнения работы, совпадает с теоретическим графиком функции распределения. </w:t>
-      </w:r>
-    </w:p>
-    <w:p>
-      <w:pPr>
+        <w:t xml:space="preserve"> эмпирическая функция распределения заметно приближается к теоретической. При n = 10 ступени ЭФР крупные, кривая грубо аппроксимирует теоретическую; при n = 100 сходство становится отчётливым; при n = 200 ЭФР практически совпадает с теоретической функцией. Это согласуется с теоремой Гливенко</w:t>
+      </w:r>
+      <w:r>
+        <w:rPr>
+          <w:sz w:val="28"/>
+          <w:szCs w:val="28"/>
+        </w:rPr>
+        <w:t>.</w:t>
+      </w:r>
+    </w:p>
+    <w:p>
+      <w:pPr>
+        <w:spacing w:line="432" w:lineRule="auto"/>
+        <w:rPr>
+          <w:sz w:val="28"/>
+          <w:szCs w:val="28"/>
+          <w:lang w:val="en-US"/>
+        </w:rPr>
+      </w:pPr>
+    </w:p>
+    <w:p>
+      <w:pPr>
+        <w:spacing w:line="432" w:lineRule="auto"/>
+        <w:rPr>
+          <w:sz w:val="28"/>
+          <w:szCs w:val="28"/>
+          <w:lang w:val="en-US"/>
+        </w:rPr>
+      </w:pPr>
+      <w:r>
+        <w:rPr>
+          <w:b/>
+          <w:bCs/>
+          <w:sz w:val="28"/>
+          <w:szCs w:val="28"/>
+        </w:rPr>
+        <w:t>Предположения о параметрах распределения</w:t>
+      </w:r>
+      <w:r>
+        <w:rPr>
+          <w:sz w:val="28"/>
+          <w:szCs w:val="28"/>
+        </w:rPr>
+        <w:t>. По форме ЭФР на рисунке 3 (n = 200) можно установить:</w:t>
+      </w:r>
+    </w:p>
+    <w:p>
+      <w:pPr>
+        <w:spacing w:line="432" w:lineRule="auto"/>
+        <w:rPr>
+          <w:sz w:val="28"/>
+          <w:szCs w:val="28"/>
+        </w:rPr>
+      </w:pPr>
+      <w:r>
+        <w:rPr>
+          <w:sz w:val="28"/>
+          <w:szCs w:val="28"/>
+        </w:rPr>
+        <w:t>–</w:t>
+      </w:r>
+      <w:r>
+        <w:rPr>
+          <w:sz w:val="28"/>
+          <w:szCs w:val="28"/>
+        </w:rPr>
+        <w:tab/>
+        <w:t xml:space="preserve">Точка перегиба ЭФР расположена вблизи x ≈ 0,8, что позволяет предположить значение параметра смещения </w:t>
+      </w:r>
+      <w:proofErr w:type="spellStart"/>
+      <w:r>
+        <w:rPr>
+          <w:sz w:val="28"/>
+          <w:szCs w:val="28"/>
+        </w:rPr>
+        <w:t>loc</w:t>
+      </w:r>
+      <w:proofErr w:type="spellEnd"/>
+      <w:r>
+        <w:rPr>
+          <w:sz w:val="28"/>
+          <w:szCs w:val="28"/>
+        </w:rPr>
+        <w:t> ≈ 0,8.</w:t>
+      </w:r>
+    </w:p>
+    <w:p>
+      <w:pPr>
+        <w:spacing w:line="432" w:lineRule="auto"/>
+        <w:rPr>
+          <w:sz w:val="28"/>
+          <w:szCs w:val="28"/>
+        </w:rPr>
+      </w:pPr>
+      <w:r>
+        <w:rPr>
+          <w:sz w:val="28"/>
+          <w:szCs w:val="28"/>
+        </w:rPr>
+        <w:t>–</w:t>
+      </w:r>
+      <w:r>
+        <w:rPr>
+          <w:sz w:val="28"/>
+          <w:szCs w:val="28"/>
+        </w:rPr>
+        <w:tab/>
+        <w:t xml:space="preserve">Крутизна перехода от 0 к 1 указывает на относительно малое значение дисперсии. Значение Fₙ(x) = 0,5 достигается приблизительно при x ≈ 4,0, а </w:t>
+      </w:r>
+      <w:r>
+        <w:rPr>
+          <w:sz w:val="28"/>
+          <w:szCs w:val="28"/>
+        </w:rPr>
+        <w:lastRenderedPageBreak/>
+        <w:t>95 % распределения укладывается в интервал [−13; 15], что соответствует умеренному масштабному параметру β ≈ 1.</w:t>
+      </w:r>
+    </w:p>
+    <w:p>
+      <w:pPr>
+        <w:spacing w:line="432" w:lineRule="auto"/>
+        <w:rPr>
+          <w:sz w:val="28"/>
+          <w:szCs w:val="28"/>
+          <w:lang w:val="en-US"/>
+        </w:rPr>
+      </w:pPr>
+      <w:r>
+        <w:rPr>
+          <w:sz w:val="28"/>
+          <w:szCs w:val="28"/>
+        </w:rPr>
+        <w:t>–</w:t>
+      </w:r>
+      <w:r>
+        <w:rPr>
+          <w:sz w:val="28"/>
+          <w:szCs w:val="28"/>
+        </w:rPr>
+        <w:tab/>
+        <w:t xml:space="preserve">Гладкая, без резких скачков, форма кривой характерна для параметра формы </w:t>
+      </w:r>
+      <w:proofErr w:type="gramStart"/>
+      <w:r>
+        <w:rPr>
+          <w:sz w:val="28"/>
+          <w:szCs w:val="28"/>
+        </w:rPr>
+        <w:t>α &gt;</w:t>
+      </w:r>
+      <w:proofErr w:type="gramEnd"/>
+      <w:r>
+        <w:rPr>
+          <w:sz w:val="28"/>
+          <w:szCs w:val="28"/>
+        </w:rPr>
+        <w:t> 1 (при α ≤ 1 плотность была бы J-образной).</w:t>
+      </w:r>
+    </w:p>
+    <w:p>
+      <w:pPr>
+        <w:spacing w:line="432" w:lineRule="auto"/>
+        <w:rPr>
+          <w:sz w:val="28"/>
+          <w:szCs w:val="28"/>
+          <w:lang w:val="en-US"/>
+        </w:rPr>
+      </w:pPr>
+    </w:p>
+    <w:p>
+      <w:pPr>
+        <w:spacing w:line="432" w:lineRule="auto"/>
+        <w:rPr>
+          <w:sz w:val="28"/>
+          <w:szCs w:val="28"/>
+        </w:rPr>
+      </w:pPr>
+      <w:r>
+        <w:rPr>
+          <w:sz w:val="28"/>
+          <w:szCs w:val="28"/>
+        </w:rPr>
+        <w:t xml:space="preserve">Таким образом, визуальный анализ ЭФР позволяет предположить параметры двойного гамма-распределения: α ≈ 8, β ≈ 1, </w:t>
+      </w:r>
+      <w:proofErr w:type="spellStart"/>
+      <w:r>
+        <w:rPr>
+          <w:sz w:val="28"/>
+          <w:szCs w:val="28"/>
+        </w:rPr>
+        <w:t>loc</w:t>
+      </w:r>
+      <w:proofErr w:type="spellEnd"/>
+      <w:r>
+        <w:rPr>
+          <w:sz w:val="28"/>
+          <w:szCs w:val="28"/>
+        </w:rPr>
+        <w:t xml:space="preserve"> ≈ 0,8. </w:t>
+      </w:r>
+    </w:p>
+    <w:p>
+      <w:pPr>
+        <w:spacing w:line="432" w:lineRule="auto"/>
+        <w:rPr>
+          <w:sz w:val="28"/>
+          <w:szCs w:val="28"/>
+        </w:rPr>
+      </w:pPr>
+    </w:p>
+    <w:p>
+      <w:pPr>
+        <w:pStyle w:val="a7"/>
+        <w:numPr>
+          <w:ilvl w:val="0"/>
+          <w:numId w:val="3"/>
+        </w:numPr>
         <w:jc w:val="center"/>
         <w:rPr>
-          <w:sz w:val="28"/>
-          <w:szCs w:val="28"/>
-        </w:rPr>
-      </w:pPr>
+          <w:b/>
+          <w:bCs/>
+          <w:sz w:val="40"/>
+          <w:szCs w:val="40"/>
+        </w:rPr>
+      </w:pPr>
+      <w:r>
+        <w:rPr>
+          <w:b/>
+          <w:bCs/>
+          <w:sz w:val="32"/>
+          <w:szCs w:val="32"/>
+        </w:rPr>
+        <w:t>Гистограмма</w:t>
+      </w:r>
+    </w:p>
+    <w:p>
+      <w:pPr>
+        <w:pStyle w:val="a7"/>
+        <w:numPr>
+          <w:ilvl w:val="1"/>
+          <w:numId w:val="3"/>
+        </w:numPr>
+        <w:jc w:val="center"/>
+        <w:rPr>
+          <w:b/>
+          <w:bCs/>
+          <w:sz w:val="32"/>
+          <w:szCs w:val="32"/>
+        </w:rPr>
+      </w:pPr>
+      <w:r>
+        <w:rPr>
+          <w:b/>
+          <w:bCs/>
+          <w:sz w:val="28"/>
+          <w:szCs w:val="28"/>
+        </w:rPr>
+        <w:t>Определение и алгоритм построения</w:t>
+      </w:r>
     </w:p>
     <w:p>
       <w:pPr>
         <w:pStyle w:val="a7"/>
         <w:ind w:left="780"/>
         <w:rPr>
+          <w:b/>
+          <w:bCs/>
           <w:sz w:val="32"/>
           <w:szCs w:val="32"/>
         </w:rPr>
       </w:pPr>
-      <w:r>
-        <w:rPr>
-          <w:sz w:val="32"/>
-          <w:szCs w:val="32"/>
-        </w:rPr>
-        <w:t xml:space="preserve"> </w:t>
-      </w:r>
     </w:p>
     <w:p>
       <w:pPr>
@@ -7842,7 +8314,6 @@
           <w:sz w:val="28"/>
           <w:szCs w:val="28"/>
         </w:rPr>
-        <w:lastRenderedPageBreak/>
         <w:t>Б.</w:t>
       </w:r>
       <w:proofErr w:type="gramEnd"/>

</xml_diff>